<commit_message>
Chụp lại ảnh net_transport bằng địa chỉ ZeroTier, nối liền mục 3.1 và 3.2
Ảnh cũ chụp bằng IP mạng nhà nên hai mục thành hai chuyện rời rạc. Ảnh
mới dùng đúng 10.91.229.18 đã xuất hiện ở mục 3.1, lại thấy rõ trong
Object Explorer có kết nối thứ tư mở theo địa chỉ đó.

Thêm một đoạn giải thích vì sao cột MayChuDangKetNoi vẫn là Mignon\KHO_A:
@@SERVERNAME cho tên đăng ký của máy chủ, không đổi theo đường kết nối.

Co-Authored-By: Claude Opus 5 <noreply@anthropic.com>
</commit_message>
<xml_diff>
--- a/Do an cuoi ki/BaoCao_DoAn_CSDLPhanTan.docx
+++ b/Do an cuoi ki/BaoCao_DoAn_CSDLPhanTan.docx
@@ -320,7 +320,7 @@
     <w:sdt>
       <w:sdtPr>
         <w:alias w:val="Muc luc"/>
-        <w:id w:val="-1263760461"/>
+        <w:id w:val="1026209796"/>
       </w:sdtPr>
       <w:sdtEndPr/>
       <w:sdtContent>
@@ -370,7 +370,7 @@
             <w:rPr>
               <w:noProof/>
             </w:rPr>
-            <w:instrText xml:space="preserve"> PAGEREF _Toc240163572 \h </w:instrText>
+            <w:instrText xml:space="preserve"> PAGEREF _Toc240164216 \h </w:instrText>
           </w:r>
           <w:r>
             <w:rPr>
@@ -433,7 +433,7 @@
             <w:rPr>
               <w:noProof/>
             </w:rPr>
-            <w:instrText xml:space="preserve"> PAGEREF _Toc240163573 \h </w:instrText>
+            <w:instrText xml:space="preserve"> PAGEREF _Toc240164217 \h </w:instrText>
           </w:r>
           <w:r>
             <w:rPr>
@@ -498,7 +498,7 @@
             <w:rPr>
               <w:noProof/>
             </w:rPr>
-            <w:instrText xml:space="preserve"> PAGEREF _Toc240163574 \h </w:instrText>
+            <w:instrText xml:space="preserve"> PAGEREF _Toc240164218 \h </w:instrText>
           </w:r>
           <w:r>
             <w:rPr>
@@ -563,7 +563,7 @@
             <w:rPr>
               <w:noProof/>
             </w:rPr>
-            <w:instrText xml:space="preserve"> PAGEREF _Toc240163575 \h </w:instrText>
+            <w:instrText xml:space="preserve"> PAGEREF _Toc240164219 \h </w:instrText>
           </w:r>
           <w:r>
             <w:rPr>
@@ -628,7 +628,7 @@
             <w:rPr>
               <w:noProof/>
             </w:rPr>
-            <w:instrText xml:space="preserve"> PAGEREF _Toc240163576 \h </w:instrText>
+            <w:instrText xml:space="preserve"> PAGEREF _Toc240164220 \h </w:instrText>
           </w:r>
           <w:r>
             <w:rPr>
@@ -693,7 +693,7 @@
             <w:rPr>
               <w:noProof/>
             </w:rPr>
-            <w:instrText xml:space="preserve"> PAGEREF _Toc240163577 \h </w:instrText>
+            <w:instrText xml:space="preserve"> PAGEREF _Toc240164221 \h </w:instrText>
           </w:r>
           <w:r>
             <w:rPr>
@@ -758,7 +758,7 @@
             <w:rPr>
               <w:noProof/>
             </w:rPr>
-            <w:instrText xml:space="preserve"> PAGEREF _Toc240163578 \h </w:instrText>
+            <w:instrText xml:space="preserve"> PAGEREF _Toc240164222 \h </w:instrText>
           </w:r>
           <w:r>
             <w:rPr>
@@ -823,7 +823,7 @@
             <w:rPr>
               <w:noProof/>
             </w:rPr>
-            <w:instrText xml:space="preserve"> PAGEREF _Toc240163579 \h </w:instrText>
+            <w:instrText xml:space="preserve"> PAGEREF _Toc240164223 \h </w:instrText>
           </w:r>
           <w:r>
             <w:rPr>
@@ -886,7 +886,7 @@
             <w:rPr>
               <w:noProof/>
             </w:rPr>
-            <w:instrText xml:space="preserve"> PAGEREF _Toc240163580 \h </w:instrText>
+            <w:instrText xml:space="preserve"> PAGEREF _Toc240164224 \h </w:instrText>
           </w:r>
           <w:r>
             <w:rPr>
@@ -951,7 +951,7 @@
             <w:rPr>
               <w:noProof/>
             </w:rPr>
-            <w:instrText xml:space="preserve"> PAGEREF _Toc240163581 \h </w:instrText>
+            <w:instrText xml:space="preserve"> PAGEREF _Toc240164225 \h </w:instrText>
           </w:r>
           <w:r>
             <w:rPr>
@@ -1016,7 +1016,7 @@
             <w:rPr>
               <w:noProof/>
             </w:rPr>
-            <w:instrText xml:space="preserve"> PAGEREF _Toc240163582 \h </w:instrText>
+            <w:instrText xml:space="preserve"> PAGEREF _Toc240164226 \h </w:instrText>
           </w:r>
           <w:r>
             <w:rPr>
@@ -1081,7 +1081,7 @@
             <w:rPr>
               <w:noProof/>
             </w:rPr>
-            <w:instrText xml:space="preserve"> PAGEREF _Toc240163583 \h </w:instrText>
+            <w:instrText xml:space="preserve"> PAGEREF _Toc240164227 \h </w:instrText>
           </w:r>
           <w:r>
             <w:rPr>
@@ -1146,7 +1146,7 @@
             <w:rPr>
               <w:noProof/>
             </w:rPr>
-            <w:instrText xml:space="preserve"> PAGEREF _Toc240163584 \h </w:instrText>
+            <w:instrText xml:space="preserve"> PAGEREF _Toc240164228 \h </w:instrText>
           </w:r>
           <w:r>
             <w:rPr>
@@ -1211,7 +1211,7 @@
             <w:rPr>
               <w:noProof/>
             </w:rPr>
-            <w:instrText xml:space="preserve"> PAGEREF _Toc240163585 \h </w:instrText>
+            <w:instrText xml:space="preserve"> PAGEREF _Toc240164229 \h </w:instrText>
           </w:r>
           <w:r>
             <w:rPr>
@@ -1276,7 +1276,7 @@
             <w:rPr>
               <w:noProof/>
             </w:rPr>
-            <w:instrText xml:space="preserve"> PAGEREF _Toc240163586 \h </w:instrText>
+            <w:instrText xml:space="preserve"> PAGEREF _Toc240164230 \h </w:instrText>
           </w:r>
           <w:r>
             <w:rPr>
@@ -1339,7 +1339,7 @@
             <w:rPr>
               <w:noProof/>
             </w:rPr>
-            <w:instrText xml:space="preserve"> PAGEREF _Toc240163587 \h </w:instrText>
+            <w:instrText xml:space="preserve"> PAGEREF _Toc240164231 \h </w:instrText>
           </w:r>
           <w:r>
             <w:rPr>
@@ -1402,7 +1402,7 @@
             <w:rPr>
               <w:noProof/>
             </w:rPr>
-            <w:instrText xml:space="preserve"> PAGEREF _Toc240163588 \h </w:instrText>
+            <w:instrText xml:space="preserve"> PAGEREF _Toc240164232 \h </w:instrText>
           </w:r>
           <w:r>
             <w:rPr>
@@ -1467,7 +1467,7 @@
             <w:rPr>
               <w:noProof/>
             </w:rPr>
-            <w:instrText xml:space="preserve"> PAGEREF _Toc240163589 \h </w:instrText>
+            <w:instrText xml:space="preserve"> PAGEREF _Toc240164233 \h </w:instrText>
           </w:r>
           <w:r>
             <w:rPr>
@@ -1532,7 +1532,7 @@
             <w:rPr>
               <w:noProof/>
             </w:rPr>
-            <w:instrText xml:space="preserve"> PAGEREF _Toc240163590 \h </w:instrText>
+            <w:instrText xml:space="preserve"> PAGEREF _Toc240164234 \h </w:instrText>
           </w:r>
           <w:r>
             <w:rPr>
@@ -1597,7 +1597,7 @@
             <w:rPr>
               <w:noProof/>
             </w:rPr>
-            <w:instrText xml:space="preserve"> PAGEREF _Toc240163591 \h </w:instrText>
+            <w:instrText xml:space="preserve"> PAGEREF _Toc240164235 \h </w:instrText>
           </w:r>
           <w:r>
             <w:rPr>
@@ -1662,7 +1662,7 @@
             <w:rPr>
               <w:noProof/>
             </w:rPr>
-            <w:instrText xml:space="preserve"> PAGEREF _Toc240163592 \h </w:instrText>
+            <w:instrText xml:space="preserve"> PAGEREF _Toc240164236 \h </w:instrText>
           </w:r>
           <w:r>
             <w:rPr>
@@ -1727,7 +1727,7 @@
             <w:rPr>
               <w:noProof/>
             </w:rPr>
-            <w:instrText xml:space="preserve"> PAGEREF _Toc240163593 \h </w:instrText>
+            <w:instrText xml:space="preserve"> PAGEREF _Toc240164237 \h </w:instrText>
           </w:r>
           <w:r>
             <w:rPr>
@@ -1792,7 +1792,7 @@
             <w:rPr>
               <w:noProof/>
             </w:rPr>
-            <w:instrText xml:space="preserve"> PAGEREF _Toc240163594 \h </w:instrText>
+            <w:instrText xml:space="preserve"> PAGEREF _Toc240164238 \h </w:instrText>
           </w:r>
           <w:r>
             <w:rPr>
@@ -1855,7 +1855,7 @@
             <w:rPr>
               <w:noProof/>
             </w:rPr>
-            <w:instrText xml:space="preserve"> PAGEREF _Toc240163595 \h </w:instrText>
+            <w:instrText xml:space="preserve"> PAGEREF _Toc240164239 \h </w:instrText>
           </w:r>
           <w:r>
             <w:rPr>
@@ -1920,7 +1920,7 @@
             <w:rPr>
               <w:noProof/>
             </w:rPr>
-            <w:instrText xml:space="preserve"> PAGEREF _Toc240163596 \h </w:instrText>
+            <w:instrText xml:space="preserve"> PAGEREF _Toc240164240 \h </w:instrText>
           </w:r>
           <w:r>
             <w:rPr>
@@ -1985,7 +1985,7 @@
             <w:rPr>
               <w:noProof/>
             </w:rPr>
-            <w:instrText xml:space="preserve"> PAGEREF _Toc240163597 \h </w:instrText>
+            <w:instrText xml:space="preserve"> PAGEREF _Toc240164241 \h </w:instrText>
           </w:r>
           <w:r>
             <w:rPr>
@@ -2050,7 +2050,7 @@
             <w:rPr>
               <w:noProof/>
             </w:rPr>
-            <w:instrText xml:space="preserve"> PAGEREF _Toc240163598 \h </w:instrText>
+            <w:instrText xml:space="preserve"> PAGEREF _Toc240164242 \h </w:instrText>
           </w:r>
           <w:r>
             <w:rPr>
@@ -2115,7 +2115,7 @@
             <w:rPr>
               <w:noProof/>
             </w:rPr>
-            <w:instrText xml:space="preserve"> PAGEREF _Toc240163599 \h </w:instrText>
+            <w:instrText xml:space="preserve"> PAGEREF _Toc240164243 \h </w:instrText>
           </w:r>
           <w:r>
             <w:rPr>
@@ -2180,7 +2180,7 @@
             <w:rPr>
               <w:noProof/>
             </w:rPr>
-            <w:instrText xml:space="preserve"> PAGEREF _Toc240163600 \h </w:instrText>
+            <w:instrText xml:space="preserve"> PAGEREF _Toc240164244 \h </w:instrText>
           </w:r>
           <w:r>
             <w:rPr>
@@ -2245,7 +2245,7 @@
             <w:rPr>
               <w:noProof/>
             </w:rPr>
-            <w:instrText xml:space="preserve"> PAGEREF _Toc240163601 \h </w:instrText>
+            <w:instrText xml:space="preserve"> PAGEREF _Toc240164245 \h </w:instrText>
           </w:r>
           <w:r>
             <w:rPr>
@@ -2310,7 +2310,7 @@
             <w:rPr>
               <w:noProof/>
             </w:rPr>
-            <w:instrText xml:space="preserve"> PAGEREF _Toc240163602 \h </w:instrText>
+            <w:instrText xml:space="preserve"> PAGEREF _Toc240164246 \h </w:instrText>
           </w:r>
           <w:r>
             <w:rPr>
@@ -2375,7 +2375,7 @@
             <w:rPr>
               <w:noProof/>
             </w:rPr>
-            <w:instrText xml:space="preserve"> PAGEREF _Toc240163603 \h </w:instrText>
+            <w:instrText xml:space="preserve"> PAGEREF _Toc240164247 \h </w:instrText>
           </w:r>
           <w:r>
             <w:rPr>
@@ -2438,7 +2438,7 @@
             <w:rPr>
               <w:noProof/>
             </w:rPr>
-            <w:instrText xml:space="preserve"> PAGEREF _Toc240163604 \h </w:instrText>
+            <w:instrText xml:space="preserve"> PAGEREF _Toc240164248 \h </w:instrText>
           </w:r>
           <w:r>
             <w:rPr>
@@ -2501,7 +2501,7 @@
             <w:rPr>
               <w:noProof/>
             </w:rPr>
-            <w:instrText xml:space="preserve"> PAGEREF _Toc240163605 \h </w:instrText>
+            <w:instrText xml:space="preserve"> PAGEREF _Toc240164249 \h </w:instrText>
           </w:r>
           <w:r>
             <w:rPr>
@@ -2565,7 +2565,7 @@
             <w:rPr>
               <w:noProof/>
             </w:rPr>
-            <w:instrText xml:space="preserve"> PAGEREF _Toc240163606 \h </w:instrText>
+            <w:instrText xml:space="preserve"> PAGEREF _Toc240164250 \h </w:instrText>
           </w:r>
           <w:r>
             <w:rPr>
@@ -2628,7 +2628,7 @@
             <w:rPr>
               <w:noProof/>
             </w:rPr>
-            <w:instrText xml:space="preserve"> PAGEREF _Toc240163607 \h </w:instrText>
+            <w:instrText xml:space="preserve"> PAGEREF _Toc240164251 \h </w:instrText>
           </w:r>
           <w:r>
             <w:rPr>
@@ -2691,7 +2691,7 @@
             <w:rPr>
               <w:noProof/>
             </w:rPr>
-            <w:instrText xml:space="preserve"> PAGEREF _Toc240163608 \h </w:instrText>
+            <w:instrText xml:space="preserve"> PAGEREF _Toc240164252 \h </w:instrText>
           </w:r>
           <w:r>
             <w:rPr>
@@ -2754,7 +2754,7 @@
             <w:rPr>
               <w:noProof/>
             </w:rPr>
-            <w:instrText xml:space="preserve"> PAGEREF _Toc240163609 \h </w:instrText>
+            <w:instrText xml:space="preserve"> PAGEREF _Toc240164253 \h </w:instrText>
           </w:r>
           <w:r>
             <w:rPr>
@@ -2817,7 +2817,7 @@
             <w:rPr>
               <w:noProof/>
             </w:rPr>
-            <w:instrText xml:space="preserve"> PAGEREF _Toc240163610 \h </w:instrText>
+            <w:instrText xml:space="preserve"> PAGEREF _Toc240164254 \h </w:instrText>
           </w:r>
           <w:r>
             <w:rPr>
@@ -2880,7 +2880,7 @@
             <w:rPr>
               <w:noProof/>
             </w:rPr>
-            <w:instrText xml:space="preserve"> PAGEREF _Toc240163611 \h </w:instrText>
+            <w:instrText xml:space="preserve"> PAGEREF _Toc240164255 \h </w:instrText>
           </w:r>
           <w:r>
             <w:rPr>
@@ -2945,7 +2945,7 @@
             <w:rPr>
               <w:noProof/>
             </w:rPr>
-            <w:instrText xml:space="preserve"> PAGEREF _Toc240163612 \h </w:instrText>
+            <w:instrText xml:space="preserve"> PAGEREF _Toc240164256 \h </w:instrText>
           </w:r>
           <w:r>
             <w:rPr>
@@ -3010,7 +3010,7 @@
             <w:rPr>
               <w:noProof/>
             </w:rPr>
-            <w:instrText xml:space="preserve"> PAGEREF _Toc240163613 \h </w:instrText>
+            <w:instrText xml:space="preserve"> PAGEREF _Toc240164257 \h </w:instrText>
           </w:r>
           <w:r>
             <w:rPr>
@@ -3075,7 +3075,7 @@
             <w:rPr>
               <w:noProof/>
             </w:rPr>
-            <w:instrText xml:space="preserve"> PAGEREF _Toc240163614 \h </w:instrText>
+            <w:instrText xml:space="preserve"> PAGEREF _Toc240164258 \h </w:instrText>
           </w:r>
           <w:r>
             <w:rPr>
@@ -3140,7 +3140,7 @@
             <w:rPr>
               <w:noProof/>
             </w:rPr>
-            <w:instrText xml:space="preserve"> PAGEREF _Toc240163615 \h </w:instrText>
+            <w:instrText xml:space="preserve"> PAGEREF _Toc240164259 \h </w:instrText>
           </w:r>
           <w:r>
             <w:rPr>
@@ -3205,7 +3205,7 @@
             <w:rPr>
               <w:noProof/>
             </w:rPr>
-            <w:instrText xml:space="preserve"> PAGEREF _Toc240163616 \h </w:instrText>
+            <w:instrText xml:space="preserve"> PAGEREF _Toc240164260 \h </w:instrText>
           </w:r>
           <w:r>
             <w:rPr>
@@ -3268,7 +3268,7 @@
             <w:rPr>
               <w:noProof/>
             </w:rPr>
-            <w:instrText xml:space="preserve"> PAGEREF _Toc240163617 \h </w:instrText>
+            <w:instrText xml:space="preserve"> PAGEREF _Toc240164261 \h </w:instrText>
           </w:r>
           <w:r>
             <w:rPr>
@@ -3331,7 +3331,7 @@
             <w:rPr>
               <w:noProof/>
             </w:rPr>
-            <w:instrText xml:space="preserve"> PAGEREF _Toc240163618 \h </w:instrText>
+            <w:instrText xml:space="preserve"> PAGEREF _Toc240164262 \h </w:instrText>
           </w:r>
           <w:r>
             <w:rPr>
@@ -3394,7 +3394,7 @@
             <w:rPr>
               <w:noProof/>
             </w:rPr>
-            <w:instrText xml:space="preserve"> PAGEREF _Toc240163619 \h </w:instrText>
+            <w:instrText xml:space="preserve"> PAGEREF _Toc240164263 \h </w:instrText>
           </w:r>
           <w:r>
             <w:rPr>
@@ -3457,7 +3457,7 @@
             <w:rPr>
               <w:noProof/>
             </w:rPr>
-            <w:instrText xml:space="preserve"> PAGEREF _Toc240163620 \h </w:instrText>
+            <w:instrText xml:space="preserve"> PAGEREF _Toc240164264 \h </w:instrText>
           </w:r>
           <w:r>
             <w:rPr>
@@ -3520,7 +3520,7 @@
             <w:rPr>
               <w:noProof/>
             </w:rPr>
-            <w:instrText xml:space="preserve"> PAGEREF _Toc240163621 \h </w:instrText>
+            <w:instrText xml:space="preserve"> PAGEREF _Toc240164265 \h </w:instrText>
           </w:r>
           <w:r>
             <w:rPr>
@@ -3583,7 +3583,7 @@
             <w:rPr>
               <w:noProof/>
             </w:rPr>
-            <w:instrText xml:space="preserve"> PAGEREF _Toc240163622 \h </w:instrText>
+            <w:instrText xml:space="preserve"> PAGEREF _Toc240164266 \h </w:instrText>
           </w:r>
           <w:r>
             <w:rPr>
@@ -3763,7 +3763,7 @@
           <w:sz w:val="24"/>
           <w:szCs w:val="24"/>
         </w:rPr>
-        <w:t>Hình III.8: Kết nối qua địa chỉ IP ảo cho net_transport bằng TCP — dữ liệu thật sự đi qua mạng chứ không qua bộ nhớ chung</w:t>
+        <w:t>Hình III.8: Kết nối tới máy chủ bằng chính địa chỉ IP ảo mà ZeroTier đã cấp. Cột net_transport trả về TCP thay vì Shared memory, chứng tỏ dữ liệu thật sự đi qua mạng chứ không qua bộ nhớ chung trong máy</w:t>
       </w:r>
     </w:p>
     <w:p>
@@ -3958,6 +3958,7 @@
           <w:sz w:val="24"/>
           <w:szCs w:val="24"/>
         </w:rPr>
+        <w:lastRenderedPageBreak/>
         <w:t>Hình III.23: Trang Security — ánh xạ đăng nhập sang tài khoản cố định ở máy đích</w:t>
       </w:r>
     </w:p>
@@ -3971,7 +3972,6 @@
           <w:sz w:val="24"/>
           <w:szCs w:val="24"/>
         </w:rPr>
-        <w:lastRenderedPageBreak/>
         <w:t>Hình III.24: Truy vấn phân tán đầu tiên — đứng tại KHO_A nhưng đọc được dữ liệu tồn kho của cả ba site</w:t>
       </w:r>
     </w:p>
@@ -4348,6 +4348,7 @@
           <w:b/>
           <w:bCs/>
         </w:rPr>
+        <w:lastRenderedPageBreak/>
         <w:t>DANH SÁCH BẢNG</w:t>
       </w:r>
     </w:p>
@@ -4361,7 +4362,6 @@
           <w:sz w:val="24"/>
           <w:szCs w:val="24"/>
         </w:rPr>
-        <w:lastRenderedPageBreak/>
         <w:t>Bảng I.1: Ba site trong hệ thống</w:t>
       </w:r>
     </w:p>
@@ -4946,7 +4946,7 @@
         <w:spacing w:before="240" w:after="240"/>
         <w:jc w:val="center"/>
       </w:pPr>
-      <w:bookmarkStart w:id="0" w:name="_Toc240163572"/>
+      <w:bookmarkStart w:id="0" w:name="_Toc240164216"/>
       <w:r>
         <w:lastRenderedPageBreak/>
         <w:t>CHƯƠNG I. TỔNG QUAN</w:t>
@@ -4958,7 +4958,7 @@
         <w:pStyle w:val="Heading2"/>
         <w:spacing w:before="240" w:after="120"/>
       </w:pPr>
-      <w:bookmarkStart w:id="1" w:name="_Toc240163573"/>
+      <w:bookmarkStart w:id="1" w:name="_Toc240164217"/>
       <w:r>
         <w:t>1. Giới thiệu đề tài</w:t>
       </w:r>
@@ -4969,7 +4969,7 @@
         <w:pStyle w:val="Heading3"/>
         <w:spacing w:before="180" w:after="100"/>
       </w:pPr>
-      <w:bookmarkStart w:id="2" w:name="_Toc240163574"/>
+      <w:bookmarkStart w:id="2" w:name="_Toc240164218"/>
       <w:r>
         <w:rPr>
           <w:i/>
@@ -5031,7 +5031,7 @@
         <w:pStyle w:val="Heading3"/>
         <w:spacing w:before="180" w:after="100"/>
       </w:pPr>
-      <w:bookmarkStart w:id="3" w:name="_Toc240163575"/>
+      <w:bookmarkStart w:id="3" w:name="_Toc240164219"/>
       <w:r>
         <w:rPr>
           <w:i/>
@@ -5127,7 +5127,7 @@
         <w:pStyle w:val="Heading3"/>
         <w:spacing w:before="180" w:after="100"/>
       </w:pPr>
-      <w:bookmarkStart w:id="4" w:name="_Toc240163576"/>
+      <w:bookmarkStart w:id="4" w:name="_Toc240164220"/>
       <w:r>
         <w:rPr>
           <w:i/>
@@ -5187,7 +5187,7 @@
           <w:left w:w="10" w:type="dxa"/>
           <w:right w:w="10" w:type="dxa"/>
         </w:tblCellMar>
-        <w:tblLook w:val="0000" w:firstRow="0" w:lastRow="0" w:firstColumn="0" w:lastColumn="0" w:noHBand="0" w:noVBand="0"/>
+        <w:tblLook w:val="04A0" w:firstRow="1" w:lastRow="0" w:firstColumn="1" w:lastColumn="0" w:noHBand="0" w:noVBand="1"/>
       </w:tblPr>
       <w:tblGrid>
         <w:gridCol w:w="726"/>
@@ -5841,7 +5841,7 @@
         <w:pStyle w:val="Heading3"/>
         <w:spacing w:before="180" w:after="100"/>
       </w:pPr>
-      <w:bookmarkStart w:id="5" w:name="_Toc240163577"/>
+      <w:bookmarkStart w:id="5" w:name="_Toc240164221"/>
       <w:r>
         <w:rPr>
           <w:i/>
@@ -6095,7 +6095,7 @@
         <w:pStyle w:val="Heading3"/>
         <w:spacing w:before="180" w:after="100"/>
       </w:pPr>
-      <w:bookmarkStart w:id="6" w:name="_Toc240163578"/>
+      <w:bookmarkStart w:id="6" w:name="_Toc240164222"/>
       <w:r>
         <w:rPr>
           <w:i/>
@@ -6154,7 +6154,7 @@
           <w:left w:w="10" w:type="dxa"/>
           <w:right w:w="10" w:type="dxa"/>
         </w:tblCellMar>
-        <w:tblLook w:val="0000" w:firstRow="0" w:lastRow="0" w:firstColumn="0" w:lastColumn="0" w:noHBand="0" w:noVBand="0"/>
+        <w:tblLook w:val="04A0" w:firstRow="1" w:lastRow="0" w:firstColumn="1" w:lastColumn="0" w:noHBand="0" w:noVBand="1"/>
       </w:tblPr>
       <w:tblGrid>
         <w:gridCol w:w="1270"/>
@@ -6586,7 +6586,7 @@
         <w:pStyle w:val="Heading3"/>
         <w:spacing w:before="180" w:after="100"/>
       </w:pPr>
-      <w:bookmarkStart w:id="7" w:name="_Toc240163579"/>
+      <w:bookmarkStart w:id="7" w:name="_Toc240164223"/>
       <w:r>
         <w:rPr>
           <w:i/>
@@ -6626,7 +6626,7 @@
           <w:left w:w="10" w:type="dxa"/>
           <w:right w:w="10" w:type="dxa"/>
         </w:tblCellMar>
-        <w:tblLook w:val="0000" w:firstRow="0" w:lastRow="0" w:firstColumn="0" w:lastColumn="0" w:noHBand="0" w:noVBand="0"/>
+        <w:tblLook w:val="04A0" w:firstRow="1" w:lastRow="0" w:firstColumn="1" w:lastColumn="0" w:noHBand="0" w:noVBand="1"/>
       </w:tblPr>
       <w:tblGrid>
         <w:gridCol w:w="1814"/>
@@ -7044,7 +7044,7 @@
         <w:pStyle w:val="Heading2"/>
         <w:spacing w:before="240" w:after="120"/>
       </w:pPr>
-      <w:bookmarkStart w:id="8" w:name="_Toc240163580"/>
+      <w:bookmarkStart w:id="8" w:name="_Toc240164224"/>
       <w:r>
         <w:lastRenderedPageBreak/>
         <w:t>2. Cơ sở lý thuyết</w:t>
@@ -7056,7 +7056,7 @@
         <w:pStyle w:val="Heading3"/>
         <w:spacing w:before="180" w:after="100"/>
       </w:pPr>
-      <w:bookmarkStart w:id="9" w:name="_Toc240163581"/>
+      <w:bookmarkStart w:id="9" w:name="_Toc240164225"/>
       <w:r>
         <w:rPr>
           <w:i/>
@@ -7206,7 +7206,7 @@
         <w:pStyle w:val="Heading3"/>
         <w:spacing w:before="180" w:after="100"/>
       </w:pPr>
-      <w:bookmarkStart w:id="10" w:name="_Toc240163582"/>
+      <w:bookmarkStart w:id="10" w:name="_Toc240164226"/>
       <w:r>
         <w:rPr>
           <w:i/>
@@ -7304,7 +7304,7 @@
         <w:pStyle w:val="Heading3"/>
         <w:spacing w:before="180" w:after="100"/>
       </w:pPr>
-      <w:bookmarkStart w:id="11" w:name="_Toc240163583"/>
+      <w:bookmarkStart w:id="11" w:name="_Toc240164227"/>
       <w:r>
         <w:rPr>
           <w:i/>
@@ -7450,7 +7450,7 @@
         <w:pStyle w:val="Heading3"/>
         <w:spacing w:before="180" w:after="100"/>
       </w:pPr>
-      <w:bookmarkStart w:id="12" w:name="_Toc240163584"/>
+      <w:bookmarkStart w:id="12" w:name="_Toc240164228"/>
       <w:r>
         <w:rPr>
           <w:i/>
@@ -7624,7 +7624,7 @@
         <w:pStyle w:val="Heading3"/>
         <w:spacing w:before="180" w:after="100"/>
       </w:pPr>
-      <w:bookmarkStart w:id="13" w:name="_Toc240163585"/>
+      <w:bookmarkStart w:id="13" w:name="_Toc240164229"/>
       <w:r>
         <w:rPr>
           <w:i/>
@@ -7774,7 +7774,7 @@
         <w:pStyle w:val="Heading3"/>
         <w:spacing w:before="180" w:after="100"/>
       </w:pPr>
-      <w:bookmarkStart w:id="14" w:name="_Toc240163586"/>
+      <w:bookmarkStart w:id="14" w:name="_Toc240164230"/>
       <w:r>
         <w:rPr>
           <w:i/>
@@ -7898,7 +7898,7 @@
         <w:spacing w:before="240" w:after="240"/>
         <w:jc w:val="center"/>
       </w:pPr>
-      <w:bookmarkStart w:id="15" w:name="_Toc240163587"/>
+      <w:bookmarkStart w:id="15" w:name="_Toc240164231"/>
       <w:r>
         <w:lastRenderedPageBreak/>
         <w:t>CHƯƠNG II. PHÂN TÍCH VÀ THIẾT KẾ HỆ THỐNG</w:t>
@@ -7910,7 +7910,7 @@
         <w:pStyle w:val="Heading2"/>
         <w:spacing w:before="240" w:after="120"/>
       </w:pPr>
-      <w:bookmarkStart w:id="16" w:name="_Toc240163588"/>
+      <w:bookmarkStart w:id="16" w:name="_Toc240164232"/>
       <w:r>
         <w:t>1. Phân tích</w:t>
       </w:r>
@@ -7921,7 +7921,7 @@
         <w:pStyle w:val="Heading3"/>
         <w:spacing w:before="180" w:after="100"/>
       </w:pPr>
-      <w:bookmarkStart w:id="17" w:name="_Toc240163589"/>
+      <w:bookmarkStart w:id="17" w:name="_Toc240164233"/>
       <w:r>
         <w:rPr>
           <w:i/>
@@ -7961,7 +7961,7 @@
           <w:left w:w="10" w:type="dxa"/>
           <w:right w:w="10" w:type="dxa"/>
         </w:tblCellMar>
-        <w:tblLook w:val="0000" w:firstRow="0" w:lastRow="0" w:firstColumn="0" w:lastColumn="0" w:noHBand="0" w:noVBand="0"/>
+        <w:tblLook w:val="04A0" w:firstRow="1" w:lastRow="0" w:firstColumn="1" w:lastColumn="0" w:noHBand="0" w:noVBand="1"/>
       </w:tblPr>
       <w:tblGrid>
         <w:gridCol w:w="544"/>
@@ -9010,7 +9010,7 @@
         <w:pStyle w:val="Heading3"/>
         <w:spacing w:before="180" w:after="100"/>
       </w:pPr>
-      <w:bookmarkStart w:id="18" w:name="_Toc240163590"/>
+      <w:bookmarkStart w:id="18" w:name="_Toc240164234"/>
       <w:r>
         <w:rPr>
           <w:i/>
@@ -9059,7 +9059,7 @@
           <w:left w:w="10" w:type="dxa"/>
           <w:right w:w="10" w:type="dxa"/>
         </w:tblCellMar>
-        <w:tblLook w:val="0000" w:firstRow="0" w:lastRow="0" w:firstColumn="0" w:lastColumn="0" w:noHBand="0" w:noVBand="0"/>
+        <w:tblLook w:val="04A0" w:firstRow="1" w:lastRow="0" w:firstColumn="1" w:lastColumn="0" w:noHBand="0" w:noVBand="1"/>
       </w:tblPr>
       <w:tblGrid>
         <w:gridCol w:w="3628"/>
@@ -10317,7 +10317,7 @@
         <w:pStyle w:val="Heading3"/>
         <w:spacing w:before="180" w:after="100"/>
       </w:pPr>
-      <w:bookmarkStart w:id="19" w:name="_Toc240163591"/>
+      <w:bookmarkStart w:id="19" w:name="_Toc240164235"/>
       <w:r>
         <w:rPr>
           <w:i/>
@@ -10366,7 +10366,7 @@
           <w:left w:w="10" w:type="dxa"/>
           <w:right w:w="10" w:type="dxa"/>
         </w:tblCellMar>
-        <w:tblLook w:val="0000" w:firstRow="0" w:lastRow="0" w:firstColumn="0" w:lastColumn="0" w:noHBand="0" w:noVBand="0"/>
+        <w:tblLook w:val="04A0" w:firstRow="1" w:lastRow="0" w:firstColumn="1" w:lastColumn="0" w:noHBand="0" w:noVBand="1"/>
       </w:tblPr>
       <w:tblGrid>
         <w:gridCol w:w="1786"/>
@@ -10846,7 +10846,7 @@
         <w:pStyle w:val="Heading3"/>
         <w:spacing w:before="180" w:after="100"/>
       </w:pPr>
-      <w:bookmarkStart w:id="20" w:name="_Toc240163592"/>
+      <w:bookmarkStart w:id="20" w:name="_Toc240164236"/>
       <w:r>
         <w:rPr>
           <w:i/>
@@ -10886,7 +10886,7 @@
           <w:left w:w="10" w:type="dxa"/>
           <w:right w:w="10" w:type="dxa"/>
         </w:tblCellMar>
-        <w:tblLook w:val="0000" w:firstRow="0" w:lastRow="0" w:firstColumn="0" w:lastColumn="0" w:noHBand="0" w:noVBand="0"/>
+        <w:tblLook w:val="04A0" w:firstRow="1" w:lastRow="0" w:firstColumn="1" w:lastColumn="0" w:noHBand="0" w:noVBand="1"/>
       </w:tblPr>
       <w:tblGrid>
         <w:gridCol w:w="1633"/>
@@ -11222,7 +11222,7 @@
         <w:pStyle w:val="Heading3"/>
         <w:spacing w:before="180" w:after="100"/>
       </w:pPr>
-      <w:bookmarkStart w:id="21" w:name="_Toc240163593"/>
+      <w:bookmarkStart w:id="21" w:name="_Toc240164237"/>
       <w:r>
         <w:rPr>
           <w:i/>
@@ -11282,7 +11282,7 @@
           <w:left w:w="10" w:type="dxa"/>
           <w:right w:w="10" w:type="dxa"/>
         </w:tblCellMar>
-        <w:tblLook w:val="0000" w:firstRow="0" w:lastRow="0" w:firstColumn="0" w:lastColumn="0" w:noHBand="0" w:noVBand="0"/>
+        <w:tblLook w:val="04A0" w:firstRow="1" w:lastRow="0" w:firstColumn="1" w:lastColumn="0" w:noHBand="0" w:noVBand="1"/>
       </w:tblPr>
       <w:tblGrid>
         <w:gridCol w:w="1996"/>
@@ -11501,7 +11501,7 @@
         <w:pStyle w:val="Heading3"/>
         <w:spacing w:before="180" w:after="100"/>
       </w:pPr>
-      <w:bookmarkStart w:id="22" w:name="_Toc240163594"/>
+      <w:bookmarkStart w:id="22" w:name="_Toc240164238"/>
       <w:r>
         <w:rPr>
           <w:i/>
@@ -11875,7 +11875,7 @@
           <w:left w:w="10" w:type="dxa"/>
           <w:right w:w="10" w:type="dxa"/>
         </w:tblCellMar>
-        <w:tblLook w:val="0000" w:firstRow="0" w:lastRow="0" w:firstColumn="0" w:lastColumn="0" w:noHBand="0" w:noVBand="0"/>
+        <w:tblLook w:val="04A0" w:firstRow="1" w:lastRow="0" w:firstColumn="1" w:lastColumn="0" w:noHBand="0" w:noVBand="1"/>
       </w:tblPr>
       <w:tblGrid>
         <w:gridCol w:w="1814"/>
@@ -13203,7 +13203,7 @@
         <w:pStyle w:val="Heading2"/>
         <w:spacing w:before="240" w:after="120"/>
       </w:pPr>
-      <w:bookmarkStart w:id="23" w:name="_Toc240163595"/>
+      <w:bookmarkStart w:id="23" w:name="_Toc240164239"/>
       <w:r>
         <w:lastRenderedPageBreak/>
         <w:t>2. Thiết kế</w:t>
@@ -13215,7 +13215,7 @@
         <w:pStyle w:val="Heading3"/>
         <w:spacing w:before="180" w:after="100"/>
       </w:pPr>
-      <w:bookmarkStart w:id="24" w:name="_Toc240163596"/>
+      <w:bookmarkStart w:id="24" w:name="_Toc240164240"/>
       <w:r>
         <w:rPr>
           <w:i/>
@@ -13255,7 +13255,7 @@
           <w:left w:w="10" w:type="dxa"/>
           <w:right w:w="10" w:type="dxa"/>
         </w:tblCellMar>
-        <w:tblLook w:val="0000" w:firstRow="0" w:lastRow="0" w:firstColumn="0" w:lastColumn="0" w:noHBand="0" w:noVBand="0"/>
+        <w:tblLook w:val="04A0" w:firstRow="1" w:lastRow="0" w:firstColumn="1" w:lastColumn="0" w:noHBand="0" w:noVBand="1"/>
       </w:tblPr>
       <w:tblGrid>
         <w:gridCol w:w="454"/>
@@ -14329,7 +14329,7 @@
           <w:left w:w="10" w:type="dxa"/>
           <w:right w:w="10" w:type="dxa"/>
         </w:tblCellMar>
-        <w:tblLook w:val="0000" w:firstRow="0" w:lastRow="0" w:firstColumn="0" w:lastColumn="0" w:noHBand="0" w:noVBand="0"/>
+        <w:tblLook w:val="04A0" w:firstRow="1" w:lastRow="0" w:firstColumn="1" w:lastColumn="0" w:noHBand="0" w:noVBand="1"/>
       </w:tblPr>
       <w:tblGrid>
         <w:gridCol w:w="2177"/>
@@ -14959,7 +14959,7 @@
           <w:left w:w="10" w:type="dxa"/>
           <w:right w:w="10" w:type="dxa"/>
         </w:tblCellMar>
-        <w:tblLook w:val="0000" w:firstRow="0" w:lastRow="0" w:firstColumn="0" w:lastColumn="0" w:noHBand="0" w:noVBand="0"/>
+        <w:tblLook w:val="04A0" w:firstRow="1" w:lastRow="0" w:firstColumn="1" w:lastColumn="0" w:noHBand="0" w:noVBand="1"/>
       </w:tblPr>
       <w:tblGrid>
         <w:gridCol w:w="544"/>
@@ -16365,7 +16365,7 @@
           <w:noProof/>
         </w:rPr>
         <w:drawing>
-          <wp:inline distT="0" distB="0" distL="0" distR="0" wp14:anchorId="61E287D7" wp14:editId="4A821B98">
+          <wp:inline distT="0" distB="0" distL="0" distR="0" wp14:anchorId="73F73908" wp14:editId="6E53D646">
             <wp:extent cx="5715000" cy="4067175"/>
             <wp:effectExtent l="0" t="0" r="0" b="0"/>
             <wp:docPr id="1" name="Picture 1"/>
@@ -16473,7 +16473,7 @@
         <w:pStyle w:val="Heading3"/>
         <w:spacing w:before="180" w:after="100"/>
       </w:pPr>
-      <w:bookmarkStart w:id="25" w:name="_Toc240163597"/>
+      <w:bookmarkStart w:id="25" w:name="_Toc240164241"/>
       <w:r>
         <w:rPr>
           <w:i/>
@@ -16595,7 +16595,7 @@
           <w:left w:w="10" w:type="dxa"/>
           <w:right w:w="10" w:type="dxa"/>
         </w:tblCellMar>
-        <w:tblLook w:val="0000" w:firstRow="0" w:lastRow="0" w:firstColumn="0" w:lastColumn="0" w:noHBand="0" w:noVBand="0"/>
+        <w:tblLook w:val="04A0" w:firstRow="1" w:lastRow="0" w:firstColumn="1" w:lastColumn="0" w:noHBand="0" w:noVBand="1"/>
       </w:tblPr>
       <w:tblGrid>
         <w:gridCol w:w="1633"/>
@@ -17100,7 +17100,7 @@
         <w:pStyle w:val="Heading3"/>
         <w:spacing w:before="180" w:after="100"/>
       </w:pPr>
-      <w:bookmarkStart w:id="26" w:name="_Toc240163598"/>
+      <w:bookmarkStart w:id="26" w:name="_Toc240164242"/>
       <w:r>
         <w:rPr>
           <w:i/>
@@ -17379,7 +17379,7 @@
         <w:pStyle w:val="Heading3"/>
         <w:spacing w:before="180" w:after="100"/>
       </w:pPr>
-      <w:bookmarkStart w:id="27" w:name="_Toc240163599"/>
+      <w:bookmarkStart w:id="27" w:name="_Toc240164243"/>
       <w:r>
         <w:rPr>
           <w:i/>
@@ -17439,7 +17439,7 @@
           <w:left w:w="10" w:type="dxa"/>
           <w:right w:w="10" w:type="dxa"/>
         </w:tblCellMar>
-        <w:tblLook w:val="0000" w:firstRow="0" w:lastRow="0" w:firstColumn="0" w:lastColumn="0" w:noHBand="0" w:noVBand="0"/>
+        <w:tblLook w:val="04A0" w:firstRow="1" w:lastRow="0" w:firstColumn="1" w:lastColumn="0" w:noHBand="0" w:noVBand="1"/>
       </w:tblPr>
       <w:tblGrid>
         <w:gridCol w:w="2721"/>
@@ -18006,7 +18006,7 @@
         <w:pStyle w:val="Heading3"/>
         <w:spacing w:before="180" w:after="100"/>
       </w:pPr>
-      <w:bookmarkStart w:id="28" w:name="_Toc240163600"/>
+      <w:bookmarkStart w:id="28" w:name="_Toc240164244"/>
       <w:r>
         <w:rPr>
           <w:i/>
@@ -18046,7 +18046,7 @@
           <w:left w:w="10" w:type="dxa"/>
           <w:right w:w="10" w:type="dxa"/>
         </w:tblCellMar>
-        <w:tblLook w:val="0000" w:firstRow="0" w:lastRow="0" w:firstColumn="0" w:lastColumn="0" w:noHBand="0" w:noVBand="0"/>
+        <w:tblLook w:val="04A0" w:firstRow="1" w:lastRow="0" w:firstColumn="1" w:lastColumn="0" w:noHBand="0" w:noVBand="1"/>
       </w:tblPr>
       <w:tblGrid>
         <w:gridCol w:w="2721"/>
@@ -19947,7 +19947,7 @@
         <w:pStyle w:val="Heading3"/>
         <w:spacing w:before="180" w:after="100"/>
       </w:pPr>
-      <w:bookmarkStart w:id="29" w:name="_Toc240163601"/>
+      <w:bookmarkStart w:id="29" w:name="_Toc240164245"/>
       <w:r>
         <w:rPr>
           <w:i/>
@@ -20584,7 +20584,7 @@
         <w:pStyle w:val="Heading3"/>
         <w:spacing w:before="180" w:after="100"/>
       </w:pPr>
-      <w:bookmarkStart w:id="30" w:name="_Toc240163602"/>
+      <w:bookmarkStart w:id="30" w:name="_Toc240164246"/>
       <w:r>
         <w:rPr>
           <w:i/>
@@ -21063,7 +21063,7 @@
           <w:left w:w="10" w:type="dxa"/>
           <w:right w:w="10" w:type="dxa"/>
         </w:tblCellMar>
-        <w:tblLook w:val="0000" w:firstRow="0" w:lastRow="0" w:firstColumn="0" w:lastColumn="0" w:noHBand="0" w:noVBand="0"/>
+        <w:tblLook w:val="04A0" w:firstRow="1" w:lastRow="0" w:firstColumn="1" w:lastColumn="0" w:noHBand="0" w:noVBand="1"/>
       </w:tblPr>
       <w:tblGrid>
         <w:gridCol w:w="1996"/>
@@ -21415,7 +21415,7 @@
         <w:pStyle w:val="Heading3"/>
         <w:spacing w:before="180" w:after="100"/>
       </w:pPr>
-      <w:bookmarkStart w:id="31" w:name="_Toc240163603"/>
+      <w:bookmarkStart w:id="31" w:name="_Toc240164247"/>
       <w:r>
         <w:rPr>
           <w:i/>
@@ -22195,7 +22195,7 @@
         <w:spacing w:before="240" w:after="240"/>
         <w:jc w:val="center"/>
       </w:pPr>
-      <w:bookmarkStart w:id="32" w:name="_Toc240163604"/>
+      <w:bookmarkStart w:id="32" w:name="_Toc240164248"/>
       <w:r>
         <w:lastRenderedPageBreak/>
         <w:t>CHƯƠNG III. TRIỂN KHAI HỆ THỐNG</w:t>
@@ -22216,7 +22216,7 @@
         <w:pStyle w:val="Heading2"/>
         <w:spacing w:before="240" w:after="120"/>
       </w:pPr>
-      <w:bookmarkStart w:id="33" w:name="_Toc240163605"/>
+      <w:bookmarkStart w:id="33" w:name="_Toc240164249"/>
       <w:r>
         <w:t>1. Cài đặt mạng riêng ảo</w:t>
       </w:r>
@@ -22354,10 +22354,10 @@
           <w:noProof/>
         </w:rPr>
         <w:drawing>
-          <wp:inline distT="0" distB="0" distL="0" distR="0" wp14:anchorId="7C6983E9" wp14:editId="76F67ED9">
+          <wp:inline distT="0" distB="0" distL="0" distR="0" wp14:anchorId="21502AB3" wp14:editId="1B82E4D4">
             <wp:extent cx="5715000" cy="2828925"/>
             <wp:effectExtent l="0" t="0" r="0" b="0"/>
-            <wp:docPr id="298498993" name="Picture 298498993"/>
+            <wp:docPr id="980387977" name="Picture 980387977"/>
             <wp:cNvGraphicFramePr>
               <a:graphicFrameLocks xmlns:a="http://schemas.openxmlformats.org/drawingml/2006/main" noChangeAspect="1"/>
             </wp:cNvGraphicFramePr>
@@ -22419,10 +22419,10 @@
         </w:rPr>
         <w:lastRenderedPageBreak/>
         <w:drawing>
-          <wp:inline distT="0" distB="0" distL="0" distR="0" wp14:anchorId="696D38C0" wp14:editId="1E270993">
+          <wp:inline distT="0" distB="0" distL="0" distR="0" wp14:anchorId="07915DA7" wp14:editId="6EC291D4">
             <wp:extent cx="5715000" cy="1562100"/>
             <wp:effectExtent l="0" t="0" r="0" b="0"/>
-            <wp:docPr id="389217449" name="Picture 389217449"/>
+            <wp:docPr id="1723551759" name="Picture 1723551759"/>
             <wp:cNvGraphicFramePr>
               <a:graphicFrameLocks xmlns:a="http://schemas.openxmlformats.org/drawingml/2006/main" noChangeAspect="1"/>
             </wp:cNvGraphicFramePr>
@@ -22483,10 +22483,10 @@
           <w:noProof/>
         </w:rPr>
         <w:drawing>
-          <wp:inline distT="0" distB="0" distL="0" distR="0" wp14:anchorId="5AA70E7D" wp14:editId="55E3B331">
+          <wp:inline distT="0" distB="0" distL="0" distR="0" wp14:anchorId="39615AC4" wp14:editId="66E3E8A4">
             <wp:extent cx="5715000" cy="2143125"/>
             <wp:effectExtent l="0" t="0" r="0" b="0"/>
-            <wp:docPr id="1173775520" name="Picture 1173775520"/>
+            <wp:docPr id="209273091" name="Picture 209273091"/>
             <wp:cNvGraphicFramePr>
               <a:graphicFrameLocks xmlns:a="http://schemas.openxmlformats.org/drawingml/2006/main" noChangeAspect="1"/>
             </wp:cNvGraphicFramePr>
@@ -22542,7 +22542,7 @@
         <w:pStyle w:val="Heading2"/>
         <w:spacing w:before="240" w:after="120"/>
       </w:pPr>
-      <w:bookmarkStart w:id="34" w:name="_Toc240163606"/>
+      <w:bookmarkStart w:id="34" w:name="_Toc240164250"/>
       <w:r>
         <w:t>2. Tạo đường liên kết mạng giữa các máy chủ</w:t>
       </w:r>
@@ -22676,7 +22676,7 @@
           <w:left w:w="10" w:type="dxa"/>
           <w:right w:w="10" w:type="dxa"/>
         </w:tblCellMar>
-        <w:tblLook w:val="0000" w:firstRow="0" w:lastRow="0" w:firstColumn="0" w:lastColumn="0" w:noHBand="0" w:noVBand="0"/>
+        <w:tblLook w:val="04A0" w:firstRow="1" w:lastRow="0" w:firstColumn="1" w:lastColumn="0" w:noHBand="0" w:noVBand="1"/>
       </w:tblPr>
       <w:tblGrid>
         <w:gridCol w:w="726"/>
@@ -23175,10 +23175,10 @@
           <w:noProof/>
         </w:rPr>
         <w:drawing>
-          <wp:inline distT="0" distB="0" distL="0" distR="0" wp14:anchorId="1B5E3A37" wp14:editId="08EC1A8A">
+          <wp:inline distT="0" distB="0" distL="0" distR="0" wp14:anchorId="5060DACE" wp14:editId="2EB6FB03">
             <wp:extent cx="2381250" cy="4914900"/>
             <wp:effectExtent l="0" t="0" r="0" b="0"/>
-            <wp:docPr id="1175889044" name="Picture 1175889044"/>
+            <wp:docPr id="1722154609" name="Picture 1722154609"/>
             <wp:cNvGraphicFramePr>
               <a:graphicFrameLocks xmlns:a="http://schemas.openxmlformats.org/drawingml/2006/main" noChangeAspect="1"/>
             </wp:cNvGraphicFramePr>
@@ -23240,10 +23240,10 @@
         </w:rPr>
         <w:lastRenderedPageBreak/>
         <w:drawing>
-          <wp:inline distT="0" distB="0" distL="0" distR="0" wp14:anchorId="64C2C957" wp14:editId="1FB30B10">
+          <wp:inline distT="0" distB="0" distL="0" distR="0" wp14:anchorId="3CC86454" wp14:editId="6EBDB3DE">
             <wp:extent cx="5476875" cy="2686050"/>
             <wp:effectExtent l="0" t="0" r="0" b="0"/>
-            <wp:docPr id="1940796356" name="Picture 1940796356"/>
+            <wp:docPr id="1574534057" name="Picture 1574534057"/>
             <wp:cNvGraphicFramePr>
               <a:graphicFrameLocks xmlns:a="http://schemas.openxmlformats.org/drawingml/2006/main" noChangeAspect="1"/>
             </wp:cNvGraphicFramePr>
@@ -23304,10 +23304,10 @@
           <w:noProof/>
         </w:rPr>
         <w:drawing>
-          <wp:inline distT="0" distB="0" distL="0" distR="0" wp14:anchorId="32BC3357" wp14:editId="790A51DD">
+          <wp:inline distT="0" distB="0" distL="0" distR="0" wp14:anchorId="7EAA452E" wp14:editId="652CE786">
             <wp:extent cx="3886200" cy="4438650"/>
             <wp:effectExtent l="0" t="0" r="0" b="0"/>
-            <wp:docPr id="726916925" name="Picture 726916925"/>
+            <wp:docPr id="308291073" name="Picture 308291073"/>
             <wp:cNvGraphicFramePr>
               <a:graphicFrameLocks xmlns:a="http://schemas.openxmlformats.org/drawingml/2006/main" noChangeAspect="1"/>
             </wp:cNvGraphicFramePr>
@@ -23368,10 +23368,10 @@
           <w:noProof/>
         </w:rPr>
         <w:drawing>
-          <wp:inline distT="0" distB="0" distL="0" distR="0" wp14:anchorId="1BF39382" wp14:editId="6A6E9E64">
+          <wp:inline distT="0" distB="0" distL="0" distR="0" wp14:anchorId="06BAFC97" wp14:editId="4E78D877">
             <wp:extent cx="5715000" cy="247650"/>
             <wp:effectExtent l="0" t="0" r="0" b="0"/>
-            <wp:docPr id="681481468" name="Picture 681481468"/>
+            <wp:docPr id="1975112010" name="Picture 1975112010"/>
             <wp:cNvGraphicFramePr>
               <a:graphicFrameLocks xmlns:a="http://schemas.openxmlformats.org/drawingml/2006/main" noChangeAspect="1"/>
             </wp:cNvGraphicFramePr>
@@ -23433,10 +23433,10 @@
         </w:rPr>
         <w:lastRenderedPageBreak/>
         <w:drawing>
-          <wp:inline distT="0" distB="0" distL="0" distR="0" wp14:anchorId="30BF5D10" wp14:editId="3861F685">
-            <wp:extent cx="4657725" cy="628650"/>
+          <wp:inline distT="0" distB="0" distL="0" distR="0" wp14:anchorId="0D151C22" wp14:editId="7DE50217">
+            <wp:extent cx="5715000" cy="2085975"/>
             <wp:effectExtent l="0" t="0" r="0" b="0"/>
-            <wp:docPr id="2130517547" name="Picture 2130517547"/>
+            <wp:docPr id="675927256" name="Picture 675927256"/>
             <wp:cNvGraphicFramePr>
               <a:graphicFrameLocks xmlns:a="http://schemas.openxmlformats.org/drawingml/2006/main" noChangeAspect="1"/>
             </wp:cNvGraphicFramePr>
@@ -23459,7 +23459,7 @@
                   <pic:spPr bwMode="auto">
                     <a:xfrm>
                       <a:off x="0" y="0"/>
-                      <a:ext cx="4657725" cy="628650"/>
+                      <a:ext cx="5715000" cy="2085975"/>
                     </a:xfrm>
                     <a:prstGeom prst="rect">
                       <a:avLst/>
@@ -23484,7 +23484,69 @@
           <w:sz w:val="22"/>
           <w:szCs w:val="22"/>
         </w:rPr>
-        <w:t>Hình III.8: Kết nối qua địa chỉ IP ảo cho net_transport bằng TCP — dữ liệu thật sự đi qua mạng chứ không qua bộ nhớ chung</w:t>
+        <w:t>Hình III.8: Kết nối tới máy chủ bằng chính địa chỉ IP ảo mà ZeroTier đã cấp. Cột net_transport trả về TCP thay vì Shared memory, chứng tỏ dữ liệu thật sự đi qua mạng chứ không qua bộ nhớ chung trong máy</w:t>
+      </w:r>
+    </w:p>
+    <w:p>
+      <w:pPr>
+        <w:spacing w:after="120" w:line="360" w:lineRule="auto"/>
+        <w:jc w:val="both"/>
+      </w:pPr>
+      <w:r>
+        <w:t xml:space="preserve">Trong ảnh trên, cửa sổ Object Explorer có bốn kết nối: ba kết nối theo tên thể hiện như thường lệ, và một kết nối thứ tư mở theo địa chỉ </w:t>
+      </w:r>
+      <w:r>
+        <w:rPr>
+          <w:rFonts w:ascii="Consolas" w:eastAsia="Consolas" w:hAnsi="Consolas" w:cs="Consolas"/>
+          <w:sz w:val="22"/>
+          <w:szCs w:val="22"/>
+        </w:rPr>
+        <w:t>10.91.229.18,1440</w:t>
+      </w:r>
+      <w:r>
+        <w:t xml:space="preserve"> — chính là địa chỉ ảo đã thấy ở mục trước. Cột </w:t>
+      </w:r>
+      <w:r>
+        <w:rPr>
+          <w:b/>
+          <w:bCs/>
+        </w:rPr>
+        <w:t>MayChuDangKetNoi</w:t>
+      </w:r>
+      <w:r>
+        <w:t xml:space="preserve"> vẫn trả về </w:t>
+      </w:r>
+      <w:r>
+        <w:rPr>
+          <w:rFonts w:ascii="Consolas" w:eastAsia="Consolas" w:hAnsi="Consolas" w:cs="Consolas"/>
+          <w:sz w:val="22"/>
+          <w:szCs w:val="22"/>
+        </w:rPr>
+        <w:t>Mignon\KHO_A</w:t>
+      </w:r>
+      <w:r>
+        <w:t xml:space="preserve"> vì </w:t>
+      </w:r>
+      <w:r>
+        <w:rPr>
+          <w:rFonts w:ascii="Consolas" w:eastAsia="Consolas" w:hAnsi="Consolas" w:cs="Consolas"/>
+          <w:sz w:val="22"/>
+          <w:szCs w:val="22"/>
+        </w:rPr>
+        <w:t>@@SERVERNAME</w:t>
+      </w:r>
+      <w:r>
+        <w:t xml:space="preserve"> luôn cho tên đăng ký của máy chủ, không phụ thuộc vào cách người dùng kết nối tới; thứ thay đổi theo đường truyền là cột </w:t>
+      </w:r>
+      <w:r>
+        <w:rPr>
+          <w:b/>
+          <w:bCs/>
+        </w:rPr>
+        <w:t>DiaChi_MayChu</w:t>
+      </w:r>
+      <w:r>
+        <w:t>, và nó đang mang đúng địa chỉ ảo.</w:t>
       </w:r>
     </w:p>
     <w:p>
@@ -23497,7 +23559,7 @@
         <w:pStyle w:val="Heading2"/>
         <w:spacing w:before="240" w:after="120"/>
       </w:pPr>
-      <w:bookmarkStart w:id="35" w:name="_Toc240163607"/>
+      <w:bookmarkStart w:id="35" w:name="_Toc240164251"/>
       <w:r>
         <w:lastRenderedPageBreak/>
         <w:t>3. Cài đặt SQL Server</w:t>
@@ -23562,10 +23624,10 @@
           <w:noProof/>
         </w:rPr>
         <w:drawing>
-          <wp:inline distT="0" distB="0" distL="0" distR="0" wp14:anchorId="213B1FA4" wp14:editId="74398974">
+          <wp:inline distT="0" distB="0" distL="0" distR="0" wp14:anchorId="558E1FF8" wp14:editId="486D516C">
             <wp:extent cx="4476750" cy="3914775"/>
             <wp:effectExtent l="0" t="0" r="0" b="0"/>
-            <wp:docPr id="1471022830" name="Picture 1471022830"/>
+            <wp:docPr id="1620019059" name="Picture 1620019059"/>
             <wp:cNvGraphicFramePr>
               <a:graphicFrameLocks xmlns:a="http://schemas.openxmlformats.org/drawingml/2006/main" noChangeAspect="1"/>
             </wp:cNvGraphicFramePr>
@@ -23627,10 +23689,10 @@
         </w:rPr>
         <w:lastRenderedPageBreak/>
         <w:drawing>
-          <wp:inline distT="0" distB="0" distL="0" distR="0" wp14:anchorId="5E5B0DCA" wp14:editId="662CF8E3">
+          <wp:inline distT="0" distB="0" distL="0" distR="0" wp14:anchorId="24D97E64" wp14:editId="46D29A38">
             <wp:extent cx="4476750" cy="3924300"/>
             <wp:effectExtent l="0" t="0" r="0" b="0"/>
-            <wp:docPr id="152261038" name="Picture 152261038"/>
+            <wp:docPr id="1315148396" name="Picture 1315148396"/>
             <wp:cNvGraphicFramePr>
               <a:graphicFrameLocks xmlns:a="http://schemas.openxmlformats.org/drawingml/2006/main" noChangeAspect="1"/>
             </wp:cNvGraphicFramePr>
@@ -23710,10 +23772,10 @@
           <w:noProof/>
         </w:rPr>
         <w:drawing>
-          <wp:inline distT="0" distB="0" distL="0" distR="0" wp14:anchorId="66551BFE" wp14:editId="6A1FBEF4">
+          <wp:inline distT="0" distB="0" distL="0" distR="0" wp14:anchorId="187332A8" wp14:editId="166B287B">
             <wp:extent cx="4476750" cy="3924300"/>
             <wp:effectExtent l="0" t="0" r="0" b="0"/>
-            <wp:docPr id="587503120" name="Picture 587503120"/>
+            <wp:docPr id="151374887" name="Picture 151374887"/>
             <wp:cNvGraphicFramePr>
               <a:graphicFrameLocks xmlns:a="http://schemas.openxmlformats.org/drawingml/2006/main" noChangeAspect="1"/>
             </wp:cNvGraphicFramePr>
@@ -23775,10 +23837,10 @@
         </w:rPr>
         <w:lastRenderedPageBreak/>
         <w:drawing>
-          <wp:inline distT="0" distB="0" distL="0" distR="0" wp14:anchorId="5EED951E" wp14:editId="5B7E911D">
+          <wp:inline distT="0" distB="0" distL="0" distR="0" wp14:anchorId="27FCBB2B" wp14:editId="25A53B36">
             <wp:extent cx="4476750" cy="3914775"/>
             <wp:effectExtent l="0" t="0" r="0" b="0"/>
-            <wp:docPr id="572170891" name="Picture 572170891"/>
+            <wp:docPr id="2071316039" name="Picture 2071316039"/>
             <wp:cNvGraphicFramePr>
               <a:graphicFrameLocks xmlns:a="http://schemas.openxmlformats.org/drawingml/2006/main" noChangeAspect="1"/>
             </wp:cNvGraphicFramePr>
@@ -23839,10 +23901,10 @@
           <w:noProof/>
         </w:rPr>
         <w:drawing>
-          <wp:inline distT="0" distB="0" distL="0" distR="0" wp14:anchorId="2191F0FC" wp14:editId="76D6B927">
+          <wp:inline distT="0" distB="0" distL="0" distR="0" wp14:anchorId="4EDD513F" wp14:editId="1B82B46E">
             <wp:extent cx="4476750" cy="3914775"/>
             <wp:effectExtent l="0" t="0" r="0" b="0"/>
-            <wp:docPr id="1537935441" name="Picture 1537935441"/>
+            <wp:docPr id="194911990" name="Picture 194911990"/>
             <wp:cNvGraphicFramePr>
               <a:graphicFrameLocks xmlns:a="http://schemas.openxmlformats.org/drawingml/2006/main" noChangeAspect="1"/>
             </wp:cNvGraphicFramePr>
@@ -23904,10 +23966,10 @@
         </w:rPr>
         <w:lastRenderedPageBreak/>
         <w:drawing>
-          <wp:inline distT="0" distB="0" distL="0" distR="0" wp14:anchorId="268A038E" wp14:editId="17B73821">
+          <wp:inline distT="0" distB="0" distL="0" distR="0" wp14:anchorId="0050B1F0" wp14:editId="32C6ECBA">
             <wp:extent cx="4476750" cy="3914775"/>
             <wp:effectExtent l="0" t="0" r="0" b="0"/>
-            <wp:docPr id="2099301304" name="Picture 2099301304"/>
+            <wp:docPr id="1477763056" name="Picture 1477763056"/>
             <wp:cNvGraphicFramePr>
               <a:graphicFrameLocks xmlns:a="http://schemas.openxmlformats.org/drawingml/2006/main" noChangeAspect="1"/>
             </wp:cNvGraphicFramePr>
@@ -23968,10 +24030,10 @@
           <w:noProof/>
         </w:rPr>
         <w:drawing>
-          <wp:inline distT="0" distB="0" distL="0" distR="0" wp14:anchorId="6AF0FFC9" wp14:editId="3A91ABE5">
+          <wp:inline distT="0" distB="0" distL="0" distR="0" wp14:anchorId="14745951" wp14:editId="4E932DB3">
             <wp:extent cx="4476750" cy="3905250"/>
             <wp:effectExtent l="0" t="0" r="0" b="0"/>
-            <wp:docPr id="477070159" name="Picture 477070159"/>
+            <wp:docPr id="1910244730" name="Picture 1910244730"/>
             <wp:cNvGraphicFramePr>
               <a:graphicFrameLocks xmlns:a="http://schemas.openxmlformats.org/drawingml/2006/main" noChangeAspect="1"/>
             </wp:cNvGraphicFramePr>
@@ -24033,10 +24095,10 @@
         </w:rPr>
         <w:lastRenderedPageBreak/>
         <w:drawing>
-          <wp:inline distT="0" distB="0" distL="0" distR="0" wp14:anchorId="017C3CFF" wp14:editId="163CBD15">
+          <wp:inline distT="0" distB="0" distL="0" distR="0" wp14:anchorId="7F4D0B7C" wp14:editId="49BE7D9F">
             <wp:extent cx="4476750" cy="3924300"/>
             <wp:effectExtent l="0" t="0" r="0" b="0"/>
-            <wp:docPr id="1617739667" name="Picture 1617739667"/>
+            <wp:docPr id="494740307" name="Picture 494740307"/>
             <wp:cNvGraphicFramePr>
               <a:graphicFrameLocks xmlns:a="http://schemas.openxmlformats.org/drawingml/2006/main" noChangeAspect="1"/>
             </wp:cNvGraphicFramePr>
@@ -24097,10 +24159,10 @@
           <w:noProof/>
         </w:rPr>
         <w:drawing>
-          <wp:inline distT="0" distB="0" distL="0" distR="0" wp14:anchorId="332E9C2F" wp14:editId="1E2A75FB">
+          <wp:inline distT="0" distB="0" distL="0" distR="0" wp14:anchorId="2BE6140E" wp14:editId="349C2804">
             <wp:extent cx="4476750" cy="3924300"/>
             <wp:effectExtent l="0" t="0" r="0" b="0"/>
-            <wp:docPr id="782238396" name="Picture 782238396"/>
+            <wp:docPr id="1168517133" name="Picture 1168517133"/>
             <wp:cNvGraphicFramePr>
               <a:graphicFrameLocks xmlns:a="http://schemas.openxmlformats.org/drawingml/2006/main" noChangeAspect="1"/>
             </wp:cNvGraphicFramePr>
@@ -24162,10 +24224,10 @@
         </w:rPr>
         <w:lastRenderedPageBreak/>
         <w:drawing>
-          <wp:inline distT="0" distB="0" distL="0" distR="0" wp14:anchorId="5DFCD12C" wp14:editId="46F162E8">
+          <wp:inline distT="0" distB="0" distL="0" distR="0" wp14:anchorId="65B7ED81" wp14:editId="5C1F55B6">
             <wp:extent cx="4476750" cy="3933825"/>
             <wp:effectExtent l="0" t="0" r="0" b="0"/>
-            <wp:docPr id="2098057602" name="Picture 2098057602"/>
+            <wp:docPr id="280717962" name="Picture 280717962"/>
             <wp:cNvGraphicFramePr>
               <a:graphicFrameLocks xmlns:a="http://schemas.openxmlformats.org/drawingml/2006/main" noChangeAspect="1"/>
             </wp:cNvGraphicFramePr>
@@ -24226,10 +24288,10 @@
           <w:noProof/>
         </w:rPr>
         <w:drawing>
-          <wp:inline distT="0" distB="0" distL="0" distR="0" wp14:anchorId="356C3F3D" wp14:editId="14C2E2A7">
+          <wp:inline distT="0" distB="0" distL="0" distR="0" wp14:anchorId="39281DE1" wp14:editId="530F16C1">
             <wp:extent cx="5715000" cy="4048125"/>
             <wp:effectExtent l="0" t="0" r="0" b="0"/>
-            <wp:docPr id="277819014" name="Picture 277819014"/>
+            <wp:docPr id="509432561" name="Picture 509432561"/>
             <wp:cNvGraphicFramePr>
               <a:graphicFrameLocks xmlns:a="http://schemas.openxmlformats.org/drawingml/2006/main" noChangeAspect="1"/>
             </wp:cNvGraphicFramePr>
@@ -24290,7 +24352,7 @@
         <w:pStyle w:val="Heading2"/>
         <w:spacing w:before="240" w:after="120"/>
       </w:pPr>
-      <w:bookmarkStart w:id="36" w:name="_Toc240163608"/>
+      <w:bookmarkStart w:id="36" w:name="_Toc240164252"/>
       <w:r>
         <w:lastRenderedPageBreak/>
         <w:t>4. Kiểm tra dịch vụ Agent</w:t>
@@ -24326,10 +24388,10 @@
           <w:noProof/>
         </w:rPr>
         <w:drawing>
-          <wp:inline distT="0" distB="0" distL="0" distR="0" wp14:anchorId="137DCBD4" wp14:editId="5C014F78">
+          <wp:inline distT="0" distB="0" distL="0" distR="0" wp14:anchorId="04E8D809" wp14:editId="73B496A6">
             <wp:extent cx="5715000" cy="1409700"/>
             <wp:effectExtent l="0" t="0" r="0" b="0"/>
-            <wp:docPr id="139354345" name="Picture 139354345"/>
+            <wp:docPr id="95051264" name="Picture 95051264"/>
             <wp:cNvGraphicFramePr>
               <a:graphicFrameLocks xmlns:a="http://schemas.openxmlformats.org/drawingml/2006/main" noChangeAspect="1"/>
             </wp:cNvGraphicFramePr>
@@ -24481,7 +24543,7 @@
         <w:pStyle w:val="Heading2"/>
         <w:spacing w:before="240" w:after="120"/>
       </w:pPr>
-      <w:bookmarkStart w:id="37" w:name="_Toc240163609"/>
+      <w:bookmarkStart w:id="37" w:name="_Toc240164253"/>
       <w:r>
         <w:lastRenderedPageBreak/>
         <w:t>5. Tạo liên kết cơ sở dữ liệu giữa các máy chủ</w:t>
@@ -24582,10 +24644,10 @@
           <w:noProof/>
         </w:rPr>
         <w:drawing>
-          <wp:inline distT="0" distB="0" distL="0" distR="0" wp14:anchorId="39528510" wp14:editId="2DC781D1">
+          <wp:inline distT="0" distB="0" distL="0" distR="0" wp14:anchorId="72046626" wp14:editId="2DCFA5C9">
             <wp:extent cx="4905375" cy="6391275"/>
             <wp:effectExtent l="0" t="0" r="0" b="0"/>
-            <wp:docPr id="258750095" name="Picture 258750095"/>
+            <wp:docPr id="141016964" name="Picture 141016964"/>
             <wp:cNvGraphicFramePr>
               <a:graphicFrameLocks xmlns:a="http://schemas.openxmlformats.org/drawingml/2006/main" noChangeAspect="1"/>
             </wp:cNvGraphicFramePr>
@@ -24647,10 +24709,10 @@
         </w:rPr>
         <w:lastRenderedPageBreak/>
         <w:drawing>
-          <wp:inline distT="0" distB="0" distL="0" distR="0" wp14:anchorId="59CC01F2" wp14:editId="027384A6">
+          <wp:inline distT="0" distB="0" distL="0" distR="0" wp14:anchorId="1217CBBE" wp14:editId="35EFE295">
             <wp:extent cx="5715000" cy="5172075"/>
             <wp:effectExtent l="0" t="0" r="0" b="0"/>
-            <wp:docPr id="997236881" name="Picture 997236881"/>
+            <wp:docPr id="1933245560" name="Picture 1933245560"/>
             <wp:cNvGraphicFramePr>
               <a:graphicFrameLocks xmlns:a="http://schemas.openxmlformats.org/drawingml/2006/main" noChangeAspect="1"/>
             </wp:cNvGraphicFramePr>
@@ -24712,10 +24774,10 @@
         </w:rPr>
         <w:lastRenderedPageBreak/>
         <w:drawing>
-          <wp:inline distT="0" distB="0" distL="0" distR="0" wp14:anchorId="24B47EB7" wp14:editId="3B6E04FB">
+          <wp:inline distT="0" distB="0" distL="0" distR="0" wp14:anchorId="4ED44E90" wp14:editId="41D6BB63">
             <wp:extent cx="5715000" cy="5162550"/>
             <wp:effectExtent l="0" t="0" r="0" b="0"/>
-            <wp:docPr id="1305652635" name="Picture 1305652635"/>
+            <wp:docPr id="1676048395" name="Picture 1676048395"/>
             <wp:cNvGraphicFramePr>
               <a:graphicFrameLocks xmlns:a="http://schemas.openxmlformats.org/drawingml/2006/main" noChangeAspect="1"/>
             </wp:cNvGraphicFramePr>
@@ -24805,7 +24867,7 @@
           <w:left w:w="10" w:type="dxa"/>
           <w:right w:w="10" w:type="dxa"/>
         </w:tblCellMar>
-        <w:tblLook w:val="0000" w:firstRow="0" w:lastRow="0" w:firstColumn="0" w:lastColumn="0" w:noHBand="0" w:noVBand="0"/>
+        <w:tblLook w:val="04A0" w:firstRow="1" w:lastRow="0" w:firstColumn="1" w:lastColumn="0" w:noHBand="0" w:noVBand="1"/>
       </w:tblPr>
       <w:tblGrid>
         <w:gridCol w:w="2358"/>
@@ -25284,10 +25346,10 @@
           <w:noProof/>
         </w:rPr>
         <w:drawing>
-          <wp:inline distT="0" distB="0" distL="0" distR="0" wp14:anchorId="06C1DB24" wp14:editId="5600B245">
+          <wp:inline distT="0" distB="0" distL="0" distR="0" wp14:anchorId="65DF8CF8" wp14:editId="4C2FF549">
             <wp:extent cx="5715000" cy="2781300"/>
             <wp:effectExtent l="0" t="0" r="0" b="0"/>
-            <wp:docPr id="664317404" name="Picture 664317404"/>
+            <wp:docPr id="2085693555" name="Picture 2085693555"/>
             <wp:cNvGraphicFramePr>
               <a:graphicFrameLocks xmlns:a="http://schemas.openxmlformats.org/drawingml/2006/main" noChangeAspect="1"/>
             </wp:cNvGraphicFramePr>
@@ -25357,7 +25419,7 @@
         <w:pStyle w:val="Heading2"/>
         <w:spacing w:before="240" w:after="120"/>
       </w:pPr>
-      <w:bookmarkStart w:id="38" w:name="_Toc240163610"/>
+      <w:bookmarkStart w:id="38" w:name="_Toc240164254"/>
       <w:r>
         <w:lastRenderedPageBreak/>
         <w:t>6. Tạo Publication</w:t>
@@ -25413,10 +25475,10 @@
           <w:noProof/>
         </w:rPr>
         <w:drawing>
-          <wp:inline distT="0" distB="0" distL="0" distR="0" wp14:anchorId="73C3D1C3" wp14:editId="3A5317BB">
+          <wp:inline distT="0" distB="0" distL="0" distR="0" wp14:anchorId="66E1E0A3" wp14:editId="0273B55F">
             <wp:extent cx="3657600" cy="6200775"/>
             <wp:effectExtent l="0" t="0" r="0" b="0"/>
-            <wp:docPr id="2015298984" name="Picture 2015298984"/>
+            <wp:docPr id="1006939441" name="Picture 1006939441"/>
             <wp:cNvGraphicFramePr>
               <a:graphicFrameLocks xmlns:a="http://schemas.openxmlformats.org/drawingml/2006/main" noChangeAspect="1"/>
             </wp:cNvGraphicFramePr>
@@ -25478,10 +25540,10 @@
         </w:rPr>
         <w:lastRenderedPageBreak/>
         <w:drawing>
-          <wp:inline distT="0" distB="0" distL="0" distR="0" wp14:anchorId="20C23E5F" wp14:editId="56DF8965">
+          <wp:inline distT="0" distB="0" distL="0" distR="0" wp14:anchorId="2C019D0F" wp14:editId="54F30DFC">
             <wp:extent cx="5715000" cy="5181600"/>
             <wp:effectExtent l="0" t="0" r="0" b="0"/>
-            <wp:docPr id="407576779" name="Picture 407576779"/>
+            <wp:docPr id="1989094639" name="Picture 1989094639"/>
             <wp:cNvGraphicFramePr>
               <a:graphicFrameLocks xmlns:a="http://schemas.openxmlformats.org/drawingml/2006/main" noChangeAspect="1"/>
             </wp:cNvGraphicFramePr>
@@ -25543,10 +25605,10 @@
         </w:rPr>
         <w:lastRenderedPageBreak/>
         <w:drawing>
-          <wp:inline distT="0" distB="0" distL="0" distR="0" wp14:anchorId="58A6BB16" wp14:editId="0F641B34">
+          <wp:inline distT="0" distB="0" distL="0" distR="0" wp14:anchorId="0B6C5C9C" wp14:editId="57297AE7">
             <wp:extent cx="5715000" cy="4057650"/>
             <wp:effectExtent l="0" t="0" r="0" b="0"/>
-            <wp:docPr id="566957812" name="Picture 566957812"/>
+            <wp:docPr id="2009629763" name="Picture 2009629763"/>
             <wp:cNvGraphicFramePr>
               <a:graphicFrameLocks xmlns:a="http://schemas.openxmlformats.org/drawingml/2006/main" noChangeAspect="1"/>
             </wp:cNvGraphicFramePr>
@@ -25694,10 +25756,10 @@
         </w:rPr>
         <w:lastRenderedPageBreak/>
         <w:drawing>
-          <wp:inline distT="0" distB="0" distL="0" distR="0" wp14:anchorId="0E745610" wp14:editId="201651D2">
+          <wp:inline distT="0" distB="0" distL="0" distR="0" wp14:anchorId="6D5CCC87" wp14:editId="1C1F445E">
             <wp:extent cx="5715000" cy="2781300"/>
             <wp:effectExtent l="0" t="0" r="0" b="0"/>
-            <wp:docPr id="2015104795" name="Picture 2015104795"/>
+            <wp:docPr id="2122787598" name="Picture 2122787598"/>
             <wp:cNvGraphicFramePr>
               <a:graphicFrameLocks xmlns:a="http://schemas.openxmlformats.org/drawingml/2006/main" noChangeAspect="1"/>
             </wp:cNvGraphicFramePr>
@@ -25797,7 +25859,7 @@
         <w:pStyle w:val="Heading2"/>
         <w:spacing w:before="240" w:after="120"/>
       </w:pPr>
-      <w:bookmarkStart w:id="39" w:name="_Toc240163611"/>
+      <w:bookmarkStart w:id="39" w:name="_Toc240164255"/>
       <w:r>
         <w:lastRenderedPageBreak/>
         <w:t>7. Thử các giao tác tương ứng với các chức năng</w:t>
@@ -25809,7 +25871,7 @@
         <w:pStyle w:val="Heading3"/>
         <w:spacing w:before="180" w:after="100"/>
       </w:pPr>
-      <w:bookmarkStart w:id="40" w:name="_Toc240163612"/>
+      <w:bookmarkStart w:id="40" w:name="_Toc240164256"/>
       <w:r>
         <w:rPr>
           <w:i/>
@@ -25925,7 +25987,7 @@
           <w:left w:w="10" w:type="dxa"/>
           <w:right w:w="10" w:type="dxa"/>
         </w:tblCellMar>
-        <w:tblLook w:val="0000" w:firstRow="0" w:lastRow="0" w:firstColumn="0" w:lastColumn="0" w:noHBand="0" w:noVBand="0"/>
+        <w:tblLook w:val="04A0" w:firstRow="1" w:lastRow="0" w:firstColumn="1" w:lastColumn="0" w:noHBand="0" w:noVBand="1"/>
       </w:tblPr>
       <w:tblGrid>
         <w:gridCol w:w="2458"/>
@@ -26434,7 +26496,7 @@
         <w:pStyle w:val="Heading3"/>
         <w:spacing w:before="180" w:after="100"/>
       </w:pPr>
-      <w:bookmarkStart w:id="41" w:name="_Toc240163613"/>
+      <w:bookmarkStart w:id="41" w:name="_Toc240164257"/>
       <w:r>
         <w:rPr>
           <w:i/>
@@ -26477,10 +26539,10 @@
         </w:rPr>
         <w:lastRenderedPageBreak/>
         <w:drawing>
-          <wp:inline distT="0" distB="0" distL="0" distR="0" wp14:anchorId="134DAD00" wp14:editId="25F285F5">
+          <wp:inline distT="0" distB="0" distL="0" distR="0" wp14:anchorId="768E7E38" wp14:editId="538D33C3">
             <wp:extent cx="5524500" cy="6353175"/>
             <wp:effectExtent l="0" t="0" r="0" b="0"/>
-            <wp:docPr id="190511106" name="Picture 190511106"/>
+            <wp:docPr id="442729934" name="Picture 442729934"/>
             <wp:cNvGraphicFramePr>
               <a:graphicFrameLocks xmlns:a="http://schemas.openxmlformats.org/drawingml/2006/main" noChangeAspect="1"/>
             </wp:cNvGraphicFramePr>
@@ -26574,10 +26636,10 @@
         </w:rPr>
         <w:lastRenderedPageBreak/>
         <w:drawing>
-          <wp:inline distT="0" distB="0" distL="0" distR="0" wp14:anchorId="6409E13E" wp14:editId="6A12EE2C">
+          <wp:inline distT="0" distB="0" distL="0" distR="0" wp14:anchorId="6B079EC6" wp14:editId="1E62F117">
             <wp:extent cx="5715000" cy="2143125"/>
             <wp:effectExtent l="0" t="0" r="0" b="0"/>
-            <wp:docPr id="72251652" name="Picture 72251652"/>
+            <wp:docPr id="414018329" name="Picture 414018329"/>
             <wp:cNvGraphicFramePr>
               <a:graphicFrameLocks xmlns:a="http://schemas.openxmlformats.org/drawingml/2006/main" noChangeAspect="1"/>
             </wp:cNvGraphicFramePr>
@@ -26658,7 +26720,7 @@
           <w:left w:w="10" w:type="dxa"/>
           <w:right w:w="10" w:type="dxa"/>
         </w:tblCellMar>
-        <w:tblLook w:val="0000" w:firstRow="0" w:lastRow="0" w:firstColumn="0" w:lastColumn="0" w:noHBand="0" w:noVBand="0"/>
+        <w:tblLook w:val="04A0" w:firstRow="1" w:lastRow="0" w:firstColumn="1" w:lastColumn="0" w:noHBand="0" w:noVBand="1"/>
       </w:tblPr>
       <w:tblGrid>
         <w:gridCol w:w="1996"/>
@@ -27166,10 +27228,10 @@
           <w:noProof/>
         </w:rPr>
         <w:drawing>
-          <wp:inline distT="0" distB="0" distL="0" distR="0" wp14:anchorId="73480857" wp14:editId="2D74E333">
+          <wp:inline distT="0" distB="0" distL="0" distR="0" wp14:anchorId="54C7CD34" wp14:editId="10183988">
             <wp:extent cx="5715000" cy="3524250"/>
             <wp:effectExtent l="0" t="0" r="0" b="0"/>
-            <wp:docPr id="1389510012" name="Picture 1389510012"/>
+            <wp:docPr id="1783734262" name="Picture 1783734262"/>
             <wp:cNvGraphicFramePr>
               <a:graphicFrameLocks xmlns:a="http://schemas.openxmlformats.org/drawingml/2006/main" noChangeAspect="1"/>
             </wp:cNvGraphicFramePr>
@@ -27282,10 +27344,10 @@
           <w:noProof/>
         </w:rPr>
         <w:drawing>
-          <wp:inline distT="0" distB="0" distL="0" distR="0" wp14:anchorId="783CDD16" wp14:editId="51FA92B9">
+          <wp:inline distT="0" distB="0" distL="0" distR="0" wp14:anchorId="0C63D0A1" wp14:editId="6C476922">
             <wp:extent cx="5715000" cy="2257425"/>
             <wp:effectExtent l="0" t="0" r="0" b="0"/>
-            <wp:docPr id="245341376" name="Picture 245341376"/>
+            <wp:docPr id="1150043537" name="Picture 1150043537"/>
             <wp:cNvGraphicFramePr>
               <a:graphicFrameLocks xmlns:a="http://schemas.openxmlformats.org/drawingml/2006/main" noChangeAspect="1"/>
             </wp:cNvGraphicFramePr>
@@ -27380,10 +27442,10 @@
         </w:rPr>
         <w:lastRenderedPageBreak/>
         <w:drawing>
-          <wp:inline distT="0" distB="0" distL="0" distR="0" wp14:anchorId="14DB9542" wp14:editId="46F9B47B">
+          <wp:inline distT="0" distB="0" distL="0" distR="0" wp14:anchorId="0A99237B" wp14:editId="2FF2EF57">
             <wp:extent cx="2733675" cy="5572125"/>
             <wp:effectExtent l="0" t="0" r="0" b="0"/>
-            <wp:docPr id="1136947761" name="Picture 1136947761"/>
+            <wp:docPr id="377132559" name="Picture 377132559"/>
             <wp:cNvGraphicFramePr>
               <a:graphicFrameLocks xmlns:a="http://schemas.openxmlformats.org/drawingml/2006/main" noChangeAspect="1"/>
             </wp:cNvGraphicFramePr>
@@ -27468,7 +27530,7 @@
         <w:pStyle w:val="Heading3"/>
         <w:spacing w:before="180" w:after="100"/>
       </w:pPr>
-      <w:bookmarkStart w:id="42" w:name="_Toc240163614"/>
+      <w:bookmarkStart w:id="42" w:name="_Toc240164258"/>
       <w:r>
         <w:rPr>
           <w:i/>
@@ -27489,10 +27551,10 @@
         </w:rPr>
         <w:lastRenderedPageBreak/>
         <w:drawing>
-          <wp:inline distT="0" distB="0" distL="0" distR="0" wp14:anchorId="748DB2AA" wp14:editId="7B0C17BE">
+          <wp:inline distT="0" distB="0" distL="0" distR="0" wp14:anchorId="15D4A54A" wp14:editId="19D5C2B4">
             <wp:extent cx="5715000" cy="4371975"/>
             <wp:effectExtent l="0" t="0" r="0" b="0"/>
-            <wp:docPr id="1464820806" name="Picture 1464820806"/>
+            <wp:docPr id="1401206867" name="Picture 1401206867"/>
             <wp:cNvGraphicFramePr>
               <a:graphicFrameLocks xmlns:a="http://schemas.openxmlformats.org/drawingml/2006/main" noChangeAspect="1"/>
             </wp:cNvGraphicFramePr>
@@ -27573,7 +27635,7 @@
           <w:left w:w="10" w:type="dxa"/>
           <w:right w:w="10" w:type="dxa"/>
         </w:tblCellMar>
-        <w:tblLook w:val="0000" w:firstRow="0" w:lastRow="0" w:firstColumn="0" w:lastColumn="0" w:noHBand="0" w:noVBand="0"/>
+        <w:tblLook w:val="04A0" w:firstRow="1" w:lastRow="0" w:firstColumn="1" w:lastColumn="0" w:noHBand="0" w:noVBand="1"/>
       </w:tblPr>
       <w:tblGrid>
         <w:gridCol w:w="3084"/>
@@ -28119,10 +28181,10 @@
           <w:noProof/>
         </w:rPr>
         <w:drawing>
-          <wp:inline distT="0" distB="0" distL="0" distR="0" wp14:anchorId="19F7DB1F" wp14:editId="549DFAEB">
+          <wp:inline distT="0" distB="0" distL="0" distR="0" wp14:anchorId="389B3D6C" wp14:editId="36901D65">
             <wp:extent cx="5715000" cy="657225"/>
             <wp:effectExtent l="0" t="0" r="0" b="0"/>
-            <wp:docPr id="120121010" name="Picture 120121010"/>
+            <wp:docPr id="1989295308" name="Picture 1989295308"/>
             <wp:cNvGraphicFramePr>
               <a:graphicFrameLocks xmlns:a="http://schemas.openxmlformats.org/drawingml/2006/main" noChangeAspect="1"/>
             </wp:cNvGraphicFramePr>
@@ -28203,10 +28265,10 @@
         </w:rPr>
         <w:lastRenderedPageBreak/>
         <w:drawing>
-          <wp:inline distT="0" distB="0" distL="0" distR="0" wp14:anchorId="4BAFEE39" wp14:editId="3752ED47">
+          <wp:inline distT="0" distB="0" distL="0" distR="0" wp14:anchorId="51C47844" wp14:editId="7946BAF7">
             <wp:extent cx="4152900" cy="3629025"/>
             <wp:effectExtent l="0" t="0" r="0" b="0"/>
-            <wp:docPr id="1182187221" name="Picture 1182187221"/>
+            <wp:docPr id="1779385245" name="Picture 1779385245"/>
             <wp:cNvGraphicFramePr>
               <a:graphicFrameLocks xmlns:a="http://schemas.openxmlformats.org/drawingml/2006/main" noChangeAspect="1"/>
             </wp:cNvGraphicFramePr>
@@ -28291,7 +28353,7 @@
         <w:pStyle w:val="Heading3"/>
         <w:spacing w:before="180" w:after="100"/>
       </w:pPr>
-      <w:bookmarkStart w:id="43" w:name="_Toc240163615"/>
+      <w:bookmarkStart w:id="43" w:name="_Toc240164259"/>
       <w:r>
         <w:rPr>
           <w:i/>
@@ -28350,7 +28412,7 @@
           <w:left w:w="10" w:type="dxa"/>
           <w:right w:w="10" w:type="dxa"/>
         </w:tblCellMar>
-        <w:tblLook w:val="0000" w:firstRow="0" w:lastRow="0" w:firstColumn="0" w:lastColumn="0" w:noHBand="0" w:noVBand="0"/>
+        <w:tblLook w:val="04A0" w:firstRow="1" w:lastRow="0" w:firstColumn="1" w:lastColumn="0" w:noHBand="0" w:noVBand="1"/>
       </w:tblPr>
       <w:tblGrid>
         <w:gridCol w:w="907"/>
@@ -28724,7 +28786,7 @@
           <w:left w:w="10" w:type="dxa"/>
           <w:right w:w="10" w:type="dxa"/>
         </w:tblCellMar>
-        <w:tblLook w:val="0000" w:firstRow="0" w:lastRow="0" w:firstColumn="0" w:lastColumn="0" w:noHBand="0" w:noVBand="0"/>
+        <w:tblLook w:val="04A0" w:firstRow="1" w:lastRow="0" w:firstColumn="1" w:lastColumn="0" w:noHBand="0" w:noVBand="1"/>
       </w:tblPr>
       <w:tblGrid>
         <w:gridCol w:w="3704"/>
@@ -29406,10 +29468,10 @@
         </w:rPr>
         <w:lastRenderedPageBreak/>
         <w:drawing>
-          <wp:inline distT="0" distB="0" distL="0" distR="0" wp14:anchorId="03659E34" wp14:editId="6C72E976">
+          <wp:inline distT="0" distB="0" distL="0" distR="0" wp14:anchorId="297F9602" wp14:editId="1EAAA35E">
             <wp:extent cx="5715000" cy="7372350"/>
             <wp:effectExtent l="0" t="0" r="0" b="0"/>
-            <wp:docPr id="1742197399" name="Picture 1742197399"/>
+            <wp:docPr id="1617318662" name="Picture 1617318662"/>
             <wp:cNvGraphicFramePr>
               <a:graphicFrameLocks xmlns:a="http://schemas.openxmlformats.org/drawingml/2006/main" noChangeAspect="1"/>
             </wp:cNvGraphicFramePr>
@@ -29470,10 +29532,10 @@
           <w:noProof/>
         </w:rPr>
         <w:drawing>
-          <wp:inline distT="0" distB="0" distL="0" distR="0" wp14:anchorId="0F733308" wp14:editId="51796165">
+          <wp:inline distT="0" distB="0" distL="0" distR="0" wp14:anchorId="134A226B" wp14:editId="1E173179">
             <wp:extent cx="5715000" cy="1295400"/>
             <wp:effectExtent l="0" t="0" r="0" b="0"/>
-            <wp:docPr id="1972417121" name="Picture 1972417121"/>
+            <wp:docPr id="2137991065" name="Picture 2137991065"/>
             <wp:cNvGraphicFramePr>
               <a:graphicFrameLocks xmlns:a="http://schemas.openxmlformats.org/drawingml/2006/main" noChangeAspect="1"/>
             </wp:cNvGraphicFramePr>
@@ -29564,10 +29626,10 @@
           <w:noProof/>
         </w:rPr>
         <w:drawing>
-          <wp:inline distT="0" distB="0" distL="0" distR="0" wp14:anchorId="389A2EF7" wp14:editId="0E089A51">
+          <wp:inline distT="0" distB="0" distL="0" distR="0" wp14:anchorId="7AD1B72F" wp14:editId="5A6D8A2C">
             <wp:extent cx="5715000" cy="876300"/>
             <wp:effectExtent l="0" t="0" r="0" b="0"/>
-            <wp:docPr id="1615322505" name="Picture 1615322505"/>
+            <wp:docPr id="165263565" name="Picture 165263565"/>
             <wp:cNvGraphicFramePr>
               <a:graphicFrameLocks xmlns:a="http://schemas.openxmlformats.org/drawingml/2006/main" noChangeAspect="1"/>
             </wp:cNvGraphicFramePr>
@@ -29697,10 +29759,10 @@
           <w:noProof/>
         </w:rPr>
         <w:drawing>
-          <wp:inline distT="0" distB="0" distL="0" distR="0" wp14:anchorId="7B14CE11" wp14:editId="68326EAA">
+          <wp:inline distT="0" distB="0" distL="0" distR="0" wp14:anchorId="375A9CD1" wp14:editId="2A3EC7CF">
             <wp:extent cx="5715000" cy="866775"/>
             <wp:effectExtent l="0" t="0" r="0" b="0"/>
-            <wp:docPr id="62123707" name="Picture 62123707"/>
+            <wp:docPr id="2128867981" name="Picture 2128867981"/>
             <wp:cNvGraphicFramePr>
               <a:graphicFrameLocks xmlns:a="http://schemas.openxmlformats.org/drawingml/2006/main" noChangeAspect="1"/>
             </wp:cNvGraphicFramePr>
@@ -29800,7 +29862,7 @@
           <w:left w:w="10" w:type="dxa"/>
           <w:right w:w="10" w:type="dxa"/>
         </w:tblCellMar>
-        <w:tblLook w:val="0000" w:firstRow="0" w:lastRow="0" w:firstColumn="0" w:lastColumn="0" w:noHBand="0" w:noVBand="0"/>
+        <w:tblLook w:val="04A0" w:firstRow="1" w:lastRow="0" w:firstColumn="1" w:lastColumn="0" w:noHBand="0" w:noVBand="1"/>
       </w:tblPr>
       <w:tblGrid>
         <w:gridCol w:w="3628"/>
@@ -30314,10 +30376,10 @@
         </w:rPr>
         <w:lastRenderedPageBreak/>
         <w:drawing>
-          <wp:inline distT="0" distB="0" distL="0" distR="0" wp14:anchorId="71CC5FC6" wp14:editId="48831DF9">
+          <wp:inline distT="0" distB="0" distL="0" distR="0" wp14:anchorId="4584076C" wp14:editId="751D8F0D">
             <wp:extent cx="5715000" cy="1762125"/>
             <wp:effectExtent l="0" t="0" r="0" b="0"/>
-            <wp:docPr id="1418976345" name="Picture 1418976345"/>
+            <wp:docPr id="1971779932" name="Picture 1971779932"/>
             <wp:cNvGraphicFramePr>
               <a:graphicFrameLocks xmlns:a="http://schemas.openxmlformats.org/drawingml/2006/main" noChangeAspect="1"/>
             </wp:cNvGraphicFramePr>
@@ -30418,7 +30480,7 @@
         <w:pStyle w:val="Heading3"/>
         <w:spacing w:before="180" w:after="100"/>
       </w:pPr>
-      <w:bookmarkStart w:id="44" w:name="_Toc240163616"/>
+      <w:bookmarkStart w:id="44" w:name="_Toc240164260"/>
       <w:r>
         <w:rPr>
           <w:i/>
@@ -30596,10 +30658,10 @@
         </w:rPr>
         <w:lastRenderedPageBreak/>
         <w:drawing>
-          <wp:inline distT="0" distB="0" distL="0" distR="0" wp14:anchorId="6921BAC9" wp14:editId="4E07AF59">
+          <wp:inline distT="0" distB="0" distL="0" distR="0" wp14:anchorId="0A05D73E" wp14:editId="1D1F2032">
             <wp:extent cx="5486400" cy="3228975"/>
             <wp:effectExtent l="0" t="0" r="0" b="0"/>
-            <wp:docPr id="342581111" name="Picture 342581111"/>
+            <wp:docPr id="344655465" name="Picture 344655465"/>
             <wp:cNvGraphicFramePr>
               <a:graphicFrameLocks xmlns:a="http://schemas.openxmlformats.org/drawingml/2006/main" noChangeAspect="1"/>
             </wp:cNvGraphicFramePr>
@@ -30660,10 +30722,10 @@
           <w:noProof/>
         </w:rPr>
         <w:drawing>
-          <wp:inline distT="0" distB="0" distL="0" distR="0" wp14:anchorId="17DECC9D" wp14:editId="595C705C">
+          <wp:inline distT="0" distB="0" distL="0" distR="0" wp14:anchorId="4E22DA42" wp14:editId="2A1BE361">
             <wp:extent cx="4419600" cy="1228725"/>
             <wp:effectExtent l="0" t="0" r="0" b="0"/>
-            <wp:docPr id="1704594591" name="Picture 1704594591"/>
+            <wp:docPr id="575445883" name="Picture 575445883"/>
             <wp:cNvGraphicFramePr>
               <a:graphicFrameLocks xmlns:a="http://schemas.openxmlformats.org/drawingml/2006/main" noChangeAspect="1"/>
             </wp:cNvGraphicFramePr>
@@ -30744,7 +30806,7 @@
           <w:left w:w="10" w:type="dxa"/>
           <w:right w:w="10" w:type="dxa"/>
         </w:tblCellMar>
-        <w:tblLook w:val="0000" w:firstRow="0" w:lastRow="0" w:firstColumn="0" w:lastColumn="0" w:noHBand="0" w:noVBand="0"/>
+        <w:tblLook w:val="04A0" w:firstRow="1" w:lastRow="0" w:firstColumn="1" w:lastColumn="0" w:noHBand="0" w:noVBand="1"/>
       </w:tblPr>
       <w:tblGrid>
         <w:gridCol w:w="1451"/>
@@ -31135,10 +31197,10 @@
         </w:rPr>
         <w:lastRenderedPageBreak/>
         <w:drawing>
-          <wp:inline distT="0" distB="0" distL="0" distR="0" wp14:anchorId="4A4F64A5" wp14:editId="62D4E502">
+          <wp:inline distT="0" distB="0" distL="0" distR="0" wp14:anchorId="0AEECC12" wp14:editId="06177B20">
             <wp:extent cx="4362450" cy="2771775"/>
             <wp:effectExtent l="0" t="0" r="0" b="0"/>
-            <wp:docPr id="441695229" name="Picture 441695229"/>
+            <wp:docPr id="829985089" name="Picture 829985089"/>
             <wp:cNvGraphicFramePr>
               <a:graphicFrameLocks xmlns:a="http://schemas.openxmlformats.org/drawingml/2006/main" noChangeAspect="1"/>
             </wp:cNvGraphicFramePr>
@@ -31199,10 +31261,10 @@
           <w:noProof/>
         </w:rPr>
         <w:drawing>
-          <wp:inline distT="0" distB="0" distL="0" distR="0" wp14:anchorId="1C625A1E" wp14:editId="0427E2F4">
+          <wp:inline distT="0" distB="0" distL="0" distR="0" wp14:anchorId="4DDB3106" wp14:editId="6CF48812">
             <wp:extent cx="5715000" cy="1038225"/>
             <wp:effectExtent l="0" t="0" r="0" b="0"/>
-            <wp:docPr id="494775549" name="Picture 494775549"/>
+            <wp:docPr id="696951120" name="Picture 696951120"/>
             <wp:cNvGraphicFramePr>
               <a:graphicFrameLocks xmlns:a="http://schemas.openxmlformats.org/drawingml/2006/main" noChangeAspect="1"/>
             </wp:cNvGraphicFramePr>
@@ -31354,10 +31416,10 @@
         </w:rPr>
         <w:lastRenderedPageBreak/>
         <w:drawing>
-          <wp:inline distT="0" distB="0" distL="0" distR="0" wp14:anchorId="093A6B02" wp14:editId="2127E054">
+          <wp:inline distT="0" distB="0" distL="0" distR="0" wp14:anchorId="7C151305" wp14:editId="4F87AA04">
             <wp:extent cx="4191000" cy="3086100"/>
             <wp:effectExtent l="0" t="0" r="0" b="0"/>
-            <wp:docPr id="112625381" name="Picture 112625381"/>
+            <wp:docPr id="1636910466" name="Picture 1636910466"/>
             <wp:cNvGraphicFramePr>
               <a:graphicFrameLocks xmlns:a="http://schemas.openxmlformats.org/drawingml/2006/main" noChangeAspect="1"/>
             </wp:cNvGraphicFramePr>
@@ -31418,10 +31480,10 @@
           <w:noProof/>
         </w:rPr>
         <w:drawing>
-          <wp:inline distT="0" distB="0" distL="0" distR="0" wp14:anchorId="11D5BDA0" wp14:editId="4FD86510">
+          <wp:inline distT="0" distB="0" distL="0" distR="0" wp14:anchorId="22923764" wp14:editId="5E63CC4C">
             <wp:extent cx="5715000" cy="952500"/>
             <wp:effectExtent l="0" t="0" r="0" b="0"/>
-            <wp:docPr id="1428914477" name="Picture 1428914477"/>
+            <wp:docPr id="547820798" name="Picture 547820798"/>
             <wp:cNvGraphicFramePr>
               <a:graphicFrameLocks xmlns:a="http://schemas.openxmlformats.org/drawingml/2006/main" noChangeAspect="1"/>
             </wp:cNvGraphicFramePr>
@@ -31528,7 +31590,7 @@
           <w:left w:w="10" w:type="dxa"/>
           <w:right w:w="10" w:type="dxa"/>
         </w:tblCellMar>
-        <w:tblLook w:val="0000" w:firstRow="0" w:lastRow="0" w:firstColumn="0" w:lastColumn="0" w:noHBand="0" w:noVBand="0"/>
+        <w:tblLook w:val="04A0" w:firstRow="1" w:lastRow="0" w:firstColumn="1" w:lastColumn="0" w:noHBand="0" w:noVBand="1"/>
       </w:tblPr>
       <w:tblGrid>
         <w:gridCol w:w="907"/>
@@ -32024,10 +32086,10 @@
         </w:rPr>
         <w:lastRenderedPageBreak/>
         <w:drawing>
-          <wp:inline distT="0" distB="0" distL="0" distR="0" wp14:anchorId="3BA9EAA8" wp14:editId="009C12B1">
+          <wp:inline distT="0" distB="0" distL="0" distR="0" wp14:anchorId="35A158B3" wp14:editId="09D4A3BF">
             <wp:extent cx="5715000" cy="3133725"/>
             <wp:effectExtent l="0" t="0" r="0" b="0"/>
-            <wp:docPr id="1958374304" name="Picture 1958374304"/>
+            <wp:docPr id="740410574" name="Picture 740410574"/>
             <wp:cNvGraphicFramePr>
               <a:graphicFrameLocks xmlns:a="http://schemas.openxmlformats.org/drawingml/2006/main" noChangeAspect="1"/>
             </wp:cNvGraphicFramePr>
@@ -32107,10 +32169,10 @@
           <w:noProof/>
         </w:rPr>
         <w:drawing>
-          <wp:inline distT="0" distB="0" distL="0" distR="0" wp14:anchorId="7E85B3BD" wp14:editId="6A4D56A4">
+          <wp:inline distT="0" distB="0" distL="0" distR="0" wp14:anchorId="3D9A8C43" wp14:editId="6D03B0D1">
             <wp:extent cx="5715000" cy="2486025"/>
             <wp:effectExtent l="0" t="0" r="0" b="0"/>
-            <wp:docPr id="267573727" name="Picture 267573727"/>
+            <wp:docPr id="1734771902" name="Picture 1734771902"/>
             <wp:cNvGraphicFramePr>
               <a:graphicFrameLocks xmlns:a="http://schemas.openxmlformats.org/drawingml/2006/main" noChangeAspect="1"/>
             </wp:cNvGraphicFramePr>
@@ -32212,10 +32274,10 @@
         </w:rPr>
         <w:lastRenderedPageBreak/>
         <w:drawing>
-          <wp:inline distT="0" distB="0" distL="0" distR="0" wp14:anchorId="3401B60F" wp14:editId="40B2272E">
+          <wp:inline distT="0" distB="0" distL="0" distR="0" wp14:anchorId="41A330E5" wp14:editId="2C979B7B">
             <wp:extent cx="5715000" cy="3238500"/>
             <wp:effectExtent l="0" t="0" r="0" b="0"/>
-            <wp:docPr id="725210577" name="Picture 725210577"/>
+            <wp:docPr id="1596650366" name="Picture 1596650366"/>
             <wp:cNvGraphicFramePr>
               <a:graphicFrameLocks xmlns:a="http://schemas.openxmlformats.org/drawingml/2006/main" noChangeAspect="1"/>
             </wp:cNvGraphicFramePr>
@@ -32306,10 +32368,10 @@
           <w:noProof/>
         </w:rPr>
         <w:drawing>
-          <wp:inline distT="0" distB="0" distL="0" distR="0" wp14:anchorId="0D95DF5D" wp14:editId="49A6A97C">
+          <wp:inline distT="0" distB="0" distL="0" distR="0" wp14:anchorId="4F3492CD" wp14:editId="2EF0A980">
             <wp:extent cx="5715000" cy="2486025"/>
             <wp:effectExtent l="0" t="0" r="0" b="0"/>
-            <wp:docPr id="132029186" name="Picture 132029186"/>
+            <wp:docPr id="1288020473" name="Picture 1288020473"/>
             <wp:cNvGraphicFramePr>
               <a:graphicFrameLocks xmlns:a="http://schemas.openxmlformats.org/drawingml/2006/main" noChangeAspect="1"/>
             </wp:cNvGraphicFramePr>
@@ -32429,10 +32491,10 @@
         </w:rPr>
         <w:lastRenderedPageBreak/>
         <w:drawing>
-          <wp:inline distT="0" distB="0" distL="0" distR="0" wp14:anchorId="19C0C474" wp14:editId="133D57C8">
+          <wp:inline distT="0" distB="0" distL="0" distR="0" wp14:anchorId="61A363F9" wp14:editId="543F2471">
             <wp:extent cx="5715000" cy="3057525"/>
             <wp:effectExtent l="0" t="0" r="0" b="0"/>
-            <wp:docPr id="1575516904" name="Picture 1575516904"/>
+            <wp:docPr id="1554028588" name="Picture 1554028588"/>
             <wp:cNvGraphicFramePr>
               <a:graphicFrameLocks xmlns:a="http://schemas.openxmlformats.org/drawingml/2006/main" noChangeAspect="1"/>
             </wp:cNvGraphicFramePr>
@@ -32513,7 +32575,7 @@
           <w:left w:w="10" w:type="dxa"/>
           <w:right w:w="10" w:type="dxa"/>
         </w:tblCellMar>
-        <w:tblLook w:val="0000" w:firstRow="0" w:lastRow="0" w:firstColumn="0" w:lastColumn="0" w:noHBand="0" w:noVBand="0"/>
+        <w:tblLook w:val="04A0" w:firstRow="1" w:lastRow="0" w:firstColumn="1" w:lastColumn="0" w:noHBand="0" w:noVBand="1"/>
       </w:tblPr>
       <w:tblGrid>
         <w:gridCol w:w="544"/>
@@ -33114,7 +33176,7 @@
         <w:spacing w:before="240" w:after="240"/>
         <w:jc w:val="center"/>
       </w:pPr>
-      <w:bookmarkStart w:id="45" w:name="_Toc240163617"/>
+      <w:bookmarkStart w:id="45" w:name="_Toc240164261"/>
       <w:r>
         <w:lastRenderedPageBreak/>
         <w:t>CHƯƠNG IV. KẾT LUẬN</w:t>
@@ -33126,7 +33188,7 @@
         <w:pStyle w:val="Heading2"/>
         <w:spacing w:before="240" w:after="120"/>
       </w:pPr>
-      <w:bookmarkStart w:id="46" w:name="_Toc240163618"/>
+      <w:bookmarkStart w:id="46" w:name="_Toc240164262"/>
       <w:r>
         <w:t>1. Kết quả đạt được</w:t>
       </w:r>
@@ -33181,7 +33243,7 @@
           <w:left w:w="10" w:type="dxa"/>
           <w:right w:w="10" w:type="dxa"/>
         </w:tblCellMar>
-        <w:tblLook w:val="0000" w:firstRow="0" w:lastRow="0" w:firstColumn="0" w:lastColumn="0" w:noHBand="0" w:noVBand="0"/>
+        <w:tblLook w:val="04A0" w:firstRow="1" w:lastRow="0" w:firstColumn="1" w:lastColumn="0" w:noHBand="0" w:noVBand="1"/>
       </w:tblPr>
       <w:tblGrid>
         <w:gridCol w:w="2358"/>
@@ -34162,7 +34224,7 @@
         <w:pStyle w:val="Heading2"/>
         <w:spacing w:before="240" w:after="120"/>
       </w:pPr>
-      <w:bookmarkStart w:id="47" w:name="_Toc240163619"/>
+      <w:bookmarkStart w:id="47" w:name="_Toc240164263"/>
       <w:r>
         <w:t>2. Những vấn đề đã gặp và cách khắc phục</w:t>
       </w:r>
@@ -34207,7 +34269,7 @@
           <w:left w:w="10" w:type="dxa"/>
           <w:right w:w="10" w:type="dxa"/>
         </w:tblCellMar>
-        <w:tblLook w:val="0000" w:firstRow="0" w:lastRow="0" w:firstColumn="0" w:lastColumn="0" w:noHBand="0" w:noVBand="0"/>
+        <w:tblLook w:val="04A0" w:firstRow="1" w:lastRow="0" w:firstColumn="1" w:lastColumn="0" w:noHBand="0" w:noVBand="1"/>
       </w:tblPr>
       <w:tblGrid>
         <w:gridCol w:w="2358"/>
@@ -34775,7 +34837,7 @@
         <w:pStyle w:val="Heading2"/>
         <w:spacing w:before="240" w:after="120"/>
       </w:pPr>
-      <w:bookmarkStart w:id="48" w:name="_Toc240163620"/>
+      <w:bookmarkStart w:id="48" w:name="_Toc240164264"/>
       <w:r>
         <w:t>3. Đánh giá</w:t>
       </w:r>
@@ -34978,7 +35040,7 @@
         <w:pStyle w:val="Heading2"/>
         <w:spacing w:before="240" w:after="120"/>
       </w:pPr>
-      <w:bookmarkStart w:id="49" w:name="_Toc240163621"/>
+      <w:bookmarkStart w:id="49" w:name="_Toc240164265"/>
       <w:r>
         <w:t>4. Hướng phát triển</w:t>
       </w:r>
@@ -35061,7 +35123,7 @@
         <w:spacing w:before="240" w:after="240"/>
         <w:jc w:val="center"/>
       </w:pPr>
-      <w:bookmarkStart w:id="50" w:name="_Toc240163622"/>
+      <w:bookmarkStart w:id="50" w:name="_Toc240164266"/>
       <w:r>
         <w:lastRenderedPageBreak/>
         <w:t>TÀI LIỆU THAM KHẢO</w:t>
@@ -35269,210 +35331,210 @@
 <file path=word/numbering.xml><?xml version="1.0" encoding="utf-8"?>
 <w:numbering xmlns:wpc="http://schemas.microsoft.com/office/word/2010/wordprocessingCanvas" xmlns:cx="http://schemas.microsoft.com/office/drawing/2014/chartex" xmlns:cx1="http://schemas.microsoft.com/office/drawing/2015/9/8/chartex" xmlns:cx2="http://schemas.microsoft.com/office/drawing/2015/10/21/chartex" xmlns:cx3="http://schemas.microsoft.com/office/drawing/2016/5/9/chartex" xmlns:cx4="http://schemas.microsoft.com/office/drawing/2016/5/10/chartex" xmlns:cx5="http://schemas.microsoft.com/office/drawing/2016/5/11/chartex" xmlns:cx6="http://schemas.microsoft.com/office/drawing/2016/5/12/chartex" xmlns:cx7="http://schemas.microsoft.com/office/drawing/2016/5/13/chartex" xmlns:cx8="http://schemas.microsoft.com/office/drawing/2016/5/14/chartex" xmlns:mc="http://schemas.openxmlformats.org/markup-compatibility/2006" xmlns:aink="http://schemas.microsoft.com/office/drawing/2016/ink" xmlns:am3d="http://schemas.microsoft.com/office/drawing/2017/model3d" xmlns:o="urn:schemas-microsoft-com:office:office" xmlns:oel="http://schemas.microsoft.com/office/2019/extlst" xmlns:r="http://schemas.openxmlformats.org/officeDocument/2006/relationships" xmlns:m="http://schemas.openxmlformats.org/officeDocument/2006/math" xmlns:v="urn:schemas-microsoft-com:vml" xmlns:wp14="http://schemas.microsoft.com/office/word/2010/wordprocessingDrawing" xmlns:wp="http://schemas.openxmlformats.org/drawingml/2006/wordprocessingDrawing" xmlns:w10="urn:schemas-microsoft-com:office:word" xmlns:w="http://schemas.openxmlformats.org/wordprocessingml/2006/main" xmlns:w14="http://schemas.microsoft.com/office/word/2010/wordml" xmlns:w15="http://schemas.microsoft.com/office/word/2012/wordml" xmlns:w16cex="http://schemas.microsoft.com/office/word/2018/wordml/cex" xmlns:w16cid="http://schemas.microsoft.com/office/word/2016/wordml/cid" xmlns:w16="http://schemas.microsoft.com/office/word/2018/wordml" xmlns:w16du="http://schemas.microsoft.com/office/word/2023/wordml/word16du" xmlns:w16sdtdh="http://schemas.microsoft.com/office/word/2020/wordml/sdtdatahash" xmlns:w16sdtfl="http://schemas.microsoft.com/office/word/2024/wordml/sdtformatlock" xmlns:w16se="http://schemas.microsoft.com/office/word/2015/wordml/symex" xmlns:wpg="http://schemas.microsoft.com/office/word/2010/wordprocessingGroup" xmlns:wpi="http://schemas.microsoft.com/office/word/2010/wordprocessingInk" xmlns:wne="http://schemas.microsoft.com/office/word/2006/wordml" xmlns:wps="http://schemas.microsoft.com/office/word/2010/wordprocessingShape" mc:Ignorable="w14 w15 w16se w16cid w16 w16cex w16sdtdh w16sdtfl w16du wp14">
   <w:abstractNum w:abstractNumId="0" w15:restartNumberingAfterBreak="0">
-    <w:nsid w:val="0E395847"/>
+    <w:nsid w:val="12F333AD"/>
     <w:multiLevelType w:val="hybridMultilevel"/>
-    <w:tmpl w:val="C1906C74"/>
-    <w:lvl w:ilvl="0" w:tplc="F77A8D7E">
+    <w:tmpl w:val="01E298BC"/>
+    <w:lvl w:ilvl="0" w:tplc="E1B0B0D8">
       <w:start w:val="1"/>
-      <w:numFmt w:val="decimal"/>
-      <w:lvlText w:val="%1."/>
+      <w:numFmt w:val="bullet"/>
+      <w:lvlText w:val="●"/>
       <w:lvlJc w:val="left"/>
       <w:pPr>
-        <w:ind w:left="648" w:hanging="360"/>
+        <w:ind w:left="720" w:hanging="360"/>
       </w:pPr>
     </w:lvl>
-    <w:lvl w:ilvl="1" w:tplc="B908DE04">
+    <w:lvl w:ilvl="1" w:tplc="E1C87AD8">
+      <w:start w:val="1"/>
+      <w:numFmt w:val="bullet"/>
+      <w:lvlText w:val="○"/>
+      <w:lvlJc w:val="left"/>
+      <w:pPr>
+        <w:ind w:left="1440" w:hanging="360"/>
+      </w:pPr>
+    </w:lvl>
+    <w:lvl w:ilvl="2" w:tplc="36A81AA6">
+      <w:start w:val="1"/>
+      <w:numFmt w:val="bullet"/>
+      <w:lvlText w:val="■"/>
+      <w:lvlJc w:val="left"/>
+      <w:pPr>
+        <w:ind w:left="2160" w:hanging="360"/>
+      </w:pPr>
+    </w:lvl>
+    <w:lvl w:ilvl="3" w:tplc="CA70DF7E">
+      <w:start w:val="1"/>
+      <w:numFmt w:val="bullet"/>
+      <w:lvlText w:val="●"/>
+      <w:lvlJc w:val="left"/>
+      <w:pPr>
+        <w:ind w:left="2880" w:hanging="360"/>
+      </w:pPr>
+    </w:lvl>
+    <w:lvl w:ilvl="4" w:tplc="86481818">
+      <w:start w:val="1"/>
+      <w:numFmt w:val="bullet"/>
+      <w:lvlText w:val="○"/>
+      <w:lvlJc w:val="left"/>
+      <w:pPr>
+        <w:ind w:left="3600" w:hanging="360"/>
+      </w:pPr>
+    </w:lvl>
+    <w:lvl w:ilvl="5" w:tplc="C040EE30">
+      <w:start w:val="1"/>
+      <w:numFmt w:val="bullet"/>
+      <w:lvlText w:val="■"/>
+      <w:lvlJc w:val="left"/>
+      <w:pPr>
+        <w:ind w:left="4320" w:hanging="360"/>
+      </w:pPr>
+    </w:lvl>
+    <w:lvl w:ilvl="6" w:tplc="3ECEBE70">
+      <w:start w:val="1"/>
+      <w:numFmt w:val="bullet"/>
+      <w:lvlText w:val="●"/>
+      <w:lvlJc w:val="left"/>
+      <w:pPr>
+        <w:ind w:left="5040" w:hanging="360"/>
+      </w:pPr>
+    </w:lvl>
+    <w:lvl w:ilvl="7" w:tplc="7B82882E">
+      <w:start w:val="1"/>
+      <w:numFmt w:val="bullet"/>
+      <w:lvlText w:val="●"/>
+      <w:lvlJc w:val="left"/>
+      <w:pPr>
+        <w:ind w:left="5760" w:hanging="360"/>
+      </w:pPr>
+    </w:lvl>
+    <w:lvl w:ilvl="8" w:tplc="B21A3862">
+      <w:start w:val="1"/>
+      <w:numFmt w:val="bullet"/>
+      <w:lvlText w:val="●"/>
+      <w:lvlJc w:val="left"/>
+      <w:pPr>
+        <w:ind w:left="6480" w:hanging="360"/>
+      </w:pPr>
+    </w:lvl>
+  </w:abstractNum>
+  <w:abstractNum w:abstractNumId="1" w15:restartNumberingAfterBreak="0">
+    <w:nsid w:val="1C8B3423"/>
+    <w:multiLevelType w:val="hybridMultilevel"/>
+    <w:tmpl w:val="DCCAF05E"/>
+    <w:lvl w:ilvl="0" w:tplc="01F458CA">
+      <w:start w:val="1"/>
+      <w:numFmt w:val="bullet"/>
+      <w:lvlText w:val="•"/>
+      <w:lvlJc w:val="left"/>
+      <w:pPr>
+        <w:ind w:left="648" w:hanging="316"/>
+      </w:pPr>
+    </w:lvl>
+    <w:lvl w:ilvl="1" w:tplc="98C2F4E2">
+      <w:start w:val="1"/>
+      <w:numFmt w:val="bullet"/>
+      <w:lvlText w:val="◦"/>
+      <w:lvlJc w:val="left"/>
+      <w:pPr>
+        <w:ind w:left="1152" w:hanging="316"/>
+      </w:pPr>
+    </w:lvl>
+    <w:lvl w:ilvl="2" w:tplc="13B46146">
       <w:numFmt w:val="decimal"/>
       <w:lvlText w:val=""/>
       <w:lvlJc w:val="left"/>
     </w:lvl>
-    <w:lvl w:ilvl="2" w:tplc="F838364E">
+    <w:lvl w:ilvl="3" w:tplc="4C84B254">
       <w:numFmt w:val="decimal"/>
       <w:lvlText w:val=""/>
       <w:lvlJc w:val="left"/>
     </w:lvl>
-    <w:lvl w:ilvl="3" w:tplc="B4662AE8">
+    <w:lvl w:ilvl="4" w:tplc="B5BED1F4">
       <w:numFmt w:val="decimal"/>
       <w:lvlText w:val=""/>
       <w:lvlJc w:val="left"/>
     </w:lvl>
-    <w:lvl w:ilvl="4" w:tplc="5844C408">
+    <w:lvl w:ilvl="5" w:tplc="399A5A34">
       <w:numFmt w:val="decimal"/>
       <w:lvlText w:val=""/>
       <w:lvlJc w:val="left"/>
     </w:lvl>
-    <w:lvl w:ilvl="5" w:tplc="FD8A346A">
+    <w:lvl w:ilvl="6" w:tplc="D81402EC">
       <w:numFmt w:val="decimal"/>
       <w:lvlText w:val=""/>
       <w:lvlJc w:val="left"/>
     </w:lvl>
-    <w:lvl w:ilvl="6" w:tplc="2DFC850C">
+    <w:lvl w:ilvl="7" w:tplc="620CD894">
       <w:numFmt w:val="decimal"/>
       <w:lvlText w:val=""/>
       <w:lvlJc w:val="left"/>
     </w:lvl>
-    <w:lvl w:ilvl="7" w:tplc="884A0D7C">
-      <w:numFmt w:val="decimal"/>
-      <w:lvlText w:val=""/>
-      <w:lvlJc w:val="left"/>
-    </w:lvl>
-    <w:lvl w:ilvl="8" w:tplc="B9349388">
-      <w:numFmt w:val="decimal"/>
-      <w:lvlText w:val=""/>
-      <w:lvlJc w:val="left"/>
-    </w:lvl>
-  </w:abstractNum>
-  <w:abstractNum w:abstractNumId="1" w15:restartNumberingAfterBreak="0">
-    <w:nsid w:val="643F0A98"/>
-    <w:multiLevelType w:val="hybridMultilevel"/>
-    <w:tmpl w:val="1938CBBA"/>
-    <w:lvl w:ilvl="0" w:tplc="4F8ABD44">
-      <w:start w:val="1"/>
-      <w:numFmt w:val="bullet"/>
-      <w:lvlText w:val="•"/>
-      <w:lvlJc w:val="left"/>
-      <w:pPr>
-        <w:ind w:left="648" w:hanging="316"/>
-      </w:pPr>
-    </w:lvl>
-    <w:lvl w:ilvl="1" w:tplc="7B828A1E">
-      <w:start w:val="1"/>
-      <w:numFmt w:val="bullet"/>
-      <w:lvlText w:val="◦"/>
-      <w:lvlJc w:val="left"/>
-      <w:pPr>
-        <w:ind w:left="1152" w:hanging="316"/>
-      </w:pPr>
-    </w:lvl>
-    <w:lvl w:ilvl="2" w:tplc="351494DC">
-      <w:numFmt w:val="decimal"/>
-      <w:lvlText w:val=""/>
-      <w:lvlJc w:val="left"/>
-    </w:lvl>
-    <w:lvl w:ilvl="3" w:tplc="5AD62F2E">
-      <w:numFmt w:val="decimal"/>
-      <w:lvlText w:val=""/>
-      <w:lvlJc w:val="left"/>
-    </w:lvl>
-    <w:lvl w:ilvl="4" w:tplc="81089BFC">
-      <w:numFmt w:val="decimal"/>
-      <w:lvlText w:val=""/>
-      <w:lvlJc w:val="left"/>
-    </w:lvl>
-    <w:lvl w:ilvl="5" w:tplc="824E7F5C">
-      <w:numFmt w:val="decimal"/>
-      <w:lvlText w:val=""/>
-      <w:lvlJc w:val="left"/>
-    </w:lvl>
-    <w:lvl w:ilvl="6" w:tplc="5C9AECC2">
-      <w:numFmt w:val="decimal"/>
-      <w:lvlText w:val=""/>
-      <w:lvlJc w:val="left"/>
-    </w:lvl>
-    <w:lvl w:ilvl="7" w:tplc="613EDB02">
-      <w:numFmt w:val="decimal"/>
-      <w:lvlText w:val=""/>
-      <w:lvlJc w:val="left"/>
-    </w:lvl>
-    <w:lvl w:ilvl="8" w:tplc="88801764">
+    <w:lvl w:ilvl="8" w:tplc="576C2458">
       <w:numFmt w:val="decimal"/>
       <w:lvlText w:val=""/>
       <w:lvlJc w:val="left"/>
     </w:lvl>
   </w:abstractNum>
   <w:abstractNum w:abstractNumId="2" w15:restartNumberingAfterBreak="0">
-    <w:nsid w:val="674937B8"/>
+    <w:nsid w:val="29B77A6E"/>
     <w:multiLevelType w:val="hybridMultilevel"/>
-    <w:tmpl w:val="B0509C66"/>
-    <w:lvl w:ilvl="0" w:tplc="738410FC">
+    <w:tmpl w:val="55A075CC"/>
+    <w:lvl w:ilvl="0" w:tplc="AF92FC68">
       <w:start w:val="1"/>
-      <w:numFmt w:val="bullet"/>
-      <w:lvlText w:val="●"/>
+      <w:numFmt w:val="decimal"/>
+      <w:lvlText w:val="%1."/>
       <w:lvlJc w:val="left"/>
       <w:pPr>
-        <w:ind w:left="720" w:hanging="360"/>
+        <w:ind w:left="648" w:hanging="360"/>
       </w:pPr>
     </w:lvl>
-    <w:lvl w:ilvl="1" w:tplc="E558207E">
-      <w:start w:val="1"/>
-      <w:numFmt w:val="bullet"/>
-      <w:lvlText w:val="○"/>
+    <w:lvl w:ilvl="1" w:tplc="E95E7FE4">
+      <w:numFmt w:val="decimal"/>
+      <w:lvlText w:val=""/>
       <w:lvlJc w:val="left"/>
-      <w:pPr>
-        <w:ind w:left="1440" w:hanging="360"/>
-      </w:pPr>
     </w:lvl>
-    <w:lvl w:ilvl="2" w:tplc="CA84CE3A">
-      <w:start w:val="1"/>
-      <w:numFmt w:val="bullet"/>
-      <w:lvlText w:val="■"/>
+    <w:lvl w:ilvl="2" w:tplc="C0DC3C46">
+      <w:numFmt w:val="decimal"/>
+      <w:lvlText w:val=""/>
       <w:lvlJc w:val="left"/>
-      <w:pPr>
-        <w:ind w:left="2160" w:hanging="360"/>
-      </w:pPr>
     </w:lvl>
-    <w:lvl w:ilvl="3" w:tplc="02F4B510">
-      <w:start w:val="1"/>
-      <w:numFmt w:val="bullet"/>
-      <w:lvlText w:val="●"/>
+    <w:lvl w:ilvl="3" w:tplc="97B43A70">
+      <w:numFmt w:val="decimal"/>
+      <w:lvlText w:val=""/>
       <w:lvlJc w:val="left"/>
-      <w:pPr>
-        <w:ind w:left="2880" w:hanging="360"/>
-      </w:pPr>
     </w:lvl>
-    <w:lvl w:ilvl="4" w:tplc="D752FA4A">
-      <w:start w:val="1"/>
-      <w:numFmt w:val="bullet"/>
-      <w:lvlText w:val="○"/>
+    <w:lvl w:ilvl="4" w:tplc="3B582940">
+      <w:numFmt w:val="decimal"/>
+      <w:lvlText w:val=""/>
       <w:lvlJc w:val="left"/>
-      <w:pPr>
-        <w:ind w:left="3600" w:hanging="360"/>
-      </w:pPr>
     </w:lvl>
-    <w:lvl w:ilvl="5" w:tplc="74AC4B4C">
-      <w:start w:val="1"/>
-      <w:numFmt w:val="bullet"/>
-      <w:lvlText w:val="■"/>
+    <w:lvl w:ilvl="5" w:tplc="C36EE944">
+      <w:numFmt w:val="decimal"/>
+      <w:lvlText w:val=""/>
       <w:lvlJc w:val="left"/>
-      <w:pPr>
-        <w:ind w:left="4320" w:hanging="360"/>
-      </w:pPr>
     </w:lvl>
-    <w:lvl w:ilvl="6" w:tplc="FA20613E">
-      <w:start w:val="1"/>
-      <w:numFmt w:val="bullet"/>
-      <w:lvlText w:val="●"/>
+    <w:lvl w:ilvl="6" w:tplc="65C830E0">
+      <w:numFmt w:val="decimal"/>
+      <w:lvlText w:val=""/>
       <w:lvlJc w:val="left"/>
-      <w:pPr>
-        <w:ind w:left="5040" w:hanging="360"/>
-      </w:pPr>
     </w:lvl>
-    <w:lvl w:ilvl="7" w:tplc="0838CF9C">
-      <w:start w:val="1"/>
-      <w:numFmt w:val="bullet"/>
-      <w:lvlText w:val="●"/>
+    <w:lvl w:ilvl="7" w:tplc="84368504">
+      <w:numFmt w:val="decimal"/>
+      <w:lvlText w:val=""/>
       <w:lvlJc w:val="left"/>
-      <w:pPr>
-        <w:ind w:left="5760" w:hanging="360"/>
-      </w:pPr>
     </w:lvl>
-    <w:lvl w:ilvl="8" w:tplc="2F52BCE8">
-      <w:start w:val="1"/>
-      <w:numFmt w:val="bullet"/>
-      <w:lvlText w:val="●"/>
+    <w:lvl w:ilvl="8" w:tplc="6D1C47A0">
+      <w:numFmt w:val="decimal"/>
+      <w:lvlText w:val=""/>
       <w:lvlJc w:val="left"/>
-      <w:pPr>
-        <w:ind w:left="6480" w:hanging="360"/>
-      </w:pPr>
     </w:lvl>
   </w:abstractNum>
-  <w:num w:numId="1" w16cid:durableId="747917970">
-    <w:abstractNumId w:val="2"/>
+  <w:num w:numId="1" w16cid:durableId="473136048">
+    <w:abstractNumId w:val="0"/>
     <w:lvlOverride w:ilvl="0">
       <w:startOverride w:val="1"/>
     </w:lvlOverride>
   </w:num>
-  <w:num w:numId="2" w16cid:durableId="809859204">
+  <w:num w:numId="2" w16cid:durableId="625620138">
     <w:abstractNumId w:val="1"/>
     <w:lvlOverride w:ilvl="0">
       <w:startOverride w:val="1"/>
@@ -36088,7 +36150,7 @@
     <w:autoRedefine/>
     <w:uiPriority w:val="39"/>
     <w:unhideWhenUsed/>
-    <w:rsid w:val="002E1E36"/>
+    <w:rsid w:val="00AF02B4"/>
     <w:pPr>
       <w:spacing w:after="100"/>
     </w:pPr>
@@ -36100,7 +36162,7 @@
     <w:autoRedefine/>
     <w:uiPriority w:val="39"/>
     <w:unhideWhenUsed/>
-    <w:rsid w:val="002E1E36"/>
+    <w:rsid w:val="00AF02B4"/>
     <w:pPr>
       <w:spacing w:after="100"/>
       <w:ind w:left="260"/>
@@ -36113,7 +36175,7 @@
     <w:autoRedefine/>
     <w:uiPriority w:val="39"/>
     <w:unhideWhenUsed/>
-    <w:rsid w:val="002E1E36"/>
+    <w:rsid w:val="00AF02B4"/>
     <w:pPr>
       <w:spacing w:after="100"/>
       <w:ind w:left="520"/>

</xml_diff>

<commit_message>
Dựng lại báo cáo với danh sách hình bảng đã rút gọn
64 trang, mục lục cập nhật số trang. Danh sách hình và bảng gọn trong
hai trang thay vì ba, mỗi mục một dòng.

Co-Authored-By: Claude Opus 5 <noreply@anthropic.com>
</commit_message>
<xml_diff>
--- a/Do an cuoi ki/BaoCao_DoAn_CSDLPhanTan.docx
+++ b/Do an cuoi ki/BaoCao_DoAn_CSDLPhanTan.docx
@@ -320,7 +320,7 @@
     <w:sdt>
       <w:sdtPr>
         <w:alias w:val="Muc luc"/>
-        <w:id w:val="-576595696"/>
+        <w:id w:val="1190804282"/>
       </w:sdtPr>
       <w:sdtEndPr/>
       <w:sdtContent>
@@ -370,7 +370,7 @@
             <w:rPr>
               <w:noProof/>
             </w:rPr>
-            <w:instrText xml:space="preserve"> PAGEREF _Toc240201311 \h </w:instrText>
+            <w:instrText xml:space="preserve"> PAGEREF _Toc240203042 \h </w:instrText>
           </w:r>
           <w:r>
             <w:rPr>
@@ -433,7 +433,7 @@
             <w:rPr>
               <w:noProof/>
             </w:rPr>
-            <w:instrText xml:space="preserve"> PAGEREF _Toc240201312 \h </w:instrText>
+            <w:instrText xml:space="preserve"> PAGEREF _Toc240203043 \h </w:instrText>
           </w:r>
           <w:r>
             <w:rPr>
@@ -496,7 +496,7 @@
             <w:rPr>
               <w:noProof/>
             </w:rPr>
-            <w:instrText xml:space="preserve"> PAGEREF _Toc240201313 \h </w:instrText>
+            <w:instrText xml:space="preserve"> PAGEREF _Toc240203044 \h </w:instrText>
           </w:r>
           <w:r>
             <w:rPr>
@@ -559,7 +559,7 @@
             <w:rPr>
               <w:noProof/>
             </w:rPr>
-            <w:instrText xml:space="preserve"> PAGEREF _Toc240201314 \h </w:instrText>
+            <w:instrText xml:space="preserve"> PAGEREF _Toc240203045 \h </w:instrText>
           </w:r>
           <w:r>
             <w:rPr>
@@ -576,7 +576,7 @@
             <w:rPr>
               <w:noProof/>
             </w:rPr>
-            <w:t>7</w:t>
+            <w:t>6</w:t>
           </w:r>
           <w:r>
             <w:rPr>
@@ -622,7 +622,7 @@
             <w:rPr>
               <w:noProof/>
             </w:rPr>
-            <w:instrText xml:space="preserve"> PAGEREF _Toc240201315 \h </w:instrText>
+            <w:instrText xml:space="preserve"> PAGEREF _Toc240203046 \h </w:instrText>
           </w:r>
           <w:r>
             <w:rPr>
@@ -639,7 +639,7 @@
             <w:rPr>
               <w:noProof/>
             </w:rPr>
-            <w:t>8</w:t>
+            <w:t>7</w:t>
           </w:r>
           <w:r>
             <w:rPr>
@@ -685,7 +685,7 @@
             <w:rPr>
               <w:noProof/>
             </w:rPr>
-            <w:instrText xml:space="preserve"> PAGEREF _Toc240201316 \h </w:instrText>
+            <w:instrText xml:space="preserve"> PAGEREF _Toc240203047 \h </w:instrText>
           </w:r>
           <w:r>
             <w:rPr>
@@ -702,7 +702,7 @@
             <w:rPr>
               <w:noProof/>
             </w:rPr>
-            <w:t>8</w:t>
+            <w:t>7</w:t>
           </w:r>
           <w:r>
             <w:rPr>
@@ -750,7 +750,7 @@
             <w:rPr>
               <w:noProof/>
             </w:rPr>
-            <w:instrText xml:space="preserve"> PAGEREF _Toc240201317 \h </w:instrText>
+            <w:instrText xml:space="preserve"> PAGEREF _Toc240203048 \h </w:instrText>
           </w:r>
           <w:r>
             <w:rPr>
@@ -767,7 +767,7 @@
             <w:rPr>
               <w:noProof/>
             </w:rPr>
-            <w:t>8</w:t>
+            <w:t>7</w:t>
           </w:r>
           <w:r>
             <w:rPr>
@@ -815,7 +815,7 @@
             <w:rPr>
               <w:noProof/>
             </w:rPr>
-            <w:instrText xml:space="preserve"> PAGEREF _Toc240201318 \h </w:instrText>
+            <w:instrText xml:space="preserve"> PAGEREF _Toc240203049 \h </w:instrText>
           </w:r>
           <w:r>
             <w:rPr>
@@ -832,7 +832,7 @@
             <w:rPr>
               <w:noProof/>
             </w:rPr>
-            <w:t>8</w:t>
+            <w:t>7</w:t>
           </w:r>
           <w:r>
             <w:rPr>
@@ -880,7 +880,7 @@
             <w:rPr>
               <w:noProof/>
             </w:rPr>
-            <w:instrText xml:space="preserve"> PAGEREF _Toc240201319 \h </w:instrText>
+            <w:instrText xml:space="preserve"> PAGEREF _Toc240203050 \h </w:instrText>
           </w:r>
           <w:r>
             <w:rPr>
@@ -897,7 +897,7 @@
             <w:rPr>
               <w:noProof/>
             </w:rPr>
-            <w:t>8</w:t>
+            <w:t>7</w:t>
           </w:r>
           <w:r>
             <w:rPr>
@@ -945,7 +945,7 @@
             <w:rPr>
               <w:noProof/>
             </w:rPr>
-            <w:instrText xml:space="preserve"> PAGEREF _Toc240201320 \h </w:instrText>
+            <w:instrText xml:space="preserve"> PAGEREF _Toc240203051 \h </w:instrText>
           </w:r>
           <w:r>
             <w:rPr>
@@ -962,7 +962,7 @@
             <w:rPr>
               <w:noProof/>
             </w:rPr>
-            <w:t>9</w:t>
+            <w:t>8</w:t>
           </w:r>
           <w:r>
             <w:rPr>
@@ -1010,7 +1010,7 @@
             <w:rPr>
               <w:noProof/>
             </w:rPr>
-            <w:instrText xml:space="preserve"> PAGEREF _Toc240201321 \h </w:instrText>
+            <w:instrText xml:space="preserve"> PAGEREF _Toc240203052 \h </w:instrText>
           </w:r>
           <w:r>
             <w:rPr>
@@ -1027,7 +1027,7 @@
             <w:rPr>
               <w:noProof/>
             </w:rPr>
-            <w:t>10</w:t>
+            <w:t>9</w:t>
           </w:r>
           <w:r>
             <w:rPr>
@@ -1075,7 +1075,7 @@
             <w:rPr>
               <w:noProof/>
             </w:rPr>
-            <w:instrText xml:space="preserve"> PAGEREF _Toc240201322 \h </w:instrText>
+            <w:instrText xml:space="preserve"> PAGEREF _Toc240203053 \h </w:instrText>
           </w:r>
           <w:r>
             <w:rPr>
@@ -1092,7 +1092,7 @@
             <w:rPr>
               <w:noProof/>
             </w:rPr>
-            <w:t>10</w:t>
+            <w:t>9</w:t>
           </w:r>
           <w:r>
             <w:rPr>
@@ -1138,7 +1138,7 @@
             <w:rPr>
               <w:noProof/>
             </w:rPr>
-            <w:instrText xml:space="preserve"> PAGEREF _Toc240201323 \h </w:instrText>
+            <w:instrText xml:space="preserve"> PAGEREF _Toc240203054 \h </w:instrText>
           </w:r>
           <w:r>
             <w:rPr>
@@ -1155,7 +1155,7 @@
             <w:rPr>
               <w:noProof/>
             </w:rPr>
-            <w:t>11</w:t>
+            <w:t>10</w:t>
           </w:r>
           <w:r>
             <w:rPr>
@@ -1203,7 +1203,7 @@
             <w:rPr>
               <w:noProof/>
             </w:rPr>
-            <w:instrText xml:space="preserve"> PAGEREF _Toc240201324 \h </w:instrText>
+            <w:instrText xml:space="preserve"> PAGEREF _Toc240203055 \h </w:instrText>
           </w:r>
           <w:r>
             <w:rPr>
@@ -1220,7 +1220,7 @@
             <w:rPr>
               <w:noProof/>
             </w:rPr>
-            <w:t>11</w:t>
+            <w:t>10</w:t>
           </w:r>
           <w:r>
             <w:rPr>
@@ -1268,7 +1268,7 @@
             <w:rPr>
               <w:noProof/>
             </w:rPr>
-            <w:instrText xml:space="preserve"> PAGEREF _Toc240201325 \h </w:instrText>
+            <w:instrText xml:space="preserve"> PAGEREF _Toc240203056 \h </w:instrText>
           </w:r>
           <w:r>
             <w:rPr>
@@ -1285,7 +1285,7 @@
             <w:rPr>
               <w:noProof/>
             </w:rPr>
-            <w:t>11</w:t>
+            <w:t>10</w:t>
           </w:r>
           <w:r>
             <w:rPr>
@@ -1333,7 +1333,7 @@
             <w:rPr>
               <w:noProof/>
             </w:rPr>
-            <w:instrText xml:space="preserve"> PAGEREF _Toc240201326 \h </w:instrText>
+            <w:instrText xml:space="preserve"> PAGEREF _Toc240203057 \h </w:instrText>
           </w:r>
           <w:r>
             <w:rPr>
@@ -1350,7 +1350,7 @@
             <w:rPr>
               <w:noProof/>
             </w:rPr>
-            <w:t>11</w:t>
+            <w:t>10</w:t>
           </w:r>
           <w:r>
             <w:rPr>
@@ -1398,7 +1398,7 @@
             <w:rPr>
               <w:noProof/>
             </w:rPr>
-            <w:instrText xml:space="preserve"> PAGEREF _Toc240201327 \h </w:instrText>
+            <w:instrText xml:space="preserve"> PAGEREF _Toc240203058 \h </w:instrText>
           </w:r>
           <w:r>
             <w:rPr>
@@ -1415,7 +1415,7 @@
             <w:rPr>
               <w:noProof/>
             </w:rPr>
-            <w:t>12</w:t>
+            <w:t>11</w:t>
           </w:r>
           <w:r>
             <w:rPr>
@@ -1463,7 +1463,7 @@
             <w:rPr>
               <w:noProof/>
             </w:rPr>
-            <w:instrText xml:space="preserve"> PAGEREF _Toc240201328 \h </w:instrText>
+            <w:instrText xml:space="preserve"> PAGEREF _Toc240203059 \h </w:instrText>
           </w:r>
           <w:r>
             <w:rPr>
@@ -1480,7 +1480,7 @@
             <w:rPr>
               <w:noProof/>
             </w:rPr>
-            <w:t>12</w:t>
+            <w:t>11</w:t>
           </w:r>
           <w:r>
             <w:rPr>
@@ -1528,7 +1528,7 @@
             <w:rPr>
               <w:noProof/>
             </w:rPr>
-            <w:instrText xml:space="preserve"> PAGEREF _Toc240201329 \h </w:instrText>
+            <w:instrText xml:space="preserve"> PAGEREF _Toc240203060 \h </w:instrText>
           </w:r>
           <w:r>
             <w:rPr>
@@ -1545,7 +1545,7 @@
             <w:rPr>
               <w:noProof/>
             </w:rPr>
-            <w:t>13</w:t>
+            <w:t>12</w:t>
           </w:r>
           <w:r>
             <w:rPr>
@@ -1591,7 +1591,7 @@
             <w:rPr>
               <w:noProof/>
             </w:rPr>
-            <w:instrText xml:space="preserve"> PAGEREF _Toc240201330 \h </w:instrText>
+            <w:instrText xml:space="preserve"> PAGEREF _Toc240203061 \h </w:instrText>
           </w:r>
           <w:r>
             <w:rPr>
@@ -1608,7 +1608,7 @@
             <w:rPr>
               <w:noProof/>
             </w:rPr>
-            <w:t>14</w:t>
+            <w:t>13</w:t>
           </w:r>
           <w:r>
             <w:rPr>
@@ -1654,7 +1654,7 @@
             <w:rPr>
               <w:noProof/>
             </w:rPr>
-            <w:instrText xml:space="preserve"> PAGEREF _Toc240201331 \h </w:instrText>
+            <w:instrText xml:space="preserve"> PAGEREF _Toc240203062 \h </w:instrText>
           </w:r>
           <w:r>
             <w:rPr>
@@ -1671,7 +1671,7 @@
             <w:rPr>
               <w:noProof/>
             </w:rPr>
-            <w:t>14</w:t>
+            <w:t>13</w:t>
           </w:r>
           <w:r>
             <w:rPr>
@@ -1719,7 +1719,7 @@
             <w:rPr>
               <w:noProof/>
             </w:rPr>
-            <w:instrText xml:space="preserve"> PAGEREF _Toc240201332 \h </w:instrText>
+            <w:instrText xml:space="preserve"> PAGEREF _Toc240203063 \h </w:instrText>
           </w:r>
           <w:r>
             <w:rPr>
@@ -1736,7 +1736,7 @@
             <w:rPr>
               <w:noProof/>
             </w:rPr>
-            <w:t>14</w:t>
+            <w:t>13</w:t>
           </w:r>
           <w:r>
             <w:rPr>
@@ -1784,7 +1784,7 @@
             <w:rPr>
               <w:noProof/>
             </w:rPr>
-            <w:instrText xml:space="preserve"> PAGEREF _Toc240201333 \h </w:instrText>
+            <w:instrText xml:space="preserve"> PAGEREF _Toc240203064 \h </w:instrText>
           </w:r>
           <w:r>
             <w:rPr>
@@ -1801,7 +1801,7 @@
             <w:rPr>
               <w:noProof/>
             </w:rPr>
-            <w:t>14</w:t>
+            <w:t>13</w:t>
           </w:r>
           <w:r>
             <w:rPr>
@@ -1849,7 +1849,7 @@
             <w:rPr>
               <w:noProof/>
             </w:rPr>
-            <w:instrText xml:space="preserve"> PAGEREF _Toc240201334 \h </w:instrText>
+            <w:instrText xml:space="preserve"> PAGEREF _Toc240203065 \h </w:instrText>
           </w:r>
           <w:r>
             <w:rPr>
@@ -1866,7 +1866,7 @@
             <w:rPr>
               <w:noProof/>
             </w:rPr>
-            <w:t>15</w:t>
+            <w:t>14</w:t>
           </w:r>
           <w:r>
             <w:rPr>
@@ -1914,7 +1914,7 @@
             <w:rPr>
               <w:noProof/>
             </w:rPr>
-            <w:instrText xml:space="preserve"> PAGEREF _Toc240201335 \h </w:instrText>
+            <w:instrText xml:space="preserve"> PAGEREF _Toc240203066 \h </w:instrText>
           </w:r>
           <w:r>
             <w:rPr>
@@ -1931,7 +1931,7 @@
             <w:rPr>
               <w:noProof/>
             </w:rPr>
-            <w:t>15</w:t>
+            <w:t>14</w:t>
           </w:r>
           <w:r>
             <w:rPr>
@@ -1979,7 +1979,7 @@
             <w:rPr>
               <w:noProof/>
             </w:rPr>
-            <w:instrText xml:space="preserve"> PAGEREF _Toc240201336 \h </w:instrText>
+            <w:instrText xml:space="preserve"> PAGEREF _Toc240203067 \h </w:instrText>
           </w:r>
           <w:r>
             <w:rPr>
@@ -1996,7 +1996,7 @@
             <w:rPr>
               <w:noProof/>
             </w:rPr>
-            <w:t>16</w:t>
+            <w:t>15</w:t>
           </w:r>
           <w:r>
             <w:rPr>
@@ -2044,7 +2044,7 @@
             <w:rPr>
               <w:noProof/>
             </w:rPr>
-            <w:instrText xml:space="preserve"> PAGEREF _Toc240201337 \h </w:instrText>
+            <w:instrText xml:space="preserve"> PAGEREF _Toc240203068 \h </w:instrText>
           </w:r>
           <w:r>
             <w:rPr>
@@ -2061,7 +2061,7 @@
             <w:rPr>
               <w:noProof/>
             </w:rPr>
-            <w:t>16</w:t>
+            <w:t>15</w:t>
           </w:r>
           <w:r>
             <w:rPr>
@@ -2107,7 +2107,7 @@
             <w:rPr>
               <w:noProof/>
             </w:rPr>
-            <w:instrText xml:space="preserve"> PAGEREF _Toc240201338 \h </w:instrText>
+            <w:instrText xml:space="preserve"> PAGEREF _Toc240203069 \h </w:instrText>
           </w:r>
           <w:r>
             <w:rPr>
@@ -2124,7 +2124,7 @@
             <w:rPr>
               <w:noProof/>
             </w:rPr>
-            <w:t>18</w:t>
+            <w:t>17</w:t>
           </w:r>
           <w:r>
             <w:rPr>
@@ -2172,7 +2172,7 @@
             <w:rPr>
               <w:noProof/>
             </w:rPr>
-            <w:instrText xml:space="preserve"> PAGEREF _Toc240201339 \h </w:instrText>
+            <w:instrText xml:space="preserve"> PAGEREF _Toc240203070 \h </w:instrText>
           </w:r>
           <w:r>
             <w:rPr>
@@ -2189,7 +2189,7 @@
             <w:rPr>
               <w:noProof/>
             </w:rPr>
-            <w:t>18</w:t>
+            <w:t>17</w:t>
           </w:r>
           <w:r>
             <w:rPr>
@@ -2237,7 +2237,7 @@
             <w:rPr>
               <w:noProof/>
             </w:rPr>
-            <w:instrText xml:space="preserve"> PAGEREF _Toc240201340 \h </w:instrText>
+            <w:instrText xml:space="preserve"> PAGEREF _Toc240203071 \h </w:instrText>
           </w:r>
           <w:r>
             <w:rPr>
@@ -2254,7 +2254,7 @@
             <w:rPr>
               <w:noProof/>
             </w:rPr>
-            <w:t>20</w:t>
+            <w:t>19</w:t>
           </w:r>
           <w:r>
             <w:rPr>
@@ -2302,7 +2302,7 @@
             <w:rPr>
               <w:noProof/>
             </w:rPr>
-            <w:instrText xml:space="preserve"> PAGEREF _Toc240201341 \h </w:instrText>
+            <w:instrText xml:space="preserve"> PAGEREF _Toc240203072 \h </w:instrText>
           </w:r>
           <w:r>
             <w:rPr>
@@ -2319,7 +2319,7 @@
             <w:rPr>
               <w:noProof/>
             </w:rPr>
-            <w:t>20</w:t>
+            <w:t>19</w:t>
           </w:r>
           <w:r>
             <w:rPr>
@@ -2367,7 +2367,7 @@
             <w:rPr>
               <w:noProof/>
             </w:rPr>
-            <w:instrText xml:space="preserve"> PAGEREF _Toc240201342 \h </w:instrText>
+            <w:instrText xml:space="preserve"> PAGEREF _Toc240203073 \h </w:instrText>
           </w:r>
           <w:r>
             <w:rPr>
@@ -2384,7 +2384,7 @@
             <w:rPr>
               <w:noProof/>
             </w:rPr>
-            <w:t>20</w:t>
+            <w:t>19</w:t>
           </w:r>
           <w:r>
             <w:rPr>
@@ -2432,7 +2432,7 @@
             <w:rPr>
               <w:noProof/>
             </w:rPr>
-            <w:instrText xml:space="preserve"> PAGEREF _Toc240201343 \h </w:instrText>
+            <w:instrText xml:space="preserve"> PAGEREF _Toc240203074 \h </w:instrText>
           </w:r>
           <w:r>
             <w:rPr>
@@ -2449,7 +2449,7 @@
             <w:rPr>
               <w:noProof/>
             </w:rPr>
-            <w:t>21</w:t>
+            <w:t>20</w:t>
           </w:r>
           <w:r>
             <w:rPr>
@@ -2497,7 +2497,7 @@
             <w:rPr>
               <w:noProof/>
             </w:rPr>
-            <w:instrText xml:space="preserve"> PAGEREF _Toc240201344 \h </w:instrText>
+            <w:instrText xml:space="preserve"> PAGEREF _Toc240203075 \h </w:instrText>
           </w:r>
           <w:r>
             <w:rPr>
@@ -2514,7 +2514,7 @@
             <w:rPr>
               <w:noProof/>
             </w:rPr>
-            <w:t>22</w:t>
+            <w:t>21</w:t>
           </w:r>
           <w:r>
             <w:rPr>
@@ -2563,7 +2563,7 @@
             <w:rPr>
               <w:noProof/>
             </w:rPr>
-            <w:instrText xml:space="preserve"> PAGEREF _Toc240201345 \h </w:instrText>
+            <w:instrText xml:space="preserve"> PAGEREF _Toc240203076 \h </w:instrText>
           </w:r>
           <w:r>
             <w:rPr>
@@ -2580,7 +2580,7 @@
             <w:rPr>
               <w:noProof/>
             </w:rPr>
-            <w:t>23</w:t>
+            <w:t>22</w:t>
           </w:r>
           <w:r>
             <w:rPr>
@@ -2628,7 +2628,7 @@
             <w:rPr>
               <w:noProof/>
             </w:rPr>
-            <w:instrText xml:space="preserve"> PAGEREF _Toc240201346 \h </w:instrText>
+            <w:instrText xml:space="preserve"> PAGEREF _Toc240203077 \h </w:instrText>
           </w:r>
           <w:r>
             <w:rPr>
@@ -2645,7 +2645,7 @@
             <w:rPr>
               <w:noProof/>
             </w:rPr>
-            <w:t>23</w:t>
+            <w:t>22</w:t>
           </w:r>
           <w:r>
             <w:rPr>
@@ -2691,7 +2691,7 @@
             <w:rPr>
               <w:noProof/>
             </w:rPr>
-            <w:instrText xml:space="preserve"> PAGEREF _Toc240201347 \h </w:instrText>
+            <w:instrText xml:space="preserve"> PAGEREF _Toc240203078 \h </w:instrText>
           </w:r>
           <w:r>
             <w:rPr>
@@ -2708,7 +2708,7 @@
             <w:rPr>
               <w:noProof/>
             </w:rPr>
-            <w:t>25</w:t>
+            <w:t>24</w:t>
           </w:r>
           <w:r>
             <w:rPr>
@@ -2754,7 +2754,7 @@
             <w:rPr>
               <w:noProof/>
             </w:rPr>
-            <w:instrText xml:space="preserve"> PAGEREF _Toc240201348 \h </w:instrText>
+            <w:instrText xml:space="preserve"> PAGEREF _Toc240203079 \h </w:instrText>
           </w:r>
           <w:r>
             <w:rPr>
@@ -2771,7 +2771,7 @@
             <w:rPr>
               <w:noProof/>
             </w:rPr>
-            <w:t>25</w:t>
+            <w:t>24</w:t>
           </w:r>
           <w:r>
             <w:rPr>
@@ -2817,7 +2817,7 @@
             <w:rPr>
               <w:noProof/>
             </w:rPr>
-            <w:instrText xml:space="preserve"> PAGEREF _Toc240201349 \h </w:instrText>
+            <w:instrText xml:space="preserve"> PAGEREF _Toc240203080 \h </w:instrText>
           </w:r>
           <w:r>
             <w:rPr>
@@ -2834,7 +2834,7 @@
             <w:rPr>
               <w:noProof/>
             </w:rPr>
-            <w:t>26</w:t>
+            <w:t>25</w:t>
           </w:r>
           <w:r>
             <w:rPr>
@@ -2880,7 +2880,7 @@
             <w:rPr>
               <w:noProof/>
             </w:rPr>
-            <w:instrText xml:space="preserve"> PAGEREF _Toc240201350 \h </w:instrText>
+            <w:instrText xml:space="preserve"> PAGEREF _Toc240203081 \h </w:instrText>
           </w:r>
           <w:r>
             <w:rPr>
@@ -2897,7 +2897,7 @@
             <w:rPr>
               <w:noProof/>
             </w:rPr>
-            <w:t>30</w:t>
+            <w:t>29</w:t>
           </w:r>
           <w:r>
             <w:rPr>
@@ -2943,7 +2943,7 @@
             <w:rPr>
               <w:noProof/>
             </w:rPr>
-            <w:instrText xml:space="preserve"> PAGEREF _Toc240201351 \h </w:instrText>
+            <w:instrText xml:space="preserve"> PAGEREF _Toc240203082 \h </w:instrText>
           </w:r>
           <w:r>
             <w:rPr>
@@ -2960,7 +2960,7 @@
             <w:rPr>
               <w:noProof/>
             </w:rPr>
-            <w:t>36</w:t>
+            <w:t>35</w:t>
           </w:r>
           <w:r>
             <w:rPr>
@@ -3006,7 +3006,7 @@
             <w:rPr>
               <w:noProof/>
             </w:rPr>
-            <w:instrText xml:space="preserve"> PAGEREF _Toc240201352 \h </w:instrText>
+            <w:instrText xml:space="preserve"> PAGEREF _Toc240203083 \h </w:instrText>
           </w:r>
           <w:r>
             <w:rPr>
@@ -3023,7 +3023,7 @@
             <w:rPr>
               <w:noProof/>
             </w:rPr>
-            <w:t>37</w:t>
+            <w:t>36</w:t>
           </w:r>
           <w:r>
             <w:rPr>
@@ -3069,7 +3069,7 @@
             <w:rPr>
               <w:noProof/>
             </w:rPr>
-            <w:instrText xml:space="preserve"> PAGEREF _Toc240201353 \h </w:instrText>
+            <w:instrText xml:space="preserve"> PAGEREF _Toc240203084 \h </w:instrText>
           </w:r>
           <w:r>
             <w:rPr>
@@ -3086,7 +3086,7 @@
             <w:rPr>
               <w:noProof/>
             </w:rPr>
-            <w:t>41</w:t>
+            <w:t>40</w:t>
           </w:r>
           <w:r>
             <w:rPr>
@@ -3132,7 +3132,7 @@
             <w:rPr>
               <w:noProof/>
             </w:rPr>
-            <w:instrText xml:space="preserve"> PAGEREF _Toc240201354 \h </w:instrText>
+            <w:instrText xml:space="preserve"> PAGEREF _Toc240203085 \h </w:instrText>
           </w:r>
           <w:r>
             <w:rPr>
@@ -3149,7 +3149,7 @@
             <w:rPr>
               <w:noProof/>
             </w:rPr>
-            <w:t>45</w:t>
+            <w:t>44</w:t>
           </w:r>
           <w:r>
             <w:rPr>
@@ -3197,7 +3197,7 @@
             <w:rPr>
               <w:noProof/>
             </w:rPr>
-            <w:instrText xml:space="preserve"> PAGEREF _Toc240201355 \h </w:instrText>
+            <w:instrText xml:space="preserve"> PAGEREF _Toc240203086 \h </w:instrText>
           </w:r>
           <w:r>
             <w:rPr>
@@ -3214,7 +3214,7 @@
             <w:rPr>
               <w:noProof/>
             </w:rPr>
-            <w:t>45</w:t>
+            <w:t>44</w:t>
           </w:r>
           <w:r>
             <w:rPr>
@@ -3262,7 +3262,7 @@
             <w:rPr>
               <w:noProof/>
             </w:rPr>
-            <w:instrText xml:space="preserve"> PAGEREF _Toc240201356 \h </w:instrText>
+            <w:instrText xml:space="preserve"> PAGEREF _Toc240203087 \h </w:instrText>
           </w:r>
           <w:r>
             <w:rPr>
@@ -3279,7 +3279,7 @@
             <w:rPr>
               <w:noProof/>
             </w:rPr>
-            <w:t>45</w:t>
+            <w:t>44</w:t>
           </w:r>
           <w:r>
             <w:rPr>
@@ -3327,7 +3327,7 @@
             <w:rPr>
               <w:noProof/>
             </w:rPr>
-            <w:instrText xml:space="preserve"> PAGEREF _Toc240201357 \h </w:instrText>
+            <w:instrText xml:space="preserve"> PAGEREF _Toc240203088 \h </w:instrText>
           </w:r>
           <w:r>
             <w:rPr>
@@ -3344,7 +3344,7 @@
             <w:rPr>
               <w:noProof/>
             </w:rPr>
-            <w:t>49</w:t>
+            <w:t>48</w:t>
           </w:r>
           <w:r>
             <w:rPr>
@@ -3392,7 +3392,7 @@
             <w:rPr>
               <w:noProof/>
             </w:rPr>
-            <w:instrText xml:space="preserve"> PAGEREF _Toc240201358 \h </w:instrText>
+            <w:instrText xml:space="preserve"> PAGEREF _Toc240203089 \h </w:instrText>
           </w:r>
           <w:r>
             <w:rPr>
@@ -3409,7 +3409,7 @@
             <w:rPr>
               <w:noProof/>
             </w:rPr>
-            <w:t>51</w:t>
+            <w:t>50</w:t>
           </w:r>
           <w:r>
             <w:rPr>
@@ -3457,7 +3457,7 @@
             <w:rPr>
               <w:noProof/>
             </w:rPr>
-            <w:instrText xml:space="preserve"> PAGEREF _Toc240201359 \h </w:instrText>
+            <w:instrText xml:space="preserve"> PAGEREF _Toc240203090 \h </w:instrText>
           </w:r>
           <w:r>
             <w:rPr>
@@ -3474,7 +3474,7 @@
             <w:rPr>
               <w:noProof/>
             </w:rPr>
-            <w:t>55</w:t>
+            <w:t>54</w:t>
           </w:r>
           <w:r>
             <w:rPr>
@@ -3520,7 +3520,7 @@
             <w:rPr>
               <w:noProof/>
             </w:rPr>
-            <w:instrText xml:space="preserve"> PAGEREF _Toc240201360 \h </w:instrText>
+            <w:instrText xml:space="preserve"> PAGEREF _Toc240203091 \h </w:instrText>
           </w:r>
           <w:r>
             <w:rPr>
@@ -3537,7 +3537,7 @@
             <w:rPr>
               <w:noProof/>
             </w:rPr>
-            <w:t>62</w:t>
+            <w:t>61</w:t>
           </w:r>
           <w:r>
             <w:rPr>
@@ -3583,7 +3583,7 @@
             <w:rPr>
               <w:noProof/>
             </w:rPr>
-            <w:instrText xml:space="preserve"> PAGEREF _Toc240201361 \h </w:instrText>
+            <w:instrText xml:space="preserve"> PAGEREF _Toc240203092 \h </w:instrText>
           </w:r>
           <w:r>
             <w:rPr>
@@ -3600,7 +3600,7 @@
             <w:rPr>
               <w:noProof/>
             </w:rPr>
-            <w:t>62</w:t>
+            <w:t>61</w:t>
           </w:r>
           <w:r>
             <w:rPr>
@@ -3646,7 +3646,7 @@
             <w:rPr>
               <w:noProof/>
             </w:rPr>
-            <w:instrText xml:space="preserve"> PAGEREF _Toc240201362 \h </w:instrText>
+            <w:instrText xml:space="preserve"> PAGEREF _Toc240203093 \h </w:instrText>
           </w:r>
           <w:r>
             <w:rPr>
@@ -3663,7 +3663,7 @@
             <w:rPr>
               <w:noProof/>
             </w:rPr>
-            <w:t>62</w:t>
+            <w:t>61</w:t>
           </w:r>
           <w:r>
             <w:rPr>
@@ -3709,7 +3709,7 @@
             <w:rPr>
               <w:noProof/>
             </w:rPr>
-            <w:instrText xml:space="preserve"> PAGEREF _Toc240201363 \h </w:instrText>
+            <w:instrText xml:space="preserve"> PAGEREF _Toc240203094 \h </w:instrText>
           </w:r>
           <w:r>
             <w:rPr>
@@ -3726,7 +3726,7 @@
             <w:rPr>
               <w:noProof/>
             </w:rPr>
-            <w:t>63</w:t>
+            <w:t>62</w:t>
           </w:r>
           <w:r>
             <w:rPr>
@@ -3772,7 +3772,7 @@
             <w:rPr>
               <w:noProof/>
             </w:rPr>
-            <w:instrText xml:space="preserve"> PAGEREF _Toc240201364 \h </w:instrText>
+            <w:instrText xml:space="preserve"> PAGEREF _Toc240203095 \h </w:instrText>
           </w:r>
           <w:r>
             <w:rPr>
@@ -3789,7 +3789,7 @@
             <w:rPr>
               <w:noProof/>
             </w:rPr>
-            <w:t>63</w:t>
+            <w:t>62</w:t>
           </w:r>
           <w:r>
             <w:rPr>
@@ -3835,7 +3835,7 @@
             <w:rPr>
               <w:noProof/>
             </w:rPr>
-            <w:instrText xml:space="preserve"> PAGEREF _Toc240201365 \h </w:instrText>
+            <w:instrText xml:space="preserve"> PAGEREF _Toc240203096 \h </w:instrText>
           </w:r>
           <w:r>
             <w:rPr>
@@ -3852,7 +3852,7 @@
             <w:rPr>
               <w:noProof/>
             </w:rPr>
-            <w:t>65</w:t>
+            <w:t>64</w:t>
           </w:r>
           <w:r>
             <w:rPr>
@@ -3879,7 +3879,7 @@
         <w:spacing w:before="240" w:after="240"/>
         <w:jc w:val="center"/>
       </w:pPr>
-      <w:bookmarkStart w:id="0" w:name="_Toc240201311"/>
+      <w:bookmarkStart w:id="0" w:name="_Toc240203042"/>
       <w:r>
         <w:lastRenderedPageBreak/>
         <w:t>DANH SÁCH HÌNH, BẢNG</w:t>
@@ -3891,7 +3891,7 @@
         <w:pStyle w:val="Heading2"/>
         <w:spacing w:before="240" w:after="120"/>
       </w:pPr>
-      <w:bookmarkStart w:id="1" w:name="_Toc240201312"/>
+      <w:bookmarkStart w:id="1" w:name="_Toc240203043"/>
       <w:r>
         <w:t>DANH SÁCH HÌNH</w:t>
       </w:r>
@@ -3899,690 +3899,690 @@
     </w:p>
     <w:p>
       <w:pPr>
-        <w:spacing w:after="40" w:line="280" w:lineRule="auto"/>
-        <w:ind w:left="288"/>
-      </w:pPr>
-      <w:r>
-        <w:rPr>
-          <w:sz w:val="24"/>
-          <w:szCs w:val="24"/>
-        </w:rPr>
-        <w:t>Hình 1: Sơ đồ quan hệ do SSMS sinh tại site KHO_A — chín bảng nghiệp vụ và bảng nhật ký kiểm toán</w:t>
-      </w:r>
-    </w:p>
-    <w:p>
-      <w:pPr>
-        <w:spacing w:after="40" w:line="280" w:lineRule="auto"/>
-        <w:ind w:left="288"/>
-      </w:pPr>
-      <w:r>
-        <w:rPr>
-          <w:sz w:val="24"/>
-          <w:szCs w:val="24"/>
-        </w:rPr>
-        <w:t>Hình 2: Network riêng của nhóm vừa được tạo, kèm Network ID mười sáu ký tự dùng để mời hai máy còn lại</w:t>
-      </w:r>
-    </w:p>
-    <w:p>
-      <w:pPr>
-        <w:spacing w:after="40" w:line="280" w:lineRule="auto"/>
-        <w:ind w:left="288"/>
-      </w:pPr>
-      <w:r>
-        <w:rPr>
-          <w:sz w:val="24"/>
-          <w:szCs w:val="24"/>
-        </w:rPr>
-        <w:t>Hình 3: Danh sách thành viên của network. Mỗi máy chỉ vào được sau khi người quản trị tích ô Auth</w:t>
-      </w:r>
-    </w:p>
-    <w:p>
-      <w:pPr>
-        <w:spacing w:after="40" w:line="280" w:lineRule="auto"/>
-        <w:ind w:left="288"/>
-      </w:pPr>
-      <w:r>
-        <w:rPr>
-          <w:sz w:val="24"/>
-          <w:szCs w:val="24"/>
-        </w:rPr>
-        <w:t>Hình 4: Địa chỉ IP ảo mà ZeroTier cấp cho máy chủ, đối chiếu giữa trang quản lý network và lệnh ipconfig trên chính máy đó</w:t>
-      </w:r>
-    </w:p>
-    <w:p>
-      <w:pPr>
-        <w:spacing w:after="40" w:line="280" w:lineRule="auto"/>
-        <w:ind w:left="288"/>
-      </w:pPr>
-      <w:r>
-        <w:rPr>
-          <w:sz w:val="24"/>
-          <w:szCs w:val="24"/>
-        </w:rPr>
-        <w:t>Hình 5: Kết quả tập lệnh cấu hình mạng: ba cổng đã được lắng nghe, bảy dịch vụ đều ở trạng thái Running và Automatic</w:t>
-      </w:r>
-    </w:p>
-    <w:p>
-      <w:pPr>
-        <w:spacing w:after="40" w:line="280" w:lineRule="auto"/>
-        <w:ind w:left="288"/>
-      </w:pPr>
-      <w:r>
-        <w:rPr>
-          <w:sz w:val="24"/>
-          <w:szCs w:val="24"/>
-        </w:rPr>
-        <w:t>Hình 6: Giao thức TCP/IP được bật cho thể hiện SQL Server trong SQL Server Configuration Manager</w:t>
-      </w:r>
-    </w:p>
-    <w:p>
-      <w:pPr>
-        <w:spacing w:after="40" w:line="280" w:lineRule="auto"/>
-        <w:ind w:left="288"/>
-      </w:pPr>
-      <w:r>
-        <w:rPr>
-          <w:sz w:val="24"/>
-          <w:szCs w:val="24"/>
+        <w:spacing w:line="250" w:lineRule="auto"/>
+        <w:ind w:left="360" w:hanging="72"/>
+      </w:pPr>
+      <w:r>
+        <w:rPr>
+          <w:sz w:val="22"/>
+          <w:szCs w:val="22"/>
+        </w:rPr>
+        <w:t>Hình 1: Sơ đồ quan hệ do SSMS sinh tại site KHO_A</w:t>
+      </w:r>
+    </w:p>
+    <w:p>
+      <w:pPr>
+        <w:spacing w:line="250" w:lineRule="auto"/>
+        <w:ind w:left="360" w:hanging="72"/>
+      </w:pPr>
+      <w:r>
+        <w:rPr>
+          <w:sz w:val="22"/>
+          <w:szCs w:val="22"/>
+        </w:rPr>
+        <w:t>Hình 2: Network riêng của nhóm vừa được tạo</w:t>
+      </w:r>
+    </w:p>
+    <w:p>
+      <w:pPr>
+        <w:spacing w:line="250" w:lineRule="auto"/>
+        <w:ind w:left="360" w:hanging="72"/>
+      </w:pPr>
+      <w:r>
+        <w:rPr>
+          <w:sz w:val="22"/>
+          <w:szCs w:val="22"/>
+        </w:rPr>
+        <w:t>Hình 3: Danh sách thành viên của network</w:t>
+      </w:r>
+    </w:p>
+    <w:p>
+      <w:pPr>
+        <w:spacing w:line="250" w:lineRule="auto"/>
+        <w:ind w:left="360" w:hanging="72"/>
+      </w:pPr>
+      <w:r>
+        <w:rPr>
+          <w:sz w:val="22"/>
+          <w:szCs w:val="22"/>
+        </w:rPr>
+        <w:t>Hình 4: Địa chỉ IP ảo mà ZeroTier cấp cho máy chủ</w:t>
+      </w:r>
+    </w:p>
+    <w:p>
+      <w:pPr>
+        <w:spacing w:line="250" w:lineRule="auto"/>
+        <w:ind w:left="360" w:hanging="72"/>
+      </w:pPr>
+      <w:r>
+        <w:rPr>
+          <w:sz w:val="22"/>
+          <w:szCs w:val="22"/>
+        </w:rPr>
+        <w:t>Hình 5: Kết quả tập lệnh cấu hình mạng</w:t>
+      </w:r>
+    </w:p>
+    <w:p>
+      <w:pPr>
+        <w:spacing w:line="250" w:lineRule="auto"/>
+        <w:ind w:left="360" w:hanging="72"/>
+      </w:pPr>
+      <w:r>
+        <w:rPr>
+          <w:sz w:val="22"/>
+          <w:szCs w:val="22"/>
+        </w:rPr>
+        <w:t>Hình 6: Giao thức TCP/IP được bật cho thể hiện SQL Server trong SQL Server</w:t>
+      </w:r>
+    </w:p>
+    <w:p>
+      <w:pPr>
+        <w:spacing w:line="250" w:lineRule="auto"/>
+        <w:ind w:left="360" w:hanging="72"/>
+      </w:pPr>
+      <w:r>
+        <w:rPr>
+          <w:sz w:val="22"/>
+          <w:szCs w:val="22"/>
         </w:rPr>
         <w:t>Hình 7: Gán cổng cố định tại mục IPAll, đồng thời xoá trắng ô cổng động</w:t>
       </w:r>
     </w:p>
     <w:p>
       <w:pPr>
-        <w:spacing w:after="40" w:line="280" w:lineRule="auto"/>
-        <w:ind w:left="288"/>
-      </w:pPr>
-      <w:r>
-        <w:rPr>
-          <w:sz w:val="24"/>
-          <w:szCs w:val="24"/>
-        </w:rPr>
-        <w:t>Hình 8: Các luật tường lửa mở cho ba cổng thể hiện, cổng UDP 1434 của SQL Server Browser và dịch vụ MS DTC</w:t>
-      </w:r>
-    </w:p>
-    <w:p>
-      <w:pPr>
-        <w:spacing w:after="40" w:line="280" w:lineRule="auto"/>
-        <w:ind w:left="288"/>
-      </w:pPr>
-      <w:r>
-        <w:rPr>
-          <w:sz w:val="24"/>
-          <w:szCs w:val="24"/>
-        </w:rPr>
-        <w:t>Hình 9: Kết nối tới máy chủ bằng chính địa chỉ IP ảo mà ZeroTier đã cấp. Cột net_transport trả về TCP thay vì Shared memory, chứng tỏ dữ liệu thật sự đi qua mạng chứ không qua bộ nhớ chung trong máy</w:t>
-      </w:r>
-    </w:p>
-    <w:p>
-      <w:pPr>
-        <w:spacing w:after="40" w:line="280" w:lineRule="auto"/>
-        <w:ind w:left="288"/>
-      </w:pPr>
-      <w:r>
-        <w:rPr>
-          <w:sz w:val="24"/>
-          <w:szCs w:val="24"/>
-        </w:rPr>
-        <w:t>Hình 10: Chọn phiên bản Developer — miễn phí và đầy đủ tính năng</w:t>
-      </w:r>
-    </w:p>
-    <w:p>
-      <w:pPr>
-        <w:spacing w:after="40" w:line="280" w:lineRule="auto"/>
-        <w:ind w:left="288"/>
-      </w:pPr>
-      <w:r>
-        <w:rPr>
-          <w:sz w:val="24"/>
-          <w:szCs w:val="24"/>
-        </w:rPr>
-        <w:t>Hình 11: Chọn tính năng cài đặt. Bắt buộc tích SQL Server Replication, thiếu mục này là không làm được nhân bản</w:t>
-      </w:r>
-    </w:p>
-    <w:p>
-      <w:pPr>
-        <w:spacing w:after="40" w:line="280" w:lineRule="auto"/>
-        <w:ind w:left="288"/>
-      </w:pPr>
-      <w:r>
-        <w:rPr>
-          <w:sz w:val="24"/>
-          <w:szCs w:val="24"/>
-        </w:rPr>
-        <w:t>Hình 12: Đặt tên thể hiện là KHO_A. Đây là bước quyết định ba site độc lập với nhau</w:t>
-      </w:r>
-    </w:p>
-    <w:p>
-      <w:pPr>
-        <w:spacing w:after="40" w:line="280" w:lineRule="auto"/>
-        <w:ind w:left="288"/>
-      </w:pPr>
-      <w:r>
-        <w:rPr>
-          <w:sz w:val="24"/>
-          <w:szCs w:val="24"/>
-        </w:rPr>
-        <w:t>Hình 13: Đặt SQL Server Agent ở chế độ Automatic — điều kiện bắt buộc để các tiến trình nhân bản chạy được</w:t>
-      </w:r>
-    </w:p>
-    <w:p>
-      <w:pPr>
-        <w:spacing w:after="40" w:line="280" w:lineRule="auto"/>
-        <w:ind w:left="288"/>
-      </w:pPr>
-      <w:r>
-        <w:rPr>
-          <w:sz w:val="24"/>
-          <w:szCs w:val="24"/>
-        </w:rPr>
-        <w:t>Hình 14: Chọn Mixed Mode để dùng được tài khoản sa. Linked Server giữa các site sẽ đăng nhập bằng tài khoản này</w:t>
-      </w:r>
-    </w:p>
-    <w:p>
-      <w:pPr>
-        <w:spacing w:after="40" w:line="280" w:lineRule="auto"/>
-        <w:ind w:left="288"/>
-      </w:pPr>
-      <w:r>
-        <w:rPr>
-          <w:sz w:val="24"/>
-          <w:szCs w:val="24"/>
+        <w:spacing w:line="250" w:lineRule="auto"/>
+        <w:ind w:left="360" w:hanging="72"/>
+      </w:pPr>
+      <w:r>
+        <w:rPr>
+          <w:sz w:val="22"/>
+          <w:szCs w:val="22"/>
+        </w:rPr>
+        <w:t>Hình 8: Các luật tường lửa mở cho ba cổng thể hiện</w:t>
+      </w:r>
+    </w:p>
+    <w:p>
+      <w:pPr>
+        <w:spacing w:line="250" w:lineRule="auto"/>
+        <w:ind w:left="360" w:hanging="72"/>
+      </w:pPr>
+      <w:r>
+        <w:rPr>
+          <w:sz w:val="22"/>
+          <w:szCs w:val="22"/>
+        </w:rPr>
+        <w:t>Hình 9: Kết nối tới máy chủ bằng chính địa chỉ IP ảo mà ZeroTier đã cấp</w:t>
+      </w:r>
+    </w:p>
+    <w:p>
+      <w:pPr>
+        <w:spacing w:line="250" w:lineRule="auto"/>
+        <w:ind w:left="360" w:hanging="72"/>
+      </w:pPr>
+      <w:r>
+        <w:rPr>
+          <w:sz w:val="22"/>
+          <w:szCs w:val="22"/>
+        </w:rPr>
+        <w:t>Hình 10: Chọn phiên bản Developer</w:t>
+      </w:r>
+    </w:p>
+    <w:p>
+      <w:pPr>
+        <w:spacing w:line="250" w:lineRule="auto"/>
+        <w:ind w:left="360" w:hanging="72"/>
+      </w:pPr>
+      <w:r>
+        <w:rPr>
+          <w:sz w:val="22"/>
+          <w:szCs w:val="22"/>
+        </w:rPr>
+        <w:t>Hình 11: Chọn tính năng cài đặt</w:t>
+      </w:r>
+    </w:p>
+    <w:p>
+      <w:pPr>
+        <w:spacing w:line="250" w:lineRule="auto"/>
+        <w:ind w:left="360" w:hanging="72"/>
+      </w:pPr>
+      <w:r>
+        <w:rPr>
+          <w:sz w:val="22"/>
+          <w:szCs w:val="22"/>
+        </w:rPr>
+        <w:t>Hình 12: Đặt tên thể hiện là KHO_A</w:t>
+      </w:r>
+    </w:p>
+    <w:p>
+      <w:pPr>
+        <w:spacing w:line="250" w:lineRule="auto"/>
+        <w:ind w:left="360" w:hanging="72"/>
+      </w:pPr>
+      <w:r>
+        <w:rPr>
+          <w:sz w:val="22"/>
+          <w:szCs w:val="22"/>
+        </w:rPr>
+        <w:t>Hình 13: Đặt SQL Server Agent ở chế độ Automatic</w:t>
+      </w:r>
+    </w:p>
+    <w:p>
+      <w:pPr>
+        <w:spacing w:line="250" w:lineRule="auto"/>
+        <w:ind w:left="360" w:hanging="72"/>
+      </w:pPr>
+      <w:r>
+        <w:rPr>
+          <w:sz w:val="22"/>
+          <w:szCs w:val="22"/>
+        </w:rPr>
+        <w:t>Hình 14: Chọn Mixed Mode để dùng được tài khoản sa</w:t>
+      </w:r>
+    </w:p>
+    <w:p>
+      <w:pPr>
+        <w:spacing w:line="250" w:lineRule="auto"/>
+        <w:ind w:left="360" w:hanging="72"/>
+      </w:pPr>
+      <w:r>
+        <w:rPr>
+          <w:sz w:val="22"/>
+          <w:szCs w:val="22"/>
         </w:rPr>
         <w:t>Hình 15: Thư mục dữ liệu riêng của từng thể hiện</w:t>
       </w:r>
     </w:p>
     <w:p>
       <w:pPr>
-        <w:spacing w:after="40" w:line="280" w:lineRule="auto"/>
-        <w:ind w:left="288"/>
-      </w:pPr>
-      <w:r>
-        <w:rPr>
-          <w:sz w:val="24"/>
-          <w:szCs w:val="24"/>
-        </w:rPr>
-        <w:t>Hình 16: Cài đặt thể hiện KHO_A hoàn tất, cả Database Engine và Replication đều Succeeded</w:t>
-      </w:r>
-    </w:p>
-    <w:p>
-      <w:pPr>
-        <w:spacing w:after="40" w:line="280" w:lineRule="auto"/>
-        <w:ind w:left="288"/>
-      </w:pPr>
-      <w:r>
-        <w:rPr>
-          <w:sz w:val="24"/>
-          <w:szCs w:val="24"/>
-        </w:rPr>
-        <w:t>Hình 17: Cài thể hiện thứ hai. Bảng Installed instances đã có KHO_A, chọn Perform a new installation để tạo thêm thể hiện mới</w:t>
-      </w:r>
-    </w:p>
-    <w:p>
-      <w:pPr>
-        <w:spacing w:after="40" w:line="280" w:lineRule="auto"/>
-        <w:ind w:left="288"/>
-      </w:pPr>
-      <w:r>
-        <w:rPr>
-          <w:sz w:val="24"/>
-          <w:szCs w:val="24"/>
-        </w:rPr>
-        <w:t>Hình 18: Cài thể hiện thứ ba KHO_C. Bảng dưới cho thấy KHO_A và KHO_B đã tồn tại — ba thể hiện chạy song song trên cùng một máy</w:t>
-      </w:r>
-    </w:p>
-    <w:p>
-      <w:pPr>
-        <w:spacing w:after="40" w:line="280" w:lineRule="auto"/>
-        <w:ind w:left="288"/>
-      </w:pPr>
-      <w:r>
-        <w:rPr>
-          <w:sz w:val="24"/>
-          <w:szCs w:val="24"/>
+        <w:spacing w:line="250" w:lineRule="auto"/>
+        <w:ind w:left="360" w:hanging="72"/>
+      </w:pPr>
+      <w:r>
+        <w:rPr>
+          <w:sz w:val="22"/>
+          <w:szCs w:val="22"/>
+        </w:rPr>
+        <w:t>Hình 16: Cài đặt thể hiện KHO_A hoàn tất</w:t>
+      </w:r>
+    </w:p>
+    <w:p>
+      <w:pPr>
+        <w:spacing w:line="250" w:lineRule="auto"/>
+        <w:ind w:left="360" w:hanging="72"/>
+      </w:pPr>
+      <w:r>
+        <w:rPr>
+          <w:sz w:val="22"/>
+          <w:szCs w:val="22"/>
+        </w:rPr>
+        <w:t>Hình 17: Cài thể hiện thứ hai</w:t>
+      </w:r>
+    </w:p>
+    <w:p>
+      <w:pPr>
+        <w:spacing w:line="250" w:lineRule="auto"/>
+        <w:ind w:left="360" w:hanging="72"/>
+      </w:pPr>
+      <w:r>
+        <w:rPr>
+          <w:sz w:val="22"/>
+          <w:szCs w:val="22"/>
+        </w:rPr>
+        <w:t>Hình 18: Cài thể hiện thứ ba KHO_C</w:t>
+      </w:r>
+    </w:p>
+    <w:p>
+      <w:pPr>
+        <w:spacing w:line="250" w:lineRule="auto"/>
+        <w:ind w:left="360" w:hanging="72"/>
+      </w:pPr>
+      <w:r>
+        <w:rPr>
+          <w:sz w:val="22"/>
+          <w:szCs w:val="22"/>
         </w:rPr>
         <w:t>Hình 19: Hoàn tất cài đặt cả ba thể hiện</w:t>
       </w:r>
     </w:p>
     <w:p>
       <w:pPr>
-        <w:spacing w:after="40" w:line="280" w:lineRule="auto"/>
-        <w:ind w:left="288"/>
-      </w:pPr>
-      <w:r>
-        <w:rPr>
-          <w:sz w:val="24"/>
-          <w:szCs w:val="24"/>
-        </w:rPr>
-        <w:t>Hình 20: Ba thể hiện hiện diện cùng lúc trong Object Explorer của SSMS — hình ảnh đại diện cho toàn bộ hệ thống phân tán</w:t>
-      </w:r>
-    </w:p>
-    <w:p>
-      <w:pPr>
-        <w:spacing w:after="40" w:line="280" w:lineRule="auto"/>
-        <w:ind w:left="288"/>
-      </w:pPr>
-      <w:r>
-        <w:rPr>
-          <w:sz w:val="24"/>
-          <w:szCs w:val="24"/>
+        <w:spacing w:line="250" w:lineRule="auto"/>
+        <w:ind w:left="360" w:hanging="72"/>
+      </w:pPr>
+      <w:r>
+        <w:rPr>
+          <w:sz w:val="22"/>
+          <w:szCs w:val="22"/>
+        </w:rPr>
+        <w:t>Hình 20: Ba thể hiện hiện diện cùng lúc trong Object Explorer của SSMS</w:t>
+      </w:r>
+    </w:p>
+    <w:p>
+      <w:pPr>
+        <w:spacing w:line="250" w:lineRule="auto"/>
+        <w:ind w:left="360" w:hanging="72"/>
+      </w:pPr>
+      <w:r>
+        <w:rPr>
+          <w:sz w:val="22"/>
+          <w:szCs w:val="22"/>
         </w:rPr>
         <w:t>Hình 21: Bảy dịch vụ của hệ thống đều ở trạng thái Running và Automatic</w:t>
       </w:r>
     </w:p>
     <w:p>
       <w:pPr>
-        <w:spacing w:after="40" w:line="280" w:lineRule="auto"/>
-        <w:ind w:left="288"/>
-      </w:pPr>
-      <w:r>
-        <w:rPr>
-          <w:sz w:val="24"/>
-          <w:szCs w:val="24"/>
+        <w:spacing w:line="250" w:lineRule="auto"/>
+        <w:ind w:left="360" w:hanging="72"/>
+      </w:pPr>
+      <w:r>
+        <w:rPr>
+          <w:sz w:val="22"/>
+          <w:szCs w:val="22"/>
         </w:rPr>
         <w:t>Hình 22: Hai Linked Server tại site KHO_A trong Object Explorer</w:t>
       </w:r>
     </w:p>
     <w:p>
       <w:pPr>
-        <w:spacing w:after="40" w:line="280" w:lineRule="auto"/>
-        <w:ind w:left="288"/>
-      </w:pPr>
-      <w:r>
-        <w:rPr>
-          <w:sz w:val="24"/>
-          <w:szCs w:val="24"/>
-        </w:rPr>
-        <w:t>Hình 23: Trang General — khai báo nguồn dữ liệu của liên kết</w:t>
-      </w:r>
-    </w:p>
-    <w:p>
-      <w:pPr>
-        <w:spacing w:after="40" w:line="280" w:lineRule="auto"/>
-        <w:ind w:left="288"/>
-      </w:pPr>
-      <w:r>
-        <w:rPr>
-          <w:sz w:val="24"/>
-          <w:szCs w:val="24"/>
+        <w:spacing w:line="250" w:lineRule="auto"/>
+        <w:ind w:left="360" w:hanging="72"/>
+      </w:pPr>
+      <w:r>
+        <w:rPr>
+          <w:sz w:val="22"/>
+          <w:szCs w:val="22"/>
+        </w:rPr>
+        <w:t>Hình 23: Trang General</w:t>
+      </w:r>
+    </w:p>
+    <w:p>
+      <w:pPr>
+        <w:spacing w:line="250" w:lineRule="auto"/>
+        <w:ind w:left="360" w:hanging="72"/>
+      </w:pPr>
+      <w:r>
+        <w:rPr>
+          <w:sz w:val="22"/>
+          <w:szCs w:val="22"/>
+        </w:rPr>
+        <w:t>Hình 24: Trang Security</w:t>
+      </w:r>
+    </w:p>
+    <w:p>
+      <w:pPr>
+        <w:spacing w:line="250" w:lineRule="auto"/>
+        <w:ind w:left="360" w:hanging="72"/>
+      </w:pPr>
+      <w:r>
+        <w:rPr>
+          <w:sz w:val="22"/>
+          <w:szCs w:val="22"/>
+        </w:rPr>
+        <w:t>Hình 25: Truy vấn phân tán đầu tiên</w:t>
+      </w:r>
+    </w:p>
+    <w:p>
+      <w:pPr>
+        <w:spacing w:line="250" w:lineRule="auto"/>
+        <w:ind w:left="360" w:hanging="72"/>
+      </w:pPr>
+      <w:r>
+        <w:rPr>
+          <w:sz w:val="22"/>
+          <w:szCs w:val="22"/>
+        </w:rPr>
+        <w:t>Hình 26: Publication PUB_DanhMuc trong Object Explorer tại site KHO_A</w:t>
+      </w:r>
+    </w:p>
+    <w:p>
+      <w:pPr>
+        <w:spacing w:line="250" w:lineRule="auto"/>
+        <w:ind w:left="360" w:hanging="72"/>
+      </w:pPr>
+      <w:r>
+        <w:rPr>
+          <w:sz w:val="22"/>
+          <w:szCs w:val="22"/>
+        </w:rPr>
+        <w:t>Hình 27: Ba bảng danh mục được chọn làm article của Publication</w:t>
+      </w:r>
+    </w:p>
+    <w:p>
+      <w:pPr>
+        <w:spacing w:line="250" w:lineRule="auto"/>
+        <w:ind w:left="360" w:hanging="72"/>
+      </w:pPr>
+      <w:r>
+        <w:rPr>
+          <w:sz w:val="22"/>
+          <w:szCs w:val="22"/>
+        </w:rPr>
+        <w:t>Hình 28: Replication Monitor</w:t>
+      </w:r>
+    </w:p>
+    <w:p>
+      <w:pPr>
+        <w:spacing w:line="250" w:lineRule="auto"/>
+        <w:ind w:left="360" w:hanging="72"/>
+      </w:pPr>
+      <w:r>
+        <w:rPr>
+          <w:sz w:val="22"/>
+          <w:szCs w:val="22"/>
+        </w:rPr>
+        <w:t>Hình 29: Bằng chứng đồng bộ</w:t>
+      </w:r>
+    </w:p>
+    <w:p>
+      <w:pPr>
+        <w:spacing w:line="250" w:lineRule="auto"/>
+        <w:ind w:left="360" w:hanging="72"/>
+      </w:pPr>
+      <w:r>
+        <w:rPr>
+          <w:sz w:val="22"/>
+          <w:szCs w:val="22"/>
+        </w:rPr>
+        <w:t>Hình 30: Tồn kho toàn hệ thống</w:t>
+      </w:r>
+    </w:p>
+    <w:p>
+      <w:pPr>
+        <w:spacing w:line="250" w:lineRule="auto"/>
+        <w:ind w:left="360" w:hanging="72"/>
+      </w:pPr>
+      <w:r>
+        <w:rPr>
+          <w:sz w:val="22"/>
+          <w:szCs w:val="22"/>
+        </w:rPr>
+        <w:t>Hình 31: Kiểm chứng ba tính chất của phân mảnh cùng phép thử vi phạm</w:t>
+      </w:r>
+    </w:p>
+    <w:p>
+      <w:pPr>
+        <w:spacing w:line="250" w:lineRule="auto"/>
+        <w:ind w:left="360" w:hanging="72"/>
+      </w:pPr>
+      <w:r>
+        <w:rPr>
+          <w:sz w:val="22"/>
+          <w:szCs w:val="22"/>
+        </w:rPr>
+        <w:t>Hình 32: So khớp ba bản sao danh mục bằng vân tay CHECKSUM_AGG</w:t>
+      </w:r>
+    </w:p>
+    <w:p>
+      <w:pPr>
+        <w:spacing w:line="250" w:lineRule="auto"/>
+        <w:ind w:left="360" w:hanging="72"/>
+      </w:pPr>
+      <w:r>
+        <w:rPr>
+          <w:sz w:val="22"/>
+          <w:szCs w:val="22"/>
+        </w:rPr>
+        <w:t>Hình 33: Danh sách liên kết, ánh xạ đăng nhập</w:t>
+      </w:r>
+    </w:p>
+    <w:p>
+      <w:pPr>
+        <w:spacing w:line="250" w:lineRule="auto"/>
+        <w:ind w:left="360" w:hanging="72"/>
+      </w:pPr>
+      <w:r>
+        <w:rPr>
+          <w:sz w:val="22"/>
+          <w:szCs w:val="22"/>
+        </w:rPr>
+        <w:t>Hình 34: Thủ tục sp_TonKhoToanHeThong dựng câu lệnh tự động từ bảng Kho</w:t>
+      </w:r>
+    </w:p>
+    <w:p>
+      <w:pPr>
+        <w:spacing w:line="250" w:lineRule="auto"/>
+        <w:ind w:left="360" w:hanging="72"/>
+      </w:pPr>
+      <w:r>
+        <w:rPr>
+          <w:sz w:val="22"/>
+          <w:szCs w:val="22"/>
+        </w:rPr>
+        <w:t>Hình 35: Thống kê toàn hệ thống theo kho, theo vật tư và theo tỷ trọng vốn</w:t>
+      </w:r>
+    </w:p>
+    <w:p>
+      <w:pPr>
+        <w:spacing w:line="250" w:lineRule="auto"/>
+        <w:ind w:left="360" w:hanging="72"/>
+      </w:pPr>
+      <w:r>
+        <w:rPr>
+          <w:sz w:val="22"/>
+          <w:szCs w:val="22"/>
+        </w:rPr>
+        <w:t>Hình 36: Cảnh báo thiếu hàng kèm đề xuất kho cấp bù</w:t>
+      </w:r>
+    </w:p>
+    <w:p>
+      <w:pPr>
+        <w:spacing w:line="250" w:lineRule="auto"/>
+        <w:ind w:left="360" w:hanging="72"/>
+      </w:pPr>
+      <w:r>
+        <w:rPr>
+          <w:sz w:val="22"/>
+          <w:szCs w:val="22"/>
+        </w:rPr>
+        <w:t>Hình 37: So sánh hai cách viết truy vấn phân tán qua thời gian thực thi</w:t>
+      </w:r>
+    </w:p>
+    <w:p>
+      <w:pPr>
+        <w:spacing w:line="250" w:lineRule="auto"/>
+        <w:ind w:left="360" w:hanging="72"/>
+      </w:pPr>
+      <w:r>
+        <w:rPr>
+          <w:sz w:val="22"/>
+          <w:szCs w:val="22"/>
+        </w:rPr>
+        <w:t>Hình 38: Bảng tổng hợp quyền đã cấp cho bốn vai trò và danh sách trigger đang hoạt động</w:t>
+      </w:r>
+    </w:p>
+    <w:p>
+      <w:pPr>
+        <w:spacing w:line="250" w:lineRule="auto"/>
+        <w:ind w:left="360" w:hanging="72"/>
+      </w:pPr>
+      <w:r>
+        <w:rPr>
+          <w:sz w:val="22"/>
+          <w:szCs w:val="22"/>
+        </w:rPr>
+        <w:t>Hình 39: Kết quả thử quyền</w:t>
+      </w:r>
+    </w:p>
+    <w:p>
+      <w:pPr>
+        <w:spacing w:line="250" w:lineRule="auto"/>
+        <w:ind w:left="360" w:hanging="72"/>
+      </w:pPr>
+      <w:r>
+        <w:rPr>
+          <w:sz w:val="22"/>
+          <w:szCs w:val="22"/>
+        </w:rPr>
+        <w:t>Hình 40: Thử trigger tại site KHO_A</w:t>
+      </w:r>
+    </w:p>
+    <w:p>
+      <w:pPr>
+        <w:spacing w:line="250" w:lineRule="auto"/>
+        <w:ind w:left="360" w:hanging="72"/>
+      </w:pPr>
+      <w:r>
+        <w:rPr>
+          <w:sz w:val="22"/>
+          <w:szCs w:val="22"/>
+        </w:rPr>
+        <w:t>Hình 41: Cùng kịch bản chạy tại site KHO_B</w:t>
+      </w:r>
+    </w:p>
+    <w:p>
+      <w:pPr>
+        <w:spacing w:line="250" w:lineRule="auto"/>
+        <w:ind w:left="360" w:hanging="72"/>
+      </w:pPr>
+      <w:r>
+        <w:rPr>
+          <w:sz w:val="22"/>
+          <w:szCs w:val="22"/>
+        </w:rPr>
+        <w:t>Hình 42: Nhật ký kiểm toán do trigger ghi lại</w:t>
+      </w:r>
+    </w:p>
+    <w:p>
+      <w:pPr>
+        <w:spacing w:line="250" w:lineRule="auto"/>
+        <w:ind w:left="360" w:hanging="72"/>
+      </w:pPr>
+      <w:r>
+        <w:rPr>
+          <w:sz w:val="22"/>
+          <w:szCs w:val="22"/>
+        </w:rPr>
+        <w:t>Hình 43: Kịch bản T1 — tồn kho trước và sau khi điều chuyển</w:t>
+      </w:r>
+    </w:p>
+    <w:p>
+      <w:pPr>
+        <w:spacing w:line="250" w:lineRule="auto"/>
+        <w:ind w:left="360" w:hanging="72"/>
+      </w:pPr>
+      <w:r>
+        <w:rPr>
+          <w:sz w:val="22"/>
+          <w:szCs w:val="22"/>
+        </w:rPr>
+        <w:t>Hình 44: Thông báo của kịch bản T1</w:t>
+      </w:r>
+    </w:p>
+    <w:p>
+      <w:pPr>
+        <w:spacing w:line="250" w:lineRule="auto"/>
+        <w:ind w:left="360" w:hanging="72"/>
+      </w:pPr>
+      <w:r>
+        <w:rPr>
+          <w:sz w:val="22"/>
+          <w:szCs w:val="22"/>
+        </w:rPr>
+        <w:t>Hình 45: Kịch bản T2 — tồn kho hai site trước và sau đều y nguyên</w:t>
+      </w:r>
+    </w:p>
+    <w:p>
+      <w:pPr>
+        <w:spacing w:line="250" w:lineRule="auto"/>
+        <w:ind w:left="360" w:hanging="72"/>
+      </w:pPr>
+      <w:r>
+        <w:rPr>
+          <w:sz w:val="22"/>
+          <w:szCs w:val="22"/>
+        </w:rPr>
+        <w:t>Hình 46: Thông báo từ chối của kịch bản T2</w:t>
+      </w:r>
+    </w:p>
+    <w:p>
+      <w:pPr>
+        <w:spacing w:line="250" w:lineRule="auto"/>
+        <w:ind w:left="360" w:hanging="72"/>
+      </w:pPr>
+      <w:r>
+        <w:rPr>
+          <w:sz w:val="22"/>
+          <w:szCs w:val="22"/>
+        </w:rPr>
+        <w:t>Hình 47: Kịch bản T3 — tồn kho và số phiếu ở cả hai site đều y nguyên sau khi giao tác</w:t>
+      </w:r>
+    </w:p>
+    <w:p>
+      <w:pPr>
+        <w:spacing w:line="250" w:lineRule="auto"/>
+        <w:ind w:left="360" w:hanging="72"/>
+      </w:pPr>
+      <w:r>
+        <w:rPr>
+          <w:sz w:val="22"/>
+          <w:szCs w:val="22"/>
+        </w:rPr>
+        <w:t>Hình 48: Thông báo quay lui của kịch bản T3</w:t>
+      </w:r>
+    </w:p>
+    <w:p>
+      <w:pPr>
+        <w:spacing w:line="250" w:lineRule="auto"/>
+        <w:ind w:left="360" w:hanging="72"/>
+      </w:pPr>
+      <w:r>
+        <w:rPr>
+          <w:sz w:val="22"/>
+          <w:szCs w:val="22"/>
+        </w:rPr>
+        <w:t>Hình 49: Kịch bản C1 — hiện tượng mất cập nhật khi không dùng khoá</w:t>
+      </w:r>
+    </w:p>
+    <w:p>
+      <w:pPr>
+        <w:spacing w:line="250" w:lineRule="auto"/>
+        <w:ind w:left="360" w:hanging="72"/>
+      </w:pPr>
+      <w:r>
+        <w:rPr>
+          <w:sz w:val="22"/>
+          <w:szCs w:val="22"/>
+        </w:rPr>
+        <w:t>Hình 50: Kịch bản C2 — khoá bi quan khắc phục triệt để</w:t>
+      </w:r>
+    </w:p>
+    <w:p>
+      <w:pPr>
+        <w:spacing w:line="250" w:lineRule="auto"/>
+        <w:ind w:left="360" w:hanging="72"/>
+      </w:pPr>
+      <w:r>
+        <w:rPr>
+          <w:sz w:val="22"/>
+          <w:szCs w:val="22"/>
+        </w:rPr>
+        <w:t>Hình 51: Kịch bản C3 — khoá lạc quan bằng cột ROWVERSION</w:t>
+      </w:r>
+    </w:p>
+    <w:p>
+      <w:pPr>
+        <w:spacing w:line="250" w:lineRule="auto"/>
+        <w:ind w:left="360" w:hanging="72"/>
+      </w:pPr>
+      <w:r>
+        <w:rPr>
+          <w:sz w:val="22"/>
+          <w:szCs w:val="22"/>
         </w:rPr>
         <w:lastRenderedPageBreak/>
-        <w:t>Hình 24: Trang Security — ánh xạ đăng nhập sang tài khoản cố định ở máy đích</w:t>
-      </w:r>
-    </w:p>
-    <w:p>
-      <w:pPr>
-        <w:spacing w:after="40" w:line="280" w:lineRule="auto"/>
-        <w:ind w:left="288"/>
-      </w:pPr>
-      <w:r>
-        <w:rPr>
-          <w:sz w:val="24"/>
-          <w:szCs w:val="24"/>
-        </w:rPr>
-        <w:t>Hình 25: Truy vấn phân tán đầu tiên — đứng tại KHO_A nhưng đọc được dữ liệu tồn kho của cả ba site</w:t>
-      </w:r>
-    </w:p>
-    <w:p>
-      <w:pPr>
-        <w:spacing w:after="40" w:line="280" w:lineRule="auto"/>
-        <w:ind w:left="288"/>
-      </w:pPr>
-      <w:r>
-        <w:rPr>
-          <w:sz w:val="24"/>
-          <w:szCs w:val="24"/>
-        </w:rPr>
-        <w:t>Hình 26: Publication PUB_DanhMuc trong Object Explorer tại site KHO_A</w:t>
-      </w:r>
-    </w:p>
-    <w:p>
-      <w:pPr>
-        <w:spacing w:after="40" w:line="280" w:lineRule="auto"/>
-        <w:ind w:left="288"/>
-      </w:pPr>
-      <w:r>
-        <w:rPr>
-          <w:sz w:val="24"/>
-          <w:szCs w:val="24"/>
-        </w:rPr>
-        <w:t>Hình 27: Ba bảng danh mục được chọn làm article của Publication</w:t>
-      </w:r>
-    </w:p>
-    <w:p>
-      <w:pPr>
-        <w:spacing w:after="40" w:line="280" w:lineRule="auto"/>
-        <w:ind w:left="288"/>
-      </w:pPr>
-      <w:r>
-        <w:rPr>
-          <w:sz w:val="24"/>
-          <w:szCs w:val="24"/>
-        </w:rPr>
-        <w:t>Hình 28: Replication Monitor — hai Subscription đều ở trạng thái hoạt động</w:t>
-      </w:r>
-    </w:p>
-    <w:p>
-      <w:pPr>
-        <w:spacing w:after="40" w:line="280" w:lineRule="auto"/>
-        <w:ind w:left="288"/>
-      </w:pPr>
-      <w:r>
-        <w:rPr>
-          <w:sz w:val="24"/>
-          <w:szCs w:val="24"/>
-        </w:rPr>
-        <w:t>Hình 29: Bằng chứng đồng bộ — sửa danh mục tại KHO_A, sau khoảng 20 giây cả KHO_B và KHO_C đều tự động cập nhật theo</w:t>
-      </w:r>
-    </w:p>
-    <w:p>
-      <w:pPr>
-        <w:spacing w:after="40" w:line="280" w:lineRule="auto"/>
-        <w:ind w:left="288"/>
-      </w:pPr>
-      <w:r>
-        <w:rPr>
-          <w:sz w:val="24"/>
-          <w:szCs w:val="24"/>
-        </w:rPr>
-        <w:t>Hình 30: Tồn kho toàn hệ thống — 24 dòng gộp từ ba site, hiển thị như một bảng duy nhất</w:t>
-      </w:r>
-    </w:p>
-    <w:p>
-      <w:pPr>
-        <w:spacing w:after="40" w:line="280" w:lineRule="auto"/>
-        <w:ind w:left="288"/>
-      </w:pPr>
-      <w:r>
-        <w:rPr>
-          <w:sz w:val="24"/>
-          <w:szCs w:val="24"/>
-        </w:rPr>
-        <w:t>Hình 31: Kiểm chứng ba tính chất của phân mảnh cùng phép thử vi phạm</w:t>
-      </w:r>
-    </w:p>
-    <w:p>
-      <w:pPr>
-        <w:spacing w:after="40" w:line="280" w:lineRule="auto"/>
-        <w:ind w:left="288"/>
-      </w:pPr>
-      <w:r>
-        <w:rPr>
-          <w:sz w:val="24"/>
-          <w:szCs w:val="24"/>
-        </w:rPr>
-        <w:t>Hình 32: So khớp ba bản sao danh mục bằng vân tay CHECKSUM_AGG</w:t>
-      </w:r>
-    </w:p>
-    <w:p>
-      <w:pPr>
-        <w:spacing w:after="40" w:line="280" w:lineRule="auto"/>
-        <w:ind w:left="288"/>
-      </w:pPr>
-      <w:r>
-        <w:rPr>
-          <w:sz w:val="24"/>
-          <w:szCs w:val="24"/>
-        </w:rPr>
-        <w:t>Hình 33: Danh sách liên kết, ánh xạ đăng nhập, kết quả thử kết nối và thông tin phiên bản đọc ngược từ hai site kia</w:t>
-      </w:r>
-    </w:p>
-    <w:p>
-      <w:pPr>
-        <w:spacing w:after="40" w:line="280" w:lineRule="auto"/>
-        <w:ind w:left="288"/>
-      </w:pPr>
-      <w:r>
-        <w:rPr>
-          <w:sz w:val="24"/>
-          <w:szCs w:val="24"/>
-        </w:rPr>
-        <w:t>Hình 34: Thủ tục sp_TonKhoToanHeThong dựng câu lệnh tự động từ bảng Kho</w:t>
-      </w:r>
-    </w:p>
-    <w:p>
-      <w:pPr>
-        <w:spacing w:after="40" w:line="280" w:lineRule="auto"/>
-        <w:ind w:left="288"/>
-      </w:pPr>
-      <w:r>
-        <w:rPr>
-          <w:sz w:val="24"/>
-          <w:szCs w:val="24"/>
-        </w:rPr>
-        <w:t>Hình 35: Thống kê toàn hệ thống theo kho, theo vật tư và theo tỷ trọng vốn</w:t>
-      </w:r>
-    </w:p>
-    <w:p>
-      <w:pPr>
-        <w:spacing w:after="40" w:line="280" w:lineRule="auto"/>
-        <w:ind w:left="288"/>
-      </w:pPr>
-      <w:r>
-        <w:rPr>
-          <w:sz w:val="24"/>
-          <w:szCs w:val="24"/>
-        </w:rPr>
-        <w:t>Hình 36: Cảnh báo thiếu hàng kèm đề xuất kho cấp bù</w:t>
-      </w:r>
-    </w:p>
-    <w:p>
-      <w:pPr>
-        <w:spacing w:after="40" w:line="280" w:lineRule="auto"/>
-        <w:ind w:left="288"/>
-      </w:pPr>
-      <w:r>
-        <w:rPr>
-          <w:sz w:val="24"/>
-          <w:szCs w:val="24"/>
-        </w:rPr>
-        <w:t>Hình 37: So sánh hai cách viết truy vấn phân tán qua thời gian thực thi</w:t>
-      </w:r>
-    </w:p>
-    <w:p>
-      <w:pPr>
-        <w:spacing w:after="40" w:line="280" w:lineRule="auto"/>
-        <w:ind w:left="288"/>
-      </w:pPr>
-      <w:r>
-        <w:rPr>
-          <w:sz w:val="24"/>
-          <w:szCs w:val="24"/>
-        </w:rPr>
-        <w:t>Hình 38: Bảng tổng hợp quyền đã cấp cho bốn vai trò và danh sách trigger đang hoạt động</w:t>
-      </w:r>
-    </w:p>
-    <w:p>
-      <w:pPr>
-        <w:spacing w:after="40" w:line="280" w:lineRule="auto"/>
-        <w:ind w:left="288"/>
-      </w:pPr>
-      <w:r>
-        <w:rPr>
-          <w:sz w:val="24"/>
-          <w:szCs w:val="24"/>
-        </w:rPr>
-        <w:t>Hình 39: Kết quả thử quyền — ai làm được gì, ai bị chặn</w:t>
-      </w:r>
-    </w:p>
-    <w:p>
-      <w:pPr>
-        <w:spacing w:after="40" w:line="280" w:lineRule="auto"/>
-        <w:ind w:left="288"/>
-      </w:pPr>
-      <w:r>
-        <w:rPr>
-          <w:sz w:val="24"/>
-          <w:szCs w:val="24"/>
-        </w:rPr>
-        <w:t>Hình 40: Thử trigger tại site KHO_A — cột LỚP CHẶN chỉ rõ hàng phòng thủ nào đã bắt được vi phạm</w:t>
-      </w:r>
-    </w:p>
-    <w:p>
-      <w:pPr>
-        <w:spacing w:after="40" w:line="280" w:lineRule="auto"/>
-        <w:ind w:left="288"/>
-      </w:pPr>
-      <w:r>
-        <w:rPr>
-          <w:sz w:val="24"/>
-          <w:szCs w:val="24"/>
-        </w:rPr>
-        <w:t>Hình 41: Cùng kịch bản chạy tại site KHO_B. Bốn dòng đầu giống hệt, riêng dòng thứ năm đổi từ được phép sang bị chặn — bằng chứng cho thấy trigger phân biệt được vai trò Publisher và Subscriber</w:t>
-      </w:r>
-    </w:p>
-    <w:p>
-      <w:pPr>
-        <w:spacing w:after="40" w:line="280" w:lineRule="auto"/>
-        <w:ind w:left="288"/>
-      </w:pPr>
-      <w:r>
-        <w:rPr>
-          <w:sz w:val="24"/>
-          <w:szCs w:val="24"/>
-        </w:rPr>
-        <w:t>Hình 42: Nhật ký kiểm toán do trigger ghi lại</w:t>
-      </w:r>
-    </w:p>
-    <w:p>
-      <w:pPr>
-        <w:spacing w:after="40" w:line="280" w:lineRule="auto"/>
-        <w:ind w:left="288"/>
-      </w:pPr>
-      <w:r>
-        <w:rPr>
-          <w:sz w:val="24"/>
-          <w:szCs w:val="24"/>
-        </w:rPr>
-        <w:t>Hình 43: Kịch bản T1 — tồn kho trước và sau khi điều chuyển, phiếu được ghi ở cả hai site</w:t>
-      </w:r>
-    </w:p>
-    <w:p>
-      <w:pPr>
-        <w:spacing w:after="40" w:line="280" w:lineRule="auto"/>
-        <w:ind w:left="288"/>
-      </w:pPr>
-      <w:r>
-        <w:rPr>
-          <w:sz w:val="24"/>
-          <w:szCs w:val="24"/>
-        </w:rPr>
-        <w:t>Hình 44: Thông báo của kịch bản T1</w:t>
-      </w:r>
-    </w:p>
-    <w:p>
-      <w:pPr>
-        <w:spacing w:after="40" w:line="280" w:lineRule="auto"/>
-        <w:ind w:left="288"/>
-      </w:pPr>
-      <w:r>
-        <w:rPr>
-          <w:sz w:val="24"/>
-          <w:szCs w:val="24"/>
-        </w:rPr>
-        <w:t>Hình 45: Kịch bản T2 — tồn kho hai site trước và sau đều y nguyên</w:t>
-      </w:r>
-    </w:p>
-    <w:p>
-      <w:pPr>
-        <w:spacing w:after="40" w:line="280" w:lineRule="auto"/>
-        <w:ind w:left="288"/>
-      </w:pPr>
-      <w:r>
-        <w:rPr>
-          <w:sz w:val="24"/>
-          <w:szCs w:val="24"/>
-        </w:rPr>
-        <w:t>Hình 46: Thông báo từ chối của kịch bản T2</w:t>
-      </w:r>
-    </w:p>
-    <w:p>
-      <w:pPr>
-        <w:spacing w:after="40" w:line="280" w:lineRule="auto"/>
-        <w:ind w:left="288"/>
-      </w:pPr>
-      <w:r>
-        <w:rPr>
-          <w:sz w:val="24"/>
-          <w:szCs w:val="24"/>
-        </w:rPr>
-        <w:t>Hình 47: Kịch bản T3 — tồn kho và số phiếu ở cả hai site đều y nguyên sau khi giao tác bị huỷ</w:t>
-      </w:r>
-    </w:p>
-    <w:p>
-      <w:pPr>
-        <w:spacing w:after="40" w:line="280" w:lineRule="auto"/>
-        <w:ind w:left="288"/>
-      </w:pPr>
-      <w:r>
-        <w:rPr>
-          <w:sz w:val="24"/>
-          <w:szCs w:val="24"/>
-        </w:rPr>
-        <w:t>Hình 48: Thông báo quay lui của kịch bản T3</w:t>
-      </w:r>
-    </w:p>
-    <w:p>
-      <w:pPr>
-        <w:spacing w:after="40" w:line="280" w:lineRule="auto"/>
-        <w:ind w:left="288"/>
-      </w:pPr>
-      <w:r>
-        <w:rPr>
-          <w:sz w:val="24"/>
-          <w:szCs w:val="24"/>
-        </w:rPr>
-        <w:t>Hình 49: Kịch bản C1 — hiện tượng mất cập nhật khi không dùng khoá</w:t>
-      </w:r>
-    </w:p>
-    <w:p>
-      <w:pPr>
-        <w:spacing w:after="40" w:line="280" w:lineRule="auto"/>
-        <w:ind w:left="288"/>
-      </w:pPr>
-      <w:r>
-        <w:rPr>
-          <w:sz w:val="24"/>
-          <w:szCs w:val="24"/>
-        </w:rPr>
-        <w:t>Hình 50: Kịch bản C2 — khoá bi quan khắc phục triệt để</w:t>
-      </w:r>
-    </w:p>
-    <w:p>
-      <w:pPr>
-        <w:spacing w:after="40" w:line="280" w:lineRule="auto"/>
-        <w:ind w:left="288"/>
-      </w:pPr>
-      <w:r>
-        <w:rPr>
-          <w:sz w:val="24"/>
-          <w:szCs w:val="24"/>
-        </w:rPr>
-        <w:t>Hình 51: Kịch bản C3 — khoá lạc quan bằng cột ROWVERSION</w:t>
-      </w:r>
-    </w:p>
-    <w:p>
-      <w:pPr>
-        <w:spacing w:after="40" w:line="280" w:lineRule="auto"/>
-        <w:ind w:left="288"/>
-      </w:pPr>
-      <w:r>
-        <w:rPr>
-          <w:sz w:val="24"/>
-          <w:szCs w:val="24"/>
-        </w:rPr>
         <w:t>Hình 52: Kịch bản C4 — khoá chết và cơ chế tự gỡ của SQL Server</w:t>
       </w:r>
     </w:p>
     <w:p>
       <w:pPr>
-        <w:spacing w:after="40" w:line="280" w:lineRule="auto"/>
-        <w:ind w:left="288"/>
-      </w:pPr>
-      <w:r>
-        <w:rPr>
-          <w:sz w:val="24"/>
-          <w:szCs w:val="24"/>
+        <w:spacing w:line="250" w:lineRule="auto"/>
+        <w:ind w:left="360" w:hanging="72"/>
+      </w:pPr>
+      <w:r>
+        <w:rPr>
+          <w:sz w:val="22"/>
+          <w:szCs w:val="22"/>
         </w:rPr>
         <w:t>Hình 53: Quan sát các khoá đang tồn tại trong hệ thống</w:t>
       </w:r>
@@ -4592,7 +4592,7 @@
         <w:pStyle w:val="Heading2"/>
         <w:spacing w:before="240" w:after="120"/>
       </w:pPr>
-      <w:bookmarkStart w:id="2" w:name="_Toc240201313"/>
+      <w:bookmarkStart w:id="2" w:name="_Toc240203044"/>
       <w:r>
         <w:t>DANH SÁCH BẢNG</w:t>
       </w:r>
@@ -4600,378 +4600,377 @@
     </w:p>
     <w:p>
       <w:pPr>
-        <w:spacing w:after="40" w:line="280" w:lineRule="auto"/>
-        <w:ind w:left="288"/>
-      </w:pPr>
-      <w:r>
-        <w:rPr>
-          <w:sz w:val="24"/>
-          <w:szCs w:val="24"/>
+        <w:spacing w:line="250" w:lineRule="auto"/>
+        <w:ind w:left="360" w:hanging="72"/>
+      </w:pPr>
+      <w:r>
+        <w:rPr>
+          <w:sz w:val="22"/>
+          <w:szCs w:val="22"/>
         </w:rPr>
         <w:t>Bảng 1: Ba site trong hệ thống</w:t>
       </w:r>
     </w:p>
     <w:p>
       <w:pPr>
-        <w:spacing w:after="40" w:line="280" w:lineRule="auto"/>
-        <w:ind w:left="288"/>
-      </w:pPr>
-      <w:r>
-        <w:rPr>
-          <w:sz w:val="24"/>
-          <w:szCs w:val="24"/>
-        </w:rPr>
-        <w:lastRenderedPageBreak/>
+        <w:spacing w:line="250" w:lineRule="auto"/>
+        <w:ind w:left="360" w:hanging="72"/>
+      </w:pPr>
+      <w:r>
+        <w:rPr>
+          <w:sz w:val="22"/>
+          <w:szCs w:val="22"/>
+        </w:rPr>
         <w:t>Bảng 2: Ba nhóm bảng theo cách phân bố</w:t>
       </w:r>
     </w:p>
     <w:p>
       <w:pPr>
-        <w:spacing w:after="40" w:line="280" w:lineRule="auto"/>
-        <w:ind w:left="288"/>
-      </w:pPr>
-      <w:r>
-        <w:rPr>
-          <w:sz w:val="24"/>
-          <w:szCs w:val="24"/>
+        <w:spacing w:line="250" w:lineRule="auto"/>
+        <w:ind w:left="360" w:hanging="72"/>
+      </w:pPr>
+      <w:r>
+        <w:rPr>
+          <w:sz w:val="22"/>
+          <w:szCs w:val="22"/>
         </w:rPr>
         <w:t>Bảng 3: Bốn nhóm người dùng và phạm vi quyền</w:t>
       </w:r>
     </w:p>
     <w:p>
       <w:pPr>
-        <w:spacing w:after="40" w:line="280" w:lineRule="auto"/>
-        <w:ind w:left="288"/>
-      </w:pPr>
-      <w:r>
-        <w:rPr>
-          <w:sz w:val="24"/>
-          <w:szCs w:val="24"/>
+        <w:spacing w:line="250" w:lineRule="auto"/>
+        <w:ind w:left="360" w:hanging="72"/>
+      </w:pPr>
+      <w:r>
+        <w:rPr>
+          <w:sz w:val="22"/>
+          <w:szCs w:val="22"/>
         </w:rPr>
         <w:t>Bảng 4: Bảy chức năng chính của hệ thống</w:t>
       </w:r>
     </w:p>
     <w:p>
       <w:pPr>
-        <w:spacing w:after="40" w:line="280" w:lineRule="auto"/>
-        <w:ind w:left="288"/>
-      </w:pPr>
-      <w:r>
-        <w:rPr>
-          <w:sz w:val="24"/>
-          <w:szCs w:val="24"/>
+        <w:spacing w:line="250" w:lineRule="auto"/>
+        <w:ind w:left="360" w:hanging="72"/>
+      </w:pPr>
+      <w:r>
+        <w:rPr>
+          <w:sz w:val="22"/>
+          <w:szCs w:val="22"/>
         </w:rPr>
         <w:t>Bảng 5: Tần suất truy cập theo chức năng và vị trí (lượt/ngày)</w:t>
       </w:r>
     </w:p>
     <w:p>
       <w:pPr>
-        <w:spacing w:after="40" w:line="280" w:lineRule="auto"/>
-        <w:ind w:left="288"/>
-      </w:pPr>
-      <w:r>
-        <w:rPr>
-          <w:sz w:val="24"/>
-          <w:szCs w:val="24"/>
+        <w:spacing w:line="250" w:lineRule="auto"/>
+        <w:ind w:left="360" w:hanging="72"/>
+      </w:pPr>
+      <w:r>
+        <w:rPr>
+          <w:sz w:val="22"/>
+          <w:szCs w:val="22"/>
         </w:rPr>
         <w:t>Bảng 6: Bốn vai trò và quyền tương ứng</w:t>
       </w:r>
     </w:p>
     <w:p>
       <w:pPr>
-        <w:spacing w:after="40" w:line="280" w:lineRule="auto"/>
-        <w:ind w:left="288"/>
-      </w:pPr>
-      <w:r>
-        <w:rPr>
-          <w:sz w:val="24"/>
-          <w:szCs w:val="24"/>
+        <w:spacing w:line="250" w:lineRule="auto"/>
+        <w:ind w:left="360" w:hanging="72"/>
+      </w:pPr>
+      <w:r>
+        <w:rPr>
+          <w:sz w:val="22"/>
+          <w:szCs w:val="22"/>
         </w:rPr>
         <w:t>Bảng 7: Nhiệm vụ riêng của từng site</w:t>
       </w:r>
     </w:p>
     <w:p>
       <w:pPr>
-        <w:spacing w:after="40" w:line="280" w:lineRule="auto"/>
-        <w:ind w:left="288"/>
-      </w:pPr>
-      <w:r>
-        <w:rPr>
-          <w:sz w:val="24"/>
-          <w:szCs w:val="24"/>
+        <w:spacing w:line="250" w:lineRule="auto"/>
+        <w:ind w:left="360" w:hanging="72"/>
+      </w:pPr>
+      <w:r>
+        <w:rPr>
+          <w:sz w:val="22"/>
+          <w:szCs w:val="22"/>
         </w:rPr>
         <w:t>Bảng 8: Phân chia chức năng giữa máy chủ và máy trạm</w:t>
       </w:r>
     </w:p>
     <w:p>
       <w:pPr>
-        <w:spacing w:after="40" w:line="280" w:lineRule="auto"/>
-        <w:ind w:left="288"/>
-      </w:pPr>
-      <w:r>
-        <w:rPr>
-          <w:sz w:val="24"/>
-          <w:szCs w:val="24"/>
+        <w:spacing w:line="250" w:lineRule="auto"/>
+        <w:ind w:left="360" w:hanging="72"/>
+      </w:pPr>
+      <w:r>
+        <w:rPr>
+          <w:sz w:val="22"/>
+          <w:szCs w:val="22"/>
         </w:rPr>
         <w:t>Bảng 9: Các mối kết hợp và bản số</w:t>
       </w:r>
     </w:p>
     <w:p>
       <w:pPr>
-        <w:spacing w:after="40" w:line="280" w:lineRule="auto"/>
-        <w:ind w:left="288"/>
-      </w:pPr>
-      <w:r>
-        <w:rPr>
-          <w:sz w:val="24"/>
-          <w:szCs w:val="24"/>
+        <w:spacing w:line="250" w:lineRule="auto"/>
+        <w:ind w:left="360" w:hanging="72"/>
+      </w:pPr>
+      <w:r>
+        <w:rPr>
+          <w:sz w:val="22"/>
+          <w:szCs w:val="22"/>
         </w:rPr>
         <w:t>Bảng 10: Danh sách chín bảng của hệ thống</w:t>
       </w:r>
     </w:p>
     <w:p>
       <w:pPr>
-        <w:spacing w:after="40" w:line="280" w:lineRule="auto"/>
-        <w:ind w:left="288"/>
-      </w:pPr>
-      <w:r>
-        <w:rPr>
-          <w:sz w:val="24"/>
-          <w:szCs w:val="24"/>
+        <w:spacing w:line="250" w:lineRule="auto"/>
+        <w:ind w:left="360" w:hanging="72"/>
+      </w:pPr>
+      <w:r>
+        <w:rPr>
+          <w:sz w:val="22"/>
+          <w:szCs w:val="22"/>
         </w:rPr>
         <w:t>Bảng 11: Quy ước sinh mã</w:t>
       </w:r>
     </w:p>
     <w:p>
       <w:pPr>
-        <w:spacing w:after="40" w:line="280" w:lineRule="auto"/>
-        <w:ind w:left="288"/>
-      </w:pPr>
-      <w:r>
-        <w:rPr>
-          <w:sz w:val="24"/>
-          <w:szCs w:val="24"/>
+        <w:spacing w:line="250" w:lineRule="auto"/>
+        <w:ind w:left="360" w:hanging="72"/>
+      </w:pPr>
+      <w:r>
+        <w:rPr>
+          <w:sz w:val="22"/>
+          <w:szCs w:val="22"/>
         </w:rPr>
         <w:t>Bảng 12: Danh sách khoá ngoại</w:t>
       </w:r>
     </w:p>
     <w:p>
       <w:pPr>
-        <w:spacing w:after="40" w:line="280" w:lineRule="auto"/>
-        <w:ind w:left="288"/>
-      </w:pPr>
-      <w:r>
-        <w:rPr>
-          <w:sz w:val="24"/>
-          <w:szCs w:val="24"/>
+        <w:spacing w:line="250" w:lineRule="auto"/>
+        <w:ind w:left="360" w:hanging="72"/>
+      </w:pPr>
+      <w:r>
+        <w:rPr>
+          <w:sz w:val="22"/>
+          <w:szCs w:val="22"/>
         </w:rPr>
         <w:t>Bảng 13: Ba mảnh ngang nguyên thủy của TonKho</w:t>
       </w:r>
     </w:p>
     <w:p>
       <w:pPr>
-        <w:spacing w:after="40" w:line="280" w:lineRule="auto"/>
-        <w:ind w:left="288"/>
-      </w:pPr>
-      <w:r>
-        <w:rPr>
-          <w:sz w:val="24"/>
-          <w:szCs w:val="24"/>
+        <w:spacing w:line="250" w:lineRule="auto"/>
+        <w:ind w:left="360" w:hanging="72"/>
+      </w:pPr>
+      <w:r>
+        <w:rPr>
+          <w:sz w:val="22"/>
+          <w:szCs w:val="22"/>
         </w:rPr>
         <w:t>Bảng 14: Cấu hình nhân bản</w:t>
       </w:r>
     </w:p>
     <w:p>
       <w:pPr>
-        <w:spacing w:after="40" w:line="280" w:lineRule="auto"/>
-        <w:ind w:left="288"/>
-      </w:pPr>
-      <w:r>
-        <w:rPr>
-          <w:sz w:val="24"/>
-          <w:szCs w:val="24"/>
+        <w:spacing w:line="250" w:lineRule="auto"/>
+        <w:ind w:left="360" w:hanging="72"/>
+      </w:pPr>
+      <w:r>
+        <w:rPr>
+          <w:sz w:val="22"/>
+          <w:szCs w:val="22"/>
         </w:rPr>
         <w:t>Bảng 15: Lược đồ định vị dữ liệu trên ba site</w:t>
       </w:r>
     </w:p>
     <w:p>
       <w:pPr>
-        <w:spacing w:after="40" w:line="280" w:lineRule="auto"/>
-        <w:ind w:left="288"/>
-      </w:pPr>
-      <w:r>
-        <w:rPr>
-          <w:sz w:val="24"/>
-          <w:szCs w:val="24"/>
+        <w:spacing w:line="250" w:lineRule="auto"/>
+        <w:ind w:left="360" w:hanging="72"/>
+      </w:pPr>
+      <w:r>
+        <w:rPr>
+          <w:sz w:val="22"/>
+          <w:szCs w:val="22"/>
         </w:rPr>
         <w:t>Bảng 16: Hai đường đồng bộ hoá</w:t>
       </w:r>
     </w:p>
     <w:p>
       <w:pPr>
-        <w:spacing w:after="40" w:line="280" w:lineRule="auto"/>
-        <w:ind w:left="288"/>
-      </w:pPr>
-      <w:r>
-        <w:rPr>
-          <w:sz w:val="24"/>
-          <w:szCs w:val="24"/>
+        <w:spacing w:line="250" w:lineRule="auto"/>
+        <w:ind w:left="360" w:hanging="72"/>
+      </w:pPr>
+      <w:r>
+        <w:rPr>
+          <w:sz w:val="22"/>
+          <w:szCs w:val="22"/>
         </w:rPr>
         <w:t>Bảng 17: Cổng TCP được gán cho ba thể hiện</w:t>
       </w:r>
     </w:p>
     <w:p>
       <w:pPr>
-        <w:spacing w:after="40" w:line="280" w:lineRule="auto"/>
-        <w:ind w:left="288"/>
-      </w:pPr>
-      <w:r>
-        <w:rPr>
-          <w:sz w:val="24"/>
-          <w:szCs w:val="24"/>
+        <w:spacing w:line="250" w:lineRule="auto"/>
+        <w:ind w:left="360" w:hanging="72"/>
+      </w:pPr>
+      <w:r>
+        <w:rPr>
+          <w:sz w:val="22"/>
+          <w:szCs w:val="22"/>
         </w:rPr>
         <w:t>Bảng 18: Bốn tuỳ chọn của Linked Server</w:t>
       </w:r>
     </w:p>
     <w:p>
       <w:pPr>
-        <w:spacing w:after="40" w:line="280" w:lineRule="auto"/>
-        <w:ind w:left="288"/>
-      </w:pPr>
-      <w:r>
-        <w:rPr>
-          <w:sz w:val="24"/>
-          <w:szCs w:val="24"/>
+        <w:spacing w:line="250" w:lineRule="auto"/>
+        <w:ind w:left="360" w:hanging="72"/>
+      </w:pPr>
+      <w:r>
+        <w:rPr>
+          <w:sz w:val="22"/>
+          <w:szCs w:val="22"/>
         </w:rPr>
         <w:t>Bảng 19: Năm thủ tục nghiệp vụ</w:t>
       </w:r>
     </w:p>
     <w:p>
       <w:pPr>
-        <w:spacing w:after="40" w:line="280" w:lineRule="auto"/>
-        <w:ind w:left="288"/>
-      </w:pPr>
-      <w:r>
-        <w:rPr>
-          <w:sz w:val="24"/>
-          <w:szCs w:val="24"/>
+        <w:spacing w:line="250" w:lineRule="auto"/>
+        <w:ind w:left="360" w:hanging="72"/>
+      </w:pPr>
+      <w:r>
+        <w:rPr>
+          <w:sz w:val="22"/>
+          <w:szCs w:val="22"/>
         </w:rPr>
         <w:t>Bảng 20: Kết quả kiểm chứng phân mảnh</w:t>
       </w:r>
     </w:p>
     <w:p>
       <w:pPr>
-        <w:spacing w:after="40" w:line="280" w:lineRule="auto"/>
-        <w:ind w:left="288"/>
-      </w:pPr>
-      <w:r>
-        <w:rPr>
-          <w:sz w:val="24"/>
-          <w:szCs w:val="24"/>
+        <w:spacing w:line="250" w:lineRule="auto"/>
+        <w:ind w:left="360" w:hanging="72"/>
+      </w:pPr>
+      <w:r>
+        <w:rPr>
+          <w:sz w:val="22"/>
+          <w:szCs w:val="22"/>
         </w:rPr>
         <w:t>Bảng 21: Số liệu thống kê toàn hệ thống</w:t>
       </w:r>
     </w:p>
     <w:p>
       <w:pPr>
-        <w:spacing w:after="40" w:line="280" w:lineRule="auto"/>
-        <w:ind w:left="288"/>
-      </w:pPr>
-      <w:r>
-        <w:rPr>
-          <w:sz w:val="24"/>
-          <w:szCs w:val="24"/>
+        <w:spacing w:line="250" w:lineRule="auto"/>
+        <w:ind w:left="360" w:hanging="72"/>
+      </w:pPr>
+      <w:r>
+        <w:rPr>
+          <w:sz w:val="22"/>
+          <w:szCs w:val="22"/>
         </w:rPr>
         <w:t>Bảng 22: Ba lớp bảo vệ dữ liệu</w:t>
       </w:r>
     </w:p>
     <w:p>
       <w:pPr>
-        <w:spacing w:after="40" w:line="280" w:lineRule="auto"/>
-        <w:ind w:left="288"/>
-      </w:pPr>
-      <w:r>
-        <w:rPr>
-          <w:sz w:val="24"/>
-          <w:szCs w:val="24"/>
+        <w:spacing w:line="250" w:lineRule="auto"/>
+        <w:ind w:left="360" w:hanging="72"/>
+      </w:pPr>
+      <w:r>
+        <w:rPr>
+          <w:sz w:val="22"/>
+          <w:szCs w:val="22"/>
         </w:rPr>
         <w:t>Bảng 23: Danh sách trigger bảo vệ</w:t>
       </w:r>
     </w:p>
     <w:p>
       <w:pPr>
-        <w:spacing w:after="40" w:line="280" w:lineRule="auto"/>
-        <w:ind w:left="288"/>
-      </w:pPr>
-      <w:r>
-        <w:rPr>
-          <w:sz w:val="24"/>
-          <w:szCs w:val="24"/>
+        <w:spacing w:line="250" w:lineRule="auto"/>
+        <w:ind w:left="360" w:hanging="72"/>
+      </w:pPr>
+      <w:r>
+        <w:rPr>
+          <w:sz w:val="22"/>
+          <w:szCs w:val="22"/>
         </w:rPr>
         <w:t>Bảng 24: Kết quả thử năm hành vi vi phạm</w:t>
       </w:r>
     </w:p>
     <w:p>
       <w:pPr>
-        <w:spacing w:after="40" w:line="280" w:lineRule="auto"/>
-        <w:ind w:left="288"/>
-      </w:pPr>
-      <w:r>
-        <w:rPr>
-          <w:sz w:val="24"/>
-          <w:szCs w:val="24"/>
+        <w:spacing w:line="250" w:lineRule="auto"/>
+        <w:ind w:left="360" w:hanging="72"/>
+      </w:pPr>
+      <w:r>
+        <w:rPr>
+          <w:sz w:val="22"/>
+          <w:szCs w:val="22"/>
         </w:rPr>
         <w:t>Bảng 25: Kết quả kịch bản T1</w:t>
       </w:r>
     </w:p>
     <w:p>
       <w:pPr>
-        <w:spacing w:after="40" w:line="280" w:lineRule="auto"/>
-        <w:ind w:left="288"/>
-      </w:pPr>
-      <w:r>
-        <w:rPr>
-          <w:sz w:val="24"/>
-          <w:szCs w:val="24"/>
+        <w:spacing w:line="250" w:lineRule="auto"/>
+        <w:ind w:left="360" w:hanging="72"/>
+      </w:pPr>
+      <w:r>
+        <w:rPr>
+          <w:sz w:val="22"/>
+          <w:szCs w:val="22"/>
         </w:rPr>
         <w:t>Bảng 26: Tổng kết ba kịch bản giao tác phân tán</w:t>
       </w:r>
     </w:p>
     <w:p>
       <w:pPr>
-        <w:spacing w:after="40" w:line="280" w:lineRule="auto"/>
-        <w:ind w:left="288"/>
-      </w:pPr>
-      <w:r>
-        <w:rPr>
-          <w:sz w:val="24"/>
-          <w:szCs w:val="24"/>
+        <w:spacing w:line="250" w:lineRule="auto"/>
+        <w:ind w:left="360" w:hanging="72"/>
+      </w:pPr>
+      <w:r>
+        <w:rPr>
+          <w:sz w:val="22"/>
+          <w:szCs w:val="22"/>
         </w:rPr>
         <w:t>Bảng 27: Tổng kết bốn kịch bản tương tranh</w:t>
       </w:r>
     </w:p>
     <w:p>
       <w:pPr>
-        <w:spacing w:after="40" w:line="280" w:lineRule="auto"/>
-        <w:ind w:left="288"/>
-      </w:pPr>
-      <w:r>
-        <w:rPr>
-          <w:sz w:val="24"/>
-          <w:szCs w:val="24"/>
+        <w:spacing w:line="250" w:lineRule="auto"/>
+        <w:ind w:left="360" w:hanging="72"/>
+      </w:pPr>
+      <w:r>
+        <w:rPr>
+          <w:sz w:val="22"/>
+          <w:szCs w:val="22"/>
         </w:rPr>
         <w:t>Bảng 28: Đối chiếu yêu cầu đề tài với kết quả</w:t>
       </w:r>
     </w:p>
     <w:p>
       <w:pPr>
-        <w:spacing w:after="40" w:line="280" w:lineRule="auto"/>
-        <w:ind w:left="288"/>
-      </w:pPr>
-      <w:r>
-        <w:rPr>
-          <w:sz w:val="24"/>
-          <w:szCs w:val="24"/>
+        <w:spacing w:line="250" w:lineRule="auto"/>
+        <w:ind w:left="360" w:hanging="72"/>
+      </w:pPr>
+      <w:r>
+        <w:rPr>
+          <w:sz w:val="22"/>
+          <w:szCs w:val="22"/>
         </w:rPr>
         <w:t>Bảng 29: Các sự cố đã xử lý</w:t>
       </w:r>
@@ -4987,7 +4986,7 @@
         <w:spacing w:before="240" w:after="240"/>
         <w:jc w:val="center"/>
       </w:pPr>
-      <w:bookmarkStart w:id="3" w:name="_Toc240201314"/>
+      <w:bookmarkStart w:id="3" w:name="_Toc240203045"/>
       <w:r>
         <w:lastRenderedPageBreak/>
         <w:t>TÓM TẮT</w:t>
@@ -5066,7 +5065,7 @@
         <w:spacing w:before="240" w:after="240"/>
         <w:jc w:val="center"/>
       </w:pPr>
-      <w:bookmarkStart w:id="4" w:name="_Toc240201315"/>
+      <w:bookmarkStart w:id="4" w:name="_Toc240203046"/>
       <w:r>
         <w:lastRenderedPageBreak/>
         <w:t>CHƯƠNG I. TỔNG QUAN</w:t>
@@ -5078,7 +5077,7 @@
         <w:pStyle w:val="Heading2"/>
         <w:spacing w:before="240" w:after="120"/>
       </w:pPr>
-      <w:bookmarkStart w:id="5" w:name="_Toc240201316"/>
+      <w:bookmarkStart w:id="5" w:name="_Toc240203047"/>
       <w:r>
         <w:t>1. Giới thiệu đề tài</w:t>
       </w:r>
@@ -5089,7 +5088,7 @@
         <w:pStyle w:val="Heading3"/>
         <w:spacing w:before="180" w:after="100"/>
       </w:pPr>
-      <w:bookmarkStart w:id="6" w:name="_Toc240201317"/>
+      <w:bookmarkStart w:id="6" w:name="_Toc240203048"/>
       <w:r>
         <w:rPr>
           <w:i/>
@@ -5134,7 +5133,7 @@
         <w:pStyle w:val="Heading3"/>
         <w:spacing w:before="180" w:after="100"/>
       </w:pPr>
-      <w:bookmarkStart w:id="7" w:name="_Toc240201318"/>
+      <w:bookmarkStart w:id="7" w:name="_Toc240203049"/>
       <w:r>
         <w:rPr>
           <w:i/>
@@ -5212,7 +5211,7 @@
         <w:pStyle w:val="Heading3"/>
         <w:spacing w:before="180" w:after="100"/>
       </w:pPr>
-      <w:bookmarkStart w:id="8" w:name="_Toc240201319"/>
+      <w:bookmarkStart w:id="8" w:name="_Toc240203050"/>
       <w:r>
         <w:rPr>
           <w:i/>
@@ -5895,7 +5894,7 @@
         <w:pStyle w:val="Heading3"/>
         <w:spacing w:before="180" w:after="100"/>
       </w:pPr>
-      <w:bookmarkStart w:id="9" w:name="_Toc240201320"/>
+      <w:bookmarkStart w:id="9" w:name="_Toc240203051"/>
       <w:r>
         <w:rPr>
           <w:i/>
@@ -6025,7 +6024,7 @@
         <w:pStyle w:val="Heading3"/>
         <w:spacing w:before="180" w:after="100"/>
       </w:pPr>
-      <w:bookmarkStart w:id="10" w:name="_Toc240201321"/>
+      <w:bookmarkStart w:id="10" w:name="_Toc240203052"/>
       <w:r>
         <w:rPr>
           <w:i/>
@@ -6496,7 +6495,7 @@
         <w:pStyle w:val="Heading3"/>
         <w:spacing w:before="180" w:after="100"/>
       </w:pPr>
-      <w:bookmarkStart w:id="11" w:name="_Toc240201322"/>
+      <w:bookmarkStart w:id="11" w:name="_Toc240203053"/>
       <w:r>
         <w:rPr>
           <w:i/>
@@ -6954,7 +6953,7 @@
         <w:pStyle w:val="Heading2"/>
         <w:spacing w:before="240" w:after="120"/>
       </w:pPr>
-      <w:bookmarkStart w:id="12" w:name="_Toc240201323"/>
+      <w:bookmarkStart w:id="12" w:name="_Toc240203054"/>
       <w:r>
         <w:lastRenderedPageBreak/>
         <w:t>2. Cơ sở lý thuyết</w:t>
@@ -6966,7 +6965,7 @@
         <w:pStyle w:val="Heading3"/>
         <w:spacing w:before="180" w:after="100"/>
       </w:pPr>
-      <w:bookmarkStart w:id="13" w:name="_Toc240201324"/>
+      <w:bookmarkStart w:id="13" w:name="_Toc240203055"/>
       <w:r>
         <w:rPr>
           <w:i/>
@@ -7068,7 +7067,7 @@
         <w:pStyle w:val="Heading3"/>
         <w:spacing w:before="180" w:after="100"/>
       </w:pPr>
-      <w:bookmarkStart w:id="14" w:name="_Toc240201325"/>
+      <w:bookmarkStart w:id="14" w:name="_Toc240203056"/>
       <w:r>
         <w:rPr>
           <w:i/>
@@ -7119,7 +7118,7 @@
         <w:pStyle w:val="Heading3"/>
         <w:spacing w:before="180" w:after="100"/>
       </w:pPr>
-      <w:bookmarkStart w:id="15" w:name="_Toc240201326"/>
+      <w:bookmarkStart w:id="15" w:name="_Toc240203057"/>
       <w:r>
         <w:rPr>
           <w:i/>
@@ -7207,7 +7206,7 @@
         <w:pStyle w:val="Heading3"/>
         <w:spacing w:before="180" w:after="100"/>
       </w:pPr>
-      <w:bookmarkStart w:id="16" w:name="_Toc240201327"/>
+      <w:bookmarkStart w:id="16" w:name="_Toc240203058"/>
       <w:r>
         <w:rPr>
           <w:i/>
@@ -7280,7 +7279,7 @@
         <w:pStyle w:val="Heading3"/>
         <w:spacing w:before="180" w:after="100"/>
       </w:pPr>
-      <w:bookmarkStart w:id="17" w:name="_Toc240201328"/>
+      <w:bookmarkStart w:id="17" w:name="_Toc240203059"/>
       <w:r>
         <w:rPr>
           <w:i/>
@@ -7379,7 +7378,7 @@
         <w:pStyle w:val="Heading3"/>
         <w:spacing w:before="180" w:after="100"/>
       </w:pPr>
-      <w:bookmarkStart w:id="18" w:name="_Toc240201329"/>
+      <w:bookmarkStart w:id="18" w:name="_Toc240203060"/>
       <w:r>
         <w:rPr>
           <w:i/>
@@ -7468,7 +7467,7 @@
         <w:spacing w:before="240" w:after="240"/>
         <w:jc w:val="center"/>
       </w:pPr>
-      <w:bookmarkStart w:id="19" w:name="_Toc240201330"/>
+      <w:bookmarkStart w:id="19" w:name="_Toc240203061"/>
       <w:r>
         <w:lastRenderedPageBreak/>
         <w:t>CHƯƠNG II. PHÂN TÍCH VÀ THIẾT KẾ HỆ THỐNG</w:t>
@@ -7480,7 +7479,7 @@
         <w:pStyle w:val="Heading2"/>
         <w:spacing w:before="240" w:after="120"/>
       </w:pPr>
-      <w:bookmarkStart w:id="20" w:name="_Toc240201331"/>
+      <w:bookmarkStart w:id="20" w:name="_Toc240203062"/>
       <w:r>
         <w:t>1. Phân tích</w:t>
       </w:r>
@@ -7491,7 +7490,7 @@
         <w:pStyle w:val="Heading3"/>
         <w:spacing w:before="180" w:after="100"/>
       </w:pPr>
-      <w:bookmarkStart w:id="21" w:name="_Toc240201332"/>
+      <w:bookmarkStart w:id="21" w:name="_Toc240203063"/>
       <w:r>
         <w:rPr>
           <w:i/>
@@ -8553,7 +8552,7 @@
         <w:pStyle w:val="Heading3"/>
         <w:spacing w:before="180" w:after="100"/>
       </w:pPr>
-      <w:bookmarkStart w:id="22" w:name="_Toc240201333"/>
+      <w:bookmarkStart w:id="22" w:name="_Toc240203064"/>
       <w:r>
         <w:rPr>
           <w:i/>
@@ -9796,7 +9795,7 @@
         <w:pStyle w:val="Heading3"/>
         <w:spacing w:before="180" w:after="100"/>
       </w:pPr>
-      <w:bookmarkStart w:id="23" w:name="_Toc240201334"/>
+      <w:bookmarkStart w:id="23" w:name="_Toc240203065"/>
       <w:r>
         <w:rPr>
           <w:i/>
@@ -10279,7 +10278,7 @@
         <w:pStyle w:val="Heading3"/>
         <w:spacing w:before="180" w:after="100"/>
       </w:pPr>
-      <w:bookmarkStart w:id="24" w:name="_Toc240201335"/>
+      <w:bookmarkStart w:id="24" w:name="_Toc240203066"/>
       <w:r>
         <w:rPr>
           <w:i/>
@@ -10656,7 +10655,7 @@
         <w:pStyle w:val="Heading3"/>
         <w:spacing w:before="180" w:after="100"/>
       </w:pPr>
-      <w:bookmarkStart w:id="25" w:name="_Toc240201336"/>
+      <w:bookmarkStart w:id="25" w:name="_Toc240203067"/>
       <w:r>
         <w:rPr>
           <w:i/>
@@ -10899,7 +10898,7 @@
         <w:pStyle w:val="Heading3"/>
         <w:spacing w:before="180" w:after="100"/>
       </w:pPr>
-      <w:bookmarkStart w:id="26" w:name="_Toc240201337"/>
+      <w:bookmarkStart w:id="26" w:name="_Toc240203068"/>
       <w:r>
         <w:rPr>
           <w:i/>
@@ -12532,7 +12531,7 @@
         <w:pStyle w:val="Heading2"/>
         <w:spacing w:before="240" w:after="120"/>
       </w:pPr>
-      <w:bookmarkStart w:id="27" w:name="_Toc240201338"/>
+      <w:bookmarkStart w:id="27" w:name="_Toc240203069"/>
       <w:r>
         <w:lastRenderedPageBreak/>
         <w:t>2. Thiết kế</w:t>
@@ -12544,7 +12543,7 @@
         <w:pStyle w:val="Heading3"/>
         <w:spacing w:before="180" w:after="100"/>
       </w:pPr>
-      <w:bookmarkStart w:id="28" w:name="_Toc240201339"/>
+      <w:bookmarkStart w:id="28" w:name="_Toc240203070"/>
       <w:r>
         <w:rPr>
           <w:i/>
@@ -15670,7 +15669,7 @@
           <w:noProof/>
         </w:rPr>
         <w:drawing>
-          <wp:inline distT="0" distB="0" distL="0" distR="0" wp14:anchorId="2CA3C788" wp14:editId="222A6AF9">
+          <wp:inline distT="0" distB="0" distL="0" distR="0" wp14:anchorId="2E8645C1" wp14:editId="702EB78E">
             <wp:extent cx="5715000" cy="4067175"/>
             <wp:effectExtent l="0" t="0" r="0" b="0"/>
             <wp:docPr id="1" name="Picture 1"/>
@@ -15741,7 +15740,7 @@
         <w:pStyle w:val="Heading3"/>
         <w:spacing w:before="180" w:after="100"/>
       </w:pPr>
-      <w:bookmarkStart w:id="29" w:name="_Toc240201340"/>
+      <w:bookmarkStart w:id="29" w:name="_Toc240203071"/>
       <w:r>
         <w:rPr>
           <w:i/>
@@ -16321,7 +16320,7 @@
         <w:pStyle w:val="Heading3"/>
         <w:spacing w:before="180" w:after="100"/>
       </w:pPr>
-      <w:bookmarkStart w:id="30" w:name="_Toc240201341"/>
+      <w:bookmarkStart w:id="30" w:name="_Toc240203072"/>
       <w:r>
         <w:rPr>
           <w:i/>
@@ -16552,7 +16551,7 @@
         <w:pStyle w:val="Heading3"/>
         <w:spacing w:before="180" w:after="100"/>
       </w:pPr>
-      <w:bookmarkStart w:id="31" w:name="_Toc240201342"/>
+      <w:bookmarkStart w:id="31" w:name="_Toc240203073"/>
       <w:r>
         <w:rPr>
           <w:i/>
@@ -17132,7 +17131,7 @@
         <w:pStyle w:val="Heading3"/>
         <w:spacing w:before="180" w:after="100"/>
       </w:pPr>
-      <w:bookmarkStart w:id="32" w:name="_Toc240201343"/>
+      <w:bookmarkStart w:id="32" w:name="_Toc240203074"/>
       <w:r>
         <w:rPr>
           <w:i/>
@@ -19032,7 +19031,7 @@
         <w:pStyle w:val="Heading3"/>
         <w:spacing w:before="180" w:after="100"/>
       </w:pPr>
-      <w:bookmarkStart w:id="33" w:name="_Toc240201344"/>
+      <w:bookmarkStart w:id="33" w:name="_Toc240203075"/>
       <w:r>
         <w:rPr>
           <w:i/>
@@ -19632,7 +19631,7 @@
         <w:pStyle w:val="Heading3"/>
         <w:spacing w:before="180" w:after="100"/>
       </w:pPr>
-      <w:bookmarkStart w:id="34" w:name="_Toc240201345"/>
+      <w:bookmarkStart w:id="34" w:name="_Toc240203076"/>
       <w:r>
         <w:rPr>
           <w:i/>
@@ -20395,7 +20394,7 @@
         <w:pStyle w:val="Heading3"/>
         <w:spacing w:before="180" w:after="100"/>
       </w:pPr>
-      <w:bookmarkStart w:id="35" w:name="_Toc240201346"/>
+      <w:bookmarkStart w:id="35" w:name="_Toc240203077"/>
       <w:r>
         <w:rPr>
           <w:i/>
@@ -21167,7 +21166,7 @@
         <w:spacing w:before="240" w:after="240"/>
         <w:jc w:val="center"/>
       </w:pPr>
-      <w:bookmarkStart w:id="36" w:name="_Toc240201347"/>
+      <w:bookmarkStart w:id="36" w:name="_Toc240203078"/>
       <w:r>
         <w:lastRenderedPageBreak/>
         <w:t>CHƯƠNG III. TRIỂN KHAI HỆ THỐNG</w:t>
@@ -21188,7 +21187,7 @@
         <w:pStyle w:val="Heading2"/>
         <w:spacing w:before="240" w:after="120"/>
       </w:pPr>
-      <w:bookmarkStart w:id="37" w:name="_Toc240201348"/>
+      <w:bookmarkStart w:id="37" w:name="_Toc240203079"/>
       <w:r>
         <w:t>1. Cài đặt mạng riêng ảo</w:t>
       </w:r>
@@ -21296,10 +21295,10 @@
           <w:noProof/>
         </w:rPr>
         <w:drawing>
-          <wp:inline distT="0" distB="0" distL="0" distR="0" wp14:anchorId="50569FA2" wp14:editId="2636E724">
+          <wp:inline distT="0" distB="0" distL="0" distR="0" wp14:anchorId="4B44B680" wp14:editId="261A2657">
             <wp:extent cx="5715000" cy="2828925"/>
             <wp:effectExtent l="0" t="0" r="0" b="0"/>
-            <wp:docPr id="941775020" name="Picture 941775020"/>
+            <wp:docPr id="569575777" name="Picture 569575777"/>
             <wp:cNvGraphicFramePr>
               <a:graphicFrameLocks xmlns:a="http://schemas.openxmlformats.org/drawingml/2006/main" noChangeAspect="1"/>
             </wp:cNvGraphicFramePr>
@@ -21361,10 +21360,10 @@
         </w:rPr>
         <w:lastRenderedPageBreak/>
         <w:drawing>
-          <wp:inline distT="0" distB="0" distL="0" distR="0" wp14:anchorId="234E0907" wp14:editId="03BD06D2">
+          <wp:inline distT="0" distB="0" distL="0" distR="0" wp14:anchorId="543DA947" wp14:editId="5C93E22E">
             <wp:extent cx="5715000" cy="1562100"/>
             <wp:effectExtent l="0" t="0" r="0" b="0"/>
-            <wp:docPr id="16943184" name="Picture 16943184"/>
+            <wp:docPr id="1343888250" name="Picture 1343888250"/>
             <wp:cNvGraphicFramePr>
               <a:graphicFrameLocks xmlns:a="http://schemas.openxmlformats.org/drawingml/2006/main" noChangeAspect="1"/>
             </wp:cNvGraphicFramePr>
@@ -21425,10 +21424,10 @@
           <w:noProof/>
         </w:rPr>
         <w:drawing>
-          <wp:inline distT="0" distB="0" distL="0" distR="0" wp14:anchorId="05BB5F63" wp14:editId="00471C2E">
+          <wp:inline distT="0" distB="0" distL="0" distR="0" wp14:anchorId="3058F34D" wp14:editId="5F7A9CB9">
             <wp:extent cx="5715000" cy="2143125"/>
             <wp:effectExtent l="0" t="0" r="0" b="0"/>
-            <wp:docPr id="1294768819" name="Picture 1294768819"/>
+            <wp:docPr id="288354267" name="Picture 288354267"/>
             <wp:cNvGraphicFramePr>
               <a:graphicFrameLocks xmlns:a="http://schemas.openxmlformats.org/drawingml/2006/main" noChangeAspect="1"/>
             </wp:cNvGraphicFramePr>
@@ -21484,7 +21483,7 @@
         <w:pStyle w:val="Heading2"/>
         <w:spacing w:before="240" w:after="120"/>
       </w:pPr>
-      <w:bookmarkStart w:id="38" w:name="_Toc240201349"/>
+      <w:bookmarkStart w:id="38" w:name="_Toc240203080"/>
       <w:r>
         <w:t>2. Tạo đường liên kết mạng giữa các máy chủ</w:t>
       </w:r>
@@ -22059,10 +22058,10 @@
           <w:noProof/>
         </w:rPr>
         <w:drawing>
-          <wp:inline distT="0" distB="0" distL="0" distR="0" wp14:anchorId="4310C190" wp14:editId="74DE9BA2">
+          <wp:inline distT="0" distB="0" distL="0" distR="0" wp14:anchorId="7DDB578B" wp14:editId="62BA76BD">
             <wp:extent cx="2381250" cy="4914900"/>
             <wp:effectExtent l="0" t="0" r="0" b="0"/>
-            <wp:docPr id="1029776851" name="Picture 1029776851"/>
+            <wp:docPr id="647648162" name="Picture 647648162"/>
             <wp:cNvGraphicFramePr>
               <a:graphicFrameLocks xmlns:a="http://schemas.openxmlformats.org/drawingml/2006/main" noChangeAspect="1"/>
             </wp:cNvGraphicFramePr>
@@ -22124,10 +22123,10 @@
         </w:rPr>
         <w:lastRenderedPageBreak/>
         <w:drawing>
-          <wp:inline distT="0" distB="0" distL="0" distR="0" wp14:anchorId="1B059AC7" wp14:editId="410F80C3">
+          <wp:inline distT="0" distB="0" distL="0" distR="0" wp14:anchorId="266A2B9F" wp14:editId="52182902">
             <wp:extent cx="5476875" cy="2686050"/>
             <wp:effectExtent l="0" t="0" r="0" b="0"/>
-            <wp:docPr id="588793680" name="Picture 588793680"/>
+            <wp:docPr id="1292947495" name="Picture 1292947495"/>
             <wp:cNvGraphicFramePr>
               <a:graphicFrameLocks xmlns:a="http://schemas.openxmlformats.org/drawingml/2006/main" noChangeAspect="1"/>
             </wp:cNvGraphicFramePr>
@@ -22188,10 +22187,10 @@
           <w:noProof/>
         </w:rPr>
         <w:drawing>
-          <wp:inline distT="0" distB="0" distL="0" distR="0" wp14:anchorId="0ACB82B9" wp14:editId="3C62AA6E">
+          <wp:inline distT="0" distB="0" distL="0" distR="0" wp14:anchorId="03EA1F0D" wp14:editId="47B5E9B9">
             <wp:extent cx="3886200" cy="4438650"/>
             <wp:effectExtent l="0" t="0" r="0" b="0"/>
-            <wp:docPr id="1565741162" name="Picture 1565741162"/>
+            <wp:docPr id="891256677" name="Picture 891256677"/>
             <wp:cNvGraphicFramePr>
               <a:graphicFrameLocks xmlns:a="http://schemas.openxmlformats.org/drawingml/2006/main" noChangeAspect="1"/>
             </wp:cNvGraphicFramePr>
@@ -22252,10 +22251,10 @@
           <w:noProof/>
         </w:rPr>
         <w:drawing>
-          <wp:inline distT="0" distB="0" distL="0" distR="0" wp14:anchorId="303112C8" wp14:editId="65AA4DCF">
+          <wp:inline distT="0" distB="0" distL="0" distR="0" wp14:anchorId="28D43A4C" wp14:editId="70CD3226">
             <wp:extent cx="5715000" cy="247650"/>
             <wp:effectExtent l="0" t="0" r="0" b="0"/>
-            <wp:docPr id="1902608314" name="Picture 1902608314"/>
+            <wp:docPr id="1672438241" name="Picture 1672438241"/>
             <wp:cNvGraphicFramePr>
               <a:graphicFrameLocks xmlns:a="http://schemas.openxmlformats.org/drawingml/2006/main" noChangeAspect="1"/>
             </wp:cNvGraphicFramePr>
@@ -22317,10 +22316,10 @@
         </w:rPr>
         <w:lastRenderedPageBreak/>
         <w:drawing>
-          <wp:inline distT="0" distB="0" distL="0" distR="0" wp14:anchorId="5177DF28" wp14:editId="7EB8DD04">
+          <wp:inline distT="0" distB="0" distL="0" distR="0" wp14:anchorId="0B09D305" wp14:editId="12F119FF">
             <wp:extent cx="5715000" cy="2085975"/>
             <wp:effectExtent l="0" t="0" r="0" b="0"/>
-            <wp:docPr id="296434578" name="Picture 296434578"/>
+            <wp:docPr id="829426679" name="Picture 829426679"/>
             <wp:cNvGraphicFramePr>
               <a:graphicFrameLocks xmlns:a="http://schemas.openxmlformats.org/drawingml/2006/main" noChangeAspect="1"/>
             </wp:cNvGraphicFramePr>
@@ -22426,7 +22425,7 @@
         <w:pStyle w:val="Heading2"/>
         <w:spacing w:before="240" w:after="120"/>
       </w:pPr>
-      <w:bookmarkStart w:id="39" w:name="_Toc240201350"/>
+      <w:bookmarkStart w:id="39" w:name="_Toc240203081"/>
       <w:r>
         <w:lastRenderedPageBreak/>
         <w:t>3. Cài đặt SQL Server</w:t>
@@ -22464,10 +22463,10 @@
           <w:noProof/>
         </w:rPr>
         <w:drawing>
-          <wp:inline distT="0" distB="0" distL="0" distR="0" wp14:anchorId="1503DA57" wp14:editId="4FDC070F">
+          <wp:inline distT="0" distB="0" distL="0" distR="0" wp14:anchorId="467F016F" wp14:editId="1166E933">
             <wp:extent cx="4476750" cy="3914775"/>
             <wp:effectExtent l="0" t="0" r="0" b="0"/>
-            <wp:docPr id="682892350" name="Picture 682892350"/>
+            <wp:docPr id="2005127020" name="Picture 2005127020"/>
             <wp:cNvGraphicFramePr>
               <a:graphicFrameLocks xmlns:a="http://schemas.openxmlformats.org/drawingml/2006/main" noChangeAspect="1"/>
             </wp:cNvGraphicFramePr>
@@ -22529,10 +22528,10 @@
         </w:rPr>
         <w:lastRenderedPageBreak/>
         <w:drawing>
-          <wp:inline distT="0" distB="0" distL="0" distR="0" wp14:anchorId="4707A0EB" wp14:editId="0AB52261">
+          <wp:inline distT="0" distB="0" distL="0" distR="0" wp14:anchorId="340D1641" wp14:editId="751B9573">
             <wp:extent cx="4476750" cy="3924300"/>
             <wp:effectExtent l="0" t="0" r="0" b="0"/>
-            <wp:docPr id="225294025" name="Picture 225294025"/>
+            <wp:docPr id="1629311654" name="Picture 1629311654"/>
             <wp:cNvGraphicFramePr>
               <a:graphicFrameLocks xmlns:a="http://schemas.openxmlformats.org/drawingml/2006/main" noChangeAspect="1"/>
             </wp:cNvGraphicFramePr>
@@ -22602,10 +22601,10 @@
           <w:noProof/>
         </w:rPr>
         <w:drawing>
-          <wp:inline distT="0" distB="0" distL="0" distR="0" wp14:anchorId="61F48FE5" wp14:editId="7E4127EB">
+          <wp:inline distT="0" distB="0" distL="0" distR="0" wp14:anchorId="3E4154D0" wp14:editId="6B5F8919">
             <wp:extent cx="4476750" cy="3924300"/>
             <wp:effectExtent l="0" t="0" r="0" b="0"/>
-            <wp:docPr id="2076697080" name="Picture 2076697080"/>
+            <wp:docPr id="818626702" name="Picture 818626702"/>
             <wp:cNvGraphicFramePr>
               <a:graphicFrameLocks xmlns:a="http://schemas.openxmlformats.org/drawingml/2006/main" noChangeAspect="1"/>
             </wp:cNvGraphicFramePr>
@@ -22667,10 +22666,10 @@
         </w:rPr>
         <w:lastRenderedPageBreak/>
         <w:drawing>
-          <wp:inline distT="0" distB="0" distL="0" distR="0" wp14:anchorId="24A55982" wp14:editId="7667A2DF">
+          <wp:inline distT="0" distB="0" distL="0" distR="0" wp14:anchorId="4B1B869B" wp14:editId="7A07D254">
             <wp:extent cx="4476750" cy="3914775"/>
             <wp:effectExtent l="0" t="0" r="0" b="0"/>
-            <wp:docPr id="306687380" name="Picture 306687380"/>
+            <wp:docPr id="1666429943" name="Picture 1666429943"/>
             <wp:cNvGraphicFramePr>
               <a:graphicFrameLocks xmlns:a="http://schemas.openxmlformats.org/drawingml/2006/main" noChangeAspect="1"/>
             </wp:cNvGraphicFramePr>
@@ -22731,10 +22730,10 @@
           <w:noProof/>
         </w:rPr>
         <w:drawing>
-          <wp:inline distT="0" distB="0" distL="0" distR="0" wp14:anchorId="00E02C44" wp14:editId="330EEBDE">
+          <wp:inline distT="0" distB="0" distL="0" distR="0" wp14:anchorId="191CE18B" wp14:editId="0405633F">
             <wp:extent cx="4476750" cy="3914775"/>
             <wp:effectExtent l="0" t="0" r="0" b="0"/>
-            <wp:docPr id="512206685" name="Picture 512206685"/>
+            <wp:docPr id="908551188" name="Picture 908551188"/>
             <wp:cNvGraphicFramePr>
               <a:graphicFrameLocks xmlns:a="http://schemas.openxmlformats.org/drawingml/2006/main" noChangeAspect="1"/>
             </wp:cNvGraphicFramePr>
@@ -22796,10 +22795,10 @@
         </w:rPr>
         <w:lastRenderedPageBreak/>
         <w:drawing>
-          <wp:inline distT="0" distB="0" distL="0" distR="0" wp14:anchorId="5E7B8235" wp14:editId="433F1970">
+          <wp:inline distT="0" distB="0" distL="0" distR="0" wp14:anchorId="5DBD21E1" wp14:editId="3BC9A535">
             <wp:extent cx="4476750" cy="3914775"/>
             <wp:effectExtent l="0" t="0" r="0" b="0"/>
-            <wp:docPr id="36813640" name="Picture 36813640"/>
+            <wp:docPr id="1261587865" name="Picture 1261587865"/>
             <wp:cNvGraphicFramePr>
               <a:graphicFrameLocks xmlns:a="http://schemas.openxmlformats.org/drawingml/2006/main" noChangeAspect="1"/>
             </wp:cNvGraphicFramePr>
@@ -22860,10 +22859,10 @@
           <w:noProof/>
         </w:rPr>
         <w:drawing>
-          <wp:inline distT="0" distB="0" distL="0" distR="0" wp14:anchorId="66BFA850" wp14:editId="61A901F7">
+          <wp:inline distT="0" distB="0" distL="0" distR="0" wp14:anchorId="41D3AE62" wp14:editId="70D5AE0E">
             <wp:extent cx="4476750" cy="3905250"/>
             <wp:effectExtent l="0" t="0" r="0" b="0"/>
-            <wp:docPr id="1190290356" name="Picture 1190290356"/>
+            <wp:docPr id="952800724" name="Picture 952800724"/>
             <wp:cNvGraphicFramePr>
               <a:graphicFrameLocks xmlns:a="http://schemas.openxmlformats.org/drawingml/2006/main" noChangeAspect="1"/>
             </wp:cNvGraphicFramePr>
@@ -22925,10 +22924,10 @@
         </w:rPr>
         <w:lastRenderedPageBreak/>
         <w:drawing>
-          <wp:inline distT="0" distB="0" distL="0" distR="0" wp14:anchorId="2BBD5911" wp14:editId="1A0EB014">
+          <wp:inline distT="0" distB="0" distL="0" distR="0" wp14:anchorId="508341BA" wp14:editId="567D531D">
             <wp:extent cx="4476750" cy="3924300"/>
             <wp:effectExtent l="0" t="0" r="0" b="0"/>
-            <wp:docPr id="1051359414" name="Picture 1051359414"/>
+            <wp:docPr id="1671885193" name="Picture 1671885193"/>
             <wp:cNvGraphicFramePr>
               <a:graphicFrameLocks xmlns:a="http://schemas.openxmlformats.org/drawingml/2006/main" noChangeAspect="1"/>
             </wp:cNvGraphicFramePr>
@@ -22989,10 +22988,10 @@
           <w:noProof/>
         </w:rPr>
         <w:drawing>
-          <wp:inline distT="0" distB="0" distL="0" distR="0" wp14:anchorId="4085AD02" wp14:editId="634AF2FA">
+          <wp:inline distT="0" distB="0" distL="0" distR="0" wp14:anchorId="20EA5182" wp14:editId="5845B720">
             <wp:extent cx="4476750" cy="3924300"/>
             <wp:effectExtent l="0" t="0" r="0" b="0"/>
-            <wp:docPr id="582469333" name="Picture 582469333"/>
+            <wp:docPr id="621612592" name="Picture 621612592"/>
             <wp:cNvGraphicFramePr>
               <a:graphicFrameLocks xmlns:a="http://schemas.openxmlformats.org/drawingml/2006/main" noChangeAspect="1"/>
             </wp:cNvGraphicFramePr>
@@ -23054,10 +23053,10 @@
         </w:rPr>
         <w:lastRenderedPageBreak/>
         <w:drawing>
-          <wp:inline distT="0" distB="0" distL="0" distR="0" wp14:anchorId="4D584513" wp14:editId="4E5EC517">
+          <wp:inline distT="0" distB="0" distL="0" distR="0" wp14:anchorId="058F2ABC" wp14:editId="6067152F">
             <wp:extent cx="4476750" cy="3933825"/>
             <wp:effectExtent l="0" t="0" r="0" b="0"/>
-            <wp:docPr id="629665696" name="Picture 629665696"/>
+            <wp:docPr id="736247462" name="Picture 736247462"/>
             <wp:cNvGraphicFramePr>
               <a:graphicFrameLocks xmlns:a="http://schemas.openxmlformats.org/drawingml/2006/main" noChangeAspect="1"/>
             </wp:cNvGraphicFramePr>
@@ -23118,10 +23117,10 @@
           <w:noProof/>
         </w:rPr>
         <w:drawing>
-          <wp:inline distT="0" distB="0" distL="0" distR="0" wp14:anchorId="24BBDF5F" wp14:editId="5674F516">
+          <wp:inline distT="0" distB="0" distL="0" distR="0" wp14:anchorId="6DA49053" wp14:editId="5D41C1B4">
             <wp:extent cx="5715000" cy="4048125"/>
             <wp:effectExtent l="0" t="0" r="0" b="0"/>
-            <wp:docPr id="1530221503" name="Picture 1530221503"/>
+            <wp:docPr id="600625222" name="Picture 600625222"/>
             <wp:cNvGraphicFramePr>
               <a:graphicFrameLocks xmlns:a="http://schemas.openxmlformats.org/drawingml/2006/main" noChangeAspect="1"/>
             </wp:cNvGraphicFramePr>
@@ -23182,7 +23181,7 @@
         <w:pStyle w:val="Heading2"/>
         <w:spacing w:before="240" w:after="120"/>
       </w:pPr>
-      <w:bookmarkStart w:id="40" w:name="_Toc240201351"/>
+      <w:bookmarkStart w:id="40" w:name="_Toc240203082"/>
       <w:r>
         <w:lastRenderedPageBreak/>
         <w:t>4. Kiểm tra dịch vụ Agent</w:t>
@@ -23208,10 +23207,10 @@
           <w:noProof/>
         </w:rPr>
         <w:drawing>
-          <wp:inline distT="0" distB="0" distL="0" distR="0" wp14:anchorId="5FEB21F6" wp14:editId="5A82B375">
+          <wp:inline distT="0" distB="0" distL="0" distR="0" wp14:anchorId="3EB0F27A" wp14:editId="2553153A">
             <wp:extent cx="5715000" cy="1409700"/>
             <wp:effectExtent l="0" t="0" r="0" b="0"/>
-            <wp:docPr id="353271067" name="Picture 353271067"/>
+            <wp:docPr id="183335183" name="Picture 183335183"/>
             <wp:cNvGraphicFramePr>
               <a:graphicFrameLocks xmlns:a="http://schemas.openxmlformats.org/drawingml/2006/main" noChangeAspect="1"/>
             </wp:cNvGraphicFramePr>
@@ -23335,7 +23334,7 @@
         <w:pStyle w:val="Heading2"/>
         <w:spacing w:before="240" w:after="120"/>
       </w:pPr>
-      <w:bookmarkStart w:id="41" w:name="_Toc240201352"/>
+      <w:bookmarkStart w:id="41" w:name="_Toc240203083"/>
       <w:r>
         <w:lastRenderedPageBreak/>
         <w:t>5. Tạo liên kết cơ sở dữ liệu giữa các máy chủ</w:t>
@@ -23402,10 +23401,10 @@
           <w:noProof/>
         </w:rPr>
         <w:drawing>
-          <wp:inline distT="0" distB="0" distL="0" distR="0" wp14:anchorId="632B6838" wp14:editId="134A0895">
+          <wp:inline distT="0" distB="0" distL="0" distR="0" wp14:anchorId="7F6222EA" wp14:editId="72E26AD5">
             <wp:extent cx="4905375" cy="6391275"/>
             <wp:effectExtent l="0" t="0" r="0" b="0"/>
-            <wp:docPr id="344475333" name="Picture 344475333"/>
+            <wp:docPr id="2084547703" name="Picture 2084547703"/>
             <wp:cNvGraphicFramePr>
               <a:graphicFrameLocks xmlns:a="http://schemas.openxmlformats.org/drawingml/2006/main" noChangeAspect="1"/>
             </wp:cNvGraphicFramePr>
@@ -23467,10 +23466,10 @@
         </w:rPr>
         <w:lastRenderedPageBreak/>
         <w:drawing>
-          <wp:inline distT="0" distB="0" distL="0" distR="0" wp14:anchorId="1A38069C" wp14:editId="72625746">
+          <wp:inline distT="0" distB="0" distL="0" distR="0" wp14:anchorId="73296915" wp14:editId="16B146A3">
             <wp:extent cx="5715000" cy="5172075"/>
             <wp:effectExtent l="0" t="0" r="0" b="0"/>
-            <wp:docPr id="946377781" name="Picture 946377781"/>
+            <wp:docPr id="1348616045" name="Picture 1348616045"/>
             <wp:cNvGraphicFramePr>
               <a:graphicFrameLocks xmlns:a="http://schemas.openxmlformats.org/drawingml/2006/main" noChangeAspect="1"/>
             </wp:cNvGraphicFramePr>
@@ -23532,10 +23531,10 @@
         </w:rPr>
         <w:lastRenderedPageBreak/>
         <w:drawing>
-          <wp:inline distT="0" distB="0" distL="0" distR="0" wp14:anchorId="41BB1902" wp14:editId="41BB2FE1">
+          <wp:inline distT="0" distB="0" distL="0" distR="0" wp14:anchorId="29EFA65F" wp14:editId="69CE451A">
             <wp:extent cx="5715000" cy="5162550"/>
             <wp:effectExtent l="0" t="0" r="0" b="0"/>
-            <wp:docPr id="1729884464" name="Picture 1729884464"/>
+            <wp:docPr id="235209942" name="Picture 235209942"/>
             <wp:cNvGraphicFramePr>
               <a:graphicFrameLocks xmlns:a="http://schemas.openxmlformats.org/drawingml/2006/main" noChangeAspect="1"/>
             </wp:cNvGraphicFramePr>
@@ -24070,10 +24069,10 @@
           <w:noProof/>
         </w:rPr>
         <w:drawing>
-          <wp:inline distT="0" distB="0" distL="0" distR="0" wp14:anchorId="45288F86" wp14:editId="4016D7C7">
+          <wp:inline distT="0" distB="0" distL="0" distR="0" wp14:anchorId="293DF84C" wp14:editId="496B4D22">
             <wp:extent cx="5715000" cy="2781300"/>
             <wp:effectExtent l="0" t="0" r="0" b="0"/>
-            <wp:docPr id="505035096" name="Picture 505035096"/>
+            <wp:docPr id="1282399783" name="Picture 1282399783"/>
             <wp:cNvGraphicFramePr>
               <a:graphicFrameLocks xmlns:a="http://schemas.openxmlformats.org/drawingml/2006/main" noChangeAspect="1"/>
             </wp:cNvGraphicFramePr>
@@ -24143,7 +24142,7 @@
         <w:pStyle w:val="Heading2"/>
         <w:spacing w:before="240" w:after="120"/>
       </w:pPr>
-      <w:bookmarkStart w:id="42" w:name="_Toc240201353"/>
+      <w:bookmarkStart w:id="42" w:name="_Toc240203084"/>
       <w:r>
         <w:lastRenderedPageBreak/>
         <w:t>6. Tạo Publication</w:t>
@@ -24169,10 +24168,10 @@
           <w:noProof/>
         </w:rPr>
         <w:drawing>
-          <wp:inline distT="0" distB="0" distL="0" distR="0" wp14:anchorId="4760CDCD" wp14:editId="67C40983">
+          <wp:inline distT="0" distB="0" distL="0" distR="0" wp14:anchorId="347ADCCE" wp14:editId="6875A14D">
             <wp:extent cx="3657600" cy="6200775"/>
             <wp:effectExtent l="0" t="0" r="0" b="0"/>
-            <wp:docPr id="241998111" name="Picture 241998111"/>
+            <wp:docPr id="1840099185" name="Picture 1840099185"/>
             <wp:cNvGraphicFramePr>
               <a:graphicFrameLocks xmlns:a="http://schemas.openxmlformats.org/drawingml/2006/main" noChangeAspect="1"/>
             </wp:cNvGraphicFramePr>
@@ -24234,10 +24233,10 @@
         </w:rPr>
         <w:lastRenderedPageBreak/>
         <w:drawing>
-          <wp:inline distT="0" distB="0" distL="0" distR="0" wp14:anchorId="66ADD0D6" wp14:editId="35319150">
+          <wp:inline distT="0" distB="0" distL="0" distR="0" wp14:anchorId="03B9F858" wp14:editId="1078F4A1">
             <wp:extent cx="5715000" cy="5181600"/>
             <wp:effectExtent l="0" t="0" r="0" b="0"/>
-            <wp:docPr id="1812429955" name="Picture 1812429955"/>
+            <wp:docPr id="1893442847" name="Picture 1893442847"/>
             <wp:cNvGraphicFramePr>
               <a:graphicFrameLocks xmlns:a="http://schemas.openxmlformats.org/drawingml/2006/main" noChangeAspect="1"/>
             </wp:cNvGraphicFramePr>
@@ -24299,10 +24298,10 @@
         </w:rPr>
         <w:lastRenderedPageBreak/>
         <w:drawing>
-          <wp:inline distT="0" distB="0" distL="0" distR="0" wp14:anchorId="49A06F4C" wp14:editId="2ADA8A28">
+          <wp:inline distT="0" distB="0" distL="0" distR="0" wp14:anchorId="0B4D81DC" wp14:editId="377B7F55">
             <wp:extent cx="5715000" cy="4057650"/>
             <wp:effectExtent l="0" t="0" r="0" b="0"/>
-            <wp:docPr id="1748944459" name="Picture 1748944459"/>
+            <wp:docPr id="22323869" name="Picture 22323869"/>
             <wp:cNvGraphicFramePr>
               <a:graphicFrameLocks xmlns:a="http://schemas.openxmlformats.org/drawingml/2006/main" noChangeAspect="1"/>
             </wp:cNvGraphicFramePr>
@@ -24432,10 +24431,10 @@
         </w:rPr>
         <w:lastRenderedPageBreak/>
         <w:drawing>
-          <wp:inline distT="0" distB="0" distL="0" distR="0" wp14:anchorId="1CF2E851" wp14:editId="2DC71F5A">
+          <wp:inline distT="0" distB="0" distL="0" distR="0" wp14:anchorId="17D0B261" wp14:editId="3C57E631">
             <wp:extent cx="5715000" cy="2781300"/>
             <wp:effectExtent l="0" t="0" r="0" b="0"/>
-            <wp:docPr id="1826484556" name="Picture 1826484556"/>
+            <wp:docPr id="1409517212" name="Picture 1409517212"/>
             <wp:cNvGraphicFramePr>
               <a:graphicFrameLocks xmlns:a="http://schemas.openxmlformats.org/drawingml/2006/main" noChangeAspect="1"/>
             </wp:cNvGraphicFramePr>
@@ -24508,7 +24507,7 @@
         <w:pStyle w:val="Heading2"/>
         <w:spacing w:before="240" w:after="120"/>
       </w:pPr>
-      <w:bookmarkStart w:id="43" w:name="_Toc240201354"/>
+      <w:bookmarkStart w:id="43" w:name="_Toc240203085"/>
       <w:r>
         <w:lastRenderedPageBreak/>
         <w:t>7. Thử các giao tác tương ứng với các chức năng</w:t>
@@ -24520,7 +24519,7 @@
         <w:pStyle w:val="Heading3"/>
         <w:spacing w:before="180" w:after="100"/>
       </w:pPr>
-      <w:bookmarkStart w:id="44" w:name="_Toc240201355"/>
+      <w:bookmarkStart w:id="44" w:name="_Toc240203086"/>
       <w:r>
         <w:rPr>
           <w:i/>
@@ -25125,7 +25124,7 @@
         <w:pStyle w:val="Heading3"/>
         <w:spacing w:before="180" w:after="100"/>
       </w:pPr>
-      <w:bookmarkStart w:id="45" w:name="_Toc240201356"/>
+      <w:bookmarkStart w:id="45" w:name="_Toc240203087"/>
       <w:r>
         <w:rPr>
           <w:i/>
@@ -25164,10 +25163,10 @@
         </w:rPr>
         <w:lastRenderedPageBreak/>
         <w:drawing>
-          <wp:inline distT="0" distB="0" distL="0" distR="0" wp14:anchorId="4B0A94D0" wp14:editId="6FFBD696">
+          <wp:inline distT="0" distB="0" distL="0" distR="0" wp14:anchorId="1326AD10" wp14:editId="4DC9E852">
             <wp:extent cx="5524500" cy="6353175"/>
             <wp:effectExtent l="0" t="0" r="0" b="0"/>
-            <wp:docPr id="250691972" name="Picture 250691972"/>
+            <wp:docPr id="1669640808" name="Picture 1669640808"/>
             <wp:cNvGraphicFramePr>
               <a:graphicFrameLocks xmlns:a="http://schemas.openxmlformats.org/drawingml/2006/main" noChangeAspect="1"/>
             </wp:cNvGraphicFramePr>
@@ -25247,10 +25246,10 @@
         </w:rPr>
         <w:lastRenderedPageBreak/>
         <w:drawing>
-          <wp:inline distT="0" distB="0" distL="0" distR="0" wp14:anchorId="2B642F54" wp14:editId="3D7886A7">
+          <wp:inline distT="0" distB="0" distL="0" distR="0" wp14:anchorId="55E283C1" wp14:editId="6DE56784">
             <wp:extent cx="5715000" cy="2143125"/>
             <wp:effectExtent l="0" t="0" r="0" b="0"/>
-            <wp:docPr id="592888252" name="Picture 592888252"/>
+            <wp:docPr id="571376345" name="Picture 571376345"/>
             <wp:cNvGraphicFramePr>
               <a:graphicFrameLocks xmlns:a="http://schemas.openxmlformats.org/drawingml/2006/main" noChangeAspect="1"/>
             </wp:cNvGraphicFramePr>
@@ -25835,10 +25834,10 @@
           <w:noProof/>
         </w:rPr>
         <w:drawing>
-          <wp:inline distT="0" distB="0" distL="0" distR="0" wp14:anchorId="53D2860A" wp14:editId="4E6D1183">
+          <wp:inline distT="0" distB="0" distL="0" distR="0" wp14:anchorId="14C11C15" wp14:editId="4F5EFF1C">
             <wp:extent cx="5715000" cy="3524250"/>
             <wp:effectExtent l="0" t="0" r="0" b="0"/>
-            <wp:docPr id="136523021" name="Picture 136523021"/>
+            <wp:docPr id="1629349919" name="Picture 1629349919"/>
             <wp:cNvGraphicFramePr>
               <a:graphicFrameLocks xmlns:a="http://schemas.openxmlformats.org/drawingml/2006/main" noChangeAspect="1"/>
             </wp:cNvGraphicFramePr>
@@ -25927,10 +25926,10 @@
           <w:noProof/>
         </w:rPr>
         <w:drawing>
-          <wp:inline distT="0" distB="0" distL="0" distR="0" wp14:anchorId="4945AD4D" wp14:editId="11162D3B">
+          <wp:inline distT="0" distB="0" distL="0" distR="0" wp14:anchorId="0A6DB8D5" wp14:editId="2E5866D2">
             <wp:extent cx="5715000" cy="2257425"/>
             <wp:effectExtent l="0" t="0" r="0" b="0"/>
-            <wp:docPr id="1225481014" name="Picture 1225481014"/>
+            <wp:docPr id="1759617964" name="Picture 1759617964"/>
             <wp:cNvGraphicFramePr>
               <a:graphicFrameLocks xmlns:a="http://schemas.openxmlformats.org/drawingml/2006/main" noChangeAspect="1"/>
             </wp:cNvGraphicFramePr>
@@ -26021,10 +26020,10 @@
         </w:rPr>
         <w:lastRenderedPageBreak/>
         <w:drawing>
-          <wp:inline distT="0" distB="0" distL="0" distR="0" wp14:anchorId="1AD1E423" wp14:editId="0129D2EF">
+          <wp:inline distT="0" distB="0" distL="0" distR="0" wp14:anchorId="106D5CE9" wp14:editId="4E920938">
             <wp:extent cx="2733675" cy="5572125"/>
             <wp:effectExtent l="0" t="0" r="0" b="0"/>
-            <wp:docPr id="1461241638" name="Picture 1461241638"/>
+            <wp:docPr id="1956356991" name="Picture 1956356991"/>
             <wp:cNvGraphicFramePr>
               <a:graphicFrameLocks xmlns:a="http://schemas.openxmlformats.org/drawingml/2006/main" noChangeAspect="1"/>
             </wp:cNvGraphicFramePr>
@@ -26092,7 +26091,7 @@
         <w:pStyle w:val="Heading3"/>
         <w:spacing w:before="180" w:after="100"/>
       </w:pPr>
-      <w:bookmarkStart w:id="46" w:name="_Toc240201357"/>
+      <w:bookmarkStart w:id="46" w:name="_Toc240203088"/>
       <w:r>
         <w:rPr>
           <w:i/>
@@ -26113,10 +26112,10 @@
         </w:rPr>
         <w:lastRenderedPageBreak/>
         <w:drawing>
-          <wp:inline distT="0" distB="0" distL="0" distR="0" wp14:anchorId="3C8DC17D" wp14:editId="2544A7C3">
+          <wp:inline distT="0" distB="0" distL="0" distR="0" wp14:anchorId="53789A7C" wp14:editId="54CB6B86">
             <wp:extent cx="5715000" cy="4371975"/>
             <wp:effectExtent l="0" t="0" r="0" b="0"/>
-            <wp:docPr id="508557219" name="Picture 508557219"/>
+            <wp:docPr id="634321212" name="Picture 634321212"/>
             <wp:cNvGraphicFramePr>
               <a:graphicFrameLocks xmlns:a="http://schemas.openxmlformats.org/drawingml/2006/main" noChangeAspect="1"/>
             </wp:cNvGraphicFramePr>
@@ -26735,10 +26734,10 @@
           <w:noProof/>
         </w:rPr>
         <w:drawing>
-          <wp:inline distT="0" distB="0" distL="0" distR="0" wp14:anchorId="55E4B07E" wp14:editId="4153A4A5">
+          <wp:inline distT="0" distB="0" distL="0" distR="0" wp14:anchorId="1AE8E3C6" wp14:editId="7376F293">
             <wp:extent cx="5715000" cy="657225"/>
             <wp:effectExtent l="0" t="0" r="0" b="0"/>
-            <wp:docPr id="1415537858" name="Picture 1415537858"/>
+            <wp:docPr id="875798524" name="Picture 875798524"/>
             <wp:cNvGraphicFramePr>
               <a:graphicFrameLocks xmlns:a="http://schemas.openxmlformats.org/drawingml/2006/main" noChangeAspect="1"/>
             </wp:cNvGraphicFramePr>
@@ -26809,10 +26808,10 @@
         </w:rPr>
         <w:lastRenderedPageBreak/>
         <w:drawing>
-          <wp:inline distT="0" distB="0" distL="0" distR="0" wp14:anchorId="40E023BC" wp14:editId="71C7BC4F">
+          <wp:inline distT="0" distB="0" distL="0" distR="0" wp14:anchorId="3544F4D4" wp14:editId="31713392">
             <wp:extent cx="4152900" cy="3629025"/>
             <wp:effectExtent l="0" t="0" r="0" b="0"/>
-            <wp:docPr id="1101216591" name="Picture 1101216591"/>
+            <wp:docPr id="1608558103" name="Picture 1608558103"/>
             <wp:cNvGraphicFramePr>
               <a:graphicFrameLocks xmlns:a="http://schemas.openxmlformats.org/drawingml/2006/main" noChangeAspect="1"/>
             </wp:cNvGraphicFramePr>
@@ -26880,7 +26879,7 @@
         <w:pStyle w:val="Heading3"/>
         <w:spacing w:before="180" w:after="100"/>
       </w:pPr>
-      <w:bookmarkStart w:id="47" w:name="_Toc240201358"/>
+      <w:bookmarkStart w:id="47" w:name="_Toc240203089"/>
       <w:r>
         <w:rPr>
           <w:i/>
@@ -27934,10 +27933,10 @@
         </w:rPr>
         <w:lastRenderedPageBreak/>
         <w:drawing>
-          <wp:inline distT="0" distB="0" distL="0" distR="0" wp14:anchorId="16901AD0" wp14:editId="316157A2">
+          <wp:inline distT="0" distB="0" distL="0" distR="0" wp14:anchorId="5ED4379D" wp14:editId="0E665822">
             <wp:extent cx="5715000" cy="7372350"/>
             <wp:effectExtent l="0" t="0" r="0" b="0"/>
-            <wp:docPr id="1918215835" name="Picture 1918215835"/>
+            <wp:docPr id="1859791506" name="Picture 1859791506"/>
             <wp:cNvGraphicFramePr>
               <a:graphicFrameLocks xmlns:a="http://schemas.openxmlformats.org/drawingml/2006/main" noChangeAspect="1"/>
             </wp:cNvGraphicFramePr>
@@ -27998,10 +27997,10 @@
           <w:noProof/>
         </w:rPr>
         <w:drawing>
-          <wp:inline distT="0" distB="0" distL="0" distR="0" wp14:anchorId="7E6BB2EC" wp14:editId="04BBF61C">
+          <wp:inline distT="0" distB="0" distL="0" distR="0" wp14:anchorId="074FB884" wp14:editId="18666138">
             <wp:extent cx="5715000" cy="1295400"/>
             <wp:effectExtent l="0" t="0" r="0" b="0"/>
-            <wp:docPr id="1883062204" name="Picture 1883062204"/>
+            <wp:docPr id="2011553239" name="Picture 2011553239"/>
             <wp:cNvGraphicFramePr>
               <a:graphicFrameLocks xmlns:a="http://schemas.openxmlformats.org/drawingml/2006/main" noChangeAspect="1"/>
             </wp:cNvGraphicFramePr>
@@ -28072,10 +28071,10 @@
           <w:noProof/>
         </w:rPr>
         <w:drawing>
-          <wp:inline distT="0" distB="0" distL="0" distR="0" wp14:anchorId="39DD32B7" wp14:editId="75EF6634">
+          <wp:inline distT="0" distB="0" distL="0" distR="0" wp14:anchorId="2AAC5CD7" wp14:editId="31726020">
             <wp:extent cx="5715000" cy="876300"/>
             <wp:effectExtent l="0" t="0" r="0" b="0"/>
-            <wp:docPr id="676379137" name="Picture 676379137"/>
+            <wp:docPr id="1363604933" name="Picture 1363604933"/>
             <wp:cNvGraphicFramePr>
               <a:graphicFrameLocks xmlns:a="http://schemas.openxmlformats.org/drawingml/2006/main" noChangeAspect="1"/>
             </wp:cNvGraphicFramePr>
@@ -28155,10 +28154,10 @@
           <w:noProof/>
         </w:rPr>
         <w:drawing>
-          <wp:inline distT="0" distB="0" distL="0" distR="0" wp14:anchorId="7C30BCEB" wp14:editId="74CC7017">
+          <wp:inline distT="0" distB="0" distL="0" distR="0" wp14:anchorId="0BDE7210" wp14:editId="6FCA7965">
             <wp:extent cx="5715000" cy="866775"/>
             <wp:effectExtent l="0" t="0" r="0" b="0"/>
-            <wp:docPr id="358844176" name="Picture 358844176"/>
+            <wp:docPr id="1026936744" name="Picture 1026936744"/>
             <wp:cNvGraphicFramePr>
               <a:graphicFrameLocks xmlns:a="http://schemas.openxmlformats.org/drawingml/2006/main" noChangeAspect="1"/>
             </wp:cNvGraphicFramePr>
@@ -28744,10 +28743,10 @@
         </w:rPr>
         <w:lastRenderedPageBreak/>
         <w:drawing>
-          <wp:inline distT="0" distB="0" distL="0" distR="0" wp14:anchorId="61F511C6" wp14:editId="11B7B6AB">
+          <wp:inline distT="0" distB="0" distL="0" distR="0" wp14:anchorId="45A010A0" wp14:editId="28AAAA8F">
             <wp:extent cx="5715000" cy="1762125"/>
             <wp:effectExtent l="0" t="0" r="0" b="0"/>
-            <wp:docPr id="415543752" name="Picture 415543752"/>
+            <wp:docPr id="734679496" name="Picture 734679496"/>
             <wp:cNvGraphicFramePr>
               <a:graphicFrameLocks xmlns:a="http://schemas.openxmlformats.org/drawingml/2006/main" noChangeAspect="1"/>
             </wp:cNvGraphicFramePr>
@@ -28824,7 +28823,7 @@
         <w:pStyle w:val="Heading3"/>
         <w:spacing w:before="180" w:after="100"/>
       </w:pPr>
-      <w:bookmarkStart w:id="48" w:name="_Toc240201359"/>
+      <w:bookmarkStart w:id="48" w:name="_Toc240203090"/>
       <w:r>
         <w:rPr>
           <w:i/>
@@ -28967,10 +28966,10 @@
         </w:rPr>
         <w:lastRenderedPageBreak/>
         <w:drawing>
-          <wp:inline distT="0" distB="0" distL="0" distR="0" wp14:anchorId="4FE77A83" wp14:editId="7E53DCDC">
+          <wp:inline distT="0" distB="0" distL="0" distR="0" wp14:anchorId="365E0106" wp14:editId="4F5A0B2F">
             <wp:extent cx="5486400" cy="3228975"/>
             <wp:effectExtent l="0" t="0" r="0" b="0"/>
-            <wp:docPr id="1122113690" name="Picture 1122113690"/>
+            <wp:docPr id="1132774212" name="Picture 1132774212"/>
             <wp:cNvGraphicFramePr>
               <a:graphicFrameLocks xmlns:a="http://schemas.openxmlformats.org/drawingml/2006/main" noChangeAspect="1"/>
             </wp:cNvGraphicFramePr>
@@ -29031,10 +29030,10 @@
           <w:noProof/>
         </w:rPr>
         <w:drawing>
-          <wp:inline distT="0" distB="0" distL="0" distR="0" wp14:anchorId="724CEBFD" wp14:editId="0C0643B9">
+          <wp:inline distT="0" distB="0" distL="0" distR="0" wp14:anchorId="4C6BF944" wp14:editId="654694D2">
             <wp:extent cx="4419600" cy="1228725"/>
             <wp:effectExtent l="0" t="0" r="0" b="0"/>
-            <wp:docPr id="1290223647" name="Picture 1290223647"/>
+            <wp:docPr id="147259972" name="Picture 147259972"/>
             <wp:cNvGraphicFramePr>
               <a:graphicFrameLocks xmlns:a="http://schemas.openxmlformats.org/drawingml/2006/main" noChangeAspect="1"/>
             </wp:cNvGraphicFramePr>
@@ -29472,10 +29471,10 @@
         </w:rPr>
         <w:lastRenderedPageBreak/>
         <w:drawing>
-          <wp:inline distT="0" distB="0" distL="0" distR="0" wp14:anchorId="6760B897" wp14:editId="04967564">
+          <wp:inline distT="0" distB="0" distL="0" distR="0" wp14:anchorId="5FC82470" wp14:editId="1C2AC8F6">
             <wp:extent cx="4362450" cy="2771775"/>
             <wp:effectExtent l="0" t="0" r="0" b="0"/>
-            <wp:docPr id="1409084355" name="Picture 1409084355"/>
+            <wp:docPr id="1755376378" name="Picture 1755376378"/>
             <wp:cNvGraphicFramePr>
               <a:graphicFrameLocks xmlns:a="http://schemas.openxmlformats.org/drawingml/2006/main" noChangeAspect="1"/>
             </wp:cNvGraphicFramePr>
@@ -29536,10 +29535,10 @@
           <w:noProof/>
         </w:rPr>
         <w:drawing>
-          <wp:inline distT="0" distB="0" distL="0" distR="0" wp14:anchorId="1B222C76" wp14:editId="09106803">
+          <wp:inline distT="0" distB="0" distL="0" distR="0" wp14:anchorId="306C4AE7" wp14:editId="458248F9">
             <wp:extent cx="5715000" cy="1038225"/>
             <wp:effectExtent l="0" t="0" r="0" b="0"/>
-            <wp:docPr id="323542771" name="Picture 323542771"/>
+            <wp:docPr id="2007623941" name="Picture 2007623941"/>
             <wp:cNvGraphicFramePr>
               <a:graphicFrameLocks xmlns:a="http://schemas.openxmlformats.org/drawingml/2006/main" noChangeAspect="1"/>
             </wp:cNvGraphicFramePr>
@@ -29647,10 +29646,10 @@
         </w:rPr>
         <w:lastRenderedPageBreak/>
         <w:drawing>
-          <wp:inline distT="0" distB="0" distL="0" distR="0" wp14:anchorId="5572F6F5" wp14:editId="3678F3DD">
+          <wp:inline distT="0" distB="0" distL="0" distR="0" wp14:anchorId="3236561E" wp14:editId="699298AF">
             <wp:extent cx="4191000" cy="3086100"/>
             <wp:effectExtent l="0" t="0" r="0" b="0"/>
-            <wp:docPr id="587803476" name="Picture 587803476"/>
+            <wp:docPr id="165122872" name="Picture 165122872"/>
             <wp:cNvGraphicFramePr>
               <a:graphicFrameLocks xmlns:a="http://schemas.openxmlformats.org/drawingml/2006/main" noChangeAspect="1"/>
             </wp:cNvGraphicFramePr>
@@ -29711,10 +29710,10 @@
           <w:noProof/>
         </w:rPr>
         <w:drawing>
-          <wp:inline distT="0" distB="0" distL="0" distR="0" wp14:anchorId="59303D79" wp14:editId="2AB34325">
+          <wp:inline distT="0" distB="0" distL="0" distR="0" wp14:anchorId="37F85EF8" wp14:editId="4E60316D">
             <wp:extent cx="5715000" cy="952500"/>
             <wp:effectExtent l="0" t="0" r="0" b="0"/>
-            <wp:docPr id="1311332561" name="Picture 1311332561"/>
+            <wp:docPr id="544258568" name="Picture 544258568"/>
             <wp:cNvGraphicFramePr>
               <a:graphicFrameLocks xmlns:a="http://schemas.openxmlformats.org/drawingml/2006/main" noChangeAspect="1"/>
             </wp:cNvGraphicFramePr>
@@ -30271,10 +30270,10 @@
         </w:rPr>
         <w:lastRenderedPageBreak/>
         <w:drawing>
-          <wp:inline distT="0" distB="0" distL="0" distR="0" wp14:anchorId="3A23A368" wp14:editId="044092C5">
+          <wp:inline distT="0" distB="0" distL="0" distR="0" wp14:anchorId="5B54FA90" wp14:editId="661D4997">
             <wp:extent cx="5715000" cy="3133725"/>
             <wp:effectExtent l="0" t="0" r="0" b="0"/>
-            <wp:docPr id="2145997250" name="Picture 2145997250"/>
+            <wp:docPr id="413953509" name="Picture 413953509"/>
             <wp:cNvGraphicFramePr>
               <a:graphicFrameLocks xmlns:a="http://schemas.openxmlformats.org/drawingml/2006/main" noChangeAspect="1"/>
             </wp:cNvGraphicFramePr>
@@ -30347,10 +30346,10 @@
           <w:noProof/>
         </w:rPr>
         <w:drawing>
-          <wp:inline distT="0" distB="0" distL="0" distR="0" wp14:anchorId="3C4B35B5" wp14:editId="2C5825B1">
+          <wp:inline distT="0" distB="0" distL="0" distR="0" wp14:anchorId="0C9D198C" wp14:editId="01E9D4B9">
             <wp:extent cx="5715000" cy="2486025"/>
             <wp:effectExtent l="0" t="0" r="0" b="0"/>
-            <wp:docPr id="327574558" name="Picture 327574558"/>
+            <wp:docPr id="1467504754" name="Picture 1467504754"/>
             <wp:cNvGraphicFramePr>
               <a:graphicFrameLocks xmlns:a="http://schemas.openxmlformats.org/drawingml/2006/main" noChangeAspect="1"/>
             </wp:cNvGraphicFramePr>
@@ -30432,10 +30431,10 @@
         </w:rPr>
         <w:lastRenderedPageBreak/>
         <w:drawing>
-          <wp:inline distT="0" distB="0" distL="0" distR="0" wp14:anchorId="4CAAAEF9" wp14:editId="4B075EB9">
+          <wp:inline distT="0" distB="0" distL="0" distR="0" wp14:anchorId="02926DEA" wp14:editId="468F6009">
             <wp:extent cx="5715000" cy="3238500"/>
             <wp:effectExtent l="0" t="0" r="0" b="0"/>
-            <wp:docPr id="1389961494" name="Picture 1389961494"/>
+            <wp:docPr id="1934428877" name="Picture 1934428877"/>
             <wp:cNvGraphicFramePr>
               <a:graphicFrameLocks xmlns:a="http://schemas.openxmlformats.org/drawingml/2006/main" noChangeAspect="1"/>
             </wp:cNvGraphicFramePr>
@@ -30516,10 +30515,10 @@
           <w:noProof/>
         </w:rPr>
         <w:drawing>
-          <wp:inline distT="0" distB="0" distL="0" distR="0" wp14:anchorId="74C9B7FF" wp14:editId="79A494D7">
+          <wp:inline distT="0" distB="0" distL="0" distR="0" wp14:anchorId="05640253" wp14:editId="68B9D9CE">
             <wp:extent cx="5715000" cy="2486025"/>
             <wp:effectExtent l="0" t="0" r="0" b="0"/>
-            <wp:docPr id="1435253505" name="Picture 1435253505"/>
+            <wp:docPr id="450939499" name="Picture 450939499"/>
             <wp:cNvGraphicFramePr>
               <a:graphicFrameLocks xmlns:a="http://schemas.openxmlformats.org/drawingml/2006/main" noChangeAspect="1"/>
             </wp:cNvGraphicFramePr>
@@ -30602,10 +30601,10 @@
         </w:rPr>
         <w:lastRenderedPageBreak/>
         <w:drawing>
-          <wp:inline distT="0" distB="0" distL="0" distR="0" wp14:anchorId="39EEE8D4" wp14:editId="1D66D613">
+          <wp:inline distT="0" distB="0" distL="0" distR="0" wp14:anchorId="3CE5A1C2" wp14:editId="507B54DC">
             <wp:extent cx="5715000" cy="3057525"/>
             <wp:effectExtent l="0" t="0" r="0" b="0"/>
-            <wp:docPr id="1097629005" name="Picture 1097629005"/>
+            <wp:docPr id="488977647" name="Picture 488977647"/>
             <wp:cNvGraphicFramePr>
               <a:graphicFrameLocks xmlns:a="http://schemas.openxmlformats.org/drawingml/2006/main" noChangeAspect="1"/>
             </wp:cNvGraphicFramePr>
@@ -31237,7 +31236,7 @@
         <w:spacing w:before="240" w:after="240"/>
         <w:jc w:val="center"/>
       </w:pPr>
-      <w:bookmarkStart w:id="49" w:name="_Toc240201360"/>
+      <w:bookmarkStart w:id="49" w:name="_Toc240203091"/>
       <w:r>
         <w:lastRenderedPageBreak/>
         <w:t>CHƯƠNG IV. KẾT LUẬN</w:t>
@@ -31249,7 +31248,7 @@
         <w:pStyle w:val="Heading2"/>
         <w:spacing w:before="240" w:after="120"/>
       </w:pPr>
-      <w:bookmarkStart w:id="50" w:name="_Toc240201361"/>
+      <w:bookmarkStart w:id="50" w:name="_Toc240203092"/>
       <w:r>
         <w:t>1. Kết quả đạt được</w:t>
       </w:r>
@@ -32249,7 +32248,7 @@
         <w:pStyle w:val="Heading2"/>
         <w:spacing w:before="240" w:after="120"/>
       </w:pPr>
-      <w:bookmarkStart w:id="51" w:name="_Toc240201362"/>
+      <w:bookmarkStart w:id="51" w:name="_Toc240203093"/>
       <w:r>
         <w:t>2. Những vấn đề đã gặp và cách khắc phục</w:t>
       </w:r>
@@ -32862,7 +32861,7 @@
         <w:pStyle w:val="Heading2"/>
         <w:spacing w:before="240" w:after="120"/>
       </w:pPr>
-      <w:bookmarkStart w:id="52" w:name="_Toc240201363"/>
+      <w:bookmarkStart w:id="52" w:name="_Toc240203094"/>
       <w:r>
         <w:t>3. Đánh giá</w:t>
       </w:r>
@@ -33017,7 +33016,7 @@
         <w:pStyle w:val="Heading2"/>
         <w:spacing w:before="240" w:after="120"/>
       </w:pPr>
-      <w:bookmarkStart w:id="53" w:name="_Toc240201364"/>
+      <w:bookmarkStart w:id="53" w:name="_Toc240203095"/>
       <w:r>
         <w:t>4. Hướng phát triển</w:t>
       </w:r>
@@ -33100,7 +33099,7 @@
         <w:spacing w:before="240" w:after="240"/>
         <w:jc w:val="center"/>
       </w:pPr>
-      <w:bookmarkStart w:id="54" w:name="_Toc240201365"/>
+      <w:bookmarkStart w:id="54" w:name="_Toc240203096"/>
       <w:r>
         <w:lastRenderedPageBreak/>
         <w:t>TÀI LIỆU THAM KHẢO</w:t>
@@ -33308,96 +33307,10 @@
 <file path=word/numbering.xml><?xml version="1.0" encoding="utf-8"?>
 <w:numbering xmlns:wpc="http://schemas.microsoft.com/office/word/2010/wordprocessingCanvas" xmlns:cx="http://schemas.microsoft.com/office/drawing/2014/chartex" xmlns:cx1="http://schemas.microsoft.com/office/drawing/2015/9/8/chartex" xmlns:cx2="http://schemas.microsoft.com/office/drawing/2015/10/21/chartex" xmlns:cx3="http://schemas.microsoft.com/office/drawing/2016/5/9/chartex" xmlns:cx4="http://schemas.microsoft.com/office/drawing/2016/5/10/chartex" xmlns:cx5="http://schemas.microsoft.com/office/drawing/2016/5/11/chartex" xmlns:cx6="http://schemas.microsoft.com/office/drawing/2016/5/12/chartex" xmlns:cx7="http://schemas.microsoft.com/office/drawing/2016/5/13/chartex" xmlns:cx8="http://schemas.microsoft.com/office/drawing/2016/5/14/chartex" xmlns:mc="http://schemas.openxmlformats.org/markup-compatibility/2006" xmlns:aink="http://schemas.microsoft.com/office/drawing/2016/ink" xmlns:am3d="http://schemas.microsoft.com/office/drawing/2017/model3d" xmlns:o="urn:schemas-microsoft-com:office:office" xmlns:oel="http://schemas.microsoft.com/office/2019/extlst" xmlns:r="http://schemas.openxmlformats.org/officeDocument/2006/relationships" xmlns:m="http://schemas.openxmlformats.org/officeDocument/2006/math" xmlns:v="urn:schemas-microsoft-com:vml" xmlns:wp14="http://schemas.microsoft.com/office/word/2010/wordprocessingDrawing" xmlns:wp="http://schemas.openxmlformats.org/drawingml/2006/wordprocessingDrawing" xmlns:w10="urn:schemas-microsoft-com:office:word" xmlns:w="http://schemas.openxmlformats.org/wordprocessingml/2006/main" xmlns:w14="http://schemas.microsoft.com/office/word/2010/wordml" xmlns:w15="http://schemas.microsoft.com/office/word/2012/wordml" xmlns:w16cex="http://schemas.microsoft.com/office/word/2018/wordml/cex" xmlns:w16cid="http://schemas.microsoft.com/office/word/2016/wordml/cid" xmlns:w16="http://schemas.microsoft.com/office/word/2018/wordml" xmlns:w16du="http://schemas.microsoft.com/office/word/2023/wordml/word16du" xmlns:w16sdtdh="http://schemas.microsoft.com/office/word/2020/wordml/sdtdatahash" xmlns:w16sdtfl="http://schemas.microsoft.com/office/word/2024/wordml/sdtformatlock" xmlns:w16se="http://schemas.microsoft.com/office/word/2015/wordml/symex" xmlns:wpg="http://schemas.microsoft.com/office/word/2010/wordprocessingGroup" xmlns:wpi="http://schemas.microsoft.com/office/word/2010/wordprocessingInk" xmlns:wne="http://schemas.microsoft.com/office/word/2006/wordml" xmlns:wps="http://schemas.microsoft.com/office/word/2010/wordprocessingShape" mc:Ignorable="w14 w15 w16se w16cid w16 w16cex w16sdtdh w16sdtfl w16du wp14">
   <w:abstractNum w:abstractNumId="0" w15:restartNumberingAfterBreak="0">
-    <w:nsid w:val="16B970FC"/>
+    <w:nsid w:val="18EE17E4"/>
     <w:multiLevelType w:val="hybridMultilevel"/>
-    <w:tmpl w:val="5A34F5AC"/>
-    <w:lvl w:ilvl="0" w:tplc="80F81C98">
-      <w:start w:val="1"/>
-      <w:numFmt w:val="bullet"/>
-      <w:lvlText w:val="●"/>
-      <w:lvlJc w:val="left"/>
-      <w:pPr>
-        <w:ind w:left="720" w:hanging="360"/>
-      </w:pPr>
-    </w:lvl>
-    <w:lvl w:ilvl="1" w:tplc="419A057E">
-      <w:start w:val="1"/>
-      <w:numFmt w:val="bullet"/>
-      <w:lvlText w:val="○"/>
-      <w:lvlJc w:val="left"/>
-      <w:pPr>
-        <w:ind w:left="1440" w:hanging="360"/>
-      </w:pPr>
-    </w:lvl>
-    <w:lvl w:ilvl="2" w:tplc="F51AAD12">
-      <w:start w:val="1"/>
-      <w:numFmt w:val="bullet"/>
-      <w:lvlText w:val="■"/>
-      <w:lvlJc w:val="left"/>
-      <w:pPr>
-        <w:ind w:left="2160" w:hanging="360"/>
-      </w:pPr>
-    </w:lvl>
-    <w:lvl w:ilvl="3" w:tplc="38DC9F9A">
-      <w:start w:val="1"/>
-      <w:numFmt w:val="bullet"/>
-      <w:lvlText w:val="●"/>
-      <w:lvlJc w:val="left"/>
-      <w:pPr>
-        <w:ind w:left="2880" w:hanging="360"/>
-      </w:pPr>
-    </w:lvl>
-    <w:lvl w:ilvl="4" w:tplc="6158FDCE">
-      <w:start w:val="1"/>
-      <w:numFmt w:val="bullet"/>
-      <w:lvlText w:val="○"/>
-      <w:lvlJc w:val="left"/>
-      <w:pPr>
-        <w:ind w:left="3600" w:hanging="360"/>
-      </w:pPr>
-    </w:lvl>
-    <w:lvl w:ilvl="5" w:tplc="7750D1B8">
-      <w:start w:val="1"/>
-      <w:numFmt w:val="bullet"/>
-      <w:lvlText w:val="■"/>
-      <w:lvlJc w:val="left"/>
-      <w:pPr>
-        <w:ind w:left="4320" w:hanging="360"/>
-      </w:pPr>
-    </w:lvl>
-    <w:lvl w:ilvl="6" w:tplc="2DA68752">
-      <w:start w:val="1"/>
-      <w:numFmt w:val="bullet"/>
-      <w:lvlText w:val="●"/>
-      <w:lvlJc w:val="left"/>
-      <w:pPr>
-        <w:ind w:left="5040" w:hanging="360"/>
-      </w:pPr>
-    </w:lvl>
-    <w:lvl w:ilvl="7" w:tplc="C464DD26">
-      <w:start w:val="1"/>
-      <w:numFmt w:val="bullet"/>
-      <w:lvlText w:val="●"/>
-      <w:lvlJc w:val="left"/>
-      <w:pPr>
-        <w:ind w:left="5760" w:hanging="360"/>
-      </w:pPr>
-    </w:lvl>
-    <w:lvl w:ilvl="8" w:tplc="B6824C92">
-      <w:start w:val="1"/>
-      <w:numFmt w:val="bullet"/>
-      <w:lvlText w:val="●"/>
-      <w:lvlJc w:val="left"/>
-      <w:pPr>
-        <w:ind w:left="6480" w:hanging="360"/>
-      </w:pPr>
-    </w:lvl>
-  </w:abstractNum>
-  <w:abstractNum w:abstractNumId="1" w15:restartNumberingAfterBreak="0">
-    <w:nsid w:val="41FB6D2B"/>
-    <w:multiLevelType w:val="hybridMultilevel"/>
-    <w:tmpl w:val="B2D2D408"/>
-    <w:lvl w:ilvl="0" w:tplc="C528147E">
+    <w:tmpl w:val="7FFE9E6A"/>
+    <w:lvl w:ilvl="0" w:tplc="E9503C4C">
       <w:start w:val="1"/>
       <w:numFmt w:val="decimal"/>
       <w:lvlText w:val="%1."/>
@@ -33406,113 +33319,199 @@
         <w:ind w:left="648" w:hanging="360"/>
       </w:pPr>
     </w:lvl>
-    <w:lvl w:ilvl="1" w:tplc="AD16C1D4">
+    <w:lvl w:ilvl="1" w:tplc="9CA855BE">
       <w:numFmt w:val="decimal"/>
       <w:lvlText w:val=""/>
       <w:lvlJc w:val="left"/>
     </w:lvl>
-    <w:lvl w:ilvl="2" w:tplc="616A8598">
+    <w:lvl w:ilvl="2" w:tplc="BE1A7A5E">
       <w:numFmt w:val="decimal"/>
       <w:lvlText w:val=""/>
       <w:lvlJc w:val="left"/>
     </w:lvl>
-    <w:lvl w:ilvl="3" w:tplc="B770E7DC">
+    <w:lvl w:ilvl="3" w:tplc="084C95C4">
       <w:numFmt w:val="decimal"/>
       <w:lvlText w:val=""/>
       <w:lvlJc w:val="left"/>
     </w:lvl>
-    <w:lvl w:ilvl="4" w:tplc="9EDE319A">
+    <w:lvl w:ilvl="4" w:tplc="297864BA">
       <w:numFmt w:val="decimal"/>
       <w:lvlText w:val=""/>
       <w:lvlJc w:val="left"/>
     </w:lvl>
-    <w:lvl w:ilvl="5" w:tplc="4A4812F4">
+    <w:lvl w:ilvl="5" w:tplc="A02C62BC">
       <w:numFmt w:val="decimal"/>
       <w:lvlText w:val=""/>
       <w:lvlJc w:val="left"/>
     </w:lvl>
-    <w:lvl w:ilvl="6" w:tplc="7C181508">
+    <w:lvl w:ilvl="6" w:tplc="44EEA948">
       <w:numFmt w:val="decimal"/>
       <w:lvlText w:val=""/>
       <w:lvlJc w:val="left"/>
     </w:lvl>
-    <w:lvl w:ilvl="7" w:tplc="3A5C6884">
+    <w:lvl w:ilvl="7" w:tplc="C5A00C70">
       <w:numFmt w:val="decimal"/>
       <w:lvlText w:val=""/>
       <w:lvlJc w:val="left"/>
     </w:lvl>
-    <w:lvl w:ilvl="8" w:tplc="1A209B24">
+    <w:lvl w:ilvl="8" w:tplc="95C2A372">
+      <w:numFmt w:val="decimal"/>
+      <w:lvlText w:val=""/>
+      <w:lvlJc w:val="left"/>
+    </w:lvl>
+  </w:abstractNum>
+  <w:abstractNum w:abstractNumId="1" w15:restartNumberingAfterBreak="0">
+    <w:nsid w:val="446D3F25"/>
+    <w:multiLevelType w:val="hybridMultilevel"/>
+    <w:tmpl w:val="7570DD84"/>
+    <w:lvl w:ilvl="0" w:tplc="B1688878">
+      <w:start w:val="1"/>
+      <w:numFmt w:val="bullet"/>
+      <w:lvlText w:val="•"/>
+      <w:lvlJc w:val="left"/>
+      <w:pPr>
+        <w:ind w:left="648" w:hanging="316"/>
+      </w:pPr>
+    </w:lvl>
+    <w:lvl w:ilvl="1" w:tplc="D388AB7E">
+      <w:start w:val="1"/>
+      <w:numFmt w:val="bullet"/>
+      <w:lvlText w:val="◦"/>
+      <w:lvlJc w:val="left"/>
+      <w:pPr>
+        <w:ind w:left="1152" w:hanging="316"/>
+      </w:pPr>
+    </w:lvl>
+    <w:lvl w:ilvl="2" w:tplc="6FDCC99C">
+      <w:numFmt w:val="decimal"/>
+      <w:lvlText w:val=""/>
+      <w:lvlJc w:val="left"/>
+    </w:lvl>
+    <w:lvl w:ilvl="3" w:tplc="0AA263BA">
+      <w:numFmt w:val="decimal"/>
+      <w:lvlText w:val=""/>
+      <w:lvlJc w:val="left"/>
+    </w:lvl>
+    <w:lvl w:ilvl="4" w:tplc="4B5C8C74">
+      <w:numFmt w:val="decimal"/>
+      <w:lvlText w:val=""/>
+      <w:lvlJc w:val="left"/>
+    </w:lvl>
+    <w:lvl w:ilvl="5" w:tplc="B55281C2">
+      <w:numFmt w:val="decimal"/>
+      <w:lvlText w:val=""/>
+      <w:lvlJc w:val="left"/>
+    </w:lvl>
+    <w:lvl w:ilvl="6" w:tplc="5E2AD948">
+      <w:numFmt w:val="decimal"/>
+      <w:lvlText w:val=""/>
+      <w:lvlJc w:val="left"/>
+    </w:lvl>
+    <w:lvl w:ilvl="7" w:tplc="207EF608">
+      <w:numFmt w:val="decimal"/>
+      <w:lvlText w:val=""/>
+      <w:lvlJc w:val="left"/>
+    </w:lvl>
+    <w:lvl w:ilvl="8" w:tplc="3A7C033A">
       <w:numFmt w:val="decimal"/>
       <w:lvlText w:val=""/>
       <w:lvlJc w:val="left"/>
     </w:lvl>
   </w:abstractNum>
   <w:abstractNum w:abstractNumId="2" w15:restartNumberingAfterBreak="0">
-    <w:nsid w:val="4B634876"/>
+    <w:nsid w:val="532B6A7B"/>
     <w:multiLevelType w:val="hybridMultilevel"/>
-    <w:tmpl w:val="50064B00"/>
-    <w:lvl w:ilvl="0" w:tplc="98AA5708">
+    <w:tmpl w:val="5BDECA04"/>
+    <w:lvl w:ilvl="0" w:tplc="9936421E">
       <w:start w:val="1"/>
       <w:numFmt w:val="bullet"/>
-      <w:lvlText w:val="•"/>
+      <w:lvlText w:val="●"/>
       <w:lvlJc w:val="left"/>
       <w:pPr>
-        <w:ind w:left="648" w:hanging="316"/>
+        <w:ind w:left="720" w:hanging="360"/>
       </w:pPr>
     </w:lvl>
-    <w:lvl w:ilvl="1" w:tplc="6462627A">
+    <w:lvl w:ilvl="1" w:tplc="DBF266D4">
       <w:start w:val="1"/>
       <w:numFmt w:val="bullet"/>
-      <w:lvlText w:val="◦"/>
+      <w:lvlText w:val="○"/>
       <w:lvlJc w:val="left"/>
       <w:pPr>
-        <w:ind w:left="1152" w:hanging="316"/>
+        <w:ind w:left="1440" w:hanging="360"/>
       </w:pPr>
     </w:lvl>
-    <w:lvl w:ilvl="2" w:tplc="3A5C41D6">
-      <w:numFmt w:val="decimal"/>
-      <w:lvlText w:val=""/>
+    <w:lvl w:ilvl="2" w:tplc="67327EC6">
+      <w:start w:val="1"/>
+      <w:numFmt w:val="bullet"/>
+      <w:lvlText w:val="■"/>
       <w:lvlJc w:val="left"/>
+      <w:pPr>
+        <w:ind w:left="2160" w:hanging="360"/>
+      </w:pPr>
     </w:lvl>
-    <w:lvl w:ilvl="3" w:tplc="3F2A8CB6">
-      <w:numFmt w:val="decimal"/>
-      <w:lvlText w:val=""/>
+    <w:lvl w:ilvl="3" w:tplc="F6F231C2">
+      <w:start w:val="1"/>
+      <w:numFmt w:val="bullet"/>
+      <w:lvlText w:val="●"/>
       <w:lvlJc w:val="left"/>
+      <w:pPr>
+        <w:ind w:left="2880" w:hanging="360"/>
+      </w:pPr>
     </w:lvl>
-    <w:lvl w:ilvl="4" w:tplc="861C67F2">
-      <w:numFmt w:val="decimal"/>
-      <w:lvlText w:val=""/>
+    <w:lvl w:ilvl="4" w:tplc="674E829E">
+      <w:start w:val="1"/>
+      <w:numFmt w:val="bullet"/>
+      <w:lvlText w:val="○"/>
       <w:lvlJc w:val="left"/>
+      <w:pPr>
+        <w:ind w:left="3600" w:hanging="360"/>
+      </w:pPr>
     </w:lvl>
-    <w:lvl w:ilvl="5" w:tplc="3D8CABC0">
-      <w:numFmt w:val="decimal"/>
-      <w:lvlText w:val=""/>
+    <w:lvl w:ilvl="5" w:tplc="868E8A5A">
+      <w:start w:val="1"/>
+      <w:numFmt w:val="bullet"/>
+      <w:lvlText w:val="■"/>
       <w:lvlJc w:val="left"/>
+      <w:pPr>
+        <w:ind w:left="4320" w:hanging="360"/>
+      </w:pPr>
     </w:lvl>
-    <w:lvl w:ilvl="6" w:tplc="87B4AB32">
-      <w:numFmt w:val="decimal"/>
-      <w:lvlText w:val=""/>
+    <w:lvl w:ilvl="6" w:tplc="368E3AA4">
+      <w:start w:val="1"/>
+      <w:numFmt w:val="bullet"/>
+      <w:lvlText w:val="●"/>
       <w:lvlJc w:val="left"/>
+      <w:pPr>
+        <w:ind w:left="5040" w:hanging="360"/>
+      </w:pPr>
     </w:lvl>
-    <w:lvl w:ilvl="7" w:tplc="2C3C752C">
-      <w:numFmt w:val="decimal"/>
-      <w:lvlText w:val=""/>
+    <w:lvl w:ilvl="7" w:tplc="04E2CE96">
+      <w:start w:val="1"/>
+      <w:numFmt w:val="bullet"/>
+      <w:lvlText w:val="●"/>
       <w:lvlJc w:val="left"/>
+      <w:pPr>
+        <w:ind w:left="5760" w:hanging="360"/>
+      </w:pPr>
     </w:lvl>
-    <w:lvl w:ilvl="8" w:tplc="78E2D440">
-      <w:numFmt w:val="decimal"/>
-      <w:lvlText w:val=""/>
+    <w:lvl w:ilvl="8" w:tplc="CA1E61F4">
+      <w:start w:val="1"/>
+      <w:numFmt w:val="bullet"/>
+      <w:lvlText w:val="●"/>
       <w:lvlJc w:val="left"/>
+      <w:pPr>
+        <w:ind w:left="6480" w:hanging="360"/>
+      </w:pPr>
     </w:lvl>
   </w:abstractNum>
-  <w:num w:numId="1" w16cid:durableId="1906381033">
-    <w:abstractNumId w:val="0"/>
+  <w:num w:numId="1" w16cid:durableId="822965458">
+    <w:abstractNumId w:val="2"/>
     <w:lvlOverride w:ilvl="0">
       <w:startOverride w:val="1"/>
     </w:lvlOverride>
   </w:num>
-  <w:num w:numId="2" w16cid:durableId="772748273">
-    <w:abstractNumId w:val="2"/>
+  <w:num w:numId="2" w16cid:durableId="1276062224">
+    <w:abstractNumId w:val="1"/>
     <w:lvlOverride w:ilvl="0">
       <w:startOverride w:val="1"/>
     </w:lvlOverride>
@@ -34127,7 +34126,7 @@
     <w:autoRedefine/>
     <w:uiPriority w:val="39"/>
     <w:unhideWhenUsed/>
-    <w:rsid w:val="0095742D"/>
+    <w:rsid w:val="001D6D80"/>
     <w:pPr>
       <w:spacing w:after="100"/>
     </w:pPr>
@@ -34139,7 +34138,7 @@
     <w:autoRedefine/>
     <w:uiPriority w:val="39"/>
     <w:unhideWhenUsed/>
-    <w:rsid w:val="0095742D"/>
+    <w:rsid w:val="001D6D80"/>
     <w:pPr>
       <w:spacing w:after="100"/>
       <w:ind w:left="260"/>
@@ -34152,7 +34151,7 @@
     <w:autoRedefine/>
     <w:uiPriority w:val="39"/>
     <w:unhideWhenUsed/>
-    <w:rsid w:val="0095742D"/>
+    <w:rsid w:val="001D6D80"/>
     <w:pPr>
       <w:spacing w:after="100"/>
       <w:ind w:left="520"/>

</xml_diff>

<commit_message>
Đưa phần mềm trạm vào báo cáo, sửa dòng hạn chế đã lỗi thời
Chương IV vẫn ghi "chưa xây dựng phần mềm ứng dụng cho các trạm" trong
khi phần mềm đã chạy thật - để nguyên thì báo cáo tự mâu thuẫn với chính
mục 3.8 vừa thêm.

Mục 3.8 mới gồm ba ảnh chụp màn hình thật, bảng đối chiếu bảy màn hình
với năm nghiệp vụ đề bài, và giải thích vì sao ứng dụng phải gọi thủ tục
chứ không được ghi thẳng vào bảng.

Hướng phát triển đổi thành bổ sung đăng nhập và ánh xạ người dùng sang
bốn vai trò, vì việc cũ nay đã làm xong.

67 trang, 56 hình, 30 bảng.

Co-Authored-By: Claude Opus 5 <noreply@anthropic.com>
</commit_message>
<xml_diff>
--- a/Do an cuoi ki/BaoCao_DoAn_CSDLPhanTan.docx
+++ b/Do an cuoi ki/BaoCao_DoAn_CSDLPhanTan.docx
@@ -320,7 +320,7 @@
     <w:sdt>
       <w:sdtPr>
         <w:alias w:val="Muc luc"/>
-        <w:id w:val="1190804282"/>
+        <w:id w:val="130058254"/>
       </w:sdtPr>
       <w:sdtEndPr/>
       <w:sdtContent>
@@ -370,7 +370,7 @@
             <w:rPr>
               <w:noProof/>
             </w:rPr>
-            <w:instrText xml:space="preserve"> PAGEREF _Toc240203042 \h </w:instrText>
+            <w:instrText xml:space="preserve"> PAGEREF _Toc240210967 \h </w:instrText>
           </w:r>
           <w:r>
             <w:rPr>
@@ -433,7 +433,7 @@
             <w:rPr>
               <w:noProof/>
             </w:rPr>
-            <w:instrText xml:space="preserve"> PAGEREF _Toc240203043 \h </w:instrText>
+            <w:instrText xml:space="preserve"> PAGEREF _Toc240210968 \h </w:instrText>
           </w:r>
           <w:r>
             <w:rPr>
@@ -496,7 +496,7 @@
             <w:rPr>
               <w:noProof/>
             </w:rPr>
-            <w:instrText xml:space="preserve"> PAGEREF _Toc240203044 \h </w:instrText>
+            <w:instrText xml:space="preserve"> PAGEREF _Toc240210969 \h </w:instrText>
           </w:r>
           <w:r>
             <w:rPr>
@@ -559,7 +559,7 @@
             <w:rPr>
               <w:noProof/>
             </w:rPr>
-            <w:instrText xml:space="preserve"> PAGEREF _Toc240203045 \h </w:instrText>
+            <w:instrText xml:space="preserve"> PAGEREF _Toc240210970 \h </w:instrText>
           </w:r>
           <w:r>
             <w:rPr>
@@ -622,7 +622,7 @@
             <w:rPr>
               <w:noProof/>
             </w:rPr>
-            <w:instrText xml:space="preserve"> PAGEREF _Toc240203046 \h </w:instrText>
+            <w:instrText xml:space="preserve"> PAGEREF _Toc240210971 \h </w:instrText>
           </w:r>
           <w:r>
             <w:rPr>
@@ -685,7 +685,7 @@
             <w:rPr>
               <w:noProof/>
             </w:rPr>
-            <w:instrText xml:space="preserve"> PAGEREF _Toc240203047 \h </w:instrText>
+            <w:instrText xml:space="preserve"> PAGEREF _Toc240210972 \h </w:instrText>
           </w:r>
           <w:r>
             <w:rPr>
@@ -750,7 +750,7 @@
             <w:rPr>
               <w:noProof/>
             </w:rPr>
-            <w:instrText xml:space="preserve"> PAGEREF _Toc240203048 \h </w:instrText>
+            <w:instrText xml:space="preserve"> PAGEREF _Toc240210973 \h </w:instrText>
           </w:r>
           <w:r>
             <w:rPr>
@@ -815,7 +815,7 @@
             <w:rPr>
               <w:noProof/>
             </w:rPr>
-            <w:instrText xml:space="preserve"> PAGEREF _Toc240203049 \h </w:instrText>
+            <w:instrText xml:space="preserve"> PAGEREF _Toc240210974 \h </w:instrText>
           </w:r>
           <w:r>
             <w:rPr>
@@ -880,7 +880,7 @@
             <w:rPr>
               <w:noProof/>
             </w:rPr>
-            <w:instrText xml:space="preserve"> PAGEREF _Toc240203050 \h </w:instrText>
+            <w:instrText xml:space="preserve"> PAGEREF _Toc240210975 \h </w:instrText>
           </w:r>
           <w:r>
             <w:rPr>
@@ -945,7 +945,7 @@
             <w:rPr>
               <w:noProof/>
             </w:rPr>
-            <w:instrText xml:space="preserve"> PAGEREF _Toc240203051 \h </w:instrText>
+            <w:instrText xml:space="preserve"> PAGEREF _Toc240210976 \h </w:instrText>
           </w:r>
           <w:r>
             <w:rPr>
@@ -1010,7 +1010,7 @@
             <w:rPr>
               <w:noProof/>
             </w:rPr>
-            <w:instrText xml:space="preserve"> PAGEREF _Toc240203052 \h </w:instrText>
+            <w:instrText xml:space="preserve"> PAGEREF _Toc240210977 \h </w:instrText>
           </w:r>
           <w:r>
             <w:rPr>
@@ -1075,7 +1075,7 @@
             <w:rPr>
               <w:noProof/>
             </w:rPr>
-            <w:instrText xml:space="preserve"> PAGEREF _Toc240203053 \h </w:instrText>
+            <w:instrText xml:space="preserve"> PAGEREF _Toc240210978 \h </w:instrText>
           </w:r>
           <w:r>
             <w:rPr>
@@ -1138,7 +1138,7 @@
             <w:rPr>
               <w:noProof/>
             </w:rPr>
-            <w:instrText xml:space="preserve"> PAGEREF _Toc240203054 \h </w:instrText>
+            <w:instrText xml:space="preserve"> PAGEREF _Toc240210979 \h </w:instrText>
           </w:r>
           <w:r>
             <w:rPr>
@@ -1203,7 +1203,7 @@
             <w:rPr>
               <w:noProof/>
             </w:rPr>
-            <w:instrText xml:space="preserve"> PAGEREF _Toc240203055 \h </w:instrText>
+            <w:instrText xml:space="preserve"> PAGEREF _Toc240210980 \h </w:instrText>
           </w:r>
           <w:r>
             <w:rPr>
@@ -1268,7 +1268,7 @@
             <w:rPr>
               <w:noProof/>
             </w:rPr>
-            <w:instrText xml:space="preserve"> PAGEREF _Toc240203056 \h </w:instrText>
+            <w:instrText xml:space="preserve"> PAGEREF _Toc240210981 \h </w:instrText>
           </w:r>
           <w:r>
             <w:rPr>
@@ -1333,7 +1333,7 @@
             <w:rPr>
               <w:noProof/>
             </w:rPr>
-            <w:instrText xml:space="preserve"> PAGEREF _Toc240203057 \h </w:instrText>
+            <w:instrText xml:space="preserve"> PAGEREF _Toc240210982 \h </w:instrText>
           </w:r>
           <w:r>
             <w:rPr>
@@ -1398,7 +1398,7 @@
             <w:rPr>
               <w:noProof/>
             </w:rPr>
-            <w:instrText xml:space="preserve"> PAGEREF _Toc240203058 \h </w:instrText>
+            <w:instrText xml:space="preserve"> PAGEREF _Toc240210983 \h </w:instrText>
           </w:r>
           <w:r>
             <w:rPr>
@@ -1463,7 +1463,7 @@
             <w:rPr>
               <w:noProof/>
             </w:rPr>
-            <w:instrText xml:space="preserve"> PAGEREF _Toc240203059 \h </w:instrText>
+            <w:instrText xml:space="preserve"> PAGEREF _Toc240210984 \h </w:instrText>
           </w:r>
           <w:r>
             <w:rPr>
@@ -1528,7 +1528,7 @@
             <w:rPr>
               <w:noProof/>
             </w:rPr>
-            <w:instrText xml:space="preserve"> PAGEREF _Toc240203060 \h </w:instrText>
+            <w:instrText xml:space="preserve"> PAGEREF _Toc240210985 \h </w:instrText>
           </w:r>
           <w:r>
             <w:rPr>
@@ -1591,7 +1591,7 @@
             <w:rPr>
               <w:noProof/>
             </w:rPr>
-            <w:instrText xml:space="preserve"> PAGEREF _Toc240203061 \h </w:instrText>
+            <w:instrText xml:space="preserve"> PAGEREF _Toc240210986 \h </w:instrText>
           </w:r>
           <w:r>
             <w:rPr>
@@ -1654,7 +1654,7 @@
             <w:rPr>
               <w:noProof/>
             </w:rPr>
-            <w:instrText xml:space="preserve"> PAGEREF _Toc240203062 \h </w:instrText>
+            <w:instrText xml:space="preserve"> PAGEREF _Toc240210987 \h </w:instrText>
           </w:r>
           <w:r>
             <w:rPr>
@@ -1719,7 +1719,7 @@
             <w:rPr>
               <w:noProof/>
             </w:rPr>
-            <w:instrText xml:space="preserve"> PAGEREF _Toc240203063 \h </w:instrText>
+            <w:instrText xml:space="preserve"> PAGEREF _Toc240210988 \h </w:instrText>
           </w:r>
           <w:r>
             <w:rPr>
@@ -1784,7 +1784,7 @@
             <w:rPr>
               <w:noProof/>
             </w:rPr>
-            <w:instrText xml:space="preserve"> PAGEREF _Toc240203064 \h </w:instrText>
+            <w:instrText xml:space="preserve"> PAGEREF _Toc240210989 \h </w:instrText>
           </w:r>
           <w:r>
             <w:rPr>
@@ -1849,7 +1849,7 @@
             <w:rPr>
               <w:noProof/>
             </w:rPr>
-            <w:instrText xml:space="preserve"> PAGEREF _Toc240203065 \h </w:instrText>
+            <w:instrText xml:space="preserve"> PAGEREF _Toc240210990 \h </w:instrText>
           </w:r>
           <w:r>
             <w:rPr>
@@ -1914,7 +1914,7 @@
             <w:rPr>
               <w:noProof/>
             </w:rPr>
-            <w:instrText xml:space="preserve"> PAGEREF _Toc240203066 \h </w:instrText>
+            <w:instrText xml:space="preserve"> PAGEREF _Toc240210991 \h </w:instrText>
           </w:r>
           <w:r>
             <w:rPr>
@@ -1979,7 +1979,7 @@
             <w:rPr>
               <w:noProof/>
             </w:rPr>
-            <w:instrText xml:space="preserve"> PAGEREF _Toc240203067 \h </w:instrText>
+            <w:instrText xml:space="preserve"> PAGEREF _Toc240210992 \h </w:instrText>
           </w:r>
           <w:r>
             <w:rPr>
@@ -2044,7 +2044,7 @@
             <w:rPr>
               <w:noProof/>
             </w:rPr>
-            <w:instrText xml:space="preserve"> PAGEREF _Toc240203068 \h </w:instrText>
+            <w:instrText xml:space="preserve"> PAGEREF _Toc240210993 \h </w:instrText>
           </w:r>
           <w:r>
             <w:rPr>
@@ -2107,7 +2107,7 @@
             <w:rPr>
               <w:noProof/>
             </w:rPr>
-            <w:instrText xml:space="preserve"> PAGEREF _Toc240203069 \h </w:instrText>
+            <w:instrText xml:space="preserve"> PAGEREF _Toc240210994 \h </w:instrText>
           </w:r>
           <w:r>
             <w:rPr>
@@ -2172,7 +2172,7 @@
             <w:rPr>
               <w:noProof/>
             </w:rPr>
-            <w:instrText xml:space="preserve"> PAGEREF _Toc240203070 \h </w:instrText>
+            <w:instrText xml:space="preserve"> PAGEREF _Toc240210995 \h </w:instrText>
           </w:r>
           <w:r>
             <w:rPr>
@@ -2237,7 +2237,7 @@
             <w:rPr>
               <w:noProof/>
             </w:rPr>
-            <w:instrText xml:space="preserve"> PAGEREF _Toc240203071 \h </w:instrText>
+            <w:instrText xml:space="preserve"> PAGEREF _Toc240210996 \h </w:instrText>
           </w:r>
           <w:r>
             <w:rPr>
@@ -2302,7 +2302,7 @@
             <w:rPr>
               <w:noProof/>
             </w:rPr>
-            <w:instrText xml:space="preserve"> PAGEREF _Toc240203072 \h </w:instrText>
+            <w:instrText xml:space="preserve"> PAGEREF _Toc240210997 \h </w:instrText>
           </w:r>
           <w:r>
             <w:rPr>
@@ -2367,7 +2367,7 @@
             <w:rPr>
               <w:noProof/>
             </w:rPr>
-            <w:instrText xml:space="preserve"> PAGEREF _Toc240203073 \h </w:instrText>
+            <w:instrText xml:space="preserve"> PAGEREF _Toc240210998 \h </w:instrText>
           </w:r>
           <w:r>
             <w:rPr>
@@ -2432,7 +2432,7 @@
             <w:rPr>
               <w:noProof/>
             </w:rPr>
-            <w:instrText xml:space="preserve"> PAGEREF _Toc240203074 \h </w:instrText>
+            <w:instrText xml:space="preserve"> PAGEREF _Toc240210999 \h </w:instrText>
           </w:r>
           <w:r>
             <w:rPr>
@@ -2497,7 +2497,7 @@
             <w:rPr>
               <w:noProof/>
             </w:rPr>
-            <w:instrText xml:space="preserve"> PAGEREF _Toc240203075 \h </w:instrText>
+            <w:instrText xml:space="preserve"> PAGEREF _Toc240211000 \h </w:instrText>
           </w:r>
           <w:r>
             <w:rPr>
@@ -2563,7 +2563,7 @@
             <w:rPr>
               <w:noProof/>
             </w:rPr>
-            <w:instrText xml:space="preserve"> PAGEREF _Toc240203076 \h </w:instrText>
+            <w:instrText xml:space="preserve"> PAGEREF _Toc240211001 \h </w:instrText>
           </w:r>
           <w:r>
             <w:rPr>
@@ -2628,7 +2628,7 @@
             <w:rPr>
               <w:noProof/>
             </w:rPr>
-            <w:instrText xml:space="preserve"> PAGEREF _Toc240203077 \h </w:instrText>
+            <w:instrText xml:space="preserve"> PAGEREF _Toc240211002 \h </w:instrText>
           </w:r>
           <w:r>
             <w:rPr>
@@ -2691,7 +2691,7 @@
             <w:rPr>
               <w:noProof/>
             </w:rPr>
-            <w:instrText xml:space="preserve"> PAGEREF _Toc240203078 \h </w:instrText>
+            <w:instrText xml:space="preserve"> PAGEREF _Toc240211003 \h </w:instrText>
           </w:r>
           <w:r>
             <w:rPr>
@@ -2754,7 +2754,7 @@
             <w:rPr>
               <w:noProof/>
             </w:rPr>
-            <w:instrText xml:space="preserve"> PAGEREF _Toc240203079 \h </w:instrText>
+            <w:instrText xml:space="preserve"> PAGEREF _Toc240211004 \h </w:instrText>
           </w:r>
           <w:r>
             <w:rPr>
@@ -2817,7 +2817,7 @@
             <w:rPr>
               <w:noProof/>
             </w:rPr>
-            <w:instrText xml:space="preserve"> PAGEREF _Toc240203080 \h </w:instrText>
+            <w:instrText xml:space="preserve"> PAGEREF _Toc240211005 \h </w:instrText>
           </w:r>
           <w:r>
             <w:rPr>
@@ -2880,7 +2880,7 @@
             <w:rPr>
               <w:noProof/>
             </w:rPr>
-            <w:instrText xml:space="preserve"> PAGEREF _Toc240203081 \h </w:instrText>
+            <w:instrText xml:space="preserve"> PAGEREF _Toc240211006 \h </w:instrText>
           </w:r>
           <w:r>
             <w:rPr>
@@ -2943,7 +2943,7 @@
             <w:rPr>
               <w:noProof/>
             </w:rPr>
-            <w:instrText xml:space="preserve"> PAGEREF _Toc240203082 \h </w:instrText>
+            <w:instrText xml:space="preserve"> PAGEREF _Toc240211007 \h </w:instrText>
           </w:r>
           <w:r>
             <w:rPr>
@@ -3006,7 +3006,7 @@
             <w:rPr>
               <w:noProof/>
             </w:rPr>
-            <w:instrText xml:space="preserve"> PAGEREF _Toc240203083 \h </w:instrText>
+            <w:instrText xml:space="preserve"> PAGEREF _Toc240211008 \h </w:instrText>
           </w:r>
           <w:r>
             <w:rPr>
@@ -3069,7 +3069,7 @@
             <w:rPr>
               <w:noProof/>
             </w:rPr>
-            <w:instrText xml:space="preserve"> PAGEREF _Toc240203084 \h </w:instrText>
+            <w:instrText xml:space="preserve"> PAGEREF _Toc240211009 \h </w:instrText>
           </w:r>
           <w:r>
             <w:rPr>
@@ -3132,7 +3132,7 @@
             <w:rPr>
               <w:noProof/>
             </w:rPr>
-            <w:instrText xml:space="preserve"> PAGEREF _Toc240203085 \h </w:instrText>
+            <w:instrText xml:space="preserve"> PAGEREF _Toc240211010 \h </w:instrText>
           </w:r>
           <w:r>
             <w:rPr>
@@ -3197,7 +3197,7 @@
             <w:rPr>
               <w:noProof/>
             </w:rPr>
-            <w:instrText xml:space="preserve"> PAGEREF _Toc240203086 \h </w:instrText>
+            <w:instrText xml:space="preserve"> PAGEREF _Toc240211011 \h </w:instrText>
           </w:r>
           <w:r>
             <w:rPr>
@@ -3262,7 +3262,7 @@
             <w:rPr>
               <w:noProof/>
             </w:rPr>
-            <w:instrText xml:space="preserve"> PAGEREF _Toc240203087 \h </w:instrText>
+            <w:instrText xml:space="preserve"> PAGEREF _Toc240211012 \h </w:instrText>
           </w:r>
           <w:r>
             <w:rPr>
@@ -3327,7 +3327,7 @@
             <w:rPr>
               <w:noProof/>
             </w:rPr>
-            <w:instrText xml:space="preserve"> PAGEREF _Toc240203088 \h </w:instrText>
+            <w:instrText xml:space="preserve"> PAGEREF _Toc240211013 \h </w:instrText>
           </w:r>
           <w:r>
             <w:rPr>
@@ -3392,7 +3392,7 @@
             <w:rPr>
               <w:noProof/>
             </w:rPr>
-            <w:instrText xml:space="preserve"> PAGEREF _Toc240203089 \h </w:instrText>
+            <w:instrText xml:space="preserve"> PAGEREF _Toc240211014 \h </w:instrText>
           </w:r>
           <w:r>
             <w:rPr>
@@ -3457,7 +3457,7 @@
             <w:rPr>
               <w:noProof/>
             </w:rPr>
-            <w:instrText xml:space="preserve"> PAGEREF _Toc240203090 \h </w:instrText>
+            <w:instrText xml:space="preserve"> PAGEREF _Toc240211015 \h </w:instrText>
           </w:r>
           <w:r>
             <w:rPr>
@@ -3475,6 +3475,69 @@
               <w:noProof/>
             </w:rPr>
             <w:t>54</w:t>
+          </w:r>
+          <w:r>
+            <w:rPr>
+              <w:noProof/>
+            </w:rPr>
+            <w:fldChar w:fldCharType="end"/>
+          </w:r>
+        </w:p>
+        <w:p>
+          <w:pPr>
+            <w:pStyle w:val="TOC2"/>
+            <w:tabs>
+              <w:tab w:val="right" w:leader="dot" w:pos="9061"/>
+            </w:tabs>
+            <w:rPr>
+              <w:rFonts w:asciiTheme="minorHAnsi" w:eastAsiaTheme="minorEastAsia" w:hAnsiTheme="minorHAnsi" w:cstheme="minorBidi"/>
+              <w:noProof/>
+              <w:kern w:val="2"/>
+              <w:sz w:val="24"/>
+              <w:szCs w:val="24"/>
+              <w14:ligatures w14:val="standardContextual"/>
+            </w:rPr>
+          </w:pPr>
+          <w:r>
+            <w:rPr>
+              <w:noProof/>
+            </w:rPr>
+            <w:t>8. Phần mềm ứng dụng cho các trạm</w:t>
+          </w:r>
+          <w:r>
+            <w:rPr>
+              <w:noProof/>
+            </w:rPr>
+            <w:tab/>
+          </w:r>
+          <w:r>
+            <w:rPr>
+              <w:noProof/>
+            </w:rPr>
+            <w:fldChar w:fldCharType="begin"/>
+          </w:r>
+          <w:r>
+            <w:rPr>
+              <w:noProof/>
+            </w:rPr>
+            <w:instrText xml:space="preserve"> PAGEREF _Toc240211016 \h </w:instrText>
+          </w:r>
+          <w:r>
+            <w:rPr>
+              <w:noProof/>
+            </w:rPr>
+          </w:r>
+          <w:r>
+            <w:rPr>
+              <w:noProof/>
+            </w:rPr>
+            <w:fldChar w:fldCharType="separate"/>
+          </w:r>
+          <w:r>
+            <w:rPr>
+              <w:noProof/>
+            </w:rPr>
+            <w:t>61</w:t>
           </w:r>
           <w:r>
             <w:rPr>
@@ -3520,7 +3583,7 @@
             <w:rPr>
               <w:noProof/>
             </w:rPr>
-            <w:instrText xml:space="preserve"> PAGEREF _Toc240203091 \h </w:instrText>
+            <w:instrText xml:space="preserve"> PAGEREF _Toc240211017 \h </w:instrText>
           </w:r>
           <w:r>
             <w:rPr>
@@ -3537,7 +3600,7 @@
             <w:rPr>
               <w:noProof/>
             </w:rPr>
-            <w:t>61</w:t>
+            <w:t>64</w:t>
           </w:r>
           <w:r>
             <w:rPr>
@@ -3583,7 +3646,7 @@
             <w:rPr>
               <w:noProof/>
             </w:rPr>
-            <w:instrText xml:space="preserve"> PAGEREF _Toc240203092 \h </w:instrText>
+            <w:instrText xml:space="preserve"> PAGEREF _Toc240211018 \h </w:instrText>
           </w:r>
           <w:r>
             <w:rPr>
@@ -3600,7 +3663,7 @@
             <w:rPr>
               <w:noProof/>
             </w:rPr>
-            <w:t>61</w:t>
+            <w:t>64</w:t>
           </w:r>
           <w:r>
             <w:rPr>
@@ -3646,7 +3709,7 @@
             <w:rPr>
               <w:noProof/>
             </w:rPr>
-            <w:instrText xml:space="preserve"> PAGEREF _Toc240203093 \h </w:instrText>
+            <w:instrText xml:space="preserve"> PAGEREF _Toc240211019 \h </w:instrText>
           </w:r>
           <w:r>
             <w:rPr>
@@ -3663,7 +3726,7 @@
             <w:rPr>
               <w:noProof/>
             </w:rPr>
-            <w:t>61</w:t>
+            <w:t>64</w:t>
           </w:r>
           <w:r>
             <w:rPr>
@@ -3709,7 +3772,7 @@
             <w:rPr>
               <w:noProof/>
             </w:rPr>
-            <w:instrText xml:space="preserve"> PAGEREF _Toc240203094 \h </w:instrText>
+            <w:instrText xml:space="preserve"> PAGEREF _Toc240211020 \h </w:instrText>
           </w:r>
           <w:r>
             <w:rPr>
@@ -3726,7 +3789,7 @@
             <w:rPr>
               <w:noProof/>
             </w:rPr>
-            <w:t>62</w:t>
+            <w:t>65</w:t>
           </w:r>
           <w:r>
             <w:rPr>
@@ -3772,7 +3835,7 @@
             <w:rPr>
               <w:noProof/>
             </w:rPr>
-            <w:instrText xml:space="preserve"> PAGEREF _Toc240203095 \h </w:instrText>
+            <w:instrText xml:space="preserve"> PAGEREF _Toc240211021 \h </w:instrText>
           </w:r>
           <w:r>
             <w:rPr>
@@ -3789,7 +3852,7 @@
             <w:rPr>
               <w:noProof/>
             </w:rPr>
-            <w:t>62</w:t>
+            <w:t>65</w:t>
           </w:r>
           <w:r>
             <w:rPr>
@@ -3835,7 +3898,7 @@
             <w:rPr>
               <w:noProof/>
             </w:rPr>
-            <w:instrText xml:space="preserve"> PAGEREF _Toc240203096 \h </w:instrText>
+            <w:instrText xml:space="preserve"> PAGEREF _Toc240211022 \h </w:instrText>
           </w:r>
           <w:r>
             <w:rPr>
@@ -3852,7 +3915,7 @@
             <w:rPr>
               <w:noProof/>
             </w:rPr>
-            <w:t>64</w:t>
+            <w:t>67</w:t>
           </w:r>
           <w:r>
             <w:rPr>
@@ -3879,7 +3942,7 @@
         <w:spacing w:before="240" w:after="240"/>
         <w:jc w:val="center"/>
       </w:pPr>
-      <w:bookmarkStart w:id="0" w:name="_Toc240203042"/>
+      <w:bookmarkStart w:id="0" w:name="_Toc240210967"/>
       <w:r>
         <w:lastRenderedPageBreak/>
         <w:t>DANH SÁCH HÌNH, BẢNG</w:t>
@@ -3891,7 +3954,7 @@
         <w:pStyle w:val="Heading2"/>
         <w:spacing w:before="240" w:after="120"/>
       </w:pPr>
-      <w:bookmarkStart w:id="1" w:name="_Toc240203043"/>
+      <w:bookmarkStart w:id="1" w:name="_Toc240210968"/>
       <w:r>
         <w:t>DANH SÁCH HÌNH</w:t>
       </w:r>
@@ -4589,10 +4652,49 @@
     </w:p>
     <w:p>
       <w:pPr>
+        <w:spacing w:line="250" w:lineRule="auto"/>
+        <w:ind w:left="360" w:hanging="72"/>
+      </w:pPr>
+      <w:r>
+        <w:rPr>
+          <w:sz w:val="22"/>
+          <w:szCs w:val="22"/>
+        </w:rPr>
+        <w:t>Hình 54: Màn hình chính của trạm Kho Trung tâm</w:t>
+      </w:r>
+    </w:p>
+    <w:p>
+      <w:pPr>
+        <w:spacing w:line="250" w:lineRule="auto"/>
+        <w:ind w:left="360" w:hanging="72"/>
+      </w:pPr>
+      <w:r>
+        <w:rPr>
+          <w:sz w:val="22"/>
+          <w:szCs w:val="22"/>
+        </w:rPr>
+        <w:t>Hình 55: Tồn kho gộp từ ba site hiện trong một bảng duy nhất</w:t>
+      </w:r>
+    </w:p>
+    <w:p>
+      <w:pPr>
+        <w:spacing w:line="250" w:lineRule="auto"/>
+        <w:ind w:left="360" w:hanging="72"/>
+      </w:pPr>
+      <w:r>
+        <w:rPr>
+          <w:sz w:val="22"/>
+          <w:szCs w:val="22"/>
+        </w:rPr>
+        <w:t>Hình 56: Màn hình điều chuyển sau khi bấm nút mô phỏng lỗi giữa chừng</w:t>
+      </w:r>
+    </w:p>
+    <w:p>
+      <w:pPr>
         <w:pStyle w:val="Heading2"/>
         <w:spacing w:before="240" w:after="120"/>
       </w:pPr>
-      <w:bookmarkStart w:id="2" w:name="_Toc240203044"/>
+      <w:bookmarkStart w:id="2" w:name="_Toc240210969"/>
       <w:r>
         <w:t>DANH SÁCH BẢNG</w:t>
       </w:r>
@@ -4959,7 +5061,7 @@
           <w:sz w:val="22"/>
           <w:szCs w:val="22"/>
         </w:rPr>
-        <w:t>Bảng 28: Đối chiếu yêu cầu đề tài với kết quả</w:t>
+        <w:t>Bảng 28: Bảy màn hình và nghiệp vụ tương ứng</w:t>
       </w:r>
     </w:p>
     <w:p>
@@ -4972,7 +5074,20 @@
           <w:sz w:val="22"/>
           <w:szCs w:val="22"/>
         </w:rPr>
-        <w:t>Bảng 29: Các sự cố đã xử lý</w:t>
+        <w:t>Bảng 29: Đối chiếu yêu cầu đề tài với kết quả</w:t>
+      </w:r>
+    </w:p>
+    <w:p>
+      <w:pPr>
+        <w:spacing w:line="250" w:lineRule="auto"/>
+        <w:ind w:left="360" w:hanging="72"/>
+      </w:pPr>
+      <w:r>
+        <w:rPr>
+          <w:sz w:val="22"/>
+          <w:szCs w:val="22"/>
+        </w:rPr>
+        <w:t>Bảng 30: Các sự cố đã xử lý</w:t>
       </w:r>
     </w:p>
     <w:p>
@@ -4986,7 +5101,7 @@
         <w:spacing w:before="240" w:after="240"/>
         <w:jc w:val="center"/>
       </w:pPr>
-      <w:bookmarkStart w:id="3" w:name="_Toc240203045"/>
+      <w:bookmarkStart w:id="3" w:name="_Toc240210970"/>
       <w:r>
         <w:lastRenderedPageBreak/>
         <w:t>TÓM TẮT</w:t>
@@ -5008,10 +5123,7 @@
         <w:jc w:val="both"/>
       </w:pPr>
       <w:r>
-        <w:t>Xuất phát từ khảo sát tần suất truy cập cho thấy 89% nghiệp vụ hằng ngày chỉ đụng tới dữ liệu của chính kho đó, nhóm quyết định phân mảnh ngang bảng tồn kho và chứng từ theo mã kho, đồng thời nhân bản</w:t>
-      </w:r>
-      <w:r>
-        <w:t xml:space="preserve"> ba bảng danh mục vì chúng có tỷ lệ đọc trên ghi rất cao. Bảng chi tiết chứng từ không chứa mã kho nên được phân mảnh ngang dẫn xuất bằng phép nửa nối theo phiếu.</w:t>
+        <w:t>Xuất phát từ khảo sát tần suất truy cập cho thấy 89% nghiệp vụ hằng ngày chỉ đụng tới dữ liệu của chính kho đó, nhóm quyết định phân mảnh ngang bảng tồn kho và chứng từ theo mã kho, đồng thời nhân bản ba bảng danh mục vì chúng có tỷ lệ đọc trên ghi rất cao. Bảng chi tiết chứng từ không chứa mã kho nên được phân mảnh ngang dẫn xuất bằng phép nửa nối theo phiếu.</w:t>
       </w:r>
     </w:p>
     <w:p>
@@ -5020,7 +5132,10 @@
         <w:jc w:val="both"/>
       </w:pPr>
       <w:r>
-        <w:t>Hệ thống cài đặt đầy đủ các kỹ thuật cốt lõi của môn học: sáu Linked Server nối ba site thành đồ thị hai chiều; Transactional Replication đồng bộ danh mục với độ trễ đo được 15–20 giây; giao tác phân tán hai pha qua MS DTC cho nghiệp vụ điều chuyển vật tư; bốn kịch bản điều khiển tương tranh; và các truy vấn phân tán gộp dữ liệu từ cả ba máy chủ.</w:t>
+        <w:t>Hệ thống cài đặt đầy đủ các kỹ thuật cốt lõi của môn học: sáu Linked Server nối ba site thành đồ thị hai chiều; Transactional Replication</w:t>
+      </w:r>
+      <w:r>
+        <w:t xml:space="preserve"> đồng bộ danh mục với độ trễ đo được 15–20 giây; giao tác phân tán hai pha qua MS DTC cho nghiệp vụ điều chuyển vật tư; bốn kịch bản điều khiển tương tranh; và các truy vấn phân tán gộp dữ liệu từ cả ba máy chủ.</w:t>
       </w:r>
     </w:p>
     <w:p>
@@ -5039,7 +5154,10 @@
         <w:t>điều chuyển 50 sản phẩm từ Kho A sang Kho B, nếu thất bại giữa chừng thì dữ liệu phải nhất quán</w:t>
       </w:r>
       <w:r>
-        <w:t xml:space="preserve"> — được kiểm chứng bằng ba kịch bản chạy thật. Trong kịch bản gây lỗi cố ý sau khi kho nguồn đã bị trừ hàng, giao thức hai pha đã quay lui toàn bộ ở cả hai máy chủ, tồn kho và số chứng từ trở về đúng trạng thái ban đầu, không một đơn vị hàng nào bị mất.</w:t>
+        <w:t xml:space="preserve"> — được kiểm chứng bằng ba kịch bản chạy thật. Trong kịch bản gây lỗi cố ý sau khi kho nguồn đã bị trừ hàng</w:t>
+      </w:r>
+      <w:r>
+        <w:t>, giao thức hai pha đã quay lui toàn bộ ở cả hai máy chủ, tồn kho và số chứng từ trở về đúng trạng thái ban đầu, không một đơn vị hàng nào bị mất.</w:t>
       </w:r>
     </w:p>
     <w:p>
@@ -5048,10 +5166,7 @@
         <w:jc w:val="both"/>
       </w:pPr>
       <w:r>
-        <w:t>Dữ liệu được bảo vệ bằng ba lớp chồng nhau</w:t>
-      </w:r>
-      <w:r>
-        <w:t>: ràng buộc kiểm tra ở tầng dữ liệu, sáu trigger cho những luật mà ràng buộc không diễn tả nổi, và hệ thống bốn vai trò buộc mọi thay đổi tồn kho phải đi qua thủ tục đã kiểm soát.</w:t>
+        <w:t>Dữ liệu được bảo vệ bằng ba lớp chồng nhau: ràng buộc kiểm tra ở tầng dữ liệu, sáu trigger cho những luật mà ràng buộc không diễn tả nổi, và hệ thống bốn vai trò buộc mọi thay đổi tồn kho phải đi qua thủ tục đã kiểm soát.</w:t>
       </w:r>
     </w:p>
     <w:p>
@@ -5065,7 +5180,7 @@
         <w:spacing w:before="240" w:after="240"/>
         <w:jc w:val="center"/>
       </w:pPr>
-      <w:bookmarkStart w:id="4" w:name="_Toc240203046"/>
+      <w:bookmarkStart w:id="4" w:name="_Toc240210971"/>
       <w:r>
         <w:lastRenderedPageBreak/>
         <w:t>CHƯƠNG I. TỔNG QUAN</w:t>
@@ -5077,7 +5192,7 @@
         <w:pStyle w:val="Heading2"/>
         <w:spacing w:before="240" w:after="120"/>
       </w:pPr>
-      <w:bookmarkStart w:id="5" w:name="_Toc240203047"/>
+      <w:bookmarkStart w:id="5" w:name="_Toc240210972"/>
       <w:r>
         <w:t>1. Giới thiệu đề tài</w:t>
       </w:r>
@@ -5088,7 +5203,7 @@
         <w:pStyle w:val="Heading3"/>
         <w:spacing w:before="180" w:after="100"/>
       </w:pPr>
-      <w:bookmarkStart w:id="6" w:name="_Toc240203048"/>
+      <w:bookmarkStart w:id="6" w:name="_Toc240210973"/>
       <w:r>
         <w:rPr>
           <w:i/>
@@ -5122,10 +5237,10 @@
         <w:jc w:val="both"/>
       </w:pPr>
       <w:r>
-        <w:t>Kịch bản bắt buộc mà đề tài nêu rõ: Kho A chuyển 50 sản phẩm sang Kho B; nếu giao dịch thất bại giữa chừng thì dữ liệu phải được xử lý nhất quán.</w:t>
-      </w:r>
-      <w:r>
-        <w:t xml:space="preserve"> Toàn bộ thiết kế của nhóm xoay quanh việc bảo đảm yêu cầu này.</w:t>
+        <w:t xml:space="preserve">Kịch bản bắt buộc mà đề tài nêu rõ: </w:t>
+      </w:r>
+      <w:r>
+        <w:t>Kho A chuyển 50 sản phẩm sang Kho B; nếu giao dịch thất bại giữa chừng thì dữ liệu phải được xử lý nhất quán. Toàn bộ thiết kế của nhóm xoay quanh việc bảo đảm yêu cầu này.</w:t>
       </w:r>
     </w:p>
     <w:p>
@@ -5133,7 +5248,7 @@
         <w:pStyle w:val="Heading3"/>
         <w:spacing w:before="180" w:after="100"/>
       </w:pPr>
-      <w:bookmarkStart w:id="7" w:name="_Toc240203049"/>
+      <w:bookmarkStart w:id="7" w:name="_Toc240210974"/>
       <w:r>
         <w:rPr>
           <w:i/>
@@ -5211,7 +5326,7 @@
         <w:pStyle w:val="Heading3"/>
         <w:spacing w:before="180" w:after="100"/>
       </w:pPr>
-      <w:bookmarkStart w:id="8" w:name="_Toc240203050"/>
+      <w:bookmarkStart w:id="8" w:name="_Toc240210975"/>
       <w:r>
         <w:rPr>
           <w:i/>
@@ -5894,7 +6009,7 @@
         <w:pStyle w:val="Heading3"/>
         <w:spacing w:before="180" w:after="100"/>
       </w:pPr>
-      <w:bookmarkStart w:id="9" w:name="_Toc240203051"/>
+      <w:bookmarkStart w:id="9" w:name="_Toc240210976"/>
       <w:r>
         <w:rPr>
           <w:i/>
@@ -6024,7 +6139,7 @@
         <w:pStyle w:val="Heading3"/>
         <w:spacing w:before="180" w:after="100"/>
       </w:pPr>
-      <w:bookmarkStart w:id="10" w:name="_Toc240203052"/>
+      <w:bookmarkStart w:id="10" w:name="_Toc240210977"/>
       <w:r>
         <w:rPr>
           <w:i/>
@@ -6495,7 +6610,7 @@
         <w:pStyle w:val="Heading3"/>
         <w:spacing w:before="180" w:after="100"/>
       </w:pPr>
-      <w:bookmarkStart w:id="11" w:name="_Toc240203053"/>
+      <w:bookmarkStart w:id="11" w:name="_Toc240210978"/>
       <w:r>
         <w:rPr>
           <w:i/>
@@ -6953,7 +7068,7 @@
         <w:pStyle w:val="Heading2"/>
         <w:spacing w:before="240" w:after="120"/>
       </w:pPr>
-      <w:bookmarkStart w:id="12" w:name="_Toc240203054"/>
+      <w:bookmarkStart w:id="12" w:name="_Toc240210979"/>
       <w:r>
         <w:lastRenderedPageBreak/>
         <w:t>2. Cơ sở lý thuyết</w:t>
@@ -6965,7 +7080,7 @@
         <w:pStyle w:val="Heading3"/>
         <w:spacing w:before="180" w:after="100"/>
       </w:pPr>
-      <w:bookmarkStart w:id="13" w:name="_Toc240203055"/>
+      <w:bookmarkStart w:id="13" w:name="_Toc240210980"/>
       <w:r>
         <w:rPr>
           <w:i/>
@@ -7067,7 +7182,7 @@
         <w:pStyle w:val="Heading3"/>
         <w:spacing w:before="180" w:after="100"/>
       </w:pPr>
-      <w:bookmarkStart w:id="14" w:name="_Toc240203056"/>
+      <w:bookmarkStart w:id="14" w:name="_Toc240210981"/>
       <w:r>
         <w:rPr>
           <w:i/>
@@ -7118,7 +7233,7 @@
         <w:pStyle w:val="Heading3"/>
         <w:spacing w:before="180" w:after="100"/>
       </w:pPr>
-      <w:bookmarkStart w:id="15" w:name="_Toc240203057"/>
+      <w:bookmarkStart w:id="15" w:name="_Toc240210982"/>
       <w:r>
         <w:rPr>
           <w:i/>
@@ -7206,7 +7321,7 @@
         <w:pStyle w:val="Heading3"/>
         <w:spacing w:before="180" w:after="100"/>
       </w:pPr>
-      <w:bookmarkStart w:id="16" w:name="_Toc240203058"/>
+      <w:bookmarkStart w:id="16" w:name="_Toc240210983"/>
       <w:r>
         <w:rPr>
           <w:i/>
@@ -7279,7 +7394,7 @@
         <w:pStyle w:val="Heading3"/>
         <w:spacing w:before="180" w:after="100"/>
       </w:pPr>
-      <w:bookmarkStart w:id="17" w:name="_Toc240203059"/>
+      <w:bookmarkStart w:id="17" w:name="_Toc240210984"/>
       <w:r>
         <w:rPr>
           <w:i/>
@@ -7378,7 +7493,7 @@
         <w:pStyle w:val="Heading3"/>
         <w:spacing w:before="180" w:after="100"/>
       </w:pPr>
-      <w:bookmarkStart w:id="18" w:name="_Toc240203060"/>
+      <w:bookmarkStart w:id="18" w:name="_Toc240210985"/>
       <w:r>
         <w:rPr>
           <w:i/>
@@ -7467,7 +7582,7 @@
         <w:spacing w:before="240" w:after="240"/>
         <w:jc w:val="center"/>
       </w:pPr>
-      <w:bookmarkStart w:id="19" w:name="_Toc240203061"/>
+      <w:bookmarkStart w:id="19" w:name="_Toc240210986"/>
       <w:r>
         <w:lastRenderedPageBreak/>
         <w:t>CHƯƠNG II. PHÂN TÍCH VÀ THIẾT KẾ HỆ THỐNG</w:t>
@@ -7479,7 +7594,7 @@
         <w:pStyle w:val="Heading2"/>
         <w:spacing w:before="240" w:after="120"/>
       </w:pPr>
-      <w:bookmarkStart w:id="20" w:name="_Toc240203062"/>
+      <w:bookmarkStart w:id="20" w:name="_Toc240210987"/>
       <w:r>
         <w:t>1. Phân tích</w:t>
       </w:r>
@@ -7490,7 +7605,7 @@
         <w:pStyle w:val="Heading3"/>
         <w:spacing w:before="180" w:after="100"/>
       </w:pPr>
-      <w:bookmarkStart w:id="21" w:name="_Toc240203063"/>
+      <w:bookmarkStart w:id="21" w:name="_Toc240210988"/>
       <w:r>
         <w:rPr>
           <w:i/>
@@ -8552,7 +8667,7 @@
         <w:pStyle w:val="Heading3"/>
         <w:spacing w:before="180" w:after="100"/>
       </w:pPr>
-      <w:bookmarkStart w:id="22" w:name="_Toc240203064"/>
+      <w:bookmarkStart w:id="22" w:name="_Toc240210989"/>
       <w:r>
         <w:rPr>
           <w:i/>
@@ -9795,7 +9910,7 @@
         <w:pStyle w:val="Heading3"/>
         <w:spacing w:before="180" w:after="100"/>
       </w:pPr>
-      <w:bookmarkStart w:id="23" w:name="_Toc240203065"/>
+      <w:bookmarkStart w:id="23" w:name="_Toc240210990"/>
       <w:r>
         <w:rPr>
           <w:i/>
@@ -10278,7 +10393,7 @@
         <w:pStyle w:val="Heading3"/>
         <w:spacing w:before="180" w:after="100"/>
       </w:pPr>
-      <w:bookmarkStart w:id="24" w:name="_Toc240203066"/>
+      <w:bookmarkStart w:id="24" w:name="_Toc240210991"/>
       <w:r>
         <w:rPr>
           <w:i/>
@@ -10655,7 +10770,7 @@
         <w:pStyle w:val="Heading3"/>
         <w:spacing w:before="180" w:after="100"/>
       </w:pPr>
-      <w:bookmarkStart w:id="25" w:name="_Toc240203067"/>
+      <w:bookmarkStart w:id="25" w:name="_Toc240210992"/>
       <w:r>
         <w:rPr>
           <w:i/>
@@ -10898,7 +11013,7 @@
         <w:pStyle w:val="Heading3"/>
         <w:spacing w:before="180" w:after="100"/>
       </w:pPr>
-      <w:bookmarkStart w:id="26" w:name="_Toc240203068"/>
+      <w:bookmarkStart w:id="26" w:name="_Toc240210993"/>
       <w:r>
         <w:rPr>
           <w:i/>
@@ -12531,7 +12646,7 @@
         <w:pStyle w:val="Heading2"/>
         <w:spacing w:before="240" w:after="120"/>
       </w:pPr>
-      <w:bookmarkStart w:id="27" w:name="_Toc240203069"/>
+      <w:bookmarkStart w:id="27" w:name="_Toc240210994"/>
       <w:r>
         <w:lastRenderedPageBreak/>
         <w:t>2. Thiết kế</w:t>
@@ -12543,7 +12658,7 @@
         <w:pStyle w:val="Heading3"/>
         <w:spacing w:before="180" w:after="100"/>
       </w:pPr>
-      <w:bookmarkStart w:id="28" w:name="_Toc240203070"/>
+      <w:bookmarkStart w:id="28" w:name="_Toc240210995"/>
       <w:r>
         <w:rPr>
           <w:i/>
@@ -15669,7 +15784,7 @@
           <w:noProof/>
         </w:rPr>
         <w:drawing>
-          <wp:inline distT="0" distB="0" distL="0" distR="0" wp14:anchorId="2E8645C1" wp14:editId="702EB78E">
+          <wp:inline distT="0" distB="0" distL="0" distR="0" wp14:anchorId="1DC49518" wp14:editId="19988241">
             <wp:extent cx="5715000" cy="4067175"/>
             <wp:effectExtent l="0" t="0" r="0" b="0"/>
             <wp:docPr id="1" name="Picture 1"/>
@@ -15740,7 +15855,7 @@
         <w:pStyle w:val="Heading3"/>
         <w:spacing w:before="180" w:after="100"/>
       </w:pPr>
-      <w:bookmarkStart w:id="29" w:name="_Toc240203071"/>
+      <w:bookmarkStart w:id="29" w:name="_Toc240210996"/>
       <w:r>
         <w:rPr>
           <w:i/>
@@ -16320,7 +16435,7 @@
         <w:pStyle w:val="Heading3"/>
         <w:spacing w:before="180" w:after="100"/>
       </w:pPr>
-      <w:bookmarkStart w:id="30" w:name="_Toc240203072"/>
+      <w:bookmarkStart w:id="30" w:name="_Toc240210997"/>
       <w:r>
         <w:rPr>
           <w:i/>
@@ -16551,7 +16666,7 @@
         <w:pStyle w:val="Heading3"/>
         <w:spacing w:before="180" w:after="100"/>
       </w:pPr>
-      <w:bookmarkStart w:id="31" w:name="_Toc240203073"/>
+      <w:bookmarkStart w:id="31" w:name="_Toc240210998"/>
       <w:r>
         <w:rPr>
           <w:i/>
@@ -17131,7 +17246,7 @@
         <w:pStyle w:val="Heading3"/>
         <w:spacing w:before="180" w:after="100"/>
       </w:pPr>
-      <w:bookmarkStart w:id="32" w:name="_Toc240203074"/>
+      <w:bookmarkStart w:id="32" w:name="_Toc240210999"/>
       <w:r>
         <w:rPr>
           <w:i/>
@@ -19031,7 +19146,7 @@
         <w:pStyle w:val="Heading3"/>
         <w:spacing w:before="180" w:after="100"/>
       </w:pPr>
-      <w:bookmarkStart w:id="33" w:name="_Toc240203075"/>
+      <w:bookmarkStart w:id="33" w:name="_Toc240211000"/>
       <w:r>
         <w:rPr>
           <w:i/>
@@ -19631,7 +19746,7 @@
         <w:pStyle w:val="Heading3"/>
         <w:spacing w:before="180" w:after="100"/>
       </w:pPr>
-      <w:bookmarkStart w:id="34" w:name="_Toc240203076"/>
+      <w:bookmarkStart w:id="34" w:name="_Toc240211001"/>
       <w:r>
         <w:rPr>
           <w:i/>
@@ -20394,7 +20509,7 @@
         <w:pStyle w:val="Heading3"/>
         <w:spacing w:before="180" w:after="100"/>
       </w:pPr>
-      <w:bookmarkStart w:id="35" w:name="_Toc240203077"/>
+      <w:bookmarkStart w:id="35" w:name="_Toc240211002"/>
       <w:r>
         <w:rPr>
           <w:i/>
@@ -21166,7 +21281,7 @@
         <w:spacing w:before="240" w:after="240"/>
         <w:jc w:val="center"/>
       </w:pPr>
-      <w:bookmarkStart w:id="36" w:name="_Toc240203078"/>
+      <w:bookmarkStart w:id="36" w:name="_Toc240211003"/>
       <w:r>
         <w:lastRenderedPageBreak/>
         <w:t>CHƯƠNG III. TRIỂN KHAI HỆ THỐNG</w:t>
@@ -21187,7 +21302,7 @@
         <w:pStyle w:val="Heading2"/>
         <w:spacing w:before="240" w:after="120"/>
       </w:pPr>
-      <w:bookmarkStart w:id="37" w:name="_Toc240203079"/>
+      <w:bookmarkStart w:id="37" w:name="_Toc240211004"/>
       <w:r>
         <w:t>1. Cài đặt mạng riêng ảo</w:t>
       </w:r>
@@ -21295,10 +21410,10 @@
           <w:noProof/>
         </w:rPr>
         <w:drawing>
-          <wp:inline distT="0" distB="0" distL="0" distR="0" wp14:anchorId="4B44B680" wp14:editId="261A2657">
+          <wp:inline distT="0" distB="0" distL="0" distR="0" wp14:anchorId="0AC9A480" wp14:editId="74B86E68">
             <wp:extent cx="5715000" cy="2828925"/>
             <wp:effectExtent l="0" t="0" r="0" b="0"/>
-            <wp:docPr id="569575777" name="Picture 569575777"/>
+            <wp:docPr id="537227195" name="Picture 537227195"/>
             <wp:cNvGraphicFramePr>
               <a:graphicFrameLocks xmlns:a="http://schemas.openxmlformats.org/drawingml/2006/main" noChangeAspect="1"/>
             </wp:cNvGraphicFramePr>
@@ -21360,10 +21475,10 @@
         </w:rPr>
         <w:lastRenderedPageBreak/>
         <w:drawing>
-          <wp:inline distT="0" distB="0" distL="0" distR="0" wp14:anchorId="543DA947" wp14:editId="5C93E22E">
+          <wp:inline distT="0" distB="0" distL="0" distR="0" wp14:anchorId="6270768D" wp14:editId="0F80F949">
             <wp:extent cx="5715000" cy="1562100"/>
             <wp:effectExtent l="0" t="0" r="0" b="0"/>
-            <wp:docPr id="1343888250" name="Picture 1343888250"/>
+            <wp:docPr id="1562103668" name="Picture 1562103668"/>
             <wp:cNvGraphicFramePr>
               <a:graphicFrameLocks xmlns:a="http://schemas.openxmlformats.org/drawingml/2006/main" noChangeAspect="1"/>
             </wp:cNvGraphicFramePr>
@@ -21424,10 +21539,10 @@
           <w:noProof/>
         </w:rPr>
         <w:drawing>
-          <wp:inline distT="0" distB="0" distL="0" distR="0" wp14:anchorId="3058F34D" wp14:editId="5F7A9CB9">
+          <wp:inline distT="0" distB="0" distL="0" distR="0" wp14:anchorId="61E814DF" wp14:editId="1F75A76C">
             <wp:extent cx="5715000" cy="2143125"/>
             <wp:effectExtent l="0" t="0" r="0" b="0"/>
-            <wp:docPr id="288354267" name="Picture 288354267"/>
+            <wp:docPr id="1718051400" name="Picture 1718051400"/>
             <wp:cNvGraphicFramePr>
               <a:graphicFrameLocks xmlns:a="http://schemas.openxmlformats.org/drawingml/2006/main" noChangeAspect="1"/>
             </wp:cNvGraphicFramePr>
@@ -21483,7 +21598,7 @@
         <w:pStyle w:val="Heading2"/>
         <w:spacing w:before="240" w:after="120"/>
       </w:pPr>
-      <w:bookmarkStart w:id="38" w:name="_Toc240203080"/>
+      <w:bookmarkStart w:id="38" w:name="_Toc240211005"/>
       <w:r>
         <w:t>2. Tạo đường liên kết mạng giữa các máy chủ</w:t>
       </w:r>
@@ -22058,10 +22173,10 @@
           <w:noProof/>
         </w:rPr>
         <w:drawing>
-          <wp:inline distT="0" distB="0" distL="0" distR="0" wp14:anchorId="7DDB578B" wp14:editId="62BA76BD">
+          <wp:inline distT="0" distB="0" distL="0" distR="0" wp14:anchorId="7FA4B019" wp14:editId="6C04B56D">
             <wp:extent cx="2381250" cy="4914900"/>
             <wp:effectExtent l="0" t="0" r="0" b="0"/>
-            <wp:docPr id="647648162" name="Picture 647648162"/>
+            <wp:docPr id="1531881559" name="Picture 1531881559"/>
             <wp:cNvGraphicFramePr>
               <a:graphicFrameLocks xmlns:a="http://schemas.openxmlformats.org/drawingml/2006/main" noChangeAspect="1"/>
             </wp:cNvGraphicFramePr>
@@ -22123,10 +22238,10 @@
         </w:rPr>
         <w:lastRenderedPageBreak/>
         <w:drawing>
-          <wp:inline distT="0" distB="0" distL="0" distR="0" wp14:anchorId="266A2B9F" wp14:editId="52182902">
+          <wp:inline distT="0" distB="0" distL="0" distR="0" wp14:anchorId="0BB10AAA" wp14:editId="21F2DD2C">
             <wp:extent cx="5476875" cy="2686050"/>
             <wp:effectExtent l="0" t="0" r="0" b="0"/>
-            <wp:docPr id="1292947495" name="Picture 1292947495"/>
+            <wp:docPr id="1803919920" name="Picture 1803919920"/>
             <wp:cNvGraphicFramePr>
               <a:graphicFrameLocks xmlns:a="http://schemas.openxmlformats.org/drawingml/2006/main" noChangeAspect="1"/>
             </wp:cNvGraphicFramePr>
@@ -22187,10 +22302,10 @@
           <w:noProof/>
         </w:rPr>
         <w:drawing>
-          <wp:inline distT="0" distB="0" distL="0" distR="0" wp14:anchorId="03EA1F0D" wp14:editId="47B5E9B9">
+          <wp:inline distT="0" distB="0" distL="0" distR="0" wp14:anchorId="7D1BAA69" wp14:editId="29657EA6">
             <wp:extent cx="3886200" cy="4438650"/>
             <wp:effectExtent l="0" t="0" r="0" b="0"/>
-            <wp:docPr id="891256677" name="Picture 891256677"/>
+            <wp:docPr id="141938886" name="Picture 141938886"/>
             <wp:cNvGraphicFramePr>
               <a:graphicFrameLocks xmlns:a="http://schemas.openxmlformats.org/drawingml/2006/main" noChangeAspect="1"/>
             </wp:cNvGraphicFramePr>
@@ -22251,10 +22366,10 @@
           <w:noProof/>
         </w:rPr>
         <w:drawing>
-          <wp:inline distT="0" distB="0" distL="0" distR="0" wp14:anchorId="28D43A4C" wp14:editId="70CD3226">
+          <wp:inline distT="0" distB="0" distL="0" distR="0" wp14:anchorId="35B86D90" wp14:editId="7F4FFD2F">
             <wp:extent cx="5715000" cy="247650"/>
             <wp:effectExtent l="0" t="0" r="0" b="0"/>
-            <wp:docPr id="1672438241" name="Picture 1672438241"/>
+            <wp:docPr id="1360636571" name="Picture 1360636571"/>
             <wp:cNvGraphicFramePr>
               <a:graphicFrameLocks xmlns:a="http://schemas.openxmlformats.org/drawingml/2006/main" noChangeAspect="1"/>
             </wp:cNvGraphicFramePr>
@@ -22316,10 +22431,10 @@
         </w:rPr>
         <w:lastRenderedPageBreak/>
         <w:drawing>
-          <wp:inline distT="0" distB="0" distL="0" distR="0" wp14:anchorId="0B09D305" wp14:editId="12F119FF">
+          <wp:inline distT="0" distB="0" distL="0" distR="0" wp14:anchorId="3AB0E60A" wp14:editId="2F75F21D">
             <wp:extent cx="5715000" cy="2085975"/>
             <wp:effectExtent l="0" t="0" r="0" b="0"/>
-            <wp:docPr id="829426679" name="Picture 829426679"/>
+            <wp:docPr id="1554424310" name="Picture 1554424310"/>
             <wp:cNvGraphicFramePr>
               <a:graphicFrameLocks xmlns:a="http://schemas.openxmlformats.org/drawingml/2006/main" noChangeAspect="1"/>
             </wp:cNvGraphicFramePr>
@@ -22425,7 +22540,7 @@
         <w:pStyle w:val="Heading2"/>
         <w:spacing w:before="240" w:after="120"/>
       </w:pPr>
-      <w:bookmarkStart w:id="39" w:name="_Toc240203081"/>
+      <w:bookmarkStart w:id="39" w:name="_Toc240211006"/>
       <w:r>
         <w:lastRenderedPageBreak/>
         <w:t>3. Cài đặt SQL Server</w:t>
@@ -22463,10 +22578,10 @@
           <w:noProof/>
         </w:rPr>
         <w:drawing>
-          <wp:inline distT="0" distB="0" distL="0" distR="0" wp14:anchorId="467F016F" wp14:editId="1166E933">
+          <wp:inline distT="0" distB="0" distL="0" distR="0" wp14:anchorId="5AD60C43" wp14:editId="60A15C5A">
             <wp:extent cx="4476750" cy="3914775"/>
             <wp:effectExtent l="0" t="0" r="0" b="0"/>
-            <wp:docPr id="2005127020" name="Picture 2005127020"/>
+            <wp:docPr id="60946119" name="Picture 60946119"/>
             <wp:cNvGraphicFramePr>
               <a:graphicFrameLocks xmlns:a="http://schemas.openxmlformats.org/drawingml/2006/main" noChangeAspect="1"/>
             </wp:cNvGraphicFramePr>
@@ -22528,10 +22643,10 @@
         </w:rPr>
         <w:lastRenderedPageBreak/>
         <w:drawing>
-          <wp:inline distT="0" distB="0" distL="0" distR="0" wp14:anchorId="340D1641" wp14:editId="751B9573">
+          <wp:inline distT="0" distB="0" distL="0" distR="0" wp14:anchorId="2960C5C2" wp14:editId="008F6DE2">
             <wp:extent cx="4476750" cy="3924300"/>
             <wp:effectExtent l="0" t="0" r="0" b="0"/>
-            <wp:docPr id="1629311654" name="Picture 1629311654"/>
+            <wp:docPr id="455290757" name="Picture 455290757"/>
             <wp:cNvGraphicFramePr>
               <a:graphicFrameLocks xmlns:a="http://schemas.openxmlformats.org/drawingml/2006/main" noChangeAspect="1"/>
             </wp:cNvGraphicFramePr>
@@ -22601,10 +22716,10 @@
           <w:noProof/>
         </w:rPr>
         <w:drawing>
-          <wp:inline distT="0" distB="0" distL="0" distR="0" wp14:anchorId="3E4154D0" wp14:editId="6B5F8919">
+          <wp:inline distT="0" distB="0" distL="0" distR="0" wp14:anchorId="197738BE" wp14:editId="0DC88900">
             <wp:extent cx="4476750" cy="3924300"/>
             <wp:effectExtent l="0" t="0" r="0" b="0"/>
-            <wp:docPr id="818626702" name="Picture 818626702"/>
+            <wp:docPr id="1075316825" name="Picture 1075316825"/>
             <wp:cNvGraphicFramePr>
               <a:graphicFrameLocks xmlns:a="http://schemas.openxmlformats.org/drawingml/2006/main" noChangeAspect="1"/>
             </wp:cNvGraphicFramePr>
@@ -22666,10 +22781,10 @@
         </w:rPr>
         <w:lastRenderedPageBreak/>
         <w:drawing>
-          <wp:inline distT="0" distB="0" distL="0" distR="0" wp14:anchorId="4B1B869B" wp14:editId="7A07D254">
+          <wp:inline distT="0" distB="0" distL="0" distR="0" wp14:anchorId="613C77E9" wp14:editId="67D122F6">
             <wp:extent cx="4476750" cy="3914775"/>
             <wp:effectExtent l="0" t="0" r="0" b="0"/>
-            <wp:docPr id="1666429943" name="Picture 1666429943"/>
+            <wp:docPr id="205558670" name="Picture 205558670"/>
             <wp:cNvGraphicFramePr>
               <a:graphicFrameLocks xmlns:a="http://schemas.openxmlformats.org/drawingml/2006/main" noChangeAspect="1"/>
             </wp:cNvGraphicFramePr>
@@ -22730,10 +22845,10 @@
           <w:noProof/>
         </w:rPr>
         <w:drawing>
-          <wp:inline distT="0" distB="0" distL="0" distR="0" wp14:anchorId="191CE18B" wp14:editId="0405633F">
+          <wp:inline distT="0" distB="0" distL="0" distR="0" wp14:anchorId="5D371C85" wp14:editId="264DFC66">
             <wp:extent cx="4476750" cy="3914775"/>
             <wp:effectExtent l="0" t="0" r="0" b="0"/>
-            <wp:docPr id="908551188" name="Picture 908551188"/>
+            <wp:docPr id="465722348" name="Picture 465722348"/>
             <wp:cNvGraphicFramePr>
               <a:graphicFrameLocks xmlns:a="http://schemas.openxmlformats.org/drawingml/2006/main" noChangeAspect="1"/>
             </wp:cNvGraphicFramePr>
@@ -22795,10 +22910,10 @@
         </w:rPr>
         <w:lastRenderedPageBreak/>
         <w:drawing>
-          <wp:inline distT="0" distB="0" distL="0" distR="0" wp14:anchorId="5DBD21E1" wp14:editId="3BC9A535">
+          <wp:inline distT="0" distB="0" distL="0" distR="0" wp14:anchorId="18D8A5FB" wp14:editId="4A644841">
             <wp:extent cx="4476750" cy="3914775"/>
             <wp:effectExtent l="0" t="0" r="0" b="0"/>
-            <wp:docPr id="1261587865" name="Picture 1261587865"/>
+            <wp:docPr id="2071395654" name="Picture 2071395654"/>
             <wp:cNvGraphicFramePr>
               <a:graphicFrameLocks xmlns:a="http://schemas.openxmlformats.org/drawingml/2006/main" noChangeAspect="1"/>
             </wp:cNvGraphicFramePr>
@@ -22859,10 +22974,10 @@
           <w:noProof/>
         </w:rPr>
         <w:drawing>
-          <wp:inline distT="0" distB="0" distL="0" distR="0" wp14:anchorId="41D3AE62" wp14:editId="70D5AE0E">
+          <wp:inline distT="0" distB="0" distL="0" distR="0" wp14:anchorId="0434B6B1" wp14:editId="755145F1">
             <wp:extent cx="4476750" cy="3905250"/>
             <wp:effectExtent l="0" t="0" r="0" b="0"/>
-            <wp:docPr id="952800724" name="Picture 952800724"/>
+            <wp:docPr id="809431417" name="Picture 809431417"/>
             <wp:cNvGraphicFramePr>
               <a:graphicFrameLocks xmlns:a="http://schemas.openxmlformats.org/drawingml/2006/main" noChangeAspect="1"/>
             </wp:cNvGraphicFramePr>
@@ -22924,10 +23039,10 @@
         </w:rPr>
         <w:lastRenderedPageBreak/>
         <w:drawing>
-          <wp:inline distT="0" distB="0" distL="0" distR="0" wp14:anchorId="508341BA" wp14:editId="567D531D">
+          <wp:inline distT="0" distB="0" distL="0" distR="0" wp14:anchorId="49F51DBE" wp14:editId="5B82F124">
             <wp:extent cx="4476750" cy="3924300"/>
             <wp:effectExtent l="0" t="0" r="0" b="0"/>
-            <wp:docPr id="1671885193" name="Picture 1671885193"/>
+            <wp:docPr id="1687583425" name="Picture 1687583425"/>
             <wp:cNvGraphicFramePr>
               <a:graphicFrameLocks xmlns:a="http://schemas.openxmlformats.org/drawingml/2006/main" noChangeAspect="1"/>
             </wp:cNvGraphicFramePr>
@@ -22988,10 +23103,10 @@
           <w:noProof/>
         </w:rPr>
         <w:drawing>
-          <wp:inline distT="0" distB="0" distL="0" distR="0" wp14:anchorId="20EA5182" wp14:editId="5845B720">
+          <wp:inline distT="0" distB="0" distL="0" distR="0" wp14:anchorId="4969DA3A" wp14:editId="7CE5CF57">
             <wp:extent cx="4476750" cy="3924300"/>
             <wp:effectExtent l="0" t="0" r="0" b="0"/>
-            <wp:docPr id="621612592" name="Picture 621612592"/>
+            <wp:docPr id="379680112" name="Picture 379680112"/>
             <wp:cNvGraphicFramePr>
               <a:graphicFrameLocks xmlns:a="http://schemas.openxmlformats.org/drawingml/2006/main" noChangeAspect="1"/>
             </wp:cNvGraphicFramePr>
@@ -23053,10 +23168,10 @@
         </w:rPr>
         <w:lastRenderedPageBreak/>
         <w:drawing>
-          <wp:inline distT="0" distB="0" distL="0" distR="0" wp14:anchorId="058F2ABC" wp14:editId="6067152F">
+          <wp:inline distT="0" distB="0" distL="0" distR="0" wp14:anchorId="17502881" wp14:editId="792EA5EA">
             <wp:extent cx="4476750" cy="3933825"/>
             <wp:effectExtent l="0" t="0" r="0" b="0"/>
-            <wp:docPr id="736247462" name="Picture 736247462"/>
+            <wp:docPr id="531886058" name="Picture 531886058"/>
             <wp:cNvGraphicFramePr>
               <a:graphicFrameLocks xmlns:a="http://schemas.openxmlformats.org/drawingml/2006/main" noChangeAspect="1"/>
             </wp:cNvGraphicFramePr>
@@ -23117,10 +23232,10 @@
           <w:noProof/>
         </w:rPr>
         <w:drawing>
-          <wp:inline distT="0" distB="0" distL="0" distR="0" wp14:anchorId="6DA49053" wp14:editId="5D41C1B4">
+          <wp:inline distT="0" distB="0" distL="0" distR="0" wp14:anchorId="0DA00609" wp14:editId="4F143CD8">
             <wp:extent cx="5715000" cy="4048125"/>
             <wp:effectExtent l="0" t="0" r="0" b="0"/>
-            <wp:docPr id="600625222" name="Picture 600625222"/>
+            <wp:docPr id="1217398395" name="Picture 1217398395"/>
             <wp:cNvGraphicFramePr>
               <a:graphicFrameLocks xmlns:a="http://schemas.openxmlformats.org/drawingml/2006/main" noChangeAspect="1"/>
             </wp:cNvGraphicFramePr>
@@ -23181,7 +23296,7 @@
         <w:pStyle w:val="Heading2"/>
         <w:spacing w:before="240" w:after="120"/>
       </w:pPr>
-      <w:bookmarkStart w:id="40" w:name="_Toc240203082"/>
+      <w:bookmarkStart w:id="40" w:name="_Toc240211007"/>
       <w:r>
         <w:lastRenderedPageBreak/>
         <w:t>4. Kiểm tra dịch vụ Agent</w:t>
@@ -23207,10 +23322,10 @@
           <w:noProof/>
         </w:rPr>
         <w:drawing>
-          <wp:inline distT="0" distB="0" distL="0" distR="0" wp14:anchorId="3EB0F27A" wp14:editId="2553153A">
+          <wp:inline distT="0" distB="0" distL="0" distR="0" wp14:anchorId="566EFF70" wp14:editId="7B4A44C6">
             <wp:extent cx="5715000" cy="1409700"/>
             <wp:effectExtent l="0" t="0" r="0" b="0"/>
-            <wp:docPr id="183335183" name="Picture 183335183"/>
+            <wp:docPr id="1687021296" name="Picture 1687021296"/>
             <wp:cNvGraphicFramePr>
               <a:graphicFrameLocks xmlns:a="http://schemas.openxmlformats.org/drawingml/2006/main" noChangeAspect="1"/>
             </wp:cNvGraphicFramePr>
@@ -23334,7 +23449,7 @@
         <w:pStyle w:val="Heading2"/>
         <w:spacing w:before="240" w:after="120"/>
       </w:pPr>
-      <w:bookmarkStart w:id="41" w:name="_Toc240203083"/>
+      <w:bookmarkStart w:id="41" w:name="_Toc240211008"/>
       <w:r>
         <w:lastRenderedPageBreak/>
         <w:t>5. Tạo liên kết cơ sở dữ liệu giữa các máy chủ</w:t>
@@ -23401,10 +23516,10 @@
           <w:noProof/>
         </w:rPr>
         <w:drawing>
-          <wp:inline distT="0" distB="0" distL="0" distR="0" wp14:anchorId="7F6222EA" wp14:editId="72E26AD5">
+          <wp:inline distT="0" distB="0" distL="0" distR="0" wp14:anchorId="6B3D5F01" wp14:editId="2C72ABF7">
             <wp:extent cx="4905375" cy="6391275"/>
             <wp:effectExtent l="0" t="0" r="0" b="0"/>
-            <wp:docPr id="2084547703" name="Picture 2084547703"/>
+            <wp:docPr id="255709761" name="Picture 255709761"/>
             <wp:cNvGraphicFramePr>
               <a:graphicFrameLocks xmlns:a="http://schemas.openxmlformats.org/drawingml/2006/main" noChangeAspect="1"/>
             </wp:cNvGraphicFramePr>
@@ -23466,10 +23581,10 @@
         </w:rPr>
         <w:lastRenderedPageBreak/>
         <w:drawing>
-          <wp:inline distT="0" distB="0" distL="0" distR="0" wp14:anchorId="73296915" wp14:editId="16B146A3">
+          <wp:inline distT="0" distB="0" distL="0" distR="0" wp14:anchorId="463BED49" wp14:editId="040AD919">
             <wp:extent cx="5715000" cy="5172075"/>
             <wp:effectExtent l="0" t="0" r="0" b="0"/>
-            <wp:docPr id="1348616045" name="Picture 1348616045"/>
+            <wp:docPr id="657740192" name="Picture 657740192"/>
             <wp:cNvGraphicFramePr>
               <a:graphicFrameLocks xmlns:a="http://schemas.openxmlformats.org/drawingml/2006/main" noChangeAspect="1"/>
             </wp:cNvGraphicFramePr>
@@ -23531,10 +23646,10 @@
         </w:rPr>
         <w:lastRenderedPageBreak/>
         <w:drawing>
-          <wp:inline distT="0" distB="0" distL="0" distR="0" wp14:anchorId="29EFA65F" wp14:editId="69CE451A">
+          <wp:inline distT="0" distB="0" distL="0" distR="0" wp14:anchorId="2F3743D0" wp14:editId="76315116">
             <wp:extent cx="5715000" cy="5162550"/>
             <wp:effectExtent l="0" t="0" r="0" b="0"/>
-            <wp:docPr id="235209942" name="Picture 235209942"/>
+            <wp:docPr id="433501252" name="Picture 433501252"/>
             <wp:cNvGraphicFramePr>
               <a:graphicFrameLocks xmlns:a="http://schemas.openxmlformats.org/drawingml/2006/main" noChangeAspect="1"/>
             </wp:cNvGraphicFramePr>
@@ -24069,10 +24184,10 @@
           <w:noProof/>
         </w:rPr>
         <w:drawing>
-          <wp:inline distT="0" distB="0" distL="0" distR="0" wp14:anchorId="293DF84C" wp14:editId="496B4D22">
+          <wp:inline distT="0" distB="0" distL="0" distR="0" wp14:anchorId="5D00A09E" wp14:editId="7C1EAF54">
             <wp:extent cx="5715000" cy="2781300"/>
             <wp:effectExtent l="0" t="0" r="0" b="0"/>
-            <wp:docPr id="1282399783" name="Picture 1282399783"/>
+            <wp:docPr id="1911560175" name="Picture 1911560175"/>
             <wp:cNvGraphicFramePr>
               <a:graphicFrameLocks xmlns:a="http://schemas.openxmlformats.org/drawingml/2006/main" noChangeAspect="1"/>
             </wp:cNvGraphicFramePr>
@@ -24142,7 +24257,7 @@
         <w:pStyle w:val="Heading2"/>
         <w:spacing w:before="240" w:after="120"/>
       </w:pPr>
-      <w:bookmarkStart w:id="42" w:name="_Toc240203084"/>
+      <w:bookmarkStart w:id="42" w:name="_Toc240211009"/>
       <w:r>
         <w:lastRenderedPageBreak/>
         <w:t>6. Tạo Publication</w:t>
@@ -24168,10 +24283,10 @@
           <w:noProof/>
         </w:rPr>
         <w:drawing>
-          <wp:inline distT="0" distB="0" distL="0" distR="0" wp14:anchorId="347ADCCE" wp14:editId="6875A14D">
+          <wp:inline distT="0" distB="0" distL="0" distR="0" wp14:anchorId="403912DD" wp14:editId="6895911C">
             <wp:extent cx="3657600" cy="6200775"/>
             <wp:effectExtent l="0" t="0" r="0" b="0"/>
-            <wp:docPr id="1840099185" name="Picture 1840099185"/>
+            <wp:docPr id="251031885" name="Picture 251031885"/>
             <wp:cNvGraphicFramePr>
               <a:graphicFrameLocks xmlns:a="http://schemas.openxmlformats.org/drawingml/2006/main" noChangeAspect="1"/>
             </wp:cNvGraphicFramePr>
@@ -24233,10 +24348,10 @@
         </w:rPr>
         <w:lastRenderedPageBreak/>
         <w:drawing>
-          <wp:inline distT="0" distB="0" distL="0" distR="0" wp14:anchorId="03B9F858" wp14:editId="1078F4A1">
+          <wp:inline distT="0" distB="0" distL="0" distR="0" wp14:anchorId="4CECBD6E" wp14:editId="312C1222">
             <wp:extent cx="5715000" cy="5181600"/>
             <wp:effectExtent l="0" t="0" r="0" b="0"/>
-            <wp:docPr id="1893442847" name="Picture 1893442847"/>
+            <wp:docPr id="36591854" name="Picture 36591854"/>
             <wp:cNvGraphicFramePr>
               <a:graphicFrameLocks xmlns:a="http://schemas.openxmlformats.org/drawingml/2006/main" noChangeAspect="1"/>
             </wp:cNvGraphicFramePr>
@@ -24298,10 +24413,10 @@
         </w:rPr>
         <w:lastRenderedPageBreak/>
         <w:drawing>
-          <wp:inline distT="0" distB="0" distL="0" distR="0" wp14:anchorId="0B4D81DC" wp14:editId="377B7F55">
+          <wp:inline distT="0" distB="0" distL="0" distR="0" wp14:anchorId="02C06EC8" wp14:editId="2B66ACA0">
             <wp:extent cx="5715000" cy="4057650"/>
             <wp:effectExtent l="0" t="0" r="0" b="0"/>
-            <wp:docPr id="22323869" name="Picture 22323869"/>
+            <wp:docPr id="1949183691" name="Picture 1949183691"/>
             <wp:cNvGraphicFramePr>
               <a:graphicFrameLocks xmlns:a="http://schemas.openxmlformats.org/drawingml/2006/main" noChangeAspect="1"/>
             </wp:cNvGraphicFramePr>
@@ -24431,10 +24546,10 @@
         </w:rPr>
         <w:lastRenderedPageBreak/>
         <w:drawing>
-          <wp:inline distT="0" distB="0" distL="0" distR="0" wp14:anchorId="17D0B261" wp14:editId="3C57E631">
+          <wp:inline distT="0" distB="0" distL="0" distR="0" wp14:anchorId="1CF931EC" wp14:editId="1EFCF344">
             <wp:extent cx="5715000" cy="2781300"/>
             <wp:effectExtent l="0" t="0" r="0" b="0"/>
-            <wp:docPr id="1409517212" name="Picture 1409517212"/>
+            <wp:docPr id="1359755835" name="Picture 1359755835"/>
             <wp:cNvGraphicFramePr>
               <a:graphicFrameLocks xmlns:a="http://schemas.openxmlformats.org/drawingml/2006/main" noChangeAspect="1"/>
             </wp:cNvGraphicFramePr>
@@ -24507,7 +24622,7 @@
         <w:pStyle w:val="Heading2"/>
         <w:spacing w:before="240" w:after="120"/>
       </w:pPr>
-      <w:bookmarkStart w:id="43" w:name="_Toc240203085"/>
+      <w:bookmarkStart w:id="43" w:name="_Toc240211010"/>
       <w:r>
         <w:lastRenderedPageBreak/>
         <w:t>7. Thử các giao tác tương ứng với các chức năng</w:t>
@@ -24519,7 +24634,7 @@
         <w:pStyle w:val="Heading3"/>
         <w:spacing w:before="180" w:after="100"/>
       </w:pPr>
-      <w:bookmarkStart w:id="44" w:name="_Toc240203086"/>
+      <w:bookmarkStart w:id="44" w:name="_Toc240211011"/>
       <w:r>
         <w:rPr>
           <w:i/>
@@ -25124,7 +25239,7 @@
         <w:pStyle w:val="Heading3"/>
         <w:spacing w:before="180" w:after="100"/>
       </w:pPr>
-      <w:bookmarkStart w:id="45" w:name="_Toc240203087"/>
+      <w:bookmarkStart w:id="45" w:name="_Toc240211012"/>
       <w:r>
         <w:rPr>
           <w:i/>
@@ -25163,10 +25278,10 @@
         </w:rPr>
         <w:lastRenderedPageBreak/>
         <w:drawing>
-          <wp:inline distT="0" distB="0" distL="0" distR="0" wp14:anchorId="1326AD10" wp14:editId="4DC9E852">
+          <wp:inline distT="0" distB="0" distL="0" distR="0" wp14:anchorId="690D4AF2" wp14:editId="3E011E8D">
             <wp:extent cx="5524500" cy="6353175"/>
             <wp:effectExtent l="0" t="0" r="0" b="0"/>
-            <wp:docPr id="1669640808" name="Picture 1669640808"/>
+            <wp:docPr id="1814241636" name="Picture 1814241636"/>
             <wp:cNvGraphicFramePr>
               <a:graphicFrameLocks xmlns:a="http://schemas.openxmlformats.org/drawingml/2006/main" noChangeAspect="1"/>
             </wp:cNvGraphicFramePr>
@@ -25246,10 +25361,10 @@
         </w:rPr>
         <w:lastRenderedPageBreak/>
         <w:drawing>
-          <wp:inline distT="0" distB="0" distL="0" distR="0" wp14:anchorId="55E283C1" wp14:editId="6DE56784">
+          <wp:inline distT="0" distB="0" distL="0" distR="0" wp14:anchorId="4BFDCBA2" wp14:editId="6279D978">
             <wp:extent cx="5715000" cy="2143125"/>
             <wp:effectExtent l="0" t="0" r="0" b="0"/>
-            <wp:docPr id="571376345" name="Picture 571376345"/>
+            <wp:docPr id="1369562844" name="Picture 1369562844"/>
             <wp:cNvGraphicFramePr>
               <a:graphicFrameLocks xmlns:a="http://schemas.openxmlformats.org/drawingml/2006/main" noChangeAspect="1"/>
             </wp:cNvGraphicFramePr>
@@ -25834,10 +25949,10 @@
           <w:noProof/>
         </w:rPr>
         <w:drawing>
-          <wp:inline distT="0" distB="0" distL="0" distR="0" wp14:anchorId="14C11C15" wp14:editId="4F5EFF1C">
+          <wp:inline distT="0" distB="0" distL="0" distR="0" wp14:anchorId="7798C5B4" wp14:editId="3AE586EC">
             <wp:extent cx="5715000" cy="3524250"/>
             <wp:effectExtent l="0" t="0" r="0" b="0"/>
-            <wp:docPr id="1629349919" name="Picture 1629349919"/>
+            <wp:docPr id="1433099794" name="Picture 1433099794"/>
             <wp:cNvGraphicFramePr>
               <a:graphicFrameLocks xmlns:a="http://schemas.openxmlformats.org/drawingml/2006/main" noChangeAspect="1"/>
             </wp:cNvGraphicFramePr>
@@ -25926,10 +26041,10 @@
           <w:noProof/>
         </w:rPr>
         <w:drawing>
-          <wp:inline distT="0" distB="0" distL="0" distR="0" wp14:anchorId="0A6DB8D5" wp14:editId="2E5866D2">
+          <wp:inline distT="0" distB="0" distL="0" distR="0" wp14:anchorId="1275E161" wp14:editId="4F541151">
             <wp:extent cx="5715000" cy="2257425"/>
             <wp:effectExtent l="0" t="0" r="0" b="0"/>
-            <wp:docPr id="1759617964" name="Picture 1759617964"/>
+            <wp:docPr id="536490275" name="Picture 536490275"/>
             <wp:cNvGraphicFramePr>
               <a:graphicFrameLocks xmlns:a="http://schemas.openxmlformats.org/drawingml/2006/main" noChangeAspect="1"/>
             </wp:cNvGraphicFramePr>
@@ -26020,10 +26135,10 @@
         </w:rPr>
         <w:lastRenderedPageBreak/>
         <w:drawing>
-          <wp:inline distT="0" distB="0" distL="0" distR="0" wp14:anchorId="106D5CE9" wp14:editId="4E920938">
+          <wp:inline distT="0" distB="0" distL="0" distR="0" wp14:anchorId="67292A6A" wp14:editId="314D041E">
             <wp:extent cx="2733675" cy="5572125"/>
             <wp:effectExtent l="0" t="0" r="0" b="0"/>
-            <wp:docPr id="1956356991" name="Picture 1956356991"/>
+            <wp:docPr id="1851893487" name="Picture 1851893487"/>
             <wp:cNvGraphicFramePr>
               <a:graphicFrameLocks xmlns:a="http://schemas.openxmlformats.org/drawingml/2006/main" noChangeAspect="1"/>
             </wp:cNvGraphicFramePr>
@@ -26091,7 +26206,7 @@
         <w:pStyle w:val="Heading3"/>
         <w:spacing w:before="180" w:after="100"/>
       </w:pPr>
-      <w:bookmarkStart w:id="46" w:name="_Toc240203088"/>
+      <w:bookmarkStart w:id="46" w:name="_Toc240211013"/>
       <w:r>
         <w:rPr>
           <w:i/>
@@ -26112,10 +26227,10 @@
         </w:rPr>
         <w:lastRenderedPageBreak/>
         <w:drawing>
-          <wp:inline distT="0" distB="0" distL="0" distR="0" wp14:anchorId="53789A7C" wp14:editId="54CB6B86">
+          <wp:inline distT="0" distB="0" distL="0" distR="0" wp14:anchorId="72A3C40B" wp14:editId="0FA4CF56">
             <wp:extent cx="5715000" cy="4371975"/>
             <wp:effectExtent l="0" t="0" r="0" b="0"/>
-            <wp:docPr id="634321212" name="Picture 634321212"/>
+            <wp:docPr id="1342532225" name="Picture 1342532225"/>
             <wp:cNvGraphicFramePr>
               <a:graphicFrameLocks xmlns:a="http://schemas.openxmlformats.org/drawingml/2006/main" noChangeAspect="1"/>
             </wp:cNvGraphicFramePr>
@@ -26734,10 +26849,10 @@
           <w:noProof/>
         </w:rPr>
         <w:drawing>
-          <wp:inline distT="0" distB="0" distL="0" distR="0" wp14:anchorId="1AE8E3C6" wp14:editId="7376F293">
+          <wp:inline distT="0" distB="0" distL="0" distR="0" wp14:anchorId="40B2DB1A" wp14:editId="288C4B84">
             <wp:extent cx="5715000" cy="657225"/>
             <wp:effectExtent l="0" t="0" r="0" b="0"/>
-            <wp:docPr id="875798524" name="Picture 875798524"/>
+            <wp:docPr id="929535796" name="Picture 929535796"/>
             <wp:cNvGraphicFramePr>
               <a:graphicFrameLocks xmlns:a="http://schemas.openxmlformats.org/drawingml/2006/main" noChangeAspect="1"/>
             </wp:cNvGraphicFramePr>
@@ -26808,10 +26923,10 @@
         </w:rPr>
         <w:lastRenderedPageBreak/>
         <w:drawing>
-          <wp:inline distT="0" distB="0" distL="0" distR="0" wp14:anchorId="3544F4D4" wp14:editId="31713392">
+          <wp:inline distT="0" distB="0" distL="0" distR="0" wp14:anchorId="2939BCFA" wp14:editId="27139B3D">
             <wp:extent cx="4152900" cy="3629025"/>
             <wp:effectExtent l="0" t="0" r="0" b="0"/>
-            <wp:docPr id="1608558103" name="Picture 1608558103"/>
+            <wp:docPr id="1323205292" name="Picture 1323205292"/>
             <wp:cNvGraphicFramePr>
               <a:graphicFrameLocks xmlns:a="http://schemas.openxmlformats.org/drawingml/2006/main" noChangeAspect="1"/>
             </wp:cNvGraphicFramePr>
@@ -26879,7 +26994,7 @@
         <w:pStyle w:val="Heading3"/>
         <w:spacing w:before="180" w:after="100"/>
       </w:pPr>
-      <w:bookmarkStart w:id="47" w:name="_Toc240203089"/>
+      <w:bookmarkStart w:id="47" w:name="_Toc240211014"/>
       <w:r>
         <w:rPr>
           <w:i/>
@@ -27933,10 +28048,10 @@
         </w:rPr>
         <w:lastRenderedPageBreak/>
         <w:drawing>
-          <wp:inline distT="0" distB="0" distL="0" distR="0" wp14:anchorId="5ED4379D" wp14:editId="0E665822">
+          <wp:inline distT="0" distB="0" distL="0" distR="0" wp14:anchorId="36373386" wp14:editId="7EC076A4">
             <wp:extent cx="5715000" cy="7372350"/>
             <wp:effectExtent l="0" t="0" r="0" b="0"/>
-            <wp:docPr id="1859791506" name="Picture 1859791506"/>
+            <wp:docPr id="577627610" name="Picture 577627610"/>
             <wp:cNvGraphicFramePr>
               <a:graphicFrameLocks xmlns:a="http://schemas.openxmlformats.org/drawingml/2006/main" noChangeAspect="1"/>
             </wp:cNvGraphicFramePr>
@@ -27997,10 +28112,10 @@
           <w:noProof/>
         </w:rPr>
         <w:drawing>
-          <wp:inline distT="0" distB="0" distL="0" distR="0" wp14:anchorId="074FB884" wp14:editId="18666138">
+          <wp:inline distT="0" distB="0" distL="0" distR="0" wp14:anchorId="38945F0D" wp14:editId="2F0F37BC">
             <wp:extent cx="5715000" cy="1295400"/>
             <wp:effectExtent l="0" t="0" r="0" b="0"/>
-            <wp:docPr id="2011553239" name="Picture 2011553239"/>
+            <wp:docPr id="2100804122" name="Picture 2100804122"/>
             <wp:cNvGraphicFramePr>
               <a:graphicFrameLocks xmlns:a="http://schemas.openxmlformats.org/drawingml/2006/main" noChangeAspect="1"/>
             </wp:cNvGraphicFramePr>
@@ -28071,10 +28186,10 @@
           <w:noProof/>
         </w:rPr>
         <w:drawing>
-          <wp:inline distT="0" distB="0" distL="0" distR="0" wp14:anchorId="2AAC5CD7" wp14:editId="31726020">
+          <wp:inline distT="0" distB="0" distL="0" distR="0" wp14:anchorId="75DA021B" wp14:editId="478FCBB5">
             <wp:extent cx="5715000" cy="876300"/>
             <wp:effectExtent l="0" t="0" r="0" b="0"/>
-            <wp:docPr id="1363604933" name="Picture 1363604933"/>
+            <wp:docPr id="599572514" name="Picture 599572514"/>
             <wp:cNvGraphicFramePr>
               <a:graphicFrameLocks xmlns:a="http://schemas.openxmlformats.org/drawingml/2006/main" noChangeAspect="1"/>
             </wp:cNvGraphicFramePr>
@@ -28154,10 +28269,10 @@
           <w:noProof/>
         </w:rPr>
         <w:drawing>
-          <wp:inline distT="0" distB="0" distL="0" distR="0" wp14:anchorId="0BDE7210" wp14:editId="6FCA7965">
+          <wp:inline distT="0" distB="0" distL="0" distR="0" wp14:anchorId="7286A901" wp14:editId="330E8BCB">
             <wp:extent cx="5715000" cy="866775"/>
             <wp:effectExtent l="0" t="0" r="0" b="0"/>
-            <wp:docPr id="1026936744" name="Picture 1026936744"/>
+            <wp:docPr id="763682883" name="Picture 763682883"/>
             <wp:cNvGraphicFramePr>
               <a:graphicFrameLocks xmlns:a="http://schemas.openxmlformats.org/drawingml/2006/main" noChangeAspect="1"/>
             </wp:cNvGraphicFramePr>
@@ -28743,10 +28858,10 @@
         </w:rPr>
         <w:lastRenderedPageBreak/>
         <w:drawing>
-          <wp:inline distT="0" distB="0" distL="0" distR="0" wp14:anchorId="45A010A0" wp14:editId="28AAAA8F">
+          <wp:inline distT="0" distB="0" distL="0" distR="0" wp14:anchorId="5015AB1C" wp14:editId="6A522C22">
             <wp:extent cx="5715000" cy="1762125"/>
             <wp:effectExtent l="0" t="0" r="0" b="0"/>
-            <wp:docPr id="734679496" name="Picture 734679496"/>
+            <wp:docPr id="829423736" name="Picture 829423736"/>
             <wp:cNvGraphicFramePr>
               <a:graphicFrameLocks xmlns:a="http://schemas.openxmlformats.org/drawingml/2006/main" noChangeAspect="1"/>
             </wp:cNvGraphicFramePr>
@@ -28823,7 +28938,7 @@
         <w:pStyle w:val="Heading3"/>
         <w:spacing w:before="180" w:after="100"/>
       </w:pPr>
-      <w:bookmarkStart w:id="48" w:name="_Toc240203090"/>
+      <w:bookmarkStart w:id="48" w:name="_Toc240211015"/>
       <w:r>
         <w:rPr>
           <w:i/>
@@ -28966,10 +29081,10 @@
         </w:rPr>
         <w:lastRenderedPageBreak/>
         <w:drawing>
-          <wp:inline distT="0" distB="0" distL="0" distR="0" wp14:anchorId="365E0106" wp14:editId="4F5A0B2F">
+          <wp:inline distT="0" distB="0" distL="0" distR="0" wp14:anchorId="6D7401D2" wp14:editId="1676BD98">
             <wp:extent cx="5486400" cy="3228975"/>
             <wp:effectExtent l="0" t="0" r="0" b="0"/>
-            <wp:docPr id="1132774212" name="Picture 1132774212"/>
+            <wp:docPr id="1877988704" name="Picture 1877988704"/>
             <wp:cNvGraphicFramePr>
               <a:graphicFrameLocks xmlns:a="http://schemas.openxmlformats.org/drawingml/2006/main" noChangeAspect="1"/>
             </wp:cNvGraphicFramePr>
@@ -29030,10 +29145,10 @@
           <w:noProof/>
         </w:rPr>
         <w:drawing>
-          <wp:inline distT="0" distB="0" distL="0" distR="0" wp14:anchorId="4C6BF944" wp14:editId="654694D2">
+          <wp:inline distT="0" distB="0" distL="0" distR="0" wp14:anchorId="64541DB3" wp14:editId="0A043FB0">
             <wp:extent cx="4419600" cy="1228725"/>
             <wp:effectExtent l="0" t="0" r="0" b="0"/>
-            <wp:docPr id="147259972" name="Picture 147259972"/>
+            <wp:docPr id="977688478" name="Picture 977688478"/>
             <wp:cNvGraphicFramePr>
               <a:graphicFrameLocks xmlns:a="http://schemas.openxmlformats.org/drawingml/2006/main" noChangeAspect="1"/>
             </wp:cNvGraphicFramePr>
@@ -29471,10 +29586,10 @@
         </w:rPr>
         <w:lastRenderedPageBreak/>
         <w:drawing>
-          <wp:inline distT="0" distB="0" distL="0" distR="0" wp14:anchorId="5FC82470" wp14:editId="1C2AC8F6">
+          <wp:inline distT="0" distB="0" distL="0" distR="0" wp14:anchorId="600BE661" wp14:editId="4391EDDB">
             <wp:extent cx="4362450" cy="2771775"/>
             <wp:effectExtent l="0" t="0" r="0" b="0"/>
-            <wp:docPr id="1755376378" name="Picture 1755376378"/>
+            <wp:docPr id="1195128820" name="Picture 1195128820"/>
             <wp:cNvGraphicFramePr>
               <a:graphicFrameLocks xmlns:a="http://schemas.openxmlformats.org/drawingml/2006/main" noChangeAspect="1"/>
             </wp:cNvGraphicFramePr>
@@ -29535,10 +29650,10 @@
           <w:noProof/>
         </w:rPr>
         <w:drawing>
-          <wp:inline distT="0" distB="0" distL="0" distR="0" wp14:anchorId="306C4AE7" wp14:editId="458248F9">
+          <wp:inline distT="0" distB="0" distL="0" distR="0" wp14:anchorId="505EC37F" wp14:editId="5E7ED047">
             <wp:extent cx="5715000" cy="1038225"/>
             <wp:effectExtent l="0" t="0" r="0" b="0"/>
-            <wp:docPr id="2007623941" name="Picture 2007623941"/>
+            <wp:docPr id="272389720" name="Picture 272389720"/>
             <wp:cNvGraphicFramePr>
               <a:graphicFrameLocks xmlns:a="http://schemas.openxmlformats.org/drawingml/2006/main" noChangeAspect="1"/>
             </wp:cNvGraphicFramePr>
@@ -29646,10 +29761,10 @@
         </w:rPr>
         <w:lastRenderedPageBreak/>
         <w:drawing>
-          <wp:inline distT="0" distB="0" distL="0" distR="0" wp14:anchorId="3236561E" wp14:editId="699298AF">
+          <wp:inline distT="0" distB="0" distL="0" distR="0" wp14:anchorId="42091846" wp14:editId="71F4FF28">
             <wp:extent cx="4191000" cy="3086100"/>
             <wp:effectExtent l="0" t="0" r="0" b="0"/>
-            <wp:docPr id="165122872" name="Picture 165122872"/>
+            <wp:docPr id="1145577910" name="Picture 1145577910"/>
             <wp:cNvGraphicFramePr>
               <a:graphicFrameLocks xmlns:a="http://schemas.openxmlformats.org/drawingml/2006/main" noChangeAspect="1"/>
             </wp:cNvGraphicFramePr>
@@ -29710,10 +29825,10 @@
           <w:noProof/>
         </w:rPr>
         <w:drawing>
-          <wp:inline distT="0" distB="0" distL="0" distR="0" wp14:anchorId="37F85EF8" wp14:editId="4E60316D">
+          <wp:inline distT="0" distB="0" distL="0" distR="0" wp14:anchorId="5EED978B" wp14:editId="5BDB8CA1">
             <wp:extent cx="5715000" cy="952500"/>
             <wp:effectExtent l="0" t="0" r="0" b="0"/>
-            <wp:docPr id="544258568" name="Picture 544258568"/>
+            <wp:docPr id="119018275" name="Picture 119018275"/>
             <wp:cNvGraphicFramePr>
               <a:graphicFrameLocks xmlns:a="http://schemas.openxmlformats.org/drawingml/2006/main" noChangeAspect="1"/>
             </wp:cNvGraphicFramePr>
@@ -30270,10 +30385,10 @@
         </w:rPr>
         <w:lastRenderedPageBreak/>
         <w:drawing>
-          <wp:inline distT="0" distB="0" distL="0" distR="0" wp14:anchorId="5B54FA90" wp14:editId="661D4997">
+          <wp:inline distT="0" distB="0" distL="0" distR="0" wp14:anchorId="10AEF43A" wp14:editId="22DC1297">
             <wp:extent cx="5715000" cy="3133725"/>
             <wp:effectExtent l="0" t="0" r="0" b="0"/>
-            <wp:docPr id="413953509" name="Picture 413953509"/>
+            <wp:docPr id="296798476" name="Picture 296798476"/>
             <wp:cNvGraphicFramePr>
               <a:graphicFrameLocks xmlns:a="http://schemas.openxmlformats.org/drawingml/2006/main" noChangeAspect="1"/>
             </wp:cNvGraphicFramePr>
@@ -30346,10 +30461,10 @@
           <w:noProof/>
         </w:rPr>
         <w:drawing>
-          <wp:inline distT="0" distB="0" distL="0" distR="0" wp14:anchorId="0C9D198C" wp14:editId="01E9D4B9">
+          <wp:inline distT="0" distB="0" distL="0" distR="0" wp14:anchorId="6FC1E333" wp14:editId="7C360C24">
             <wp:extent cx="5715000" cy="2486025"/>
             <wp:effectExtent l="0" t="0" r="0" b="0"/>
-            <wp:docPr id="1467504754" name="Picture 1467504754"/>
+            <wp:docPr id="1530187057" name="Picture 1530187057"/>
             <wp:cNvGraphicFramePr>
               <a:graphicFrameLocks xmlns:a="http://schemas.openxmlformats.org/drawingml/2006/main" noChangeAspect="1"/>
             </wp:cNvGraphicFramePr>
@@ -30431,10 +30546,10 @@
         </w:rPr>
         <w:lastRenderedPageBreak/>
         <w:drawing>
-          <wp:inline distT="0" distB="0" distL="0" distR="0" wp14:anchorId="02926DEA" wp14:editId="468F6009">
+          <wp:inline distT="0" distB="0" distL="0" distR="0" wp14:anchorId="407CC195" wp14:editId="0D1B3864">
             <wp:extent cx="5715000" cy="3238500"/>
             <wp:effectExtent l="0" t="0" r="0" b="0"/>
-            <wp:docPr id="1934428877" name="Picture 1934428877"/>
+            <wp:docPr id="1018303774" name="Picture 1018303774"/>
             <wp:cNvGraphicFramePr>
               <a:graphicFrameLocks xmlns:a="http://schemas.openxmlformats.org/drawingml/2006/main" noChangeAspect="1"/>
             </wp:cNvGraphicFramePr>
@@ -30515,10 +30630,10 @@
           <w:noProof/>
         </w:rPr>
         <w:drawing>
-          <wp:inline distT="0" distB="0" distL="0" distR="0" wp14:anchorId="05640253" wp14:editId="68B9D9CE">
+          <wp:inline distT="0" distB="0" distL="0" distR="0" wp14:anchorId="684EFDD6" wp14:editId="396CECB5">
             <wp:extent cx="5715000" cy="2486025"/>
             <wp:effectExtent l="0" t="0" r="0" b="0"/>
-            <wp:docPr id="450939499" name="Picture 450939499"/>
+            <wp:docPr id="906442656" name="Picture 906442656"/>
             <wp:cNvGraphicFramePr>
               <a:graphicFrameLocks xmlns:a="http://schemas.openxmlformats.org/drawingml/2006/main" noChangeAspect="1"/>
             </wp:cNvGraphicFramePr>
@@ -30601,10 +30716,10 @@
         </w:rPr>
         <w:lastRenderedPageBreak/>
         <w:drawing>
-          <wp:inline distT="0" distB="0" distL="0" distR="0" wp14:anchorId="3CE5A1C2" wp14:editId="507B54DC">
+          <wp:inline distT="0" distB="0" distL="0" distR="0" wp14:anchorId="22C1C029" wp14:editId="7DF5A7A7">
             <wp:extent cx="5715000" cy="3057525"/>
             <wp:effectExtent l="0" t="0" r="0" b="0"/>
-            <wp:docPr id="488977647" name="Picture 488977647"/>
+            <wp:docPr id="1328542445" name="Picture 1328542445"/>
             <wp:cNvGraphicFramePr>
               <a:graphicFrameLocks xmlns:a="http://schemas.openxmlformats.org/drawingml/2006/main" noChangeAspect="1"/>
             </wp:cNvGraphicFramePr>
@@ -31232,27 +31347,1245 @@
     </w:p>
     <w:p>
       <w:pPr>
+        <w:pStyle w:val="Heading2"/>
+        <w:spacing w:before="240" w:after="120"/>
+      </w:pPr>
+      <w:bookmarkStart w:id="49" w:name="_Toc240211016"/>
+      <w:r>
+        <w:lastRenderedPageBreak/>
+        <w:t>8. Phần mềm ứng dụng cho các trạm</w:t>
+      </w:r>
+      <w:bookmarkEnd w:id="49"/>
+    </w:p>
+    <w:p>
+      <w:pPr>
+        <w:spacing w:after="120" w:line="360" w:lineRule="auto"/>
+        <w:jc w:val="both"/>
+      </w:pPr>
+      <w:r>
+        <w:t xml:space="preserve">Đề cương nêu thêm một mục không bắt buộc: </w:t>
+      </w:r>
+      <w:r>
+        <w:rPr>
+          <w:i/>
+          <w:iCs/>
+        </w:rPr>
+        <w:t>viết phần mềm ứng dụng cho các trạm theo thiết kế nếu có thể</w:t>
+      </w:r>
+      <w:r>
+        <w:t>. Nhóm đã thực hiện mục này.</w:t>
+      </w:r>
+    </w:p>
+    <w:p>
+      <w:pPr>
+        <w:spacing w:after="120" w:line="360" w:lineRule="auto"/>
+        <w:jc w:val="both"/>
+      </w:pPr>
+      <w:r>
+        <w:t>Mỗi kho chạy một bản phần mềm trên máy của mình, nối vào cơ sở dữ liệu của chính kho đó. Kiến trúc đúng theo mô hình ba tầng đã trình bày ở Chương II:</w:t>
+      </w:r>
+    </w:p>
+    <w:p>
+      <w:pPr>
+        <w:shd w:val="clear" w:color="auto" w:fill="F4F4F4"/>
+        <w:ind w:left="288"/>
+      </w:pPr>
+      <w:r>
+        <w:rPr>
+          <w:rFonts w:ascii="Consolas" w:eastAsia="Consolas" w:hAnsi="Consolas" w:cs="Consolas"/>
+          <w:sz w:val="18"/>
+          <w:szCs w:val="18"/>
+        </w:rPr>
+        <w:t xml:space="preserve">   Trình duy</w:t>
+      </w:r>
+      <w:r>
+        <w:rPr>
+          <w:rFonts w:ascii="Consolas" w:eastAsia="Consolas" w:hAnsi="Consolas" w:cs="Consolas"/>
+          <w:sz w:val="18"/>
+          <w:szCs w:val="18"/>
+        </w:rPr>
+        <w:t>ệ</w:t>
+      </w:r>
+      <w:r>
+        <w:rPr>
+          <w:rFonts w:ascii="Consolas" w:eastAsia="Consolas" w:hAnsi="Consolas" w:cs="Consolas"/>
+          <w:sz w:val="18"/>
+          <w:szCs w:val="18"/>
+        </w:rPr>
+        <w:t>t            Node.js + Express           SQL Server site này</w:t>
+      </w:r>
+    </w:p>
+    <w:p>
+      <w:pPr>
+        <w:shd w:val="clear" w:color="auto" w:fill="F4F4F4"/>
+        <w:ind w:left="288"/>
+      </w:pPr>
+      <w:r>
+        <w:rPr>
+          <w:rFonts w:ascii="Consolas" w:eastAsia="Consolas" w:hAnsi="Consolas" w:cs="Consolas"/>
+          <w:sz w:val="18"/>
+          <w:szCs w:val="18"/>
+        </w:rPr>
+        <w:t xml:space="preserve">  (T</w:t>
+      </w:r>
+      <w:r>
+        <w:rPr>
+          <w:rFonts w:ascii="Consolas" w:eastAsia="Consolas" w:hAnsi="Consolas" w:cs="Consolas"/>
+          <w:sz w:val="18"/>
+          <w:szCs w:val="18"/>
+        </w:rPr>
+        <w:t>Ầ</w:t>
+      </w:r>
+      <w:r>
+        <w:rPr>
+          <w:rFonts w:ascii="Consolas" w:eastAsia="Consolas" w:hAnsi="Consolas" w:cs="Consolas"/>
+          <w:sz w:val="18"/>
+          <w:szCs w:val="18"/>
+        </w:rPr>
+        <w:t>NG TRÌNH BÀY) --HTTP--&gt; (T</w:t>
+      </w:r>
+      <w:r>
+        <w:rPr>
+          <w:rFonts w:ascii="Consolas" w:eastAsia="Consolas" w:hAnsi="Consolas" w:cs="Consolas"/>
+          <w:sz w:val="18"/>
+          <w:szCs w:val="18"/>
+        </w:rPr>
+        <w:t>Ầ</w:t>
+      </w:r>
+      <w:r>
+        <w:rPr>
+          <w:rFonts w:ascii="Consolas" w:eastAsia="Consolas" w:hAnsi="Consolas" w:cs="Consolas"/>
+          <w:sz w:val="18"/>
+          <w:szCs w:val="18"/>
+        </w:rPr>
+        <w:t>NG NGHI</w:t>
+      </w:r>
+      <w:r>
+        <w:rPr>
+          <w:rFonts w:ascii="Consolas" w:eastAsia="Consolas" w:hAnsi="Consolas" w:cs="Consolas"/>
+          <w:sz w:val="18"/>
+          <w:szCs w:val="18"/>
+        </w:rPr>
+        <w:t>Ệ</w:t>
+      </w:r>
+      <w:r>
+        <w:rPr>
+          <w:rFonts w:ascii="Consolas" w:eastAsia="Consolas" w:hAnsi="Consolas" w:cs="Consolas"/>
+          <w:sz w:val="18"/>
+          <w:szCs w:val="18"/>
+        </w:rPr>
+        <w:t>P V</w:t>
+      </w:r>
+      <w:r>
+        <w:rPr>
+          <w:rFonts w:ascii="Consolas" w:eastAsia="Consolas" w:hAnsi="Consolas" w:cs="Consolas"/>
+          <w:sz w:val="18"/>
+          <w:szCs w:val="18"/>
+        </w:rPr>
+        <w:t>Ụ</w:t>
+      </w:r>
+      <w:r>
+        <w:rPr>
+          <w:rFonts w:ascii="Consolas" w:eastAsia="Consolas" w:hAnsi="Consolas" w:cs="Consolas"/>
+          <w:sz w:val="18"/>
+          <w:szCs w:val="18"/>
+        </w:rPr>
+        <w:t>) --TDS--&gt; (T</w:t>
+      </w:r>
+      <w:r>
+        <w:rPr>
+          <w:rFonts w:ascii="Consolas" w:eastAsia="Consolas" w:hAnsi="Consolas" w:cs="Consolas"/>
+          <w:sz w:val="18"/>
+          <w:szCs w:val="18"/>
+        </w:rPr>
+        <w:t>Ầ</w:t>
+      </w:r>
+      <w:r>
+        <w:rPr>
+          <w:rFonts w:ascii="Consolas" w:eastAsia="Consolas" w:hAnsi="Consolas" w:cs="Consolas"/>
+          <w:sz w:val="18"/>
+          <w:szCs w:val="18"/>
+        </w:rPr>
+        <w:t>NG D</w:t>
+      </w:r>
+      <w:r>
+        <w:rPr>
+          <w:rFonts w:ascii="Consolas" w:eastAsia="Consolas" w:hAnsi="Consolas" w:cs="Consolas"/>
+          <w:sz w:val="18"/>
+          <w:szCs w:val="18"/>
+        </w:rPr>
+        <w:t>Ữ</w:t>
+      </w:r>
+      <w:r>
+        <w:rPr>
+          <w:rFonts w:ascii="Consolas" w:eastAsia="Consolas" w:hAnsi="Consolas" w:cs="Consolas"/>
+          <w:sz w:val="18"/>
+          <w:szCs w:val="18"/>
+        </w:rPr>
+        <w:t xml:space="preserve"> LI</w:t>
+      </w:r>
+      <w:r>
+        <w:rPr>
+          <w:rFonts w:ascii="Consolas" w:eastAsia="Consolas" w:hAnsi="Consolas" w:cs="Consolas"/>
+          <w:sz w:val="18"/>
+          <w:szCs w:val="18"/>
+        </w:rPr>
+        <w:t>Ệ</w:t>
+      </w:r>
+      <w:r>
+        <w:rPr>
+          <w:rFonts w:ascii="Consolas" w:eastAsia="Consolas" w:hAnsi="Consolas" w:cs="Consolas"/>
+          <w:sz w:val="18"/>
+          <w:szCs w:val="18"/>
+        </w:rPr>
+        <w:t>U)</w:t>
+      </w:r>
+    </w:p>
+    <w:p>
+      <w:pPr>
+        <w:shd w:val="clear" w:color="auto" w:fill="F4F4F4"/>
+        <w:ind w:left="288"/>
+      </w:pPr>
+      <w:r>
+        <w:rPr>
+          <w:rFonts w:ascii="Consolas" w:eastAsia="Consolas" w:hAnsi="Consolas" w:cs="Consolas"/>
+          <w:sz w:val="18"/>
+          <w:szCs w:val="18"/>
+        </w:rPr>
+        <w:t xml:space="preserve">                                                              |</w:t>
+      </w:r>
+    </w:p>
+    <w:p>
+      <w:pPr>
+        <w:shd w:val="clear" w:color="auto" w:fill="F4F4F4"/>
+        <w:spacing w:after="120"/>
+        <w:ind w:left="288"/>
+      </w:pPr>
+      <w:r>
+        <w:rPr>
+          <w:rFonts w:ascii="Consolas" w:eastAsia="Consolas" w:hAnsi="Consolas" w:cs="Consolas"/>
+          <w:sz w:val="18"/>
+          <w:szCs w:val="18"/>
+        </w:rPr>
+        <w:t xml:space="preserve">                                          Linked Server ------+---&gt; hai site kia</w:t>
+      </w:r>
+    </w:p>
+    <w:p>
+      <w:pPr>
+        <w:spacing w:after="120" w:line="360" w:lineRule="auto"/>
+        <w:jc w:val="both"/>
+      </w:pPr>
+      <w:r>
+        <w:t>Một nguyên tắc quan trọng trong cách cài đặt: mọi thao tác ghi của phần mềm đều gọi các thủ tục đã có sẵn trong cơ sở dữ liệu, không viết câu lệnh thêm hay sửa trực tiếp lên bảng. Đây không phải sở thích lập trình mà là điều kiện bắt buộc — thủ tục mới là nơi đặt giao tác, khoá và kiểm tra tồn kho. Nếu ứng dụng ghi thẳng vào bảng thì toàn bộ ba lớp bảo vệ ở mục trước bị đi vòng, và bản thân vai trò NhanVienKho cũng không có quyền ghi thẳng.</w:t>
+      </w:r>
+    </w:p>
+    <w:tbl>
+      <w:tblPr>
+        <w:tblW w:w="9071" w:type="dxa"/>
+        <w:tblBorders>
+          <w:top w:val="single" w:sz="4" w:space="0" w:color="auto"/>
+          <w:left w:val="single" w:sz="4" w:space="0" w:color="auto"/>
+          <w:bottom w:val="single" w:sz="4" w:space="0" w:color="auto"/>
+          <w:right w:val="single" w:sz="4" w:space="0" w:color="auto"/>
+          <w:insideH w:val="single" w:sz="4" w:space="0" w:color="auto"/>
+          <w:insideV w:val="single" w:sz="4" w:space="0" w:color="auto"/>
+        </w:tblBorders>
+        <w:tblCellMar>
+          <w:left w:w="10" w:type="dxa"/>
+          <w:right w:w="10" w:type="dxa"/>
+        </w:tblCellMar>
+        <w:tblLook w:val="04A0" w:firstRow="1" w:lastRow="0" w:firstColumn="1" w:lastColumn="0" w:noHBand="0" w:noVBand="1"/>
+      </w:tblPr>
+      <w:tblGrid>
+        <w:gridCol w:w="1814"/>
+        <w:gridCol w:w="4173"/>
+        <w:gridCol w:w="3084"/>
+      </w:tblGrid>
+      <w:tr>
+        <w:tblPrEx>
+          <w:tblCellMar>
+            <w:top w:w="0" w:type="dxa"/>
+            <w:bottom w:w="0" w:type="dxa"/>
+          </w:tblCellMar>
+        </w:tblPrEx>
+        <w:trPr>
+          <w:tblHeader/>
+        </w:trPr>
+        <w:tc>
+          <w:tcPr>
+            <w:tcW w:w="1814" w:type="dxa"/>
+            <w:shd w:val="clear" w:color="auto" w:fill="D9E2F3"/>
+            <w:tcMar>
+              <w:top w:w="60" w:type="dxa"/>
+              <w:left w:w="80" w:type="dxa"/>
+              <w:bottom w:w="60" w:type="dxa"/>
+              <w:right w:w="80" w:type="dxa"/>
+            </w:tcMar>
+          </w:tcPr>
+          <w:p>
+            <w:pPr>
+              <w:spacing w:line="260" w:lineRule="auto"/>
+              <w:jc w:val="center"/>
+            </w:pPr>
+            <w:r>
+              <w:rPr>
+                <w:b/>
+                <w:bCs/>
+                <w:sz w:val="22"/>
+                <w:szCs w:val="22"/>
+              </w:rPr>
+              <w:t>Màn hình</w:t>
+            </w:r>
+          </w:p>
+        </w:tc>
+        <w:tc>
+          <w:tcPr>
+            <w:tcW w:w="4173" w:type="dxa"/>
+            <w:shd w:val="clear" w:color="auto" w:fill="D9E2F3"/>
+            <w:tcMar>
+              <w:top w:w="60" w:type="dxa"/>
+              <w:left w:w="80" w:type="dxa"/>
+              <w:bottom w:w="60" w:type="dxa"/>
+              <w:right w:w="80" w:type="dxa"/>
+            </w:tcMar>
+          </w:tcPr>
+          <w:p>
+            <w:pPr>
+              <w:spacing w:line="260" w:lineRule="auto"/>
+              <w:jc w:val="center"/>
+            </w:pPr>
+            <w:r>
+              <w:rPr>
+                <w:b/>
+                <w:bCs/>
+                <w:sz w:val="22"/>
+                <w:szCs w:val="22"/>
+              </w:rPr>
+              <w:t>Nghiệp vụ đề bài yêu cầu</w:t>
+            </w:r>
+          </w:p>
+        </w:tc>
+        <w:tc>
+          <w:tcPr>
+            <w:tcW w:w="3084" w:type="dxa"/>
+            <w:shd w:val="clear" w:color="auto" w:fill="D9E2F3"/>
+            <w:tcMar>
+              <w:top w:w="60" w:type="dxa"/>
+              <w:left w:w="80" w:type="dxa"/>
+              <w:bottom w:w="60" w:type="dxa"/>
+              <w:right w:w="80" w:type="dxa"/>
+            </w:tcMar>
+          </w:tcPr>
+          <w:p>
+            <w:pPr>
+              <w:spacing w:line="260" w:lineRule="auto"/>
+              <w:jc w:val="center"/>
+            </w:pPr>
+            <w:r>
+              <w:rPr>
+                <w:b/>
+                <w:bCs/>
+                <w:sz w:val="22"/>
+                <w:szCs w:val="22"/>
+              </w:rPr>
+              <w:t>Thủ tục được gọi</w:t>
+            </w:r>
+          </w:p>
+        </w:tc>
+      </w:tr>
+      <w:tr>
+        <w:tblPrEx>
+          <w:tblCellMar>
+            <w:top w:w="0" w:type="dxa"/>
+            <w:bottom w:w="0" w:type="dxa"/>
+          </w:tblCellMar>
+        </w:tblPrEx>
+        <w:tc>
+          <w:tcPr>
+            <w:tcW w:w="1814" w:type="dxa"/>
+            <w:tcMar>
+              <w:top w:w="60" w:type="dxa"/>
+              <w:left w:w="80" w:type="dxa"/>
+              <w:bottom w:w="60" w:type="dxa"/>
+              <w:right w:w="80" w:type="dxa"/>
+            </w:tcMar>
+          </w:tcPr>
+          <w:p>
+            <w:pPr>
+              <w:spacing w:line="260" w:lineRule="auto"/>
+            </w:pPr>
+            <w:r>
+              <w:rPr>
+                <w:sz w:val="22"/>
+                <w:szCs w:val="22"/>
+              </w:rPr>
+              <w:t>Tổng quan</w:t>
+            </w:r>
+          </w:p>
+        </w:tc>
+        <w:tc>
+          <w:tcPr>
+            <w:tcW w:w="4173" w:type="dxa"/>
+            <w:tcMar>
+              <w:top w:w="60" w:type="dxa"/>
+              <w:left w:w="80" w:type="dxa"/>
+              <w:bottom w:w="60" w:type="dxa"/>
+              <w:right w:w="80" w:type="dxa"/>
+            </w:tcMar>
+          </w:tcPr>
+          <w:p>
+            <w:pPr>
+              <w:spacing w:line="260" w:lineRule="auto"/>
+            </w:pPr>
+            <w:r>
+              <w:rPr>
+                <w:sz w:val="22"/>
+                <w:szCs w:val="22"/>
+              </w:rPr>
+              <w:t>Xem mảnh dữ liệu của kho này, cảnh báo thiếu hàng</w:t>
+            </w:r>
+          </w:p>
+        </w:tc>
+        <w:tc>
+          <w:tcPr>
+            <w:tcW w:w="3084" w:type="dxa"/>
+            <w:tcMar>
+              <w:top w:w="60" w:type="dxa"/>
+              <w:left w:w="80" w:type="dxa"/>
+              <w:bottom w:w="60" w:type="dxa"/>
+              <w:right w:w="80" w:type="dxa"/>
+            </w:tcMar>
+          </w:tcPr>
+          <w:p>
+            <w:pPr>
+              <w:spacing w:line="260" w:lineRule="auto"/>
+            </w:pPr>
+            <w:r>
+              <w:rPr>
+                <w:sz w:val="22"/>
+                <w:szCs w:val="22"/>
+              </w:rPr>
+              <w:t>sp_CanhBaoTonToiThieu</w:t>
+            </w:r>
+          </w:p>
+        </w:tc>
+      </w:tr>
+      <w:tr>
+        <w:tblPrEx>
+          <w:tblCellMar>
+            <w:top w:w="0" w:type="dxa"/>
+            <w:bottom w:w="0" w:type="dxa"/>
+          </w:tblCellMar>
+        </w:tblPrEx>
+        <w:tc>
+          <w:tcPr>
+            <w:tcW w:w="1814" w:type="dxa"/>
+            <w:tcMar>
+              <w:top w:w="60" w:type="dxa"/>
+              <w:left w:w="80" w:type="dxa"/>
+              <w:bottom w:w="60" w:type="dxa"/>
+              <w:right w:w="80" w:type="dxa"/>
+            </w:tcMar>
+          </w:tcPr>
+          <w:p>
+            <w:pPr>
+              <w:spacing w:line="260" w:lineRule="auto"/>
+            </w:pPr>
+            <w:r>
+              <w:rPr>
+                <w:sz w:val="22"/>
+                <w:szCs w:val="22"/>
+              </w:rPr>
+              <w:t>Tồn kho toàn hệ thống</w:t>
+            </w:r>
+          </w:p>
+        </w:tc>
+        <w:tc>
+          <w:tcPr>
+            <w:tcW w:w="4173" w:type="dxa"/>
+            <w:tcMar>
+              <w:top w:w="60" w:type="dxa"/>
+              <w:left w:w="80" w:type="dxa"/>
+              <w:bottom w:w="60" w:type="dxa"/>
+              <w:right w:w="80" w:type="dxa"/>
+            </w:tcMar>
+          </w:tcPr>
+          <w:p>
+            <w:pPr>
+              <w:spacing w:line="260" w:lineRule="auto"/>
+            </w:pPr>
+            <w:r>
+              <w:rPr>
+                <w:sz w:val="22"/>
+                <w:szCs w:val="22"/>
+              </w:rPr>
+              <w:t>Kiểm tra tồn kho toàn hệ thống</w:t>
+            </w:r>
+          </w:p>
+        </w:tc>
+        <w:tc>
+          <w:tcPr>
+            <w:tcW w:w="3084" w:type="dxa"/>
+            <w:tcMar>
+              <w:top w:w="60" w:type="dxa"/>
+              <w:left w:w="80" w:type="dxa"/>
+              <w:bottom w:w="60" w:type="dxa"/>
+              <w:right w:w="80" w:type="dxa"/>
+            </w:tcMar>
+          </w:tcPr>
+          <w:p>
+            <w:pPr>
+              <w:spacing w:line="260" w:lineRule="auto"/>
+            </w:pPr>
+            <w:r>
+              <w:rPr>
+                <w:sz w:val="22"/>
+                <w:szCs w:val="22"/>
+              </w:rPr>
+              <w:t>sp_TonKhoToanHeThong_Site</w:t>
+            </w:r>
+          </w:p>
+        </w:tc>
+      </w:tr>
+      <w:tr>
+        <w:tblPrEx>
+          <w:tblCellMar>
+            <w:top w:w="0" w:type="dxa"/>
+            <w:bottom w:w="0" w:type="dxa"/>
+          </w:tblCellMar>
+        </w:tblPrEx>
+        <w:tc>
+          <w:tcPr>
+            <w:tcW w:w="1814" w:type="dxa"/>
+            <w:tcMar>
+              <w:top w:w="60" w:type="dxa"/>
+              <w:left w:w="80" w:type="dxa"/>
+              <w:bottom w:w="60" w:type="dxa"/>
+              <w:right w:w="80" w:type="dxa"/>
+            </w:tcMar>
+          </w:tcPr>
+          <w:p>
+            <w:pPr>
+              <w:spacing w:line="260" w:lineRule="auto"/>
+            </w:pPr>
+            <w:r>
+              <w:rPr>
+                <w:sz w:val="22"/>
+                <w:szCs w:val="22"/>
+              </w:rPr>
+              <w:t>Nhập kho</w:t>
+            </w:r>
+          </w:p>
+        </w:tc>
+        <w:tc>
+          <w:tcPr>
+            <w:tcW w:w="4173" w:type="dxa"/>
+            <w:tcMar>
+              <w:top w:w="60" w:type="dxa"/>
+              <w:left w:w="80" w:type="dxa"/>
+              <w:bottom w:w="60" w:type="dxa"/>
+              <w:right w:w="80" w:type="dxa"/>
+            </w:tcMar>
+          </w:tcPr>
+          <w:p>
+            <w:pPr>
+              <w:spacing w:line="260" w:lineRule="auto"/>
+            </w:pPr>
+            <w:r>
+              <w:rPr>
+                <w:sz w:val="22"/>
+                <w:szCs w:val="22"/>
+              </w:rPr>
+              <w:t>Nhập vật tư tại Kho A</w:t>
+            </w:r>
+          </w:p>
+        </w:tc>
+        <w:tc>
+          <w:tcPr>
+            <w:tcW w:w="3084" w:type="dxa"/>
+            <w:tcMar>
+              <w:top w:w="60" w:type="dxa"/>
+              <w:left w:w="80" w:type="dxa"/>
+              <w:bottom w:w="60" w:type="dxa"/>
+              <w:right w:w="80" w:type="dxa"/>
+            </w:tcMar>
+          </w:tcPr>
+          <w:p>
+            <w:pPr>
+              <w:spacing w:line="260" w:lineRule="auto"/>
+            </w:pPr>
+            <w:r>
+              <w:rPr>
+                <w:sz w:val="22"/>
+                <w:szCs w:val="22"/>
+              </w:rPr>
+              <w:t>sp_NhapKho</w:t>
+            </w:r>
+          </w:p>
+        </w:tc>
+      </w:tr>
+      <w:tr>
+        <w:tblPrEx>
+          <w:tblCellMar>
+            <w:top w:w="0" w:type="dxa"/>
+            <w:bottom w:w="0" w:type="dxa"/>
+          </w:tblCellMar>
+        </w:tblPrEx>
+        <w:tc>
+          <w:tcPr>
+            <w:tcW w:w="1814" w:type="dxa"/>
+            <w:tcMar>
+              <w:top w:w="60" w:type="dxa"/>
+              <w:left w:w="80" w:type="dxa"/>
+              <w:bottom w:w="60" w:type="dxa"/>
+              <w:right w:w="80" w:type="dxa"/>
+            </w:tcMar>
+          </w:tcPr>
+          <w:p>
+            <w:pPr>
+              <w:spacing w:line="260" w:lineRule="auto"/>
+            </w:pPr>
+            <w:r>
+              <w:rPr>
+                <w:sz w:val="22"/>
+                <w:szCs w:val="22"/>
+              </w:rPr>
+              <w:t>Xuất kho</w:t>
+            </w:r>
+          </w:p>
+        </w:tc>
+        <w:tc>
+          <w:tcPr>
+            <w:tcW w:w="4173" w:type="dxa"/>
+            <w:tcMar>
+              <w:top w:w="60" w:type="dxa"/>
+              <w:left w:w="80" w:type="dxa"/>
+              <w:bottom w:w="60" w:type="dxa"/>
+              <w:right w:w="80" w:type="dxa"/>
+            </w:tcMar>
+          </w:tcPr>
+          <w:p>
+            <w:pPr>
+              <w:spacing w:line="260" w:lineRule="auto"/>
+            </w:pPr>
+            <w:r>
+              <w:rPr>
+                <w:sz w:val="22"/>
+                <w:szCs w:val="22"/>
+              </w:rPr>
+              <w:t>Xuất vật tư tại Kho B</w:t>
+            </w:r>
+          </w:p>
+        </w:tc>
+        <w:tc>
+          <w:tcPr>
+            <w:tcW w:w="3084" w:type="dxa"/>
+            <w:tcMar>
+              <w:top w:w="60" w:type="dxa"/>
+              <w:left w:w="80" w:type="dxa"/>
+              <w:bottom w:w="60" w:type="dxa"/>
+              <w:right w:w="80" w:type="dxa"/>
+            </w:tcMar>
+          </w:tcPr>
+          <w:p>
+            <w:pPr>
+              <w:spacing w:line="260" w:lineRule="auto"/>
+            </w:pPr>
+            <w:r>
+              <w:rPr>
+                <w:sz w:val="22"/>
+                <w:szCs w:val="22"/>
+              </w:rPr>
+              <w:t>sp_XuatKho</w:t>
+            </w:r>
+          </w:p>
+        </w:tc>
+      </w:tr>
+      <w:tr>
+        <w:tblPrEx>
+          <w:tblCellMar>
+            <w:top w:w="0" w:type="dxa"/>
+            <w:bottom w:w="0" w:type="dxa"/>
+          </w:tblCellMar>
+        </w:tblPrEx>
+        <w:tc>
+          <w:tcPr>
+            <w:tcW w:w="1814" w:type="dxa"/>
+            <w:tcMar>
+              <w:top w:w="60" w:type="dxa"/>
+              <w:left w:w="80" w:type="dxa"/>
+              <w:bottom w:w="60" w:type="dxa"/>
+              <w:right w:w="80" w:type="dxa"/>
+            </w:tcMar>
+          </w:tcPr>
+          <w:p>
+            <w:pPr>
+              <w:spacing w:line="260" w:lineRule="auto"/>
+            </w:pPr>
+            <w:r>
+              <w:rPr>
+                <w:sz w:val="22"/>
+                <w:szCs w:val="22"/>
+              </w:rPr>
+              <w:t>Điều chuyển</w:t>
+            </w:r>
+          </w:p>
+        </w:tc>
+        <w:tc>
+          <w:tcPr>
+            <w:tcW w:w="4173" w:type="dxa"/>
+            <w:tcMar>
+              <w:top w:w="60" w:type="dxa"/>
+              <w:left w:w="80" w:type="dxa"/>
+              <w:bottom w:w="60" w:type="dxa"/>
+              <w:right w:w="80" w:type="dxa"/>
+            </w:tcMar>
+          </w:tcPr>
+          <w:p>
+            <w:pPr>
+              <w:spacing w:line="260" w:lineRule="auto"/>
+            </w:pPr>
+            <w:r>
+              <w:rPr>
+                <w:sz w:val="22"/>
+                <w:szCs w:val="22"/>
+              </w:rPr>
+              <w:t>Điều chuyển vật tư giữa hai kho</w:t>
+            </w:r>
+          </w:p>
+        </w:tc>
+        <w:tc>
+          <w:tcPr>
+            <w:tcW w:w="3084" w:type="dxa"/>
+            <w:tcMar>
+              <w:top w:w="60" w:type="dxa"/>
+              <w:left w:w="80" w:type="dxa"/>
+              <w:bottom w:w="60" w:type="dxa"/>
+              <w:right w:w="80" w:type="dxa"/>
+            </w:tcMar>
+          </w:tcPr>
+          <w:p>
+            <w:pPr>
+              <w:spacing w:line="260" w:lineRule="auto"/>
+            </w:pPr>
+            <w:r>
+              <w:rPr>
+                <w:sz w:val="22"/>
+                <w:szCs w:val="22"/>
+              </w:rPr>
+              <w:t>sp_DieuChuyenVatTu</w:t>
+            </w:r>
+          </w:p>
+        </w:tc>
+      </w:tr>
+      <w:tr>
+        <w:tblPrEx>
+          <w:tblCellMar>
+            <w:top w:w="0" w:type="dxa"/>
+            <w:bottom w:w="0" w:type="dxa"/>
+          </w:tblCellMar>
+        </w:tblPrEx>
+        <w:tc>
+          <w:tcPr>
+            <w:tcW w:w="1814" w:type="dxa"/>
+            <w:tcMar>
+              <w:top w:w="60" w:type="dxa"/>
+              <w:left w:w="80" w:type="dxa"/>
+              <w:bottom w:w="60" w:type="dxa"/>
+              <w:right w:w="80" w:type="dxa"/>
+            </w:tcMar>
+          </w:tcPr>
+          <w:p>
+            <w:pPr>
+              <w:spacing w:line="260" w:lineRule="auto"/>
+            </w:pPr>
+            <w:r>
+              <w:rPr>
+                <w:sz w:val="22"/>
+                <w:szCs w:val="22"/>
+              </w:rPr>
+              <w:t>Danh mục</w:t>
+            </w:r>
+          </w:p>
+        </w:tc>
+        <w:tc>
+          <w:tcPr>
+            <w:tcW w:w="4173" w:type="dxa"/>
+            <w:tcMar>
+              <w:top w:w="60" w:type="dxa"/>
+              <w:left w:w="80" w:type="dxa"/>
+              <w:bottom w:w="60" w:type="dxa"/>
+              <w:right w:w="80" w:type="dxa"/>
+            </w:tcMar>
+          </w:tcPr>
+          <w:p>
+            <w:pPr>
+              <w:spacing w:line="260" w:lineRule="auto"/>
+            </w:pPr>
+            <w:r>
+              <w:rPr>
+                <w:sz w:val="22"/>
+                <w:szCs w:val="22"/>
+              </w:rPr>
+              <w:t>Đồng bộ danh mục vật tư</w:t>
+            </w:r>
+          </w:p>
+        </w:tc>
+        <w:tc>
+          <w:tcPr>
+            <w:tcW w:w="3084" w:type="dxa"/>
+            <w:tcMar>
+              <w:top w:w="60" w:type="dxa"/>
+              <w:left w:w="80" w:type="dxa"/>
+              <w:bottom w:w="60" w:type="dxa"/>
+              <w:right w:w="80" w:type="dxa"/>
+            </w:tcMar>
+          </w:tcPr>
+          <w:p>
+            <w:pPr>
+              <w:spacing w:line="260" w:lineRule="auto"/>
+            </w:pPr>
+            <w:r>
+              <w:rPr>
+                <w:sz w:val="22"/>
+                <w:szCs w:val="22"/>
+              </w:rPr>
+              <w:t>đọc bảng nhân bản tại chỗ</w:t>
+            </w:r>
+          </w:p>
+        </w:tc>
+      </w:tr>
+      <w:tr>
+        <w:tblPrEx>
+          <w:tblCellMar>
+            <w:top w:w="0" w:type="dxa"/>
+            <w:bottom w:w="0" w:type="dxa"/>
+          </w:tblCellMar>
+        </w:tblPrEx>
+        <w:tc>
+          <w:tcPr>
+            <w:tcW w:w="1814" w:type="dxa"/>
+            <w:tcMar>
+              <w:top w:w="60" w:type="dxa"/>
+              <w:left w:w="80" w:type="dxa"/>
+              <w:bottom w:w="60" w:type="dxa"/>
+              <w:right w:w="80" w:type="dxa"/>
+            </w:tcMar>
+          </w:tcPr>
+          <w:p>
+            <w:pPr>
+              <w:spacing w:line="260" w:lineRule="auto"/>
+            </w:pPr>
+            <w:r>
+              <w:rPr>
+                <w:sz w:val="22"/>
+                <w:szCs w:val="22"/>
+              </w:rPr>
+              <w:t>Lịch sử</w:t>
+            </w:r>
+          </w:p>
+        </w:tc>
+        <w:tc>
+          <w:tcPr>
+            <w:tcW w:w="4173" w:type="dxa"/>
+            <w:tcMar>
+              <w:top w:w="60" w:type="dxa"/>
+              <w:left w:w="80" w:type="dxa"/>
+              <w:bottom w:w="60" w:type="dxa"/>
+              <w:right w:w="80" w:type="dxa"/>
+            </w:tcMar>
+          </w:tcPr>
+          <w:p>
+            <w:pPr>
+              <w:spacing w:line="260" w:lineRule="auto"/>
+            </w:pPr>
+            <w:r>
+              <w:rPr>
+                <w:sz w:val="22"/>
+                <w:szCs w:val="22"/>
+              </w:rPr>
+              <w:t>Theo dõi chứng từ của trạm</w:t>
+            </w:r>
+          </w:p>
+        </w:tc>
+        <w:tc>
+          <w:tcPr>
+            <w:tcW w:w="3084" w:type="dxa"/>
+            <w:tcMar>
+              <w:top w:w="60" w:type="dxa"/>
+              <w:left w:w="80" w:type="dxa"/>
+              <w:bottom w:w="60" w:type="dxa"/>
+              <w:right w:w="80" w:type="dxa"/>
+            </w:tcMar>
+          </w:tcPr>
+          <w:p>
+            <w:pPr>
+              <w:spacing w:line="260" w:lineRule="auto"/>
+            </w:pPr>
+            <w:r>
+              <w:rPr>
+                <w:sz w:val="22"/>
+                <w:szCs w:val="22"/>
+              </w:rPr>
+              <w:t>sp_LichSuChungTu</w:t>
+            </w:r>
+          </w:p>
+        </w:tc>
+      </w:tr>
+    </w:tbl>
+    <w:p>
+      <w:pPr>
+        <w:spacing w:before="60" w:after="200"/>
+        <w:jc w:val="center"/>
+      </w:pPr>
+      <w:r>
+        <w:rPr>
+          <w:i/>
+          <w:iCs/>
+          <w:sz w:val="22"/>
+          <w:szCs w:val="22"/>
+        </w:rPr>
+        <w:t>Bảng 28: Bảy màn hình và nghiệp vụ tương ứng</w:t>
+      </w:r>
+    </w:p>
+    <w:p>
+      <w:pPr>
+        <w:spacing w:before="120" w:after="60"/>
+        <w:jc w:val="center"/>
+      </w:pPr>
+      <w:r>
+        <w:rPr>
+          <w:noProof/>
+        </w:rPr>
+        <w:lastRenderedPageBreak/>
+        <w:drawing>
+          <wp:inline distT="0" distB="0" distL="0" distR="0" wp14:anchorId="542DABCD" wp14:editId="7724B44E">
+            <wp:extent cx="5715000" cy="2647950"/>
+            <wp:effectExtent l="0" t="0" r="0" b="0"/>
+            <wp:docPr id="1083356232" name="Picture 1083356232"/>
+            <wp:cNvGraphicFramePr>
+              <a:graphicFrameLocks xmlns:a="http://schemas.openxmlformats.org/drawingml/2006/main" noChangeAspect="1"/>
+            </wp:cNvGraphicFramePr>
+            <a:graphic xmlns:a="http://schemas.openxmlformats.org/drawingml/2006/main">
+              <a:graphicData uri="http://schemas.openxmlformats.org/drawingml/2006/picture">
+                <pic:pic xmlns:pic="http://schemas.openxmlformats.org/drawingml/2006/picture">
+                  <pic:nvPicPr>
+                    <pic:cNvPr id="0" name=""/>
+                    <pic:cNvPicPr>
+                      <a:picLocks noChangeAspect="1" noChangeArrowheads="1"/>
+                    </pic:cNvPicPr>
+                  </pic:nvPicPr>
+                  <pic:blipFill>
+                    <a:blip r:embed="rId60"/>
+                    <a:srcRect/>
+                    <a:stretch>
+                      <a:fillRect/>
+                    </a:stretch>
+                  </pic:blipFill>
+                  <pic:spPr bwMode="auto">
+                    <a:xfrm>
+                      <a:off x="0" y="0"/>
+                      <a:ext cx="5715000" cy="2647950"/>
+                    </a:xfrm>
+                    <a:prstGeom prst="rect">
+                      <a:avLst/>
+                    </a:prstGeom>
+                  </pic:spPr>
+                </pic:pic>
+              </a:graphicData>
+            </a:graphic>
+          </wp:inline>
+        </w:drawing>
+      </w:r>
+    </w:p>
+    <w:p>
+      <w:pPr>
+        <w:spacing w:after="200"/>
+        <w:jc w:val="center"/>
+      </w:pPr>
+      <w:r>
+        <w:rPr>
+          <w:i/>
+          <w:iCs/>
+          <w:sz w:val="22"/>
+          <w:szCs w:val="22"/>
+        </w:rPr>
+        <w:t>Hình 54: Màn hình chính của trạm Kho Trung tâm. Thanh đầu trang cho biết đang nối máy chủ nào, qua giao thức nào</w:t>
+      </w:r>
+    </w:p>
+    <w:p>
+      <w:pPr>
+        <w:spacing w:after="120" w:line="360" w:lineRule="auto"/>
+        <w:jc w:val="both"/>
+      </w:pPr>
+      <w:r>
+        <w:t xml:space="preserve">Thanh đầu trang hiển thị giao thức kết nối đọc từ </w:t>
+      </w:r>
+      <w:r>
+        <w:rPr>
+          <w:rFonts w:ascii="Consolas" w:eastAsia="Consolas" w:hAnsi="Consolas" w:cs="Consolas"/>
+          <w:sz w:val="22"/>
+          <w:szCs w:val="22"/>
+        </w:rPr>
+        <w:t>sys.dm_exec_connections</w:t>
+      </w:r>
+      <w:r>
+        <w:t xml:space="preserve">. Giá trị </w:t>
+      </w:r>
+      <w:r>
+        <w:rPr>
+          <w:rFonts w:ascii="Consolas" w:eastAsia="Consolas" w:hAnsi="Consolas" w:cs="Consolas"/>
+          <w:sz w:val="22"/>
+          <w:szCs w:val="22"/>
+        </w:rPr>
+        <w:t>TCP : 1440</w:t>
+      </w:r>
+      <w:r>
+        <w:t xml:space="preserve"> cho thấy phần mềm nối tới cơ sở dữ liệu qua mạng chứ không qua bộ nhớ chung — cùng một bằng chứng đã dùng ở mục 2, lần này hiện ngay trên giao diện người dùng.</w:t>
+      </w:r>
+    </w:p>
+    <w:p>
+      <w:pPr>
+        <w:spacing w:before="120" w:after="60"/>
+        <w:jc w:val="center"/>
+      </w:pPr>
+      <w:r>
+        <w:rPr>
+          <w:noProof/>
+        </w:rPr>
+        <w:drawing>
+          <wp:inline distT="0" distB="0" distL="0" distR="0" wp14:anchorId="5626168F" wp14:editId="0E3C6077">
+            <wp:extent cx="5715000" cy="4438650"/>
+            <wp:effectExtent l="0" t="0" r="0" b="0"/>
+            <wp:docPr id="899135653" name="Picture 899135653"/>
+            <wp:cNvGraphicFramePr>
+              <a:graphicFrameLocks xmlns:a="http://schemas.openxmlformats.org/drawingml/2006/main" noChangeAspect="1"/>
+            </wp:cNvGraphicFramePr>
+            <a:graphic xmlns:a="http://schemas.openxmlformats.org/drawingml/2006/main">
+              <a:graphicData uri="http://schemas.openxmlformats.org/drawingml/2006/picture">
+                <pic:pic xmlns:pic="http://schemas.openxmlformats.org/drawingml/2006/picture">
+                  <pic:nvPicPr>
+                    <pic:cNvPr id="0" name=""/>
+                    <pic:cNvPicPr>
+                      <a:picLocks noChangeAspect="1" noChangeArrowheads="1"/>
+                    </pic:cNvPicPr>
+                  </pic:nvPicPr>
+                  <pic:blipFill>
+                    <a:blip r:embed="rId61"/>
+                    <a:srcRect/>
+                    <a:stretch>
+                      <a:fillRect/>
+                    </a:stretch>
+                  </pic:blipFill>
+                  <pic:spPr bwMode="auto">
+                    <a:xfrm>
+                      <a:off x="0" y="0"/>
+                      <a:ext cx="5715000" cy="4438650"/>
+                    </a:xfrm>
+                    <a:prstGeom prst="rect">
+                      <a:avLst/>
+                    </a:prstGeom>
+                  </pic:spPr>
+                </pic:pic>
+              </a:graphicData>
+            </a:graphic>
+          </wp:inline>
+        </w:drawing>
+      </w:r>
+    </w:p>
+    <w:p>
+      <w:pPr>
+        <w:spacing w:after="200"/>
+        <w:jc w:val="center"/>
+      </w:pPr>
+      <w:r>
+        <w:rPr>
+          <w:i/>
+          <w:iCs/>
+          <w:sz w:val="22"/>
+          <w:szCs w:val="22"/>
+        </w:rPr>
+        <w:t>Hình 55: Tồn kho gộp từ ba site hiện trong một bảng duy nhất, dòng nền xanh là dữ liệu của chính trạm đang đứng</w:t>
+      </w:r>
+    </w:p>
+    <w:p>
+      <w:pPr>
+        <w:spacing w:after="120" w:line="360" w:lineRule="auto"/>
+        <w:jc w:val="both"/>
+      </w:pPr>
+      <w:r>
+        <w:lastRenderedPageBreak/>
+        <w:t>Người dùng không hề biết dòng nào nằm ở máy nào, cũng không cần biết. Đó chính là trong suốt phân mảnh nhìn từ phía người sử dụng cuối, thứ mà các mục trước mới chỉ chứng minh bằng câu lệnh.</w:t>
+      </w:r>
+    </w:p>
+    <w:p>
+      <w:pPr>
+        <w:spacing w:after="120" w:line="360" w:lineRule="auto"/>
+        <w:jc w:val="both"/>
+      </w:pPr>
+      <w:r>
+        <w:t xml:space="preserve">Thủ tục </w:t>
+      </w:r>
+      <w:r>
+        <w:rPr>
+          <w:rFonts w:ascii="Consolas" w:eastAsia="Consolas" w:hAnsi="Consolas" w:cs="Consolas"/>
+          <w:sz w:val="22"/>
+          <w:szCs w:val="22"/>
+        </w:rPr>
+        <w:t>sp_TonKhoToanHeThong_Site</w:t>
+      </w:r>
+      <w:r>
+        <w:t xml:space="preserve"> được viết riêng cho phần mềm này. Bản ở mục 7.2 đọc danh sách kho bằng tên cơ sở dữ liệu ghi cứng nên chỉ chạy được tại Kho Trung tâm; bản mới đọc bảng Kho cục bộ</w:t>
+      </w:r>
+      <w:r>
+        <w:t xml:space="preserve"> — vốn là bảng nhân bản nên site nào cũng có một bản giống hệt — nhờ đó chạy được ở mọi trạm. Đây là một lợi ích thực tế nữa của việc nhân bản danh mục.</w:t>
+      </w:r>
+    </w:p>
+    <w:p>
+      <w:pPr>
+        <w:spacing w:before="120" w:after="60"/>
+        <w:jc w:val="center"/>
+      </w:pPr>
+      <w:r>
+        <w:rPr>
+          <w:noProof/>
+        </w:rPr>
+        <w:drawing>
+          <wp:inline distT="0" distB="0" distL="0" distR="0" wp14:anchorId="3D4D7A04" wp14:editId="604EBB8D">
+            <wp:extent cx="5715000" cy="3781425"/>
+            <wp:effectExtent l="0" t="0" r="0" b="0"/>
+            <wp:docPr id="1141139422" name="Picture 1141139422"/>
+            <wp:cNvGraphicFramePr>
+              <a:graphicFrameLocks xmlns:a="http://schemas.openxmlformats.org/drawingml/2006/main" noChangeAspect="1"/>
+            </wp:cNvGraphicFramePr>
+            <a:graphic xmlns:a="http://schemas.openxmlformats.org/drawingml/2006/main">
+              <a:graphicData uri="http://schemas.openxmlformats.org/drawingml/2006/picture">
+                <pic:pic xmlns:pic="http://schemas.openxmlformats.org/drawingml/2006/picture">
+                  <pic:nvPicPr>
+                    <pic:cNvPr id="0" name=""/>
+                    <pic:cNvPicPr>
+                      <a:picLocks noChangeAspect="1" noChangeArrowheads="1"/>
+                    </pic:cNvPicPr>
+                  </pic:nvPicPr>
+                  <pic:blipFill>
+                    <a:blip r:embed="rId62"/>
+                    <a:srcRect/>
+                    <a:stretch>
+                      <a:fillRect/>
+                    </a:stretch>
+                  </pic:blipFill>
+                  <pic:spPr bwMode="auto">
+                    <a:xfrm>
+                      <a:off x="0" y="0"/>
+                      <a:ext cx="5715000" cy="3781425"/>
+                    </a:xfrm>
+                    <a:prstGeom prst="rect">
+                      <a:avLst/>
+                    </a:prstGeom>
+                  </pic:spPr>
+                </pic:pic>
+              </a:graphicData>
+            </a:graphic>
+          </wp:inline>
+        </w:drawing>
+      </w:r>
+    </w:p>
+    <w:p>
+      <w:pPr>
+        <w:spacing w:after="200"/>
+        <w:jc w:val="center"/>
+      </w:pPr>
+      <w:r>
+        <w:rPr>
+          <w:i/>
+          <w:iCs/>
+          <w:sz w:val="22"/>
+          <w:szCs w:val="22"/>
+        </w:rPr>
+        <w:t>Hình 56: Màn hình điều chuyển sau khi bấm nút mô phỏng lỗi giữa chừng. Bảng trước và bảng sau giống hệt nhau</w:t>
+      </w:r>
+    </w:p>
+    <w:p>
+      <w:pPr>
+        <w:spacing w:after="120" w:line="360" w:lineRule="auto"/>
+        <w:jc w:val="both"/>
+      </w:pPr>
+      <w:r>
+        <w:t xml:space="preserve">Màn hình điều chuyển có hai nút. Nút xanh chạy giao tác phân tán bình thường. Nút đỏ bật cờ </w:t>
+      </w:r>
+      <w:r>
+        <w:rPr>
+          <w:rFonts w:ascii="Consolas" w:eastAsia="Consolas" w:hAnsi="Consolas" w:cs="Consolas"/>
+          <w:sz w:val="22"/>
+          <w:szCs w:val="22"/>
+        </w:rPr>
+        <w:t>@GayLoiThuNghiem</w:t>
+      </w:r>
+      <w:r>
+        <w:t>, khiến giao tác hỏng ngay sau khi kho nguồn đã bị trừ nhưng trước khi kho đích được cộng.</w:t>
+      </w:r>
+    </w:p>
+    <w:p>
+      <w:pPr>
+        <w:spacing w:after="120" w:line="360" w:lineRule="auto"/>
+        <w:jc w:val="both"/>
+      </w:pPr>
+      <w:r>
+        <w:t xml:space="preserve">Cả hai nút đều tự chụp tồn kho ba site trước và </w:t>
+      </w:r>
+      <w:r>
+        <w:t xml:space="preserve">sau rồi bày hai bảng cạnh nhau. Với nút đỏ, hai bảng giống hệt nhau — </w:t>
+      </w:r>
+      <w:r>
+        <w:rPr>
+          <w:rFonts w:ascii="Consolas" w:eastAsia="Consolas" w:hAnsi="Consolas" w:cs="Consolas"/>
+          <w:sz w:val="22"/>
+          <w:szCs w:val="22"/>
+        </w:rPr>
+        <w:t>570 / 250 / 310</w:t>
+      </w:r>
+      <w:r>
+        <w:t xml:space="preserve"> cả trước lẫn sau. Đây là cách trả lời trực quan nhất cho yêu cầu </w:t>
+      </w:r>
+      <w:r>
+        <w:rPr>
+          <w:i/>
+          <w:iCs/>
+        </w:rPr>
+        <w:t>nếu giao dịch thất bại giữa chừng thì dữ liệu phải được xử lý nhất quán</w:t>
+      </w:r>
+      <w:r>
+        <w:t>: người xem nhìn hai bảng là hiểu, không cần đọc một dòng SQL nào.</w:t>
+      </w:r>
+    </w:p>
+    <w:p>
+      <w:r>
+        <w:br w:type="page"/>
+      </w:r>
+    </w:p>
+    <w:p>
+      <w:pPr>
         <w:pStyle w:val="Heading1"/>
         <w:spacing w:before="240" w:after="240"/>
         <w:jc w:val="center"/>
       </w:pPr>
-      <w:bookmarkStart w:id="49" w:name="_Toc240203091"/>
+      <w:bookmarkStart w:id="50" w:name="_Toc240211017"/>
       <w:r>
         <w:lastRenderedPageBreak/>
         <w:t>CHƯƠNG IV. KẾT LUẬN</w:t>
       </w:r>
-      <w:bookmarkEnd w:id="49"/>
+      <w:bookmarkEnd w:id="50"/>
     </w:p>
     <w:p>
       <w:pPr>
         <w:pStyle w:val="Heading2"/>
         <w:spacing w:before="240" w:after="120"/>
       </w:pPr>
-      <w:bookmarkStart w:id="50" w:name="_Toc240203092"/>
+      <w:bookmarkStart w:id="51" w:name="_Toc240211018"/>
       <w:r>
         <w:t>1. Kết quả đạt được</w:t>
       </w:r>
-      <w:bookmarkEnd w:id="50"/>
+      <w:bookmarkEnd w:id="51"/>
     </w:p>
     <w:p>
       <w:pPr>
@@ -32240,7 +33573,7 @@
           <w:sz w:val="22"/>
           <w:szCs w:val="22"/>
         </w:rPr>
-        <w:t>Bảng 28: Đối chiếu yêu cầu đề tài với kết quả</w:t>
+        <w:t>Bảng 29: Đối chiếu yêu cầu đề tài với kết quả</w:t>
       </w:r>
     </w:p>
     <w:p>
@@ -32248,11 +33581,11 @@
         <w:pStyle w:val="Heading2"/>
         <w:spacing w:before="240" w:after="120"/>
       </w:pPr>
-      <w:bookmarkStart w:id="51" w:name="_Toc240203093"/>
+      <w:bookmarkStart w:id="52" w:name="_Toc240211019"/>
       <w:r>
         <w:t>2. Những vấn đề đã gặp và cách khắc phục</w:t>
       </w:r>
-      <w:bookmarkEnd w:id="51"/>
+      <w:bookmarkEnd w:id="52"/>
     </w:p>
     <w:p>
       <w:pPr>
@@ -32853,7 +34186,7 @@
           <w:sz w:val="22"/>
           <w:szCs w:val="22"/>
         </w:rPr>
-        <w:t>Bảng 29: Các sự cố đã xử lý</w:t>
+        <w:t>Bảng 30: Các sự cố đã xử lý</w:t>
       </w:r>
     </w:p>
     <w:p>
@@ -32861,11 +34194,11 @@
         <w:pStyle w:val="Heading2"/>
         <w:spacing w:before="240" w:after="120"/>
       </w:pPr>
-      <w:bookmarkStart w:id="52" w:name="_Toc240203094"/>
+      <w:bookmarkStart w:id="53" w:name="_Toc240211020"/>
       <w:r>
         <w:t>3. Đánh giá</w:t>
       </w:r>
-      <w:bookmarkEnd w:id="52"/>
+      <w:bookmarkEnd w:id="53"/>
     </w:p>
     <w:p>
       <w:pPr>
@@ -33008,7 +34341,7 @@
         <w:jc w:val="both"/>
       </w:pPr>
       <w:r>
-        <w:t>Chưa xây dựng phần mềm ứng dụng cho các trạm; hiện thao tác qua công cụ quản trị.</w:t>
+        <w:t>Phần mềm trạm mới dừng ở mức đủ dùng cho nghiệp vụ kho: chưa có đăng nhập người dùng, chưa phân quyền ngay trên giao diện mà còn dựa hoàn toàn vào bốn vai trò ở tầng cơ sở dữ liệu.</w:t>
       </w:r>
     </w:p>
     <w:p>
@@ -33016,11 +34349,11 @@
         <w:pStyle w:val="Heading2"/>
         <w:spacing w:before="240" w:after="120"/>
       </w:pPr>
-      <w:bookmarkStart w:id="53" w:name="_Toc240203095"/>
+      <w:bookmarkStart w:id="54" w:name="_Toc240211021"/>
       <w:r>
         <w:t>4. Hướng phát triển</w:t>
       </w:r>
-      <w:bookmarkEnd w:id="53"/>
+      <w:bookmarkEnd w:id="54"/>
     </w:p>
     <w:p>
       <w:pPr>
@@ -33032,7 +34365,11 @@
         <w:t>1. </w:t>
       </w:r>
       <w:r>
-        <w:t>Xây dựng phần mềm ứng dụng cho máy trạm theo đúng mô hình front-end đã thiết kế, dùng cột phiên bản để điều khiển tương tranh lạc quan.</w:t>
+        <w:t xml:space="preserve">Bổ sung đăng nhập cho phần mềm trạm và ánh xạ người dùng sang đúng một trong bốn vai trò, thay vì dùng chung một tài khoản như hiện nay. Khi đó cột phiên bản </w:t>
+      </w:r>
+      <w:r>
+        <w:lastRenderedPageBreak/>
+        <w:t>trong bảng tồn kho sẽ phát huy tác dụng cho điều khiển tương tranh lạc quan, vì một màn hình có thể mở hàng phút trước khi người dùng bấm Lưu.</w:t>
       </w:r>
     </w:p>
     <w:p>
@@ -33055,7 +34392,6 @@
         <w:jc w:val="both"/>
       </w:pPr>
       <w:r>
-        <w:lastRenderedPageBreak/>
         <w:t>3. </w:t>
       </w:r>
       <w:r>
@@ -33099,12 +34435,12 @@
         <w:spacing w:before="240" w:after="240"/>
         <w:jc w:val="center"/>
       </w:pPr>
-      <w:bookmarkStart w:id="54" w:name="_Toc240203096"/>
+      <w:bookmarkStart w:id="55" w:name="_Toc240211022"/>
       <w:r>
         <w:lastRenderedPageBreak/>
         <w:t>TÀI LIỆU THAM KHẢO</w:t>
       </w:r>
-      <w:bookmarkEnd w:id="54"/>
+      <w:bookmarkEnd w:id="55"/>
     </w:p>
     <w:p>
       <w:pPr>
@@ -33187,8 +34523,8 @@
       </w:r>
     </w:p>
     <w:sectPr>
-      <w:headerReference w:type="default" r:id="rId60"/>
-      <w:footerReference w:type="default" r:id="rId61"/>
+      <w:headerReference w:type="default" r:id="rId63"/>
+      <w:footerReference w:type="default" r:id="rId64"/>
       <w:pgSz w:w="11906" w:h="16838"/>
       <w:pgMar w:top="1134" w:right="1134" w:bottom="1134" w:left="1701" w:header="708" w:footer="708" w:gutter="0"/>
       <w:pgNumType w:start="2"/>
@@ -33307,210 +34643,210 @@
 <file path=word/numbering.xml><?xml version="1.0" encoding="utf-8"?>
 <w:numbering xmlns:wpc="http://schemas.microsoft.com/office/word/2010/wordprocessingCanvas" xmlns:cx="http://schemas.microsoft.com/office/drawing/2014/chartex" xmlns:cx1="http://schemas.microsoft.com/office/drawing/2015/9/8/chartex" xmlns:cx2="http://schemas.microsoft.com/office/drawing/2015/10/21/chartex" xmlns:cx3="http://schemas.microsoft.com/office/drawing/2016/5/9/chartex" xmlns:cx4="http://schemas.microsoft.com/office/drawing/2016/5/10/chartex" xmlns:cx5="http://schemas.microsoft.com/office/drawing/2016/5/11/chartex" xmlns:cx6="http://schemas.microsoft.com/office/drawing/2016/5/12/chartex" xmlns:cx7="http://schemas.microsoft.com/office/drawing/2016/5/13/chartex" xmlns:cx8="http://schemas.microsoft.com/office/drawing/2016/5/14/chartex" xmlns:mc="http://schemas.openxmlformats.org/markup-compatibility/2006" xmlns:aink="http://schemas.microsoft.com/office/drawing/2016/ink" xmlns:am3d="http://schemas.microsoft.com/office/drawing/2017/model3d" xmlns:o="urn:schemas-microsoft-com:office:office" xmlns:oel="http://schemas.microsoft.com/office/2019/extlst" xmlns:r="http://schemas.openxmlformats.org/officeDocument/2006/relationships" xmlns:m="http://schemas.openxmlformats.org/officeDocument/2006/math" xmlns:v="urn:schemas-microsoft-com:vml" xmlns:wp14="http://schemas.microsoft.com/office/word/2010/wordprocessingDrawing" xmlns:wp="http://schemas.openxmlformats.org/drawingml/2006/wordprocessingDrawing" xmlns:w10="urn:schemas-microsoft-com:office:word" xmlns:w="http://schemas.openxmlformats.org/wordprocessingml/2006/main" xmlns:w14="http://schemas.microsoft.com/office/word/2010/wordml" xmlns:w15="http://schemas.microsoft.com/office/word/2012/wordml" xmlns:w16cex="http://schemas.microsoft.com/office/word/2018/wordml/cex" xmlns:w16cid="http://schemas.microsoft.com/office/word/2016/wordml/cid" xmlns:w16="http://schemas.microsoft.com/office/word/2018/wordml" xmlns:w16du="http://schemas.microsoft.com/office/word/2023/wordml/word16du" xmlns:w16sdtdh="http://schemas.microsoft.com/office/word/2020/wordml/sdtdatahash" xmlns:w16sdtfl="http://schemas.microsoft.com/office/word/2024/wordml/sdtformatlock" xmlns:w16se="http://schemas.microsoft.com/office/word/2015/wordml/symex" xmlns:wpg="http://schemas.microsoft.com/office/word/2010/wordprocessingGroup" xmlns:wpi="http://schemas.microsoft.com/office/word/2010/wordprocessingInk" xmlns:wne="http://schemas.microsoft.com/office/word/2006/wordml" xmlns:wps="http://schemas.microsoft.com/office/word/2010/wordprocessingShape" mc:Ignorable="w14 w15 w16se w16cid w16 w16cex w16sdtdh w16sdtfl w16du wp14">
   <w:abstractNum w:abstractNumId="0" w15:restartNumberingAfterBreak="0">
-    <w:nsid w:val="18EE17E4"/>
+    <w:nsid w:val="0C8745D3"/>
     <w:multiLevelType w:val="hybridMultilevel"/>
-    <w:tmpl w:val="7FFE9E6A"/>
-    <w:lvl w:ilvl="0" w:tplc="E9503C4C">
+    <w:tmpl w:val="1D02473C"/>
+    <w:lvl w:ilvl="0" w:tplc="280CCB30">
       <w:start w:val="1"/>
-      <w:numFmt w:val="decimal"/>
-      <w:lvlText w:val="%1."/>
+      <w:numFmt w:val="bullet"/>
+      <w:lvlText w:val="●"/>
       <w:lvlJc w:val="left"/>
       <w:pPr>
-        <w:ind w:left="648" w:hanging="360"/>
+        <w:ind w:left="720" w:hanging="360"/>
       </w:pPr>
     </w:lvl>
-    <w:lvl w:ilvl="1" w:tplc="9CA855BE">
+    <w:lvl w:ilvl="1" w:tplc="7A1C1924">
+      <w:start w:val="1"/>
+      <w:numFmt w:val="bullet"/>
+      <w:lvlText w:val="○"/>
+      <w:lvlJc w:val="left"/>
+      <w:pPr>
+        <w:ind w:left="1440" w:hanging="360"/>
+      </w:pPr>
+    </w:lvl>
+    <w:lvl w:ilvl="2" w:tplc="FD6A60AE">
+      <w:start w:val="1"/>
+      <w:numFmt w:val="bullet"/>
+      <w:lvlText w:val="■"/>
+      <w:lvlJc w:val="left"/>
+      <w:pPr>
+        <w:ind w:left="2160" w:hanging="360"/>
+      </w:pPr>
+    </w:lvl>
+    <w:lvl w:ilvl="3" w:tplc="52504464">
+      <w:start w:val="1"/>
+      <w:numFmt w:val="bullet"/>
+      <w:lvlText w:val="●"/>
+      <w:lvlJc w:val="left"/>
+      <w:pPr>
+        <w:ind w:left="2880" w:hanging="360"/>
+      </w:pPr>
+    </w:lvl>
+    <w:lvl w:ilvl="4" w:tplc="32288F58">
+      <w:start w:val="1"/>
+      <w:numFmt w:val="bullet"/>
+      <w:lvlText w:val="○"/>
+      <w:lvlJc w:val="left"/>
+      <w:pPr>
+        <w:ind w:left="3600" w:hanging="360"/>
+      </w:pPr>
+    </w:lvl>
+    <w:lvl w:ilvl="5" w:tplc="B4B2AE02">
+      <w:start w:val="1"/>
+      <w:numFmt w:val="bullet"/>
+      <w:lvlText w:val="■"/>
+      <w:lvlJc w:val="left"/>
+      <w:pPr>
+        <w:ind w:left="4320" w:hanging="360"/>
+      </w:pPr>
+    </w:lvl>
+    <w:lvl w:ilvl="6" w:tplc="1DE2BEAE">
+      <w:start w:val="1"/>
+      <w:numFmt w:val="bullet"/>
+      <w:lvlText w:val="●"/>
+      <w:lvlJc w:val="left"/>
+      <w:pPr>
+        <w:ind w:left="5040" w:hanging="360"/>
+      </w:pPr>
+    </w:lvl>
+    <w:lvl w:ilvl="7" w:tplc="B7AA8AC8">
+      <w:start w:val="1"/>
+      <w:numFmt w:val="bullet"/>
+      <w:lvlText w:val="●"/>
+      <w:lvlJc w:val="left"/>
+      <w:pPr>
+        <w:ind w:left="5760" w:hanging="360"/>
+      </w:pPr>
+    </w:lvl>
+    <w:lvl w:ilvl="8" w:tplc="B73621E8">
+      <w:start w:val="1"/>
+      <w:numFmt w:val="bullet"/>
+      <w:lvlText w:val="●"/>
+      <w:lvlJc w:val="left"/>
+      <w:pPr>
+        <w:ind w:left="6480" w:hanging="360"/>
+      </w:pPr>
+    </w:lvl>
+  </w:abstractNum>
+  <w:abstractNum w:abstractNumId="1" w15:restartNumberingAfterBreak="0">
+    <w:nsid w:val="21B310DC"/>
+    <w:multiLevelType w:val="hybridMultilevel"/>
+    <w:tmpl w:val="D2441AFA"/>
+    <w:lvl w:ilvl="0" w:tplc="383A5D42">
+      <w:start w:val="1"/>
+      <w:numFmt w:val="bullet"/>
+      <w:lvlText w:val="•"/>
+      <w:lvlJc w:val="left"/>
+      <w:pPr>
+        <w:ind w:left="648" w:hanging="316"/>
+      </w:pPr>
+    </w:lvl>
+    <w:lvl w:ilvl="1" w:tplc="3E26C4AE">
+      <w:start w:val="1"/>
+      <w:numFmt w:val="bullet"/>
+      <w:lvlText w:val="◦"/>
+      <w:lvlJc w:val="left"/>
+      <w:pPr>
+        <w:ind w:left="1152" w:hanging="316"/>
+      </w:pPr>
+    </w:lvl>
+    <w:lvl w:ilvl="2" w:tplc="DBEEBAB0">
       <w:numFmt w:val="decimal"/>
       <w:lvlText w:val=""/>
       <w:lvlJc w:val="left"/>
     </w:lvl>
-    <w:lvl w:ilvl="2" w:tplc="BE1A7A5E">
+    <w:lvl w:ilvl="3" w:tplc="A61E7496">
       <w:numFmt w:val="decimal"/>
       <w:lvlText w:val=""/>
       <w:lvlJc w:val="left"/>
     </w:lvl>
-    <w:lvl w:ilvl="3" w:tplc="084C95C4">
+    <w:lvl w:ilvl="4" w:tplc="1D1C0CF2">
       <w:numFmt w:val="decimal"/>
       <w:lvlText w:val=""/>
       <w:lvlJc w:val="left"/>
     </w:lvl>
-    <w:lvl w:ilvl="4" w:tplc="297864BA">
+    <w:lvl w:ilvl="5" w:tplc="D9FC3BD2">
       <w:numFmt w:val="decimal"/>
       <w:lvlText w:val=""/>
       <w:lvlJc w:val="left"/>
     </w:lvl>
-    <w:lvl w:ilvl="5" w:tplc="A02C62BC">
+    <w:lvl w:ilvl="6" w:tplc="5EB265A6">
       <w:numFmt w:val="decimal"/>
       <w:lvlText w:val=""/>
       <w:lvlJc w:val="left"/>
     </w:lvl>
-    <w:lvl w:ilvl="6" w:tplc="44EEA948">
+    <w:lvl w:ilvl="7" w:tplc="0EA4F4EE">
       <w:numFmt w:val="decimal"/>
       <w:lvlText w:val=""/>
       <w:lvlJc w:val="left"/>
     </w:lvl>
-    <w:lvl w:ilvl="7" w:tplc="C5A00C70">
-      <w:numFmt w:val="decimal"/>
-      <w:lvlText w:val=""/>
-      <w:lvlJc w:val="left"/>
-    </w:lvl>
-    <w:lvl w:ilvl="8" w:tplc="95C2A372">
-      <w:numFmt w:val="decimal"/>
-      <w:lvlText w:val=""/>
-      <w:lvlJc w:val="left"/>
-    </w:lvl>
-  </w:abstractNum>
-  <w:abstractNum w:abstractNumId="1" w15:restartNumberingAfterBreak="0">
-    <w:nsid w:val="446D3F25"/>
-    <w:multiLevelType w:val="hybridMultilevel"/>
-    <w:tmpl w:val="7570DD84"/>
-    <w:lvl w:ilvl="0" w:tplc="B1688878">
-      <w:start w:val="1"/>
-      <w:numFmt w:val="bullet"/>
-      <w:lvlText w:val="•"/>
-      <w:lvlJc w:val="left"/>
-      <w:pPr>
-        <w:ind w:left="648" w:hanging="316"/>
-      </w:pPr>
-    </w:lvl>
-    <w:lvl w:ilvl="1" w:tplc="D388AB7E">
-      <w:start w:val="1"/>
-      <w:numFmt w:val="bullet"/>
-      <w:lvlText w:val="◦"/>
-      <w:lvlJc w:val="left"/>
-      <w:pPr>
-        <w:ind w:left="1152" w:hanging="316"/>
-      </w:pPr>
-    </w:lvl>
-    <w:lvl w:ilvl="2" w:tplc="6FDCC99C">
-      <w:numFmt w:val="decimal"/>
-      <w:lvlText w:val=""/>
-      <w:lvlJc w:val="left"/>
-    </w:lvl>
-    <w:lvl w:ilvl="3" w:tplc="0AA263BA">
-      <w:numFmt w:val="decimal"/>
-      <w:lvlText w:val=""/>
-      <w:lvlJc w:val="left"/>
-    </w:lvl>
-    <w:lvl w:ilvl="4" w:tplc="4B5C8C74">
-      <w:numFmt w:val="decimal"/>
-      <w:lvlText w:val=""/>
-      <w:lvlJc w:val="left"/>
-    </w:lvl>
-    <w:lvl w:ilvl="5" w:tplc="B55281C2">
-      <w:numFmt w:val="decimal"/>
-      <w:lvlText w:val=""/>
-      <w:lvlJc w:val="left"/>
-    </w:lvl>
-    <w:lvl w:ilvl="6" w:tplc="5E2AD948">
-      <w:numFmt w:val="decimal"/>
-      <w:lvlText w:val=""/>
-      <w:lvlJc w:val="left"/>
-    </w:lvl>
-    <w:lvl w:ilvl="7" w:tplc="207EF608">
-      <w:numFmt w:val="decimal"/>
-      <w:lvlText w:val=""/>
-      <w:lvlJc w:val="left"/>
-    </w:lvl>
-    <w:lvl w:ilvl="8" w:tplc="3A7C033A">
+    <w:lvl w:ilvl="8" w:tplc="E52EA0BE">
       <w:numFmt w:val="decimal"/>
       <w:lvlText w:val=""/>
       <w:lvlJc w:val="left"/>
     </w:lvl>
   </w:abstractNum>
   <w:abstractNum w:abstractNumId="2" w15:restartNumberingAfterBreak="0">
-    <w:nsid w:val="532B6A7B"/>
+    <w:nsid w:val="564553FC"/>
     <w:multiLevelType w:val="hybridMultilevel"/>
-    <w:tmpl w:val="5BDECA04"/>
-    <w:lvl w:ilvl="0" w:tplc="9936421E">
+    <w:tmpl w:val="49106E2C"/>
+    <w:lvl w:ilvl="0" w:tplc="FB28E0C6">
       <w:start w:val="1"/>
-      <w:numFmt w:val="bullet"/>
-      <w:lvlText w:val="●"/>
+      <w:numFmt w:val="decimal"/>
+      <w:lvlText w:val="%1."/>
       <w:lvlJc w:val="left"/>
       <w:pPr>
-        <w:ind w:left="720" w:hanging="360"/>
+        <w:ind w:left="648" w:hanging="360"/>
       </w:pPr>
     </w:lvl>
-    <w:lvl w:ilvl="1" w:tplc="DBF266D4">
-      <w:start w:val="1"/>
-      <w:numFmt w:val="bullet"/>
-      <w:lvlText w:val="○"/>
+    <w:lvl w:ilvl="1" w:tplc="8F426D8E">
+      <w:numFmt w:val="decimal"/>
+      <w:lvlText w:val=""/>
       <w:lvlJc w:val="left"/>
-      <w:pPr>
-        <w:ind w:left="1440" w:hanging="360"/>
-      </w:pPr>
     </w:lvl>
-    <w:lvl w:ilvl="2" w:tplc="67327EC6">
-      <w:start w:val="1"/>
-      <w:numFmt w:val="bullet"/>
-      <w:lvlText w:val="■"/>
+    <w:lvl w:ilvl="2" w:tplc="3B72DE8C">
+      <w:numFmt w:val="decimal"/>
+      <w:lvlText w:val=""/>
       <w:lvlJc w:val="left"/>
-      <w:pPr>
-        <w:ind w:left="2160" w:hanging="360"/>
-      </w:pPr>
     </w:lvl>
-    <w:lvl w:ilvl="3" w:tplc="F6F231C2">
-      <w:start w:val="1"/>
-      <w:numFmt w:val="bullet"/>
-      <w:lvlText w:val="●"/>
+    <w:lvl w:ilvl="3" w:tplc="532EA3DA">
+      <w:numFmt w:val="decimal"/>
+      <w:lvlText w:val=""/>
       <w:lvlJc w:val="left"/>
-      <w:pPr>
-        <w:ind w:left="2880" w:hanging="360"/>
-      </w:pPr>
     </w:lvl>
-    <w:lvl w:ilvl="4" w:tplc="674E829E">
-      <w:start w:val="1"/>
-      <w:numFmt w:val="bullet"/>
-      <w:lvlText w:val="○"/>
+    <w:lvl w:ilvl="4" w:tplc="880E0A50">
+      <w:numFmt w:val="decimal"/>
+      <w:lvlText w:val=""/>
       <w:lvlJc w:val="left"/>
-      <w:pPr>
-        <w:ind w:left="3600" w:hanging="360"/>
-      </w:pPr>
     </w:lvl>
-    <w:lvl w:ilvl="5" w:tplc="868E8A5A">
-      <w:start w:val="1"/>
-      <w:numFmt w:val="bullet"/>
-      <w:lvlText w:val="■"/>
+    <w:lvl w:ilvl="5" w:tplc="FBE4FB70">
+      <w:numFmt w:val="decimal"/>
+      <w:lvlText w:val=""/>
       <w:lvlJc w:val="left"/>
-      <w:pPr>
-        <w:ind w:left="4320" w:hanging="360"/>
-      </w:pPr>
     </w:lvl>
-    <w:lvl w:ilvl="6" w:tplc="368E3AA4">
-      <w:start w:val="1"/>
-      <w:numFmt w:val="bullet"/>
-      <w:lvlText w:val="●"/>
+    <w:lvl w:ilvl="6" w:tplc="92541DF4">
+      <w:numFmt w:val="decimal"/>
+      <w:lvlText w:val=""/>
       <w:lvlJc w:val="left"/>
-      <w:pPr>
-        <w:ind w:left="5040" w:hanging="360"/>
-      </w:pPr>
     </w:lvl>
-    <w:lvl w:ilvl="7" w:tplc="04E2CE96">
-      <w:start w:val="1"/>
-      <w:numFmt w:val="bullet"/>
-      <w:lvlText w:val="●"/>
+    <w:lvl w:ilvl="7" w:tplc="837E1928">
+      <w:numFmt w:val="decimal"/>
+      <w:lvlText w:val=""/>
       <w:lvlJc w:val="left"/>
-      <w:pPr>
-        <w:ind w:left="5760" w:hanging="360"/>
-      </w:pPr>
     </w:lvl>
-    <w:lvl w:ilvl="8" w:tplc="CA1E61F4">
-      <w:start w:val="1"/>
-      <w:numFmt w:val="bullet"/>
-      <w:lvlText w:val="●"/>
+    <w:lvl w:ilvl="8" w:tplc="8B248954">
+      <w:numFmt w:val="decimal"/>
+      <w:lvlText w:val=""/>
       <w:lvlJc w:val="left"/>
-      <w:pPr>
-        <w:ind w:left="6480" w:hanging="360"/>
-      </w:pPr>
     </w:lvl>
   </w:abstractNum>
-  <w:num w:numId="1" w16cid:durableId="822965458">
-    <w:abstractNumId w:val="2"/>
+  <w:num w:numId="1" w16cid:durableId="195041416">
+    <w:abstractNumId w:val="0"/>
     <w:lvlOverride w:ilvl="0">
       <w:startOverride w:val="1"/>
     </w:lvlOverride>
   </w:num>
-  <w:num w:numId="2" w16cid:durableId="1276062224">
+  <w:num w:numId="2" w16cid:durableId="1196693194">
     <w:abstractNumId w:val="1"/>
     <w:lvlOverride w:ilvl="0">
       <w:startOverride w:val="1"/>
@@ -34126,7 +35462,7 @@
     <w:autoRedefine/>
     <w:uiPriority w:val="39"/>
     <w:unhideWhenUsed/>
-    <w:rsid w:val="001D6D80"/>
+    <w:rsid w:val="00407931"/>
     <w:pPr>
       <w:spacing w:after="100"/>
     </w:pPr>
@@ -34138,7 +35474,7 @@
     <w:autoRedefine/>
     <w:uiPriority w:val="39"/>
     <w:unhideWhenUsed/>
-    <w:rsid w:val="001D6D80"/>
+    <w:rsid w:val="00407931"/>
     <w:pPr>
       <w:spacing w:after="100"/>
       <w:ind w:left="260"/>
@@ -34151,7 +35487,7 @@
     <w:autoRedefine/>
     <w:uiPriority w:val="39"/>
     <w:unhideWhenUsed/>
-    <w:rsid w:val="001D6D80"/>
+    <w:rsid w:val="00407931"/>
     <w:pPr>
       <w:spacing w:after="100"/>
       <w:ind w:left="520"/>

</xml_diff>